<commit_message>
Met à jour le plan de carrière avec les précisions de l'utilisateur
Cours EDR identifié comme celui de Maldev Academy, abonnement HTB actif jusqu'en
octobre 2027, lab CRTO inclus, contrat d'apprentissage de deux ans. Calendrier
des labs, points de décision D3 et D5 et sources corrigés.

Co-Authored-By: Claude Sonnet 5.5 <noreply@anthropic.com>
Claude-Session: https://claude.ai/code/session_01PLMe4ge9F6B5wJA3dMBx9D
</commit_message>
<xml_diff>
--- a/05-Plan-Carriere/Plan-carriere-Red-Team-2026-2028.docx
+++ b/05-Plan-Carriere/Plan-carriere-Red-Team-2026-2028.docx
@@ -454,7 +454,27 @@
           <w:i w:val="false"/>
           <w:iCs w:val="false"/>
         </w:rPr>
-        <w:t xml:space="preserve"> la date de fin de ton abonnement HackTheBox Pro Labs, le contenu exact de ton achat CRTO côté lab, l'identité précise du cours « EDR Internals &amp; Development » que tu possèdes, et les conditions de ton contrat d'apprentissage pour le M2. Ces quatre points conditionnent plusieurs décisions du plan (section 9).</w:t>
+        <w:t xml:space="preserve"> le nombre d'heures et la date d'expiration du lab CRTO (tu as confirmé qu'il est inclus), le prix de renouvellement de ton abonnement HackTheBox historique face à HTB PRO, le détail des prérequis du cours EDR de Maldev Academy (je n'ai pu lire son programme que par des extraits de recherche), et ce que ton ministère peut offrir comme missions offensives. </w:t>
+      </w:r>
+      <w:r>
+        <w:rPr>
+          <w:rFonts w:ascii="Calibri" w:cs="Calibri" w:eastAsia="Calibri" w:hAnsi="Calibri"/>
+          <w:b/>
+          <w:bCs/>
+          <w:i w:val="false"/>
+          <w:iCs w:val="false"/>
+        </w:rPr>
+        <w:t xml:space="preserve">Informations que tu m'as données le 14 octobre 2026 et que j'ai intégrées sans pouvoir les vérifier :</w:t>
+      </w:r>
+      <w:r>
+        <w:rPr>
+          <w:rFonts w:ascii="Calibri" w:cs="Calibri" w:eastAsia="Calibri" w:hAnsi="Calibri"/>
+          <w:b w:val="false"/>
+          <w:bCs w:val="false"/>
+          <w:i w:val="false"/>
+          <w:iCs w:val="false"/>
+        </w:rPr>
+        <w:t xml:space="preserve"> abonnement HackTheBox actif jusqu'en octobre 2027 avec accès à Shinra, Ifrit et aux autres Pro Labs et Mini Pro Labs ; lab CRTO inclus dans ton achat ; cours EDR Internals &amp; Development édité par Maldev Academy ; contrat d'apprentissage de deux ans au ministère.</w:t>
       </w:r>
     </w:p>
     <w:p>
@@ -673,7 +693,7 @@
           <w:i w:val="false"/>
           <w:iCs w:val="false"/>
         </w:rPr>
-        <w:t xml:space="preserve">10. Le levier le plus puissant n'est pas une certification : c'est un M2 en alternance dans une équipe offensive (décision à prendre en mars 2027).</w:t>
+        <w:t xml:space="preserve">10. Le levier le plus puissant n'est pas une certification : ce que ton ministère te laisse faire d'offensif pendant les deux ans de ton contrat (décision à prendre en mars 2027).</w:t>
       </w:r>
     </w:p>
     <w:p>
@@ -1356,7 +1376,7 @@
           <w:i w:val="false"/>
           <w:iCs w:val="false"/>
         </w:rPr>
-        <w:t xml:space="preserve"> Comprendre comment un EDR est construit (rappels noyau, minifiltres, télémétrie, selon le programme publié par TrainSec) rend CRTL et CETP beaucoup plus profitables. Il doit venir avant la certification d'évasion, pas après.</w:t>
+        <w:t xml:space="preserve"> Comprendre comment un EDR est construit (rappels noyau, minifiltres, télémétrie, selon le programme publié par Maldev Academy) rend CRTL et CETP beaucoup plus profitables. Il doit venir avant la certification d'évasion, pas après.</w:t>
       </w:r>
     </w:p>
     <w:p>
@@ -3015,7 +3035,7 @@
                 <w:sz w:val="17"/>
                 <w:szCs w:val="17"/>
               </w:rPr>
-              <w:t xml:space="preserve">Je suppose qu'il s'agit du cours TrainSec « EDR Internals: Research &amp; Development » (Pavel Yosifovich, Uriel Kosayev). Programme publié : architecture d'un EDR, rappels noyau (processus, threads, registre), minifiltres du système de fichiers, communication entre noyau et espace utilisateur, ETW, construction de composants. Public visé : bases en internes Windows.</w:t>
+              <w:t xml:space="preserve">Cours édité par Maldev Academy (confirmé par toi). D'après la page du cours et des publications de l'éditeur : développement pas à pas d'un agent EDR de recherche nommé MaldevEdr (service protégé, DLL en espace utilisateur, pilote ELAM, minifiltres du système de fichiers, rappels noyau sur processus, threads, chargement d'images, registre et objets), télémétrie ETW Threat Intelligence, bases du débogage noyau avec WinDbg et du développement de pilotes Windows. Je n'ai pas pu lire le programme complet ni les prérequis.</w:t>
             </w:r>
           </w:p>
         </w:tc>
@@ -3049,7 +3069,7 @@
                 <w:sz w:val="17"/>
                 <w:szCs w:val="17"/>
               </w:rPr>
-              <w:t xml:space="preserve">Incertain sur l'identité du cours ; à confirmer de ton côté.</w:t>
+              <w:t xml:space="preserve">Partiellement confirmé (extraits de recherche, programme complet non consulté). Attention : TrainSec vend un cours homonyme, distinct.</w:t>
             </w:r>
           </w:p>
         </w:tc>
@@ -3180,7 +3200,7 @@
         <w:rPr>
           <w:rFonts w:ascii="Calibri" w:cs="Calibri" w:eastAsia="Calibri" w:hAnsi="Calibri"/>
         </w:rPr>
-        <w:t xml:space="preserve">Ce que ton achat CRTO inclut côté lab : incertain</w:t>
+        <w:t xml:space="preserve">Lab CRTO : inclus selon toi, heures et expiration non vérifiées</w:t>
       </w:r>
     </w:p>
     <w:p>
@@ -3197,7 +3217,7 @@
           <w:i w:val="false"/>
           <w:iCs w:val="false"/>
         </w:rPr>
-        <w:t xml:space="preserve">Les sources se contredisent. Un guide tiers de 2026 indique que les 399 £ couvrent le cours, plus de 20 labs sans date d'expiration avec une licence Cobalt Strike utilisable dans ces labs, et l'examen. Un autre parle de 40 heures de lab par défaut, extensibles. Les anciennes versions du cours vendaient le lab en abonnement séparé. Les conditions de reprise de l'examen divergent aussi (une reprise gratuite ou reprises illimitées). </w:t>
+        <w:t xml:space="preserve">Tu m'as confirmé que le lab est inclus dans ton achat. Les sources tierces se contredisent en revanche sur ses modalités. Un guide tiers de 2026 indique que les 399 £ couvrent le cours, plus de 20 labs sans date d'expiration avec une licence Cobalt Strike utilisable dans ces labs, et l'examen. Un autre parle de 40 heures de lab par défaut, extensibles. Les anciennes versions du cours vendaient le lab en abonnement séparé. Les conditions de reprise de l'examen divergent aussi (une reprise gratuite ou reprises illimitées). </w:t>
       </w:r>
       <w:r>
         <w:rPr>
@@ -3217,7 +3237,7 @@
           <w:i w:val="false"/>
           <w:iCs w:val="false"/>
         </w:rPr>
-        <w:t xml:space="preserve"> : la présence d'un compteur d'heures de lab, sa date d'expiration et le nombre de tentatives d'examen incluses. Cela décide si tu peux étaler le CRTO à 4 h par semaine ou s'il faut le concentrer.</w:t>
+        <w:t xml:space="preserve"> : la présence d'un compteur d'heures de lab, sa date d'expiration et le nombre de tentatives d'examen incluses. Cela décide si tu peux étaler le CRTO à 4 h par semaine ou s'il faut le concentrer ; en attendant, le plan suppose un lab sans expiration proche.</w:t>
       </w:r>
     </w:p>
     <w:p>
@@ -3349,7 +3369,7 @@
           <w:i w:val="false"/>
           <w:iCs w:val="false"/>
         </w:rPr>
-        <w:t xml:space="preserve"> (septembre 2027 à janvier 2028). C'est le seul des trois qui adopte le point de vue du constructeur de défenses. Il exige une aisance en C et en internes Windows, d'où sa place après Maldev Academy.</w:t>
+        <w:t xml:space="preserve"> (septembre 2027 à janvier 2028). C'est le seul des trois qui adopte le point de vue du constructeur de défenses. Il comporte du développement de pilotes en mode noyau, ce qui exige une vraie aisance en C et en internes Windows, d'où sa place après Maldev Academy et après plusieurs mois de C.</w:t>
       </w:r>
     </w:p>
     <w:p>
@@ -3386,7 +3406,7 @@
           <w:i w:val="false"/>
           <w:iCs w:val="false"/>
         </w:rPr>
-        <w:t xml:space="preserve"> fort entre Sektor7 et le début de Maldev Academy ; faible entre Maldev Academy et EDR Internals (l'un construit des outils offensifs, l'autre des capteurs) ; nul entre ces cours et le CRTO (opération avec un C2 existant).</w:t>
+        <w:t xml:space="preserve"> fort entre Sektor7 et le début de Maldev Academy ; probablement faible sur le fond entre Maldev Academy et EDR Internals (l'un construit des outils offensifs, l'autre un agent de détection), mais les deux cours viennent du même éditeur et peuvent partager des bases en C et en API Windows : prérequis du cours EDR non vérifiés (avis) ; nul entre ces cours et le CRTO (opération avec un C2 existant).</w:t>
       </w:r>
     </w:p>
     <w:p>
@@ -4412,7 +4432,7 @@
                 <w:sz w:val="17"/>
                 <w:szCs w:val="17"/>
               </w:rPr>
-              <w:t xml:space="preserve">Maldev Academy (fin). EDR Internals &amp; Development. Shinra (fin) puis Ifrit si l'abonnement est renouvelé. Début de CRTL en novembre. Reverse engineering avec OpenSecurityTraining2.</w:t>
+              <w:t xml:space="preserve">Maldev Academy (fin). EDR Internals &amp; Development. Shinra (fin) ; Ifrit seulement si l'abonnement HTB est renouvelé en octobre 2027. Début de CRTL en novembre. Reverse engineering avec OpenSecurityTraining2.</w:t>
             </w:r>
           </w:p>
         </w:tc>
@@ -7572,7 +7592,7 @@
                 <w:sz w:val="17"/>
                 <w:szCs w:val="17"/>
               </w:rPr>
-              <w:t xml:space="preserve">Point de décision D5 sur le renouvellement HTB (date exacte selon ton abonnement).</w:t>
+              <w:t xml:space="preserve">Préparation de la décision D5 sur le renouvellement HTB (à prendre le 15 septembre 2027, l'abonnement expirant en octobre 2027).</w:t>
             </w:r>
           </w:p>
         </w:tc>
@@ -7683,7 +7703,7 @@
                 <w:sz w:val="17"/>
                 <w:szCs w:val="17"/>
               </w:rPr>
-              <w:t xml:space="preserve">Fin de Maldev Academy ou poursuite selon l'avancement. Début d'EDR Internals. Lab : Ifrit si l'abonnement est renouvelé, sinon banc d'essai Ludus.</w:t>
+              <w:t xml:space="preserve">Fin de Maldev Academy ou poursuite selon l'avancement. Début d'EDR Internals. Lab : fin de Shinra avant l'expiration de l'abonnement en octobre ; ensuite Ifrit si D5 a décidé le renouvellement, sinon banc d'essai Ludus.</w:t>
             </w:r>
           </w:p>
         </w:tc>
@@ -7871,7 +7891,7 @@
           <w:i w:val="false"/>
           <w:iCs w:val="false"/>
         </w:rPr>
-        <w:t xml:space="preserve"> : selon le centre d'aide HTB, les abonnés actuels conservent leur formule, leur prix et l'accès aux plus de 30 Pro Labs historiques tant qu'ils restent abonnés. </w:t>
+        <w:t xml:space="preserve"> : selon le centre d'aide HTB, les abonnés actuels conservent leur formule, leur prix et l'accès aux plus de 30 Pro Labs historiques tant qu'ils restent abonnés. Tu m'as confirmé que ton abonnement, actif jusqu'en octobre 2027, donne accès à Shinra, Ifrit et aux autres Pro Labs et Mini Pro Labs (non vérifié de mon côté). </w:t>
       </w:r>
       <w:r>
         <w:rPr>
@@ -7891,7 +7911,7 @@
           <w:i w:val="false"/>
           <w:iCs w:val="false"/>
         </w:rPr>
-        <w:t xml:space="preserve"> : l'accès des formules historiques aux labs ajoutés après le lancement de HTB PRO (Shinra, Ifrit, chaînes Vulnlab). Vérifie dans ton tableau de bord.</w:t>
+        <w:t xml:space="preserve"> : le prix de renouvellement de ta formule historique en octobre 2027 face aux 490 $ par an de HTB PRO.</w:t>
       </w:r>
     </w:p>
     <w:p>
@@ -9080,7 +9100,7 @@
                 <w:sz w:val="17"/>
                 <w:szCs w:val="17"/>
               </w:rPr>
-              <w:t xml:space="preserve">Inclus (accès à vérifier)</w:t>
+              <w:t xml:space="preserve">Inclus (confirmé par toi)</w:t>
             </w:r>
           </w:p>
         </w:tc>
@@ -9428,7 +9448,7 @@
                 <w:sz w:val="17"/>
                 <w:szCs w:val="17"/>
               </w:rPr>
-              <w:t xml:space="preserve">Inclus (accès à vérifier)</w:t>
+              <w:t xml:space="preserve">Inclus (confirmé par toi)</w:t>
             </w:r>
           </w:p>
         </w:tc>
@@ -10484,7 +10504,7 @@
                 <w:sz w:val="17"/>
                 <w:szCs w:val="17"/>
               </w:rPr>
-              <w:t xml:space="preserve">Inclus (à vérifier)</w:t>
+              <w:t xml:space="preserve">Inclus (confirmé par toi)</w:t>
             </w:r>
           </w:p>
         </w:tc>
@@ -10832,7 +10852,7 @@
                 <w:sz w:val="17"/>
                 <w:szCs w:val="17"/>
               </w:rPr>
-              <w:t xml:space="preserve">Inclus (à vérifier)</w:t>
+              <w:t xml:space="preserve">Inclus (confirmé par toi)</w:t>
             </w:r>
           </w:p>
         </w:tc>
@@ -25316,7 +25336,7 @@
           <w:i w:val="false"/>
           <w:iCs w:val="false"/>
         </w:rPr>
-        <w:t xml:space="preserve">, pas davantage. La date de fin de ton abonnement n'étant pas connue, le plan suppose qu'il se termine vers septembre 2027.</w:t>
+        <w:t xml:space="preserve">, pas davantage. Ton abonnement se termine en octobre 2027. Entre octobre 2026 et octobre 2027, la préparation de la BSCP supprime environ dix semaines de lab : il reste à mon avis 150 à 170 h de lab, ce qui permet RastaLabs plafonné à 75 h et Shinra, mais pas Ifrit en plus sans renouvellement ou sans réduire RastaLabs.</w:t>
       </w:r>
     </w:p>
     <w:tbl>
@@ -26023,7 +26043,7 @@
                 <w:sz w:val="17"/>
                 <w:szCs w:val="17"/>
               </w:rPr>
-              <w:t xml:space="preserve">80 à 100</w:t>
+              <w:t xml:space="preserve">70 à 90 (plafond conseillé : 75)</w:t>
             </w:r>
           </w:p>
         </w:tc>
@@ -26058,7 +26078,7 @@
                 <w:sz w:val="17"/>
                 <w:szCs w:val="17"/>
               </w:rPr>
-              <w:t xml:space="preserve">Si le lab déborde, terminer en juin et décaler Shinra.</w:t>
+              <w:t xml:space="preserve">Plafonner : chaque heure en plus retire de la place à Shinra, que je classe plus haut pour ton objectif.</w:t>
             </w:r>
           </w:p>
         </w:tc>
@@ -26098,7 +26118,7 @@
                 <w:sz w:val="17"/>
                 <w:szCs w:val="17"/>
               </w:rPr>
-              <w:t xml:space="preserve">Juin à septembre 2027</w:t>
+              <w:t xml:space="preserve">Juin à mi-octobre 2027</w:t>
             </w:r>
           </w:p>
         </w:tc>
@@ -26200,7 +26220,7 @@
                 <w:sz w:val="17"/>
                 <w:szCs w:val="17"/>
               </w:rPr>
-              <w:t xml:space="preserve">Après le CRTO : c'est volontaire.</w:t>
+              <w:t xml:space="preserve">Après le CRTO : c'est volontaire. À terminer avant l'expiration de l'abonnement.</w:t>
             </w:r>
           </w:p>
         </w:tc>
@@ -26346,7 +26366,7 @@
                 <w:sz w:val="17"/>
                 <w:szCs w:val="17"/>
               </w:rPr>
-              <w:t xml:space="preserve">Seulement si l'abonnement est renouvelé (décision D5) ; sinon construction du banc Ludus.</w:t>
+              <w:t xml:space="preserve">Seulement si l'abonnement est renouvelé en octobre 2027 (décision D5, 15 septembre 2027) ; sinon construction du banc Ludus.</w:t>
             </w:r>
           </w:p>
         </w:tc>
@@ -28758,7 +28778,7 @@
           <w:i w:val="false"/>
           <w:iCs w:val="false"/>
         </w:rPr>
-        <w:t xml:space="preserve"> : employable comme pentesteur ou opérateur Red Team junior à confirmé, en cabinet ou en équipe interne, avec OSCP, CRTP, CRTE, BSCP, CRTO et CRTL. Point faible : l'offre de Synacktiv demande trois ans d'expérience offensive ; ton expérience d'infrastructure ne comptera probablement pas comme telle.</w:t>
+        <w:t xml:space="preserve"> : employable comme pentesteur ou opérateur Red Team junior à confirmé, en cabinet ou en équipe interne, avec OSCP, CRTP, CRTE, BSCP, CRTO et CRTL. Point faible : l'offre de Synacktiv demande trois ans d'expérience offensive ; ton expérience d'infrastructure ne comptera probablement pas comme telle, d'où l'importance de ce que tu fais d'offensif pendant ton contrat.</w:t>
       </w:r>
     </w:p>
     <w:p>
@@ -28838,7 +28858,7 @@
           <w:i w:val="false"/>
           <w:iCs w:val="false"/>
         </w:rPr>
-        <w:t xml:space="preserve"> : un M2 en alternance dans une équipe offensive transforme deux années d'apprentissage en expérience offensive reconnue. C'est le point de décision D3.</w:t>
+        <w:t xml:space="preserve"> : pendant les deux ans de ton contrat au ministère, obtenir des missions offensives réelles (tests d'intrusion internes, exercices d'équipe rouge, appui à une équipe de détection) transforme l'apprentissage en expérience offensive reconnue. C'est le point de décision D3. Changer d'employeur en cours de contrat est possible en théorie mais je n'ai pas vérifié les règles de rupture d'un contrat d'apprentissage : renseigne-toi auprès de ton école et de ton service des ressources humaines avant d'y songer.</w:t>
       </w:r>
     </w:p>
     <w:p>
@@ -30025,7 +30045,7 @@
                 <w:sz w:val="17"/>
                 <w:szCs w:val="17"/>
               </w:rPr>
-              <w:t xml:space="preserve">Alternance de M2 : rester au ministère ou rejoindre une équipe offensive ?</w:t>
+              <w:t xml:space="preserve">Quelles missions offensives viser au ministère pendant le M2 ?</w:t>
             </w:r>
           </w:p>
         </w:tc>
@@ -30059,7 +30079,7 @@
                 <w:sz w:val="17"/>
                 <w:szCs w:val="17"/>
               </w:rPr>
-              <w:t xml:space="preserve">Possibilité réelle de missions offensives au ministère ; durée de ton contrat actuel ; offres d'alternance red team disponibles.</w:t>
+              <w:t xml:space="preserve">Entretien avec ton tuteur : équipe ou service susceptible d'accueillir des tests d'intrusion internes, des exercices rouges ou un appui à la détection ; présence d'une équipe offensive dans l'organisation.</w:t>
             </w:r>
           </w:p>
         </w:tc>
@@ -30093,7 +30113,7 @@
                 <w:sz w:val="17"/>
                 <w:szCs w:val="17"/>
               </w:rPr>
-              <w:t xml:space="preserve">Chercher une alternance offensive si le ministère n'offre pas de missions offensives. Décision qui t'appartient : elle dépend de ton contrat.</w:t>
+              <w:t xml:space="preserve">Demander dès mars 2027 un rattachement partiel à une équipe offensive ou de détection pour le M2. Si rien n'est possible, compenser par le lab, les projets logiciels et un stage ou une mission complémentaire en 2028 ; ne pas envisager de rupture de contrat sans avoir vérifié les règles (non vérifiées).</w:t>
             </w:r>
           </w:p>
         </w:tc>
@@ -30348,7 +30368,7 @@
                 <w:sz w:val="17"/>
                 <w:szCs w:val="17"/>
               </w:rPr>
-              <w:t xml:space="preserve">Un mois avant la fin de l'abonnement HTB</w:t>
+              <w:t xml:space="preserve">15 septembre 2027 (abonnement expirant en octobre 2027)</w:t>
             </w:r>
           </w:p>
         </w:tc>
@@ -31540,7 +31560,7 @@
                 <w:sz w:val="17"/>
                 <w:szCs w:val="17"/>
               </w:rPr>
-              <w:t xml:space="preserve">Confirmé, octobre 2026</w:t>
+              <w:t xml:space="preserve">Confirmé, octobre 2026 ; prix de ta formule historique non vérifié</w:t>
             </w:r>
           </w:p>
         </w:tc>
@@ -31575,7 +31595,7 @@
                 <w:sz w:val="17"/>
                 <w:szCs w:val="17"/>
               </w:rPr>
-              <w:t xml:space="preserve">Selon D5</w:t>
+              <w:t xml:space="preserve">Octobre 2027 si D5 le valide</w:t>
             </w:r>
           </w:p>
         </w:tc>
@@ -32050,7 +32070,7 @@
           <w:i w:val="false"/>
           <w:iCs w:val="false"/>
         </w:rPr>
-        <w:t xml:space="preserve">Vérifier quatre informations</w:t>
+        <w:t xml:space="preserve">Vérifier trois informations</w:t>
       </w:r>
       <w:r>
         <w:rPr>
@@ -32060,7 +32080,7 @@
           <w:i w:val="false"/>
           <w:iCs w:val="false"/>
         </w:rPr>
-        <w:t xml:space="preserve"> que je n'ai pas pu obtenir : la date de fin de ton abonnement Pro Labs et ton accès à Shinra, Ifrit et aux chaînes Vulnlab ; ce que ton achat CRTO inclut côté lab (heures, expiration, tentatives d'examen) ; l'éditeur exact de ton cours « EDR Internals &amp; Development » ; la durée de ton contrat d'apprentissage. Le calendrier des labs et les décisions D2, D3 et D5 en dépendent.</w:t>
+        <w:t xml:space="preserve"> que je ne peux pas obtenir : les heures, la date d'expiration et le nombre de tentatives d'examen du lab CRTO ; le prix de renouvellement de ton abonnement HackTheBox historique face à HTB PRO ; les prérequis du cours EDR de Maldev Academy (page du programme à lire en entier de ton côté). Le calendrier des labs et les décisions D2 et D5 en dépendent.</w:t>
       </w:r>
     </w:p>
     <w:p>
@@ -38139,7 +38159,226 @@
                 <w:sz w:val="17"/>
                 <w:szCs w:val="17"/>
               </w:rPr>
-              <w:t xml:space="preserve">EDR Internals: Research &amp; Development (TrainSec)</w:t>
+              <w:t xml:space="preserve">EDR Internals &amp; Development Course, page et programme (Maldev Academy) : lu seulement par extraits de recherche</w:t>
+            </w:r>
+          </w:p>
+        </w:tc>
+        <w:tc>
+          <w:tcPr>
+            <w:tcW w:type="dxa" w:w="1700"/>
+            <w:tcBorders>
+              <w:top w:val="single" w:color="B7C3D0" w:sz="4"/>
+              <w:left w:val="single" w:color="B7C3D0" w:sz="4"/>
+              <w:bottom w:val="single" w:color="B7C3D0" w:sz="4"/>
+              <w:right w:val="single" w:color="B7C3D0" w:sz="4"/>
+            </w:tcBorders>
+            <w:tcMar>
+              <w:top w:type="dxa" w:w="60"/>
+              <w:left w:type="dxa" w:w="90"/>
+              <w:bottom w:type="dxa" w:w="60"/>
+              <w:right w:type="dxa" w:w="90"/>
+            </w:tcMar>
+          </w:tcPr>
+          <w:p>
+            <w:pPr>
+              <w:spacing w:after="40"/>
+            </w:pPr>
+            <w:r>
+              <w:rPr>
+                <w:rFonts w:ascii="Calibri" w:cs="Calibri" w:eastAsia="Calibri" w:hAnsi="Calibri"/>
+                <w:b w:val="false"/>
+                <w:bCs w:val="false"/>
+                <w:i w:val="false"/>
+                <w:iCs w:val="false"/>
+                <w:sz w:val="17"/>
+                <w:szCs w:val="17"/>
+              </w:rPr>
+              <w:t xml:space="preserve">Non datée</w:t>
+            </w:r>
+          </w:p>
+        </w:tc>
+        <w:tc>
+          <w:tcPr>
+            <w:tcW w:type="dxa" w:w="3638"/>
+            <w:tcBorders>
+              <w:top w:val="single" w:color="B7C3D0" w:sz="4"/>
+              <w:left w:val="single" w:color="B7C3D0" w:sz="4"/>
+              <w:bottom w:val="single" w:color="B7C3D0" w:sz="4"/>
+              <w:right w:val="single" w:color="B7C3D0" w:sz="4"/>
+            </w:tcBorders>
+            <w:tcMar>
+              <w:top w:type="dxa" w:w="60"/>
+              <w:left w:type="dxa" w:w="90"/>
+              <w:bottom w:type="dxa" w:w="60"/>
+              <w:right w:type="dxa" w:w="90"/>
+            </w:tcMar>
+          </w:tcPr>
+          <w:p>
+            <w:pPr>
+              <w:spacing w:after="40"/>
+            </w:pPr>
+            <w:r>
+              <w:rPr>
+                <w:rFonts w:ascii="Calibri" w:cs="Calibri" w:eastAsia="Calibri" w:hAnsi="Calibri"/>
+                <w:b w:val="false"/>
+                <w:bCs w:val="false"/>
+                <w:i w:val="false"/>
+                <w:iCs w:val="false"/>
+                <w:sz w:val="17"/>
+                <w:szCs w:val="17"/>
+              </w:rPr>
+              <w:t xml:space="preserve">maldevacademy.com/edr-course ; /edr-course/syllabus</w:t>
+            </w:r>
+          </w:p>
+        </w:tc>
+      </w:tr>
+      <w:tr>
+        <w:trPr>
+          <w:cantSplit/>
+          <w:tblHeader w:val="false"/>
+        </w:trPr>
+        <w:tc>
+          <w:tcPr>
+            <w:tcW w:type="dxa" w:w="4300"/>
+            <w:tcBorders>
+              <w:top w:val="single" w:color="B7C3D0" w:sz="4"/>
+              <w:left w:val="single" w:color="B7C3D0" w:sz="4"/>
+              <w:bottom w:val="single" w:color="B7C3D0" w:sz="4"/>
+              <w:right w:val="single" w:color="B7C3D0" w:sz="4"/>
+            </w:tcBorders>
+            <w:shd w:fill="F2F5F9" w:color="auto" w:val="clear"/>
+            <w:tcMar>
+              <w:top w:type="dxa" w:w="60"/>
+              <w:left w:type="dxa" w:w="90"/>
+              <w:bottom w:type="dxa" w:w="60"/>
+              <w:right w:type="dxa" w:w="90"/>
+            </w:tcMar>
+          </w:tcPr>
+          <w:p>
+            <w:pPr>
+              <w:spacing w:after="40"/>
+            </w:pPr>
+            <w:r>
+              <w:rPr>
+                <w:rFonts w:ascii="Calibri" w:cs="Calibri" w:eastAsia="Calibri" w:hAnsi="Calibri"/>
+                <w:b w:val="false"/>
+                <w:bCs w:val="false"/>
+                <w:i w:val="false"/>
+                <w:iCs w:val="false"/>
+                <w:sz w:val="17"/>
+                <w:szCs w:val="17"/>
+              </w:rPr>
+              <w:t xml:space="preserve">Publications de Maldev Academy sur l'agent MaldevEdr et ETW-TI (X)</w:t>
+            </w:r>
+          </w:p>
+        </w:tc>
+        <w:tc>
+          <w:tcPr>
+            <w:tcW w:type="dxa" w:w="1700"/>
+            <w:tcBorders>
+              <w:top w:val="single" w:color="B7C3D0" w:sz="4"/>
+              <w:left w:val="single" w:color="B7C3D0" w:sz="4"/>
+              <w:bottom w:val="single" w:color="B7C3D0" w:sz="4"/>
+              <w:right w:val="single" w:color="B7C3D0" w:sz="4"/>
+            </w:tcBorders>
+            <w:shd w:fill="F2F5F9" w:color="auto" w:val="clear"/>
+            <w:tcMar>
+              <w:top w:type="dxa" w:w="60"/>
+              <w:left w:type="dxa" w:w="90"/>
+              <w:bottom w:type="dxa" w:w="60"/>
+              <w:right w:type="dxa" w:w="90"/>
+            </w:tcMar>
+          </w:tcPr>
+          <w:p>
+            <w:pPr>
+              <w:spacing w:after="40"/>
+            </w:pPr>
+            <w:r>
+              <w:rPr>
+                <w:rFonts w:ascii="Calibri" w:cs="Calibri" w:eastAsia="Calibri" w:hAnsi="Calibri"/>
+                <w:b w:val="false"/>
+                <w:bCs w:val="false"/>
+                <w:i w:val="false"/>
+                <w:iCs w:val="false"/>
+                <w:sz w:val="17"/>
+                <w:szCs w:val="17"/>
+              </w:rPr>
+              <w:t xml:space="preserve">Date non vérifiée</w:t>
+            </w:r>
+          </w:p>
+        </w:tc>
+        <w:tc>
+          <w:tcPr>
+            <w:tcW w:type="dxa" w:w="3638"/>
+            <w:tcBorders>
+              <w:top w:val="single" w:color="B7C3D0" w:sz="4"/>
+              <w:left w:val="single" w:color="B7C3D0" w:sz="4"/>
+              <w:bottom w:val="single" w:color="B7C3D0" w:sz="4"/>
+              <w:right w:val="single" w:color="B7C3D0" w:sz="4"/>
+            </w:tcBorders>
+            <w:shd w:fill="F2F5F9" w:color="auto" w:val="clear"/>
+            <w:tcMar>
+              <w:top w:type="dxa" w:w="60"/>
+              <w:left w:type="dxa" w:w="90"/>
+              <w:bottom w:type="dxa" w:w="60"/>
+              <w:right w:type="dxa" w:w="90"/>
+            </w:tcMar>
+          </w:tcPr>
+          <w:p>
+            <w:pPr>
+              <w:spacing w:after="40"/>
+            </w:pPr>
+            <w:r>
+              <w:rPr>
+                <w:rFonts w:ascii="Calibri" w:cs="Calibri" w:eastAsia="Calibri" w:hAnsi="Calibri"/>
+                <w:b w:val="false"/>
+                <w:bCs w:val="false"/>
+                <w:i w:val="false"/>
+                <w:iCs w:val="false"/>
+                <w:sz w:val="17"/>
+                <w:szCs w:val="17"/>
+              </w:rPr>
+              <w:t xml:space="preserve">x.com/MalDevAcademy/status/2061859754083815787 ; /2086850780024180824</w:t>
+            </w:r>
+          </w:p>
+        </w:tc>
+      </w:tr>
+      <w:tr>
+        <w:trPr>
+          <w:cantSplit/>
+          <w:tblHeader w:val="false"/>
+        </w:trPr>
+        <w:tc>
+          <w:tcPr>
+            <w:tcW w:type="dxa" w:w="4300"/>
+            <w:tcBorders>
+              <w:top w:val="single" w:color="B7C3D0" w:sz="4"/>
+              <w:left w:val="single" w:color="B7C3D0" w:sz="4"/>
+              <w:bottom w:val="single" w:color="B7C3D0" w:sz="4"/>
+              <w:right w:val="single" w:color="B7C3D0" w:sz="4"/>
+            </w:tcBorders>
+            <w:tcMar>
+              <w:top w:type="dxa" w:w="60"/>
+              <w:left w:type="dxa" w:w="90"/>
+              <w:bottom w:type="dxa" w:w="60"/>
+              <w:right w:type="dxa" w:w="90"/>
+            </w:tcMar>
+          </w:tcPr>
+          <w:p>
+            <w:pPr>
+              <w:spacing w:after="40"/>
+            </w:pPr>
+            <w:r>
+              <w:rPr>
+                <w:rFonts w:ascii="Calibri" w:cs="Calibri" w:eastAsia="Calibri" w:hAnsi="Calibri"/>
+                <w:b w:val="false"/>
+                <w:bCs w:val="false"/>
+                <w:i w:val="false"/>
+                <w:iCs w:val="false"/>
+                <w:sz w:val="17"/>
+                <w:szCs w:val="17"/>
+              </w:rPr>
+              <w:t xml:space="preserve">EDR Internals: Research &amp; Development (TrainSec), cours homonyme distinct du tien</w:t>
             </w:r>
           </w:p>
         </w:tc>

</xml_diff>

<commit_message>
Adapte le plan à l'absence d'offensif en alternance
Réévalue l'employabilité à la sortie d'école, remplace la décision D3 par la
construction de preuves hors emploi et ajoute le risque d'absence d'expérience.

Co-Authored-By: Claude Sonnet 5.5 <noreply@anthropic.com>
Claude-Session: https://claude.ai/code/session_01PLMe4ge9F6B5wJA3dMBx9D
</commit_message>
<xml_diff>
--- a/05-Plan-Carriere/Plan-carriere-Red-Team-2026-2028.docx
+++ b/05-Plan-Carriere/Plan-carriere-Red-Team-2026-2028.docx
@@ -676,7 +676,7 @@
           <w:i w:val="false"/>
           <w:iCs w:val="false"/>
         </w:rPr>
-        <w:t xml:space="preserve">9. À ta sortie d'école (été 2028), un poste d'opérateur Red Team junior à confirmé est réaliste ; la spécialisation évasion et développement d'outils demande, à mon avis, deux à quatre ans de plus.</w:t>
+        <w:t xml:space="preserve">9. Ton employeur ne te fera faire aucun offensif : à ta sortie d'école (été 2028), un poste de pentesteur ou d'opérateur Red Team junior est réaliste, pas un poste confirmé ; la spécialisation évasion et développement d'outils demande, à mon avis, trois à cinq ans de plus.</w:t>
       </w:r>
     </w:p>
     <w:p>
@@ -693,7 +693,7 @@
           <w:i w:val="false"/>
           <w:iCs w:val="false"/>
         </w:rPr>
-        <w:t xml:space="preserve">10. Le levier le plus puissant n'est pas une certification : ce que ton ministère te laisse faire d'offensif pendant les deux ans de ton contrat (décision à prendre en mars 2027).</w:t>
+        <w:t xml:space="preserve">10. Comme l'alternance ne te donnera aucune expérience offensive, la preuve doit venir de ce que tu construis à côté : rapports de lab de qualité professionnelle, deux projets logiciels publics, le mémoire de M2 orienté Red Team et une publication autorisée par ton employeur.</w:t>
       </w:r>
     </w:p>
     <w:p>
@@ -970,6 +970,46 @@
           <w:iCs w:val="false"/>
         </w:rPr>
         <w:t xml:space="preserve"> : indispensables en cabinet comme en interne ; aucun livrable écrit n'est prévu dans ton rythme actuel.</w:t>
+      </w:r>
+    </w:p>
+    <w:p>
+      <w:pPr>
+        <w:pStyle w:val="ListParagraph"/>
+        <w:numPr>
+          <w:ilvl w:val="0"/>
+          <w:numId w:val="2"/>
+        </w:numPr>
+        <w:spacing w:after="60" w:line="264"/>
+      </w:pPr>
+      <w:r>
+        <w:rPr>
+          <w:rFonts w:ascii="Calibri" w:cs="Calibri" w:eastAsia="Calibri" w:hAnsi="Calibri"/>
+          <w:b w:val="false"/>
+          <w:bCs w:val="false"/>
+          <w:i w:val="false"/>
+          <w:iCs w:val="false"/>
+        </w:rPr>
+        <w:t xml:space="preserve"/>
+      </w:r>
+      <w:r>
+        <w:rPr>
+          <w:rFonts w:ascii="Calibri" w:cs="Calibri" w:eastAsia="Calibri" w:hAnsi="Calibri"/>
+          <w:b/>
+          <w:bCs/>
+          <w:i w:val="false"/>
+          <w:iCs w:val="false"/>
+        </w:rPr>
+        <w:t xml:space="preserve">Expérience de mission offensive</w:t>
+      </w:r>
+      <w:r>
+        <w:rPr>
+          <w:rFonts w:ascii="Calibri" w:cs="Calibri" w:eastAsia="Calibri" w:hAnsi="Calibri"/>
+          <w:b w:val="false"/>
+          <w:bCs w:val="false"/>
+          <w:i w:val="false"/>
+          <w:iCs w:val="false"/>
+        </w:rPr>
+        <w:t xml:space="preserve"> : ton alternance ne t'en donnera pas (tu me l'as confirmé). C'est le premier critère que les offres demandent (Synacktiv : trois ans d'expérience offensive) et le plan est donc construit pour la compenser par des preuves indépendantes de ton employeur.</w:t>
       </w:r>
     </w:p>
     <w:p>
@@ -6345,7 +6385,7 @@
                 <w:sz w:val="17"/>
                 <w:szCs w:val="17"/>
               </w:rPr>
-              <w:t xml:space="preserve">Deux examens blancs consécutifs réussis. Point de décision sur l'alternance M2 préparé (voir D3).</w:t>
+              <w:t xml:space="preserve">Deux examens blancs consécutifs réussis. Réflexion sur les preuves hors emploi et le sujet de mémoire de M2 préparée (voir D3).</w:t>
             </w:r>
           </w:p>
         </w:tc>
@@ -6702,7 +6742,7 @@
                 <w:sz w:val="17"/>
                 <w:szCs w:val="17"/>
               </w:rPr>
-              <w:t xml:space="preserve">Environ la moitié du cours CRTO terminée. Décision D3 sur l'alternance prise.</w:t>
+              <w:t xml:space="preserve">Environ la moitié du cours CRTO terminée. Décision D3 prise : règles de publication et sujet de mémoire de M2 arrêtés.</w:t>
             </w:r>
           </w:p>
         </w:tc>
@@ -28778,7 +28818,7 @@
           <w:i w:val="false"/>
           <w:iCs w:val="false"/>
         </w:rPr>
-        <w:t xml:space="preserve"> : employable comme pentesteur ou opérateur Red Team junior à confirmé, en cabinet ou en équipe interne, avec OSCP, CRTP, CRTE, BSCP, CRTO et CRTL. Point faible : l'offre de Synacktiv demande trois ans d'expérience offensive ; ton expérience d'infrastructure ne comptera probablement pas comme telle, d'où l'importance de ce que tu fais d'offensif pendant ton contrat.</w:t>
+        <w:t xml:space="preserve"> : employable comme pentesteur ou opérateur Red Team junior, en cabinet de préférence, avec OSCP, CRTP, CRTE, BSCP, CRTO et CRTL. Un poste confirmé est peu probable : tu n'auras aucune mission offensive réelle à ton actif, alors que l'offre de Synacktiv demande trois ans d'expérience offensive et que ton expérience d'infrastructure ne comptera probablement pas comme telle (avis).</w:t>
       </w:r>
     </w:p>
     <w:p>
@@ -28818,7 +28858,7 @@
           <w:i w:val="false"/>
           <w:iCs w:val="false"/>
         </w:rPr>
-        <w:t xml:space="preserve"> : deux à quatre ans après la sortie d'école, avec un historique de projets publics et de missions réelles.</w:t>
+        <w:t xml:space="preserve"> : trois à cinq ans après la sortie d'école (avis, un an de plus que dans ma première version à cause de l'absence d'offensif en alternance), avec un historique de projets publics et de vraies missions.</w:t>
       </w:r>
     </w:p>
     <w:p>
@@ -28858,7 +28898,7 @@
           <w:i w:val="false"/>
           <w:iCs w:val="false"/>
         </w:rPr>
-        <w:t xml:space="preserve"> : pendant les deux ans de ton contrat au ministère, obtenir des missions offensives réelles (tests d'intrusion internes, exercices d'équipe rouge, appui à une équipe de détection) transforme l'apprentissage en expérience offensive reconnue. C'est le point de décision D3. Changer d'employeur en cours de contrat est possible en théorie mais je n'ai pas vérifié les règles de rupture d'un contrat d'apprentissage : renseigne-toi auprès de ton école et de ton service des ressources humaines avant d'y songer.</w:t>
+        <w:t xml:space="preserve"> : puisque l'alternance n'apporte aucune preuve offensive, ces preuves doivent venir de toi : rapports de lab au format client (privés), deux projets logiciels publics, un mémoire de M2 sur un sujet offensif ou d'évasion, et si ton employeur l'autorise, un article ou une présentation. Tes atouts réels sont ailleurs : trois ans d'infrastructure en environnement sensible et la compréhension de la défense (banc Ludus avec EDR). Pitch recommandé : un opérateur qui sait comment un parc est administré et surveillé. C'est le point de décision D3.</w:t>
       </w:r>
     </w:p>
     <w:p>
@@ -29336,6 +29376,26 @@
       <w:pPr>
         <w:spacing w:after="120"/>
       </w:pPr>
+    </w:p>
+    <w:p>
+      <w:pPr>
+        <w:keepNext w:val="false"/>
+        <w:spacing w:after="120" w:before="0" w:line="276"/>
+        <w:jc w:val="both"/>
+      </w:pPr>
+      <w:r>
+        <w:rPr>
+          <w:rFonts w:ascii="Calibri" w:cs="Calibri" w:eastAsia="Calibri" w:hAnsi="Calibri"/>
+          <w:b w:val="false"/>
+          <w:bCs w:val="false"/>
+          <w:i/>
+          <w:iCs/>
+          <w:color w:val="555555"/>
+          <w:sz w:val="19"/>
+          <w:szCs w:val="19"/>
+        </w:rPr>
+        <w:t xml:space="preserve">Risque structurel, hors des trois demandés : l'absence totale d'offensif en alternance. Si au bout de six mois de recherche (à partir de janvier 2028) aucun cabinet ne te convoque faute d'expérience, élargis aux postes de pentest généraliste et aux équipes de détection ou d'audit, puis reviens vers l'offensif après un ou deux ans (avis).</w:t>
+      </w:r>
     </w:p>
     <w:p>
       <w:pPr>
@@ -30045,7 +30105,7 @@
                 <w:sz w:val="17"/>
                 <w:szCs w:val="17"/>
               </w:rPr>
-              <w:t xml:space="preserve">Quelles missions offensives viser au ministère pendant le M2 ?</w:t>
+              <w:t xml:space="preserve">Quelles preuves offensives construire hors emploi, et lesquelles publier ?</w:t>
             </w:r>
           </w:p>
         </w:tc>
@@ -30079,7 +30139,7 @@
                 <w:sz w:val="17"/>
                 <w:szCs w:val="17"/>
               </w:rPr>
-              <w:t xml:space="preserve">Entretien avec ton tuteur : équipe ou service susceptible d'accueillir des tests d'intrusion internes, des exercices rouges ou un appui à la détection ; présence d'une équipe offensive dans l'organisation.</w:t>
+              <w:t xml:space="preserve">Ce que ton contrat et le statut de l'agent public autorisent comme publication et activité extérieure (à vérifier auprès de ton tuteur et de ton école, non vérifié de mon côté) ; sujet de mémoire de M2 disponible ; avancement de RastaLabs et du projet logiciel n° 1.</w:t>
             </w:r>
           </w:p>
         </w:tc>
@@ -30113,7 +30173,7 @@
                 <w:sz w:val="17"/>
                 <w:szCs w:val="17"/>
               </w:rPr>
-              <w:t xml:space="preserve">Demander dès mars 2027 un rattachement partiel à une équipe offensive ou de détection pour le M2. Si rien n'est possible, compenser par le lab, les projets logiciels et un stage ou une mission complémentaire en 2028 ; ne pas envisager de rupture de contrat sans avoir vérifié les règles (non vérifiées).</w:t>
+              <w:t xml:space="preserve">Arrêter un mémoire de M2 sur un sujet Red Team ou évasion avec ton école. Publier uniquement après accord écrit de l'employeur. Travailler exclusivement sur des environnements de lab autorisés, jamais sur le matériel ou le réseau de l'employeur. Si l'accord de publication est refusé, publier sous forme de rapports privés partagés en entretien.</w:t>
             </w:r>
           </w:p>
         </w:tc>

</xml_diff>

<commit_message>
Corrige les incohérences de dates et retire le mémoire du plan
Calendrier des formations rendu séquentiel (Maldev Academy, EDR, CRTL sans
chevauchement), labs bornés par l'expiration HTB, décisions D6 et D7 réordonnées,
plus aucune mention de mémoire de M2.

Co-Authored-By: Claude Sonnet 5.5 <noreply@anthropic.com>
Claude-Session: https://claude.ai/code/session_01PLMe4ge9F6B5wJA3dMBx9D
</commit_message>
<xml_diff>
--- a/05-Plan-Carriere/Plan-carriere-Red-Team-2026-2028.docx
+++ b/05-Plan-Carriere/Plan-carriere-Red-Team-2026-2028.docx
@@ -693,7 +693,7 @@
           <w:i w:val="false"/>
           <w:iCs w:val="false"/>
         </w:rPr>
-        <w:t xml:space="preserve">10. Comme l'alternance ne te donnera aucune expérience offensive, la preuve doit venir de ce que tu construis à côté : rapports de lab de qualité professionnelle, deux projets logiciels publics, le mémoire de M2 orienté Red Team et une publication autorisée par ton employeur.</w:t>
+        <w:t xml:space="preserve">10. Comme l'alternance ne te donnera aucune expérience offensive, la preuve doit venir de ce que tu construis à côté : rapports de lab de qualité professionnelle, deux projets logiciels publics, un projet scolaire de M2 orienté Red Team si ton école en impose un (à vérifier) et une publication autorisée par ton employeur.</w:t>
       </w:r>
     </w:p>
     <w:p>
@@ -1772,7 +1772,7 @@
           <w:i w:val="false"/>
           <w:iCs w:val="false"/>
         </w:rPr>
-        <w:t xml:space="preserve">BSCP (février 2027), en parallèle : C et Sektor7 Essentials à 2 h 30 par semaine.</w:t>
+        <w:t xml:space="preserve">BSCP (examen début février 2027). Piste de programmation en parallèle : C et Sektor7 Essentials à 2 h 30 par semaine d'octobre à mi-décembre 2026, pause jusqu'à l'examen, reprise à mi-février 2027.</w:t>
       </w:r>
     </w:p>
     <w:p>
@@ -1792,7 +1792,7 @@
           <w:i w:val="false"/>
           <w:iCs w:val="false"/>
         </w:rPr>
-        <w:t xml:space="preserve">CRTO (février à juin 2027), en parallèle : fin de Sektor7 et premier projet en C.</w:t>
+        <w:t xml:space="preserve">CRTO (mi-février à juin 2027), en parallèle : fin de Sektor7 en avril et premier projet en C.</w:t>
       </w:r>
     </w:p>
     <w:p>
@@ -1812,7 +1812,7 @@
           <w:i w:val="false"/>
           <w:iCs w:val="false"/>
         </w:rPr>
-        <w:t xml:space="preserve">Maldev Academy, modules non redondants (juin à novembre 2027).</w:t>
+        <w:t xml:space="preserve">Maldev Academy, modules non redondants (fin juin à septembre 2027).</w:t>
       </w:r>
     </w:p>
     <w:p>
@@ -1832,7 +1832,7 @@
           <w:i w:val="false"/>
           <w:iCs w:val="false"/>
         </w:rPr>
-        <w:t xml:space="preserve">EDR Internals &amp; Development (septembre 2027 à janvier 2028).</w:t>
+        <w:t xml:space="preserve">EDR Internals &amp; Development (octobre 2027 à janvier 2028).</w:t>
       </w:r>
     </w:p>
     <w:p>
@@ -1852,7 +1852,7 @@
           <w:i w:val="false"/>
           <w:iCs w:val="false"/>
         </w:rPr>
-        <w:t xml:space="preserve">CRTL (novembre 2027 à mars 2028).</w:t>
+        <w:t xml:space="preserve">CRTL (février à mai 2028, examen visé en avril ou mai pour avoir le résultat avant la fin de l'école).</w:t>
       </w:r>
     </w:p>
     <w:p>
@@ -1872,7 +1872,7 @@
           <w:i w:val="false"/>
           <w:iCs w:val="false"/>
         </w:rPr>
-        <w:t xml:space="preserve">CETP : uniquement si la décision de janvier 2028 le justifie.</w:t>
+        <w:t xml:space="preserve">CETP : uniquement si la décision D7 d'avril 2028 le justifie (lab en mai ou juin 2028).</w:t>
       </w:r>
     </w:p>
     <w:p>
@@ -2338,7 +2338,7 @@
                 <w:sz w:val="17"/>
                 <w:szCs w:val="17"/>
               </w:rPr>
-              <w:t xml:space="preserve">Entre janvier et mai 2028, si le budget le permet, avant les candidatures.</w:t>
+              <w:t xml:space="preserve">En mai ou juin 2028, après le CRTL, si le budget le permet et si la décision D7 (avril 2028) le valide.</w:t>
             </w:r>
           </w:p>
         </w:tc>
@@ -3329,7 +3329,7 @@
           <w:i w:val="false"/>
           <w:iCs w:val="false"/>
         </w:rPr>
-        <w:t xml:space="preserve"> (octobre 2026 à avril 2027, pause pendant la préparation finale de la BSCP). Il est court et structuré : il sert d'introduction et de test de ton niveau en C.</w:t>
+        <w:t xml:space="preserve"> (octobre à mi-décembre 2026, pause pendant la préparation de la BSCP, reprise à mi-février 2027 et fin en avril 2027). Il est court et structuré : il sert d'introduction et de test de ton niveau en C.</w:t>
       </w:r>
     </w:p>
     <w:p>
@@ -3369,7 +3369,7 @@
           <w:i w:val="false"/>
           <w:iCs w:val="false"/>
         </w:rPr>
-        <w:t xml:space="preserve"> (juin à novembre 2027). Avant de commencer, fais une table de correspondance entre les chapitres de Sektor7 et les modules de Maldev Academy, et marque comme déjà vus les modules d'injection, de stockage et d'obfuscation de charge que Sektor7 a couverts. Avis : cela devrait te faire gagner plusieurs dizaines d'heures.</w:t>
+        <w:t xml:space="preserve"> (fin juin à septembre 2027, par sélection de modules et non en intégralité). Avant de commencer, fais une table de correspondance entre les chapitres de Sektor7 et les modules de Maldev Academy, et marque comme déjà vus les modules d'injection, de stockage et d'obfuscation de charge que Sektor7 a couverts. Avis : cela devrait te faire gagner plusieurs dizaines d'heures.</w:t>
       </w:r>
     </w:p>
     <w:p>
@@ -3409,7 +3409,7 @@
           <w:i w:val="false"/>
           <w:iCs w:val="false"/>
         </w:rPr>
-        <w:t xml:space="preserve"> (septembre 2027 à janvier 2028). C'est le seul des trois qui adopte le point de vue du constructeur de défenses. Il comporte du développement de pilotes en mode noyau, ce qui exige une vraie aisance en C et en internes Windows, d'où sa place après Maldev Academy et après plusieurs mois de C.</w:t>
+        <w:t xml:space="preserve"> (octobre 2027 à janvier 2028). C'est le seul des trois qui adopte le point de vue du constructeur de défenses. Il comporte du développement de pilotes en mode noyau, ce qui exige une vraie aisance en C et en internes Windows, d'où sa place après Maldev Academy et après plusieurs mois de C.</w:t>
       </w:r>
     </w:p>
     <w:p>
@@ -3784,7 +3784,7 @@
           <w:i w:val="false"/>
           <w:iCs w:val="false"/>
         </w:rPr>
-        <w:t xml:space="preserve">Le plan est découpé en quatre semestres calés sur ton année scolaire, puis détaillé mois par mois pour les douze prochains mois (octobre 2026 à septembre 2027). Une règle s'applique partout : </w:t>
+        <w:t xml:space="preserve">Le plan est découpé en quatre semestres calés sur ton année scolaire, puis détaillé mois par mois pour les douze prochains mois (octobre 2026 à septembre 2027). Septembre 2026 est déjà écoulé : le plan démarre le 14 octobre 2026. Une règle s'applique partout : </w:t>
       </w:r>
       <w:r>
         <w:rPr>
@@ -3794,7 +3794,7 @@
           <w:i w:val="false"/>
           <w:iCs w:val="false"/>
         </w:rPr>
-        <w:t xml:space="preserve">au plus un cours, un lab et un projet logiciel ouverts en même temps</w:t>
+        <w:t xml:space="preserve">au plus un cours principal (BSCP, CRTO, Maldev Academy, EDR Internals, CRTL), un lab et un projet logiciel ouverts en même temps</w:t>
       </w:r>
       <w:r>
         <w:rPr>
@@ -3804,7 +3804,7 @@
           <w:i w:val="false"/>
           <w:iCs w:val="false"/>
         </w:rPr>
-        <w:t xml:space="preserve">.</w:t>
+        <w:t xml:space="preserve">, auxquels s'ajoute la piste de programmation (C et Sektor7 Essentials, puis le projet logiciel).</w:t>
       </w:r>
     </w:p>
     <w:tbl>
@@ -4047,7 +4047,7 @@
                 <w:sz w:val="17"/>
                 <w:szCs w:val="17"/>
               </w:rPr>
-              <w:t xml:space="preserve">S1 : septembre 2026 à janvier 2027 (M1)</w:t>
+              <w:t xml:space="preserve">S1 : octobre 2026 à janvier 2027 (M1)</w:t>
             </w:r>
           </w:p>
         </w:tc>
@@ -4115,7 +4115,7 @@
                 <w:sz w:val="17"/>
                 <w:szCs w:val="17"/>
               </w:rPr>
-              <w:t xml:space="preserve">BSCP (Web Security Academy). Sektor7 Essentials et C pur à 2 h 30 par semaine jusqu'à mi-décembre. Mini Pro Labs HTB orientés Active Directory (Push, Sidecar, puis un petit lab).</w:t>
+              <w:t xml:space="preserve">BSCP (Web Security Academy). Sektor7 Essentials et C pur à 2 h 30 par semaine jusqu'à mi-décembre, puis pause jusqu'à l'examen de début février. Mini Pro Labs HTB orientés Active Directory (Push, Sidecar, puis un petit lab).</w:t>
             </w:r>
           </w:p>
         </w:tc>
@@ -4183,7 +4183,7 @@
                 <w:sz w:val="17"/>
                 <w:szCs w:val="17"/>
               </w:rPr>
-              <w:t xml:space="preserve">Examen blanc BSCP réussi deux fois dans le temps imparti avant fin janvier. Exercices C : pointeurs, mémoire, structures et API Win32 de base maîtrisés.</w:t>
+              <w:t xml:space="preserve">Examen blanc BSCP réussi deux fois dans le temps imparti avant fin janvier (l'examen réel est début février). Exercices C : pointeurs, mémoire, structures et API Win32 de base maîtrisés.</w:t>
             </w:r>
           </w:p>
         </w:tc>
@@ -4294,7 +4294,7 @@
                 <w:sz w:val="17"/>
                 <w:szCs w:val="17"/>
               </w:rPr>
-              <w:t xml:space="preserve">CRTO (cours et examen). RastaLabs puis début de Shinra. Fin de Sektor7. Début de Maldev Academy en juin.</w:t>
+              <w:t xml:space="preserve">CRTO (cours et examen). RastaLabs puis début de Shinra. Fin de Sektor7. Début de Maldev Academy fin juin, après l'examen CRTO.</w:t>
             </w:r>
           </w:p>
         </w:tc>
@@ -4472,7 +4472,7 @@
                 <w:sz w:val="17"/>
                 <w:szCs w:val="17"/>
               </w:rPr>
-              <w:t xml:space="preserve">Maldev Academy (fin). EDR Internals &amp; Development. Shinra (fin) ; Ifrit seulement si l'abonnement HTB est renouvelé en octobre 2027. Début de CRTL en novembre. Reverse engineering avec OpenSecurityTraining2.</w:t>
+              <w:t xml:space="preserve">Maldev Academy (fin en septembre). EDR Internals &amp; Development (octobre à janvier). Shinra (fin en septembre, avant l'expiration de l'abonnement) ; Ifrit d'octobre à décembre seulement si l'abonnement HTB est renouvelé. Reverse engineering avec OpenSecurityTraining2. Candidatures à partir de janvier 2028.</w:t>
             </w:r>
           </w:p>
         </w:tc>
@@ -4651,7 +4651,7 @@
                 <w:sz w:val="17"/>
                 <w:szCs w:val="17"/>
               </w:rPr>
-              <w:t xml:space="preserve">CRTL (examen). Lab CETP ou banc d'essai Ludus avec Elastic Defend selon la décision de janvier 2028. CARTP en option. Mémoire de M2.</w:t>
+              <w:t xml:space="preserve">CRTL (cours et lab de février à avril, examen en avril ou mai). Lab CETP, CARTP ou banc d'essai Ludus avec Elastic Defend en mai ou juin selon la décision D7 d'avril 2028.</w:t>
             </w:r>
           </w:p>
         </w:tc>
@@ -4686,7 +4686,7 @@
                 <w:sz w:val="17"/>
                 <w:szCs w:val="17"/>
               </w:rPr>
-              <w:t xml:space="preserve">Certification CRTL. Portfolio finalisé (deux projets, quatre articles, une présentation courte). CV ciblé par type d'employeur.</w:t>
+              <w:t xml:space="preserve">Certification CRTL. Portfolio finalisé (deux projets, quatre articles, et une présentation courte si ton employeur l'autorise). CV ciblé par type d'employeur.</w:t>
             </w:r>
           </w:p>
         </w:tc>
@@ -4721,7 +4721,7 @@
                 <w:sz w:val="17"/>
                 <w:szCs w:val="17"/>
               </w:rPr>
-              <w:t xml:space="preserve">CRTL obtenu. Au moins une soumission de présentation (session courte de type « rump » ou conférence communautaire). Au moins trois entretiens techniques passés avant juin 2028.</w:t>
+              <w:t xml:space="preserve">CRTL obtenu. Si ton employeur l'autorise, au moins une soumission de présentation (session courte de type « rump » ou conférence communautaire). Au moins trois entretiens techniques passés avant juin 2028.</w:t>
             </w:r>
           </w:p>
         </w:tc>
@@ -5036,7 +5036,7 @@
                 <w:sz w:val="17"/>
                 <w:szCs w:val="17"/>
               </w:rPr>
-              <w:t xml:space="preserve">Mi-décembre 2026 à l'examen BSCP</w:t>
+              <w:t xml:space="preserve">Mi-décembre 2026 à début février 2027 (examen BSCP)</w:t>
             </w:r>
           </w:p>
         </w:tc>
@@ -5146,7 +5146,7 @@
                 <w:sz w:val="17"/>
                 <w:szCs w:val="17"/>
               </w:rPr>
-              <w:t xml:space="preserve">Février à juin 2027</w:t>
+              <w:t xml:space="preserve">Mi-février à juin 2027</w:t>
             </w:r>
           </w:p>
         </w:tc>
@@ -5255,7 +5255,7 @@
                 <w:sz w:val="17"/>
                 <w:szCs w:val="17"/>
               </w:rPr>
-              <w:t xml:space="preserve">Juin 2027 à janvier 2028</w:t>
+              <w:t xml:space="preserve">Juillet 2027 à janvier 2028</w:t>
             </w:r>
           </w:p>
         </w:tc>
@@ -5456,7 +5456,7 @@
           <w:sz w:val="19"/>
           <w:szCs w:val="19"/>
         </w:rPr>
-        <w:t xml:space="preserve">Avis : le M2 aura sa propre charge (mémoire, projets). Si l'école dépasse 1 h par semaine en moyenne, c'est le lab qui cède en premier, jamais le projet logiciel.</w:t>
+        <w:t xml:space="preserve">Avis : le M2 aura sa propre charge scolaire (cours et éventuels projets ; tu m'as indiqué qu'il n'y a ni mémoire ni soutenance). Si l'école dépasse 1 h par semaine en moyenne, c'est le lab qui cède en premier, jamais le projet logiciel.</w:t>
       </w:r>
     </w:p>
     <w:p>
@@ -6385,7 +6385,7 @@
                 <w:sz w:val="17"/>
                 <w:szCs w:val="17"/>
               </w:rPr>
-              <w:t xml:space="preserve">Deux examens blancs consécutifs réussis. Réflexion sur les preuves hors emploi et le sujet de mémoire de M2 préparée (voir D3).</w:t>
+              <w:t xml:space="preserve">Deux examens blancs consécutifs réussis. Réflexion sur les preuves hors emploi et sur ce que tu peux publier préparée (voir D3).</w:t>
             </w:r>
           </w:p>
         </w:tc>
@@ -6742,7 +6742,7 @@
                 <w:sz w:val="17"/>
                 <w:szCs w:val="17"/>
               </w:rPr>
-              <w:t xml:space="preserve">Environ la moitié du cours CRTO terminée. Décision D3 prise : règles de publication et sujet de mémoire de M2 arrêtés.</w:t>
+              <w:t xml:space="preserve">Environ la moitié du cours CRTO terminée. Décision D3 prise : règles de publication et projets de preuve hors emploi arrêtés.</w:t>
             </w:r>
           </w:p>
         </w:tc>
@@ -7207,7 +7207,7 @@
                 <w:sz w:val="17"/>
                 <w:szCs w:val="17"/>
               </w:rPr>
-              <w:t xml:space="preserve">Examen CRTO. Maldev Academy (début, avec la table de correspondance Sektor7). Lab : début de Shinra (EDR et SOC simulés).</w:t>
+              <w:t xml:space="preserve">Examen CRTO. Maldev Academy (début fin juin, avec la table de correspondance Sektor7). Lab : début de Shinra (EDR et SOC simulés).</w:t>
             </w:r>
           </w:p>
         </w:tc>
@@ -7743,7 +7743,7 @@
                 <w:sz w:val="17"/>
                 <w:szCs w:val="17"/>
               </w:rPr>
-              <w:t xml:space="preserve">Fin de Maldev Academy ou poursuite selon l'avancement. Début d'EDR Internals. Lab : fin de Shinra avant l'expiration de l'abonnement en octobre ; ensuite Ifrit si D5 a décidé le renouvellement, sinon banc d'essai Ludus.</w:t>
+              <w:t xml:space="preserve">Fin de Maldev Academy. Le cours EDR Internals ne démarre qu'en octobre. Lab : fin de Shinra avant l'expiration de l'abonnement en octobre ; Ifrit ensuite seulement si D5 (15 septembre) a décidé le renouvellement, sinon banc d'essai Ludus.</w:t>
             </w:r>
           </w:p>
         </w:tc>
@@ -26158,7 +26158,7 @@
                 <w:sz w:val="17"/>
                 <w:szCs w:val="17"/>
               </w:rPr>
-              <w:t xml:space="preserve">Juin à mi-octobre 2027</w:t>
+              <w:t xml:space="preserve">Juin à septembre 2027</w:t>
             </w:r>
           </w:p>
         </w:tc>
@@ -26226,7 +26226,7 @@
                 <w:sz w:val="17"/>
                 <w:szCs w:val="17"/>
               </w:rPr>
-              <w:t xml:space="preserve">70 à 100</w:t>
+              <w:t xml:space="preserve">70 à 90</w:t>
             </w:r>
           </w:p>
         </w:tc>
@@ -26260,7 +26260,7 @@
                 <w:sz w:val="17"/>
                 <w:szCs w:val="17"/>
               </w:rPr>
-              <w:t xml:space="preserve">Après le CRTO : c'est volontaire. À terminer avant l'expiration de l'abonnement.</w:t>
+              <w:t xml:space="preserve">Après le CRTO : c'est volontaire. À terminer avant l'expiration de l'abonnement en octobre 2027 (date exacte à vérifier dans ton compte).</w:t>
             </w:r>
           </w:p>
         </w:tc>
@@ -26446,7 +26446,7 @@
                 <w:sz w:val="17"/>
                 <w:szCs w:val="17"/>
               </w:rPr>
-              <w:t xml:space="preserve">Janvier à mars 2028</w:t>
+              <w:t xml:space="preserve">Janvier 2028</w:t>
             </w:r>
           </w:p>
         </w:tc>
@@ -26480,7 +26480,7 @@
                 <w:sz w:val="17"/>
                 <w:szCs w:val="17"/>
               </w:rPr>
-              <w:t xml:space="preserve">Lab Red Team Ops II (CRTL)</w:t>
+              <w:t xml:space="preserve">Fin d'Ifrit ou banc Ludus</w:t>
             </w:r>
           </w:p>
         </w:tc>
@@ -26514,7 +26514,7 @@
                 <w:sz w:val="17"/>
                 <w:szCs w:val="17"/>
               </w:rPr>
-              <w:t xml:space="preserve">60 à 80</w:t>
+              <w:t xml:space="preserve">10 à 20</w:t>
             </w:r>
           </w:p>
         </w:tc>
@@ -26548,7 +26548,7 @@
                 <w:sz w:val="17"/>
                 <w:szCs w:val="17"/>
               </w:rPr>
-              <w:t xml:space="preserve">Le lab du cours occupe le créneau lab.</w:t>
+              <w:t xml:space="preserve">Créneau lab pendant la fin du cours EDR, avant le lab du CRTL.</w:t>
             </w:r>
           </w:p>
         </w:tc>
@@ -26589,7 +26589,7 @@
                 <w:sz w:val="17"/>
                 <w:szCs w:val="17"/>
               </w:rPr>
-              <w:t xml:space="preserve">Avril à mai 2028</w:t>
+              <w:t xml:space="preserve">Février à mai 2028</w:t>
             </w:r>
           </w:p>
         </w:tc>
@@ -26624,7 +26624,7 @@
                 <w:sz w:val="17"/>
                 <w:szCs w:val="17"/>
               </w:rPr>
-              <w:t xml:space="preserve">Lab CETP (60 jours) ou Cybernetics</w:t>
+              <w:t xml:space="preserve">Lab Red Team Ops II (CRTL)</w:t>
             </w:r>
           </w:p>
         </w:tc>
@@ -26694,7 +26694,149 @@
                 <w:sz w:val="17"/>
                 <w:szCs w:val="17"/>
               </w:rPr>
-              <w:t xml:space="preserve">Selon la décision D6 ; aucun si la recherche d'emploi l'exige.</w:t>
+              <w:t xml:space="preserve">Le lab du cours occupe le créneau lab ; examen visé en avril ou mai.</w:t>
+            </w:r>
+          </w:p>
+        </w:tc>
+      </w:tr>
+      <w:tr>
+        <w:trPr>
+          <w:cantSplit/>
+          <w:tblHeader w:val="false"/>
+        </w:trPr>
+        <w:tc>
+          <w:tcPr>
+            <w:tcW w:type="dxa" w:w="3400"/>
+            <w:tcBorders>
+              <w:top w:val="single" w:color="B7C3D0" w:sz="4"/>
+              <w:left w:val="single" w:color="B7C3D0" w:sz="4"/>
+              <w:bottom w:val="single" w:color="B7C3D0" w:sz="4"/>
+              <w:right w:val="single" w:color="B7C3D0" w:sz="4"/>
+            </w:tcBorders>
+            <w:tcMar>
+              <w:top w:type="dxa" w:w="60"/>
+              <w:left w:type="dxa" w:w="90"/>
+              <w:bottom w:type="dxa" w:w="60"/>
+              <w:right w:type="dxa" w:w="90"/>
+            </w:tcMar>
+          </w:tcPr>
+          <w:p>
+            <w:pPr>
+              <w:spacing w:after="40"/>
+            </w:pPr>
+            <w:r>
+              <w:rPr>
+                <w:rFonts w:ascii="Calibri" w:cs="Calibri" w:eastAsia="Calibri" w:hAnsi="Calibri"/>
+                <w:b w:val="false"/>
+                <w:bCs w:val="false"/>
+                <w:i w:val="false"/>
+                <w:iCs w:val="false"/>
+                <w:sz w:val="17"/>
+                <w:szCs w:val="17"/>
+              </w:rPr>
+              <w:t xml:space="preserve">Mai à juin 2028</w:t>
+            </w:r>
+          </w:p>
+        </w:tc>
+        <w:tc>
+          <w:tcPr>
+            <w:tcW w:type="dxa" w:w="3200"/>
+            <w:tcBorders>
+              <w:top w:val="single" w:color="B7C3D0" w:sz="4"/>
+              <w:left w:val="single" w:color="B7C3D0" w:sz="4"/>
+              <w:bottom w:val="single" w:color="B7C3D0" w:sz="4"/>
+              <w:right w:val="single" w:color="B7C3D0" w:sz="4"/>
+            </w:tcBorders>
+            <w:tcMar>
+              <w:top w:type="dxa" w:w="60"/>
+              <w:left w:type="dxa" w:w="90"/>
+              <w:bottom w:type="dxa" w:w="60"/>
+              <w:right w:type="dxa" w:w="90"/>
+            </w:tcMar>
+          </w:tcPr>
+          <w:p>
+            <w:pPr>
+              <w:spacing w:after="40"/>
+            </w:pPr>
+            <w:r>
+              <w:rPr>
+                <w:rFonts w:ascii="Calibri" w:cs="Calibri" w:eastAsia="Calibri" w:hAnsi="Calibri"/>
+                <w:b w:val="false"/>
+                <w:bCs w:val="false"/>
+                <w:i w:val="false"/>
+                <w:iCs w:val="false"/>
+                <w:sz w:val="17"/>
+                <w:szCs w:val="17"/>
+              </w:rPr>
+              <w:t xml:space="preserve">Lab CETP (30 ou 60 jours), CARTP ou Cybernetics</w:t>
+            </w:r>
+          </w:p>
+        </w:tc>
+        <w:tc>
+          <w:tcPr>
+            <w:tcW w:type="dxa" w:w="2200"/>
+            <w:tcBorders>
+              <w:top w:val="single" w:color="B7C3D0" w:sz="4"/>
+              <w:left w:val="single" w:color="B7C3D0" w:sz="4"/>
+              <w:bottom w:val="single" w:color="B7C3D0" w:sz="4"/>
+              <w:right w:val="single" w:color="B7C3D0" w:sz="4"/>
+            </w:tcBorders>
+            <w:tcMar>
+              <w:top w:type="dxa" w:w="60"/>
+              <w:left w:type="dxa" w:w="90"/>
+              <w:bottom w:type="dxa" w:w="60"/>
+              <w:right w:type="dxa" w:w="90"/>
+            </w:tcMar>
+          </w:tcPr>
+          <w:p>
+            <w:pPr>
+              <w:spacing w:after="40"/>
+            </w:pPr>
+            <w:r>
+              <w:rPr>
+                <w:rFonts w:ascii="Calibri" w:cs="Calibri" w:eastAsia="Calibri" w:hAnsi="Calibri"/>
+                <w:b w:val="false"/>
+                <w:bCs w:val="false"/>
+                <w:i w:val="false"/>
+                <w:iCs w:val="false"/>
+                <w:sz w:val="17"/>
+                <w:szCs w:val="17"/>
+              </w:rPr>
+              <w:t xml:space="preserve">40 à 80</w:t>
+            </w:r>
+          </w:p>
+        </w:tc>
+        <w:tc>
+          <w:tcPr>
+            <w:tcW w:type="dxa" w:w="5770"/>
+            <w:tcBorders>
+              <w:top w:val="single" w:color="B7C3D0" w:sz="4"/>
+              <w:left w:val="single" w:color="B7C3D0" w:sz="4"/>
+              <w:bottom w:val="single" w:color="B7C3D0" w:sz="4"/>
+              <w:right w:val="single" w:color="B7C3D0" w:sz="4"/>
+            </w:tcBorders>
+            <w:tcMar>
+              <w:top w:type="dxa" w:w="60"/>
+              <w:left w:type="dxa" w:w="90"/>
+              <w:bottom w:type="dxa" w:w="60"/>
+              <w:right w:type="dxa" w:w="90"/>
+            </w:tcMar>
+          </w:tcPr>
+          <w:p>
+            <w:pPr>
+              <w:spacing w:after="40"/>
+            </w:pPr>
+            <w:r>
+              <w:rPr>
+                <w:rFonts w:ascii="Calibri" w:cs="Calibri" w:eastAsia="Calibri" w:hAnsi="Calibri"/>
+                <w:b w:val="false"/>
+                <w:bCs w:val="false"/>
+                <w:i w:val="false"/>
+                <w:iCs w:val="false"/>
+                <w:sz w:val="17"/>
+                <w:szCs w:val="17"/>
+              </w:rPr>
+              <w:t xml:space="preserve">Selon la décision D7 (avril 2028) ; Cybernetics seulement si l'abonnement a été renouvelé ; aucun si la recherche d'emploi l'exige.</w:t>
             </w:r>
           </w:p>
         </w:tc>
@@ -27246,7 +27388,7 @@
                 <w:sz w:val="17"/>
                 <w:szCs w:val="17"/>
               </w:rPr>
-              <w:t xml:space="preserve">2 h 30 jusqu'en février 2027, puis 3 à 4 h</w:t>
+              <w:t xml:space="preserve">2 h 30 jusqu'à mi-décembre 2026, pause pendant la préparation de la BSCP, reprise à 4 h à mi-février 2027</w:t>
             </w:r>
           </w:p>
         </w:tc>
@@ -28898,7 +29040,7 @@
           <w:i w:val="false"/>
           <w:iCs w:val="false"/>
         </w:rPr>
-        <w:t xml:space="preserve"> : puisque l'alternance n'apporte aucune preuve offensive, ces preuves doivent venir de toi : rapports de lab au format client (privés), deux projets logiciels publics, un mémoire de M2 sur un sujet offensif ou d'évasion, et si ton employeur l'autorise, un article ou une présentation. Tes atouts réels sont ailleurs : trois ans d'infrastructure en environnement sensible et la compréhension de la défense (banc Ludus avec EDR). Pitch recommandé : un opérateur qui sait comment un parc est administré et surveillé. C'est le point de décision D3.</w:t>
+        <w:t xml:space="preserve"> : puisque l'alternance n'apporte aucune preuve offensive, ces preuves doivent venir de toi : rapports de lab au format client (privés), deux projets logiciels publics, un projet scolaire de M2 orienté offensif ou évasion si ton école en impose un (à vérifier), et si ton employeur l'autorise, un article ou une présentation. Tes atouts réels sont ailleurs : trois ans d'infrastructure en environnement sensible et la compréhension de la défense (banc Ludus avec EDR). Pitch recommandé : un opérateur qui sait comment un parc est administré et surveillé. C'est le point de décision D3.</w:t>
       </w:r>
     </w:p>
     <w:p>
@@ -29366,7 +29508,7 @@
                 <w:sz w:val="17"/>
                 <w:szCs w:val="17"/>
               </w:rPr>
-              <w:t xml:space="preserve">Fin novembre : décaler l'examen d'un mois au plus. En cas d'échec en février : une seule reprise sous six à huit semaines (une nouvelle tentative doit être rachetée selon la FAQ PortSwigger ; prix actuel non confirmé, 99 $ selon une source tierce), en démarrant le CRTO à 2 h par semaine. Pas de troisième tentative avant l'été 2027 : la BSCP n'est pas critique pour ton métier cible.</w:t>
+              <w:t xml:space="preserve">Fin novembre : décaler l'examen d'un mois au plus. En cas d'échec en février : une seule reprise sous six à huit semaines (donc en mars ou avril 2027) (une nouvelle tentative doit être rachetée selon la FAQ PortSwigger ; prix actuel non confirmé, 99 $ selon une source tierce), en démarrant le CRTO à 2 h par semaine. Pas de troisième tentative avant l'été 2027 : la BSCP n'est pas critique pour ton métier cible.</w:t>
             </w:r>
           </w:p>
         </w:tc>
@@ -30139,7 +30281,7 @@
                 <w:sz w:val="17"/>
                 <w:szCs w:val="17"/>
               </w:rPr>
-              <w:t xml:space="preserve">Ce que ton contrat et le statut de l'agent public autorisent comme publication et activité extérieure (à vérifier auprès de ton tuteur et de ton école, non vérifié de mon côté) ; sujet de mémoire de M2 disponible ; avancement de RastaLabs et du projet logiciel n° 1.</w:t>
+              <w:t xml:space="preserve">Ce que ton contrat et le statut de l'agent public autorisent comme publication et activité extérieure (à vérifier auprès de ton tuteur et de ton école, non vérifié de mon côté) ; existence éventuelle d'un projet scolaire de M2 à orienter vers le Red Team ; avancement de RastaLabs et du projet logiciel n° 1.</w:t>
             </w:r>
           </w:p>
         </w:tc>
@@ -30173,7 +30315,7 @@
                 <w:sz w:val="17"/>
                 <w:szCs w:val="17"/>
               </w:rPr>
-              <w:t xml:space="preserve">Arrêter un mémoire de M2 sur un sujet Red Team ou évasion avec ton école. Publier uniquement après accord écrit de l'employeur. Travailler exclusivement sur des environnements de lab autorisés, jamais sur le matériel ou le réseau de l'employeur. Si l'accord de publication est refusé, publier sous forme de rapports privés partagés en entretien.</w:t>
+              <w:t xml:space="preserve">Si ton école impose un projet en M2, l'orienter vers un sujet Red Team ou évasion. Publier uniquement après accord écrit de l'employeur. Travailler exclusivement sur des environnements de lab autorisés, jamais sur le matériel ou le réseau de l'employeur. Si l'accord de publication est refusé, publier sous forme de rapports privés partagés en entretien.</w:t>
             </w:r>
           </w:p>
         </w:tc>
@@ -30606,7 +30748,7 @@
                 <w:sz w:val="17"/>
                 <w:szCs w:val="17"/>
               </w:rPr>
-              <w:t xml:space="preserve">Janvier 2028</w:t>
+              <w:t xml:space="preserve">Mars 2028</w:t>
             </w:r>
           </w:p>
         </w:tc>
@@ -30641,7 +30783,7 @@
                 <w:sz w:val="17"/>
                 <w:szCs w:val="17"/>
               </w:rPr>
-              <w:t xml:space="preserve">Acheter le lab CETP, le lab CARTP, ou rien ?</w:t>
+              <w:t xml:space="preserve">Type d'employeur visé en priorité</w:t>
             </w:r>
           </w:p>
         </w:tc>
@@ -30676,7 +30818,7 @@
                 <w:sz w:val="17"/>
                 <w:szCs w:val="17"/>
               </w:rPr>
-              <w:t xml:space="preserve">Analyse de 30 offres ; budget ; charge du M2.</w:t>
+              <w:t xml:space="preserve">Réponses aux premières candidatures (lancées en janvier 2028) ; préférence entre mission variée (cabinet) et profondeur (équipe interne).</w:t>
             </w:r>
           </w:p>
         </w:tc>
@@ -30711,7 +30853,7 @@
                 <w:sz w:val="17"/>
                 <w:szCs w:val="17"/>
               </w:rPr>
-              <w:t xml:space="preserve">CARTP si le cloud apparaît dans plus d'un tiers des offres ; CETP en 60 jours seulement si CRTL est obtenu et que le budget le permet.</w:t>
+              <w:t xml:space="preserve">Candidater en parallèle aux cabinets PASSI et aux équipes internes bancaires.</w:t>
             </w:r>
           </w:p>
         </w:tc>
@@ -30785,7 +30927,7 @@
                 <w:sz w:val="17"/>
                 <w:szCs w:val="17"/>
               </w:rPr>
-              <w:t xml:space="preserve">Mars 2028</w:t>
+              <w:t xml:space="preserve">Avril 2028</w:t>
             </w:r>
           </w:p>
         </w:tc>
@@ -30819,7 +30961,7 @@
                 <w:sz w:val="17"/>
                 <w:szCs w:val="17"/>
               </w:rPr>
-              <w:t xml:space="preserve">Type d'employeur visé en priorité</w:t>
+              <w:t xml:space="preserve">Acheter le lab CETP, le lab CARTP, ou rien ?</w:t>
             </w:r>
           </w:p>
         </w:tc>
@@ -30853,7 +30995,7 @@
                 <w:sz w:val="17"/>
                 <w:szCs w:val="17"/>
               </w:rPr>
-              <w:t xml:space="preserve">Réponses aux premières candidatures ; préférence entre mission variée (cabinet) et profondeur (équipe interne).</w:t>
+              <w:t xml:space="preserve">Analyse de 30 offres ; budget ; avancement du CRTL ; recherche d'emploi en cours.</w:t>
             </w:r>
           </w:p>
         </w:tc>
@@ -30887,7 +31029,7 @@
                 <w:sz w:val="17"/>
                 <w:szCs w:val="17"/>
               </w:rPr>
-              <w:t xml:space="preserve">Candidater en parallèle aux cabinets PASSI et aux équipes internes bancaires.</w:t>
+              <w:t xml:space="preserve">CARTP si le cloud apparaît dans plus d'un tiers des offres ; CETP en 60 jours seulement si le CRTL est obtenu ou l'examen passé et que le budget le permet.</w:t>
             </w:r>
           </w:p>
         </w:tc>
@@ -31221,7 +31363,7 @@
                 <w:sz w:val="17"/>
                 <w:szCs w:val="17"/>
               </w:rPr>
-              <w:t xml:space="preserve">Novembre 2027</w:t>
+              <w:t xml:space="preserve">Janvier 2028</w:t>
             </w:r>
           </w:p>
         </w:tc>
@@ -31367,7 +31509,7 @@
                 <w:sz w:val="17"/>
                 <w:szCs w:val="17"/>
               </w:rPr>
-              <w:t xml:space="preserve">Novembre 2027</w:t>
+              <w:t xml:space="preserve">Février 2028 (début du lab)</w:t>
             </w:r>
           </w:p>
         </w:tc>
@@ -31509,7 +31651,7 @@
                 <w:sz w:val="17"/>
                 <w:szCs w:val="17"/>
               </w:rPr>
-              <w:t xml:space="preserve">Avril 2028 si D6 le valide</w:t>
+              <w:t xml:space="preserve">Mai 2028 si D7 le valide</w:t>
             </w:r>
           </w:p>
         </w:tc>
@@ -31797,7 +31939,7 @@
                 <w:sz w:val="17"/>
                 <w:szCs w:val="17"/>
               </w:rPr>
-              <w:t xml:space="preserve">Début 2028 si D6 le valide</w:t>
+              <w:t xml:space="preserve">Mai ou juin 2028 si D7 le valide</w:t>
             </w:r>
           </w:p>
         </w:tc>
@@ -31943,7 +32085,7 @@
                 <w:sz w:val="17"/>
                 <w:szCs w:val="17"/>
               </w:rPr>
-              <w:t xml:space="preserve">Mars 2027</w:t>
+              <w:t xml:space="preserve">Mars ou avril 2027</w:t>
             </w:r>
           </w:p>
         </w:tc>

</xml_diff>

<commit_message>
Ajoute figures et tableau de couverture, corrige les incohérences
Quatre figures (calendrier, semaine type, réalisme et durée des labs, capacité de
lab), tableau de couverture des formations, calendrier de labs aligné sur la
capacité d'heures et corrections de cohérence relevées à la relecture.

Co-Authored-By: Claude Sonnet 5.5 <noreply@anthropic.com>
Claude-Session: https://claude.ai/code/session_01PLMe4ge9F6B5wJA3dMBx9D
</commit_message>
<xml_diff>
--- a/05-Plan-Carriere/Plan-carriere-Red-Team-2026-2028.docx
+++ b/05-Plan-Carriere/Plan-carriere-Red-Team-2026-2028.docx
@@ -260,7 +260,7 @@
           <w:i w:val="false"/>
           <w:iCs w:val="false"/>
         </w:rPr>
-        <w:t xml:space="preserve"> Le livrable est un document Word au format A4. Une version PDF générée à partir du même fichier est fournie à côté pour la lecture.</w:t>
+        <w:t xml:space="preserve"> Le livrable est un document Word au format A4. Une version PDF générée à partir du même fichier est fournie à côté pour la lecture. Le document contient quatre figures (calendrier de référence, semaine type, réalisme et durée des labs, capacité de lab) et un tableau de couverture des formations.</w:t>
       </w:r>
     </w:p>
     <w:p>
@@ -454,7 +454,7 @@
           <w:i w:val="false"/>
           <w:iCs w:val="false"/>
         </w:rPr>
-        <w:t xml:space="preserve"> le nombre d'heures et la date d'expiration du lab CRTO (tu as confirmé qu'il est inclus), le prix de renouvellement de ton abonnement HackTheBox historique face à HTB PRO, le détail des prérequis du cours EDR de Maldev Academy (je n'ai pu lire son programme que par des extraits de recherche), et ce que ton ministère peut offrir comme missions offensives. </w:t>
+        <w:t xml:space="preserve"> le nombre d'heures et la date d'expiration du lab CRTO (tu as confirmé qu'il est inclus), le prix de renouvellement de ton abonnement HackTheBox historique face à HTB PRO, le détail des prérequis du cours EDR de Maldev Academy (je n'ai pu lire son programme que par des extraits de recherche), et ce que ton contrat d'apprentissage autorise en matière de publication et d'activité extérieure. </w:t>
       </w:r>
       <w:r>
         <w:rPr>
@@ -474,7 +474,7 @@
           <w:i w:val="false"/>
           <w:iCs w:val="false"/>
         </w:rPr>
-        <w:t xml:space="preserve"> abonnement HackTheBox actif jusqu'en octobre 2027 avec accès à Shinra, Ifrit et aux autres Pro Labs et Mini Pro Labs ; lab CRTO inclus dans ton achat ; cours EDR Internals &amp; Development édité par Maldev Academy ; contrat d'apprentissage de deux ans au ministère.</w:t>
+        <w:t xml:space="preserve"> abonnement HackTheBox actif jusqu'en octobre 2027 avec accès à Shinra, Ifrit et aux autres Pro Labs et Mini Pro Labs ; lab CRTO inclus dans ton achat ; cours EDR Internals &amp; Development édité par Maldev Academy ; contrat d'apprentissage de deux ans au ministère, sans aucune activité offensive chez ton employeur ; pas de mémoire ni de soutenance en M2.</w:t>
       </w:r>
     </w:p>
     <w:p>
@@ -625,7 +625,7 @@
           <w:i w:val="false"/>
           <w:iCs w:val="false"/>
         </w:rPr>
-        <w:t xml:space="preserve">6. À 5 h par semaine, ton abonnement Pro Labs permet environ deux grands labs et quelques Mini Pro Labs en un an : RastaLabs puis Shinra sont les priorités ; Dante, Genesis, Zephyr et Alchemy sont à éviter.</w:t>
+        <w:t xml:space="preserve">6. À 5 h par semaine, ton abonnement Pro Labs permet environ deux grands labs, en version plafonnée, et quelques labs courts en un an : RastaLabs puis Shinra sont les priorités ; Dante, Genesis, Zephyr et Alchemy sont à éviter.</w:t>
       </w:r>
     </w:p>
     <w:p>
@@ -695,6 +695,132 @@
         </w:rPr>
         <w:t xml:space="preserve">10. Comme l'alternance ne te donnera aucune expérience offensive, la preuve doit venir de ce que tu construis à côté : rapports de lab de qualité professionnelle, deux projets logiciels publics, un projet scolaire de M2 orienté Red Team si ton école en impose un (à vérifier) et une publication autorisée par ton employeur.</w:t>
       </w:r>
+    </w:p>
+    <w:p>
+      <w:pPr>
+        <w:sectPr>
+          <w:footerReference w:type="default" r:id="rId7"/>
+          <w:pgSz w:w="11906" w:h="16838" w:orient="portrait"/>
+          <w:pgMar w:top="1134" w:right="1134" w:bottom="1134" w:left="1134" w:header="708" w:footer="708" w:gutter="0"/>
+          <w:pgNumType/>
+          <w:docGrid w:linePitch="360"/>
+        </w:sectPr>
+      </w:pPr>
+    </w:p>
+    <w:p>
+      <w:pPr>
+        <w:pStyle w:val="Heading1"/>
+        <w:pageBreakBefore/>
+      </w:pPr>
+      <w:r>
+        <w:rPr>
+          <w:rFonts w:ascii="Calibri" w:cs="Calibri" w:eastAsia="Calibri" w:hAnsi="Calibri"/>
+        </w:rPr>
+        <w:t xml:space="preserve">Calendrier de référence</w:t>
+      </w:r>
+    </w:p>
+    <w:p>
+      <w:pPr>
+        <w:keepNext/>
+        <w:spacing w:after="60" w:before="60"/>
+        <w:jc w:val="center"/>
+      </w:pPr>
+      <w:r>
+        <w:drawing>
+          <wp:inline distT="0" distB="0" distL="0" distR="0">
+            <wp:extent cx="8382000" cy="4895850"/>
+            <wp:effectExtent t="0" r="0" b="0" l="0"/>
+            <wp:docPr id="1" name="fig1_calendrier.png" descr="Diagramme de Gantt d'octobre 2026 à l'été 2028 : formations principales (BSCP, CRTO, Maldev Academy, EDR Internals, CRTL), programmation, projets, reverse engineering, labs un à la fois, abonnement HackTheBox, examens, sept points de décision D1 à D7 et la période de candidatures." title="Figure 1 : calendrier de référence"/>
+            <wp:cNvGraphicFramePr>
+              <a:graphicFrameLocks xmlns:a="http://schemas.openxmlformats.org/drawingml/2006/main" noChangeAspect="1"/>
+            </wp:cNvGraphicFramePr>
+            <a:graphic xmlns:a="http://schemas.openxmlformats.org/drawingml/2006/main">
+              <a:graphicData uri="http://schemas.openxmlformats.org/drawingml/2006/picture">
+                <pic:pic xmlns:pic="http://schemas.openxmlformats.org/drawingml/2006/picture">
+                  <pic:nvPicPr>
+                    <pic:cNvPr id="0" name="" descr=""/>
+                    <pic:cNvPicPr>
+                      <a:picLocks noChangeAspect="1" noChangeArrowheads="1"/>
+                    </pic:cNvPicPr>
+                  </pic:nvPicPr>
+                  <pic:blipFill>
+                    <a:blip r:embed="rId15" cstate="none"/>
+                    <a:srcRect/>
+                    <a:stretch>
+                      <a:fillRect/>
+                    </a:stretch>
+                  </pic:blipFill>
+                  <pic:spPr bwMode="auto">
+                    <a:xfrm>
+                      <a:off x="0" y="0"/>
+                      <a:ext cx="8382000" cy="4895850"/>
+                    </a:xfrm>
+                    <a:prstGeom prst="rect">
+                      <a:avLst/>
+                    </a:prstGeom>
+                  </pic:spPr>
+                </pic:pic>
+              </a:graphicData>
+            </a:graphic>
+          </wp:inline>
+        </w:drawing>
+      </w:r>
+    </w:p>
+    <w:p>
+      <w:pPr>
+        <w:spacing w:after="160"/>
+        <w:jc w:val="left"/>
+      </w:pPr>
+      <w:r>
+        <w:rPr>
+          <w:rFonts w:ascii="Calibri" w:cs="Calibri" w:eastAsia="Calibri" w:hAnsi="Calibri"/>
+          <w:b w:val="false"/>
+          <w:bCs w:val="false"/>
+          <w:i/>
+          <w:iCs/>
+          <w:color w:val="444444"/>
+          <w:sz w:val="18"/>
+          <w:szCs w:val="18"/>
+        </w:rPr>
+        <w:t xml:space="preserve"/>
+      </w:r>
+      <w:r>
+        <w:rPr>
+          <w:rFonts w:ascii="Calibri" w:cs="Calibri" w:eastAsia="Calibri" w:hAnsi="Calibri"/>
+          <w:b/>
+          <w:bCs/>
+          <w:i/>
+          <w:iCs/>
+          <w:color w:val="444444"/>
+          <w:sz w:val="18"/>
+          <w:szCs w:val="18"/>
+        </w:rPr>
+        <w:t xml:space="preserve">Figure 1.</w:t>
+      </w:r>
+      <w:r>
+        <w:rPr>
+          <w:rFonts w:ascii="Calibri" w:cs="Calibri" w:eastAsia="Calibri" w:hAnsi="Calibri"/>
+          <w:b w:val="false"/>
+          <w:bCs w:val="false"/>
+          <w:i/>
+          <w:iCs/>
+          <w:color w:val="444444"/>
+          <w:sz w:val="18"/>
+          <w:szCs w:val="18"/>
+        </w:rPr>
+        <w:t xml:space="preserve"> Calendrier de référence d'octobre 2026 à l'été 2028 (avis). Les éléments hachurés sont conditionnels ou optionnels. Décisions : D1, maintenir l'examen BSCP (fin novembre 2026) ; D2, suite après la BSCP (mi-février 2027) ; D3, preuves hors emploi et publication (mars 2027) ; D4, CRTL ou CETP (juin 2027) ; D5, renouveler HackTheBox (15 septembre 2027) ; D6, type d'employeur visé (mars 2028) ; D7, lab complémentaire (avril 2028). La date d'expiration exacte de l'abonnement HackTheBox reste à vérifier.</w:t>
+      </w:r>
+    </w:p>
+    <w:p>
+      <w:pPr>
+        <w:sectPr>
+          <w:footerReference w:type="default" r:id="rId8"/>
+          <w:pgSz w:w="16838" w:h="11906" w:orient="landscape"/>
+          <w:pgMar w:top="1134" w:right="1134" w:bottom="1134" w:left="1134" w:header="708" w:footer="708" w:gutter="0"/>
+          <w:pgNumType/>
+          <w:docGrid w:linePitch="360"/>
+        </w:sectPr>
+      </w:pPr>
     </w:p>
     <w:p>
       <w:pPr>
@@ -1098,7 +1224,7 @@
           <w:i w:val="false"/>
           <w:iCs w:val="false"/>
         </w:rPr>
-        <w:t xml:space="preserve"> : six activités par semaine, dont trois à 1 h 30 ou moins. À mon avis, une activité à 1 h par semaine ne progresse presque pas, parce que le temps de reprise mange une bonne partie de la séance.</w:t>
+        <w:t xml:space="preserve"> : six activités par semaine, dont quatre à 1 h 30 ou moins. À mon avis, une activité à 1 h par semaine ne progresse presque pas, parce que le temps de reprise mange une bonne partie de la séance.</w:t>
       </w:r>
     </w:p>
     <w:p>
@@ -3446,7 +3572,27 @@
           <w:i w:val="false"/>
           <w:iCs w:val="false"/>
         </w:rPr>
-        <w:t xml:space="preserve"> fort entre Sektor7 et le début de Maldev Academy ; probablement faible sur le fond entre Maldev Academy et EDR Internals (l'un construit des outils offensifs, l'autre un agent de détection), mais les deux cours viennent du même éditeur et peuvent partager des bases en C et en API Windows : prérequis du cours EDR non vérifiés (avis) ; nul entre ces cours et le CRTO (opération avec un C2 existant).</w:t>
+        <w:t xml:space="preserve"> fort entre Sektor7 et le début de Maldev Academy ; probablement faible sur le fond entre Maldev Academy et EDR Internals (l'un construit des outils offensifs, l'autre un agent de détection), mais les deux cours viennent du même éditeur et peuvent partager des bases en C et en API Windows : prérequis du cours EDR non vérifiés (avis) ; nul entre ces cours et le CRTO (opération avec un C2 existant). </w:t>
+      </w:r>
+      <w:r>
+        <w:rPr>
+          <w:rFonts w:ascii="Calibri" w:cs="Calibri" w:eastAsia="Calibri" w:hAnsi="Calibri"/>
+          <w:b/>
+          <w:bCs/>
+          <w:i w:val="false"/>
+          <w:iCs w:val="false"/>
+        </w:rPr>
+        <w:t xml:space="preserve">Volume disponible (avis) :</w:t>
+      </w:r>
+      <w:r>
+        <w:rPr>
+          <w:rFonts w:ascii="Calibri" w:cs="Calibri" w:eastAsia="Calibri" w:hAnsi="Calibri"/>
+          <w:b w:val="false"/>
+          <w:bCs w:val="false"/>
+          <w:i w:val="false"/>
+          <w:iCs w:val="false"/>
+        </w:rPr>
+        <w:t xml:space="preserve"> à 4 h par semaine, la fenêtre de Maldev Academy (fin juin à septembre) représente environ 60 h et celle du cours EDR (octobre à janvier) environ 65 h. Maldev Academy compte plus de 200 modules : la sélection est obligatoire. La durée totale de chaque cours n'a pas été vérifiée.</w:t>
       </w:r>
     </w:p>
     <w:p>
@@ -3663,6 +3809,1757 @@
     </w:p>
     <w:p>
       <w:pPr>
+        <w:pStyle w:val="Heading3"/>
+        <w:keepNext/>
+      </w:pPr>
+      <w:r>
+        <w:rPr>
+          <w:rFonts w:ascii="Calibri" w:cs="Calibri" w:eastAsia="Calibri" w:hAnsi="Calibri"/>
+        </w:rPr>
+        <w:t xml:space="preserve">Couverture comparée des formations</w:t>
+      </w:r>
+    </w:p>
+    <w:tbl>
+      <w:tblPr>
+        <w:tblW w:type="dxa" w:w="9638"/>
+        <w:tblBorders>
+          <w:top w:val="single" w:color="auto" w:sz="4"/>
+          <w:left w:val="single" w:color="auto" w:sz="4"/>
+          <w:bottom w:val="single" w:color="auto" w:sz="4"/>
+          <w:right w:val="single" w:color="auto" w:sz="4"/>
+          <w:insideH w:val="single" w:color="auto" w:sz="4"/>
+          <w:insideV w:val="single" w:color="auto" w:sz="4"/>
+        </w:tblBorders>
+      </w:tblPr>
+      <w:tblGrid>
+        <w:gridCol w:w="3238"/>
+        <w:gridCol w:w="1280"/>
+        <w:gridCol w:w="1280"/>
+        <w:gridCol w:w="1280"/>
+        <w:gridCol w:w="1280"/>
+        <w:gridCol w:w="1280"/>
+      </w:tblGrid>
+      <w:tr>
+        <w:trPr>
+          <w:cantSplit/>
+          <w:tblHeader/>
+        </w:trPr>
+        <w:tc>
+          <w:tcPr>
+            <w:tcW w:type="dxa" w:w="3238"/>
+            <w:tcBorders>
+              <w:top w:val="single" w:color="B7C3D0" w:sz="4"/>
+              <w:left w:val="single" w:color="B7C3D0" w:sz="4"/>
+              <w:bottom w:val="single" w:color="B7C3D0" w:sz="4"/>
+              <w:right w:val="single" w:color="B7C3D0" w:sz="4"/>
+            </w:tcBorders>
+            <w:shd w:fill="1F3A5F" w:color="auto" w:val="clear"/>
+            <w:tcMar>
+              <w:top w:type="dxa" w:w="70"/>
+              <w:left w:type="dxa" w:w="90"/>
+              <w:bottom w:type="dxa" w:w="70"/>
+              <w:right w:type="dxa" w:w="90"/>
+            </w:tcMar>
+          </w:tcPr>
+          <w:p>
+            <w:pPr>
+              <w:jc w:val="left"/>
+            </w:pPr>
+            <w:r>
+              <w:rPr>
+                <w:rFonts w:ascii="Calibri" w:cs="Calibri" w:eastAsia="Calibri" w:hAnsi="Calibri"/>
+                <w:b/>
+                <w:bCs/>
+                <w:color w:val="FFFFFF"/>
+                <w:sz w:val="18"/>
+                <w:szCs w:val="18"/>
+              </w:rPr>
+              <w:t xml:space="preserve">Thème</w:t>
+            </w:r>
+          </w:p>
+        </w:tc>
+        <w:tc>
+          <w:tcPr>
+            <w:tcW w:type="dxa" w:w="1280"/>
+            <w:tcBorders>
+              <w:top w:val="single" w:color="B7C3D0" w:sz="4"/>
+              <w:left w:val="single" w:color="B7C3D0" w:sz="4"/>
+              <w:bottom w:val="single" w:color="B7C3D0" w:sz="4"/>
+              <w:right w:val="single" w:color="B7C3D0" w:sz="4"/>
+            </w:tcBorders>
+            <w:shd w:fill="1F3A5F" w:color="auto" w:val="clear"/>
+            <w:tcMar>
+              <w:top w:type="dxa" w:w="70"/>
+              <w:left w:type="dxa" w:w="90"/>
+              <w:bottom w:type="dxa" w:w="70"/>
+              <w:right w:type="dxa" w:w="90"/>
+            </w:tcMar>
+          </w:tcPr>
+          <w:p>
+            <w:pPr>
+              <w:jc w:val="center"/>
+            </w:pPr>
+            <w:r>
+              <w:rPr>
+                <w:rFonts w:ascii="Calibri" w:cs="Calibri" w:eastAsia="Calibri" w:hAnsi="Calibri"/>
+                <w:b/>
+                <w:bCs/>
+                <w:color w:val="FFFFFF"/>
+                <w:sz w:val="18"/>
+                <w:szCs w:val="18"/>
+              </w:rPr>
+              <w:t xml:space="preserve">Sektor7 Essentials</w:t>
+            </w:r>
+          </w:p>
+        </w:tc>
+        <w:tc>
+          <w:tcPr>
+            <w:tcW w:type="dxa" w:w="1280"/>
+            <w:tcBorders>
+              <w:top w:val="single" w:color="B7C3D0" w:sz="4"/>
+              <w:left w:val="single" w:color="B7C3D0" w:sz="4"/>
+              <w:bottom w:val="single" w:color="B7C3D0" w:sz="4"/>
+              <w:right w:val="single" w:color="B7C3D0" w:sz="4"/>
+            </w:tcBorders>
+            <w:shd w:fill="1F3A5F" w:color="auto" w:val="clear"/>
+            <w:tcMar>
+              <w:top w:type="dxa" w:w="70"/>
+              <w:left w:type="dxa" w:w="90"/>
+              <w:bottom w:type="dxa" w:w="70"/>
+              <w:right w:type="dxa" w:w="90"/>
+            </w:tcMar>
+          </w:tcPr>
+          <w:p>
+            <w:pPr>
+              <w:jc w:val="center"/>
+            </w:pPr>
+            <w:r>
+              <w:rPr>
+                <w:rFonts w:ascii="Calibri" w:cs="Calibri" w:eastAsia="Calibri" w:hAnsi="Calibri"/>
+                <w:b/>
+                <w:bCs/>
+                <w:color w:val="FFFFFF"/>
+                <w:sz w:val="18"/>
+                <w:szCs w:val="18"/>
+              </w:rPr>
+              <w:t xml:space="preserve">Maldev Academy</w:t>
+            </w:r>
+          </w:p>
+        </w:tc>
+        <w:tc>
+          <w:tcPr>
+            <w:tcW w:type="dxa" w:w="1280"/>
+            <w:tcBorders>
+              <w:top w:val="single" w:color="B7C3D0" w:sz="4"/>
+              <w:left w:val="single" w:color="B7C3D0" w:sz="4"/>
+              <w:bottom w:val="single" w:color="B7C3D0" w:sz="4"/>
+              <w:right w:val="single" w:color="B7C3D0" w:sz="4"/>
+            </w:tcBorders>
+            <w:shd w:fill="1F3A5F" w:color="auto" w:val="clear"/>
+            <w:tcMar>
+              <w:top w:type="dxa" w:w="70"/>
+              <w:left w:type="dxa" w:w="90"/>
+              <w:bottom w:type="dxa" w:w="70"/>
+              <w:right w:type="dxa" w:w="90"/>
+            </w:tcMar>
+          </w:tcPr>
+          <w:p>
+            <w:pPr>
+              <w:jc w:val="center"/>
+            </w:pPr>
+            <w:r>
+              <w:rPr>
+                <w:rFonts w:ascii="Calibri" w:cs="Calibri" w:eastAsia="Calibri" w:hAnsi="Calibri"/>
+                <w:b/>
+                <w:bCs/>
+                <w:color w:val="FFFFFF"/>
+                <w:sz w:val="18"/>
+                <w:szCs w:val="18"/>
+              </w:rPr>
+              <w:t xml:space="preserve">Cours EDR</w:t>
+            </w:r>
+          </w:p>
+        </w:tc>
+        <w:tc>
+          <w:tcPr>
+            <w:tcW w:type="dxa" w:w="1280"/>
+            <w:tcBorders>
+              <w:top w:val="single" w:color="B7C3D0" w:sz="4"/>
+              <w:left w:val="single" w:color="B7C3D0" w:sz="4"/>
+              <w:bottom w:val="single" w:color="B7C3D0" w:sz="4"/>
+              <w:right w:val="single" w:color="B7C3D0" w:sz="4"/>
+            </w:tcBorders>
+            <w:shd w:fill="1F3A5F" w:color="auto" w:val="clear"/>
+            <w:tcMar>
+              <w:top w:type="dxa" w:w="70"/>
+              <w:left w:type="dxa" w:w="90"/>
+              <w:bottom w:type="dxa" w:w="70"/>
+              <w:right w:type="dxa" w:w="90"/>
+            </w:tcMar>
+          </w:tcPr>
+          <w:p>
+            <w:pPr>
+              <w:jc w:val="center"/>
+            </w:pPr>
+            <w:r>
+              <w:rPr>
+                <w:rFonts w:ascii="Calibri" w:cs="Calibri" w:eastAsia="Calibri" w:hAnsi="Calibri"/>
+                <w:b/>
+                <w:bCs/>
+                <w:color w:val="FFFFFF"/>
+                <w:sz w:val="18"/>
+                <w:szCs w:val="18"/>
+              </w:rPr>
+              <w:t xml:space="preserve">CRTO</w:t>
+            </w:r>
+          </w:p>
+        </w:tc>
+        <w:tc>
+          <w:tcPr>
+            <w:tcW w:type="dxa" w:w="1280"/>
+            <w:tcBorders>
+              <w:top w:val="single" w:color="B7C3D0" w:sz="4"/>
+              <w:left w:val="single" w:color="B7C3D0" w:sz="4"/>
+              <w:bottom w:val="single" w:color="B7C3D0" w:sz="4"/>
+              <w:right w:val="single" w:color="B7C3D0" w:sz="4"/>
+            </w:tcBorders>
+            <w:shd w:fill="1F3A5F" w:color="auto" w:val="clear"/>
+            <w:tcMar>
+              <w:top w:type="dxa" w:w="70"/>
+              <w:left w:type="dxa" w:w="90"/>
+              <w:bottom w:type="dxa" w:w="70"/>
+              <w:right w:type="dxa" w:w="90"/>
+            </w:tcMar>
+          </w:tcPr>
+          <w:p>
+            <w:pPr>
+              <w:jc w:val="center"/>
+            </w:pPr>
+            <w:r>
+              <w:rPr>
+                <w:rFonts w:ascii="Calibri" w:cs="Calibri" w:eastAsia="Calibri" w:hAnsi="Calibri"/>
+                <w:b/>
+                <w:bCs/>
+                <w:color w:val="FFFFFF"/>
+                <w:sz w:val="18"/>
+                <w:szCs w:val="18"/>
+              </w:rPr>
+              <w:t xml:space="preserve">CRTL</w:t>
+            </w:r>
+          </w:p>
+        </w:tc>
+      </w:tr>
+      <w:tr>
+        <w:trPr>
+          <w:cantSplit/>
+        </w:trPr>
+        <w:tc>
+          <w:tcPr>
+            <w:tcW w:type="dxa" w:w="3238"/>
+            <w:tcBorders>
+              <w:top w:val="single" w:color="B7C3D0" w:sz="4"/>
+              <w:left w:val="single" w:color="B7C3D0" w:sz="4"/>
+              <w:bottom w:val="single" w:color="B7C3D0" w:sz="4"/>
+              <w:right w:val="single" w:color="B7C3D0" w:sz="4"/>
+            </w:tcBorders>
+            <w:shd w:fill="FFFFFF" w:color="auto" w:val="clear"/>
+            <w:tcMar>
+              <w:top w:type="dxa" w:w="70"/>
+              <w:left w:type="dxa" w:w="90"/>
+              <w:bottom w:type="dxa" w:w="70"/>
+              <w:right w:type="dxa" w:w="90"/>
+            </w:tcMar>
+          </w:tcPr>
+          <w:p>
+            <w:pPr>
+              <w:jc w:val="left"/>
+            </w:pPr>
+            <w:r>
+              <w:rPr>
+                <w:rFonts w:ascii="Calibri" w:cs="Calibri" w:eastAsia="Calibri" w:hAnsi="Calibri"/>
+                <w:b w:val="false"/>
+                <w:bCs w:val="false"/>
+                <w:color w:val="000000"/>
+                <w:sz w:val="18"/>
+                <w:szCs w:val="18"/>
+              </w:rPr>
+              <w:t xml:space="preserve">Développement en C et API Windows</w:t>
+            </w:r>
+          </w:p>
+        </w:tc>
+        <w:tc>
+          <w:tcPr>
+            <w:tcW w:type="dxa" w:w="1280"/>
+            <w:tcBorders>
+              <w:top w:val="single" w:color="B7C3D0" w:sz="4"/>
+              <w:left w:val="single" w:color="B7C3D0" w:sz="4"/>
+              <w:bottom w:val="single" w:color="B7C3D0" w:sz="4"/>
+              <w:right w:val="single" w:color="B7C3D0" w:sz="4"/>
+            </w:tcBorders>
+            <w:shd w:fill="9EC5F4" w:color="auto" w:val="clear"/>
+            <w:tcMar>
+              <w:top w:type="dxa" w:w="70"/>
+              <w:left w:type="dxa" w:w="90"/>
+              <w:bottom w:type="dxa" w:w="70"/>
+              <w:right w:type="dxa" w:w="90"/>
+            </w:tcMar>
+          </w:tcPr>
+          <w:p>
+            <w:pPr>
+              <w:jc w:val="center"/>
+            </w:pPr>
+            <w:r>
+              <w:rPr>
+                <w:rFonts w:ascii="Calibri" w:cs="Calibri" w:eastAsia="Calibri" w:hAnsi="Calibri"/>
+                <w:b/>
+                <w:bCs/>
+                <w:color w:val="000000"/>
+                <w:sz w:val="18"/>
+                <w:szCs w:val="18"/>
+              </w:rPr>
+              <w:t xml:space="preserve">Oui</w:t>
+            </w:r>
+          </w:p>
+        </w:tc>
+        <w:tc>
+          <w:tcPr>
+            <w:tcW w:type="dxa" w:w="1280"/>
+            <w:tcBorders>
+              <w:top w:val="single" w:color="B7C3D0" w:sz="4"/>
+              <w:left w:val="single" w:color="B7C3D0" w:sz="4"/>
+              <w:bottom w:val="single" w:color="B7C3D0" w:sz="4"/>
+              <w:right w:val="single" w:color="B7C3D0" w:sz="4"/>
+            </w:tcBorders>
+            <w:shd w:fill="DCEAFB" w:color="auto" w:val="clear"/>
+            <w:tcMar>
+              <w:top w:type="dxa" w:w="70"/>
+              <w:left w:type="dxa" w:w="90"/>
+              <w:bottom w:type="dxa" w:w="70"/>
+              <w:right w:type="dxa" w:w="90"/>
+            </w:tcMar>
+          </w:tcPr>
+          <w:p>
+            <w:pPr>
+              <w:jc w:val="center"/>
+            </w:pPr>
+            <w:r>
+              <w:rPr>
+                <w:rFonts w:ascii="Calibri" w:cs="Calibri" w:eastAsia="Calibri" w:hAnsi="Calibri"/>
+                <w:b w:val="false"/>
+                <w:bCs w:val="false"/>
+                <w:color w:val="000000"/>
+                <w:sz w:val="18"/>
+                <w:szCs w:val="18"/>
+              </w:rPr>
+              <w:t xml:space="preserve">Partiel</w:t>
+            </w:r>
+          </w:p>
+        </w:tc>
+        <w:tc>
+          <w:tcPr>
+            <w:tcW w:type="dxa" w:w="1280"/>
+            <w:tcBorders>
+              <w:top w:val="single" w:color="B7C3D0" w:sz="4"/>
+              <w:left w:val="single" w:color="B7C3D0" w:sz="4"/>
+              <w:bottom w:val="single" w:color="B7C3D0" w:sz="4"/>
+              <w:right w:val="single" w:color="B7C3D0" w:sz="4"/>
+            </w:tcBorders>
+            <w:shd w:fill="DCEAFB" w:color="auto" w:val="clear"/>
+            <w:tcMar>
+              <w:top w:type="dxa" w:w="70"/>
+              <w:left w:type="dxa" w:w="90"/>
+              <w:bottom w:type="dxa" w:w="70"/>
+              <w:right w:type="dxa" w:w="90"/>
+            </w:tcMar>
+          </w:tcPr>
+          <w:p>
+            <w:pPr>
+              <w:jc w:val="center"/>
+            </w:pPr>
+            <w:r>
+              <w:rPr>
+                <w:rFonts w:ascii="Calibri" w:cs="Calibri" w:eastAsia="Calibri" w:hAnsi="Calibri"/>
+                <w:b w:val="false"/>
+                <w:bCs w:val="false"/>
+                <w:color w:val="000000"/>
+                <w:sz w:val="18"/>
+                <w:szCs w:val="18"/>
+              </w:rPr>
+              <w:t xml:space="preserve">Partiel</w:t>
+            </w:r>
+          </w:p>
+        </w:tc>
+        <w:tc>
+          <w:tcPr>
+            <w:tcW w:type="dxa" w:w="1280"/>
+            <w:tcBorders>
+              <w:top w:val="single" w:color="B7C3D0" w:sz="4"/>
+              <w:left w:val="single" w:color="B7C3D0" w:sz="4"/>
+              <w:bottom w:val="single" w:color="B7C3D0" w:sz="4"/>
+              <w:right w:val="single" w:color="B7C3D0" w:sz="4"/>
+            </w:tcBorders>
+            <w:shd w:fill="FFFFFF" w:color="auto" w:val="clear"/>
+            <w:tcMar>
+              <w:top w:type="dxa" w:w="70"/>
+              <w:left w:type="dxa" w:w="90"/>
+              <w:bottom w:type="dxa" w:w="70"/>
+              <w:right w:type="dxa" w:w="90"/>
+            </w:tcMar>
+          </w:tcPr>
+          <w:p>
+            <w:pPr>
+              <w:jc w:val="center"/>
+            </w:pPr>
+            <w:r>
+              <w:rPr>
+                <w:rFonts w:ascii="Calibri" w:cs="Calibri" w:eastAsia="Calibri" w:hAnsi="Calibri"/>
+                <w:b w:val="false"/>
+                <w:bCs w:val="false"/>
+                <w:color w:val="777777"/>
+                <w:sz w:val="18"/>
+                <w:szCs w:val="18"/>
+              </w:rPr>
+              <w:t xml:space="preserve">Non indiqué</w:t>
+            </w:r>
+          </w:p>
+        </w:tc>
+        <w:tc>
+          <w:tcPr>
+            <w:tcW w:type="dxa" w:w="1280"/>
+            <w:tcBorders>
+              <w:top w:val="single" w:color="B7C3D0" w:sz="4"/>
+              <w:left w:val="single" w:color="B7C3D0" w:sz="4"/>
+              <w:bottom w:val="single" w:color="B7C3D0" w:sz="4"/>
+              <w:right w:val="single" w:color="B7C3D0" w:sz="4"/>
+            </w:tcBorders>
+            <w:shd w:fill="FFFFFF" w:color="auto" w:val="clear"/>
+            <w:tcMar>
+              <w:top w:type="dxa" w:w="70"/>
+              <w:left w:type="dxa" w:w="90"/>
+              <w:bottom w:type="dxa" w:w="70"/>
+              <w:right w:type="dxa" w:w="90"/>
+            </w:tcMar>
+          </w:tcPr>
+          <w:p>
+            <w:pPr>
+              <w:jc w:val="center"/>
+            </w:pPr>
+            <w:r>
+              <w:rPr>
+                <w:rFonts w:ascii="Calibri" w:cs="Calibri" w:eastAsia="Calibri" w:hAnsi="Calibri"/>
+                <w:b w:val="false"/>
+                <w:bCs w:val="false"/>
+                <w:color w:val="777777"/>
+                <w:sz w:val="18"/>
+                <w:szCs w:val="18"/>
+              </w:rPr>
+              <w:t xml:space="preserve">Non indiqué</w:t>
+            </w:r>
+          </w:p>
+        </w:tc>
+      </w:tr>
+      <w:tr>
+        <w:trPr>
+          <w:cantSplit/>
+        </w:trPr>
+        <w:tc>
+          <w:tcPr>
+            <w:tcW w:type="dxa" w:w="3238"/>
+            <w:tcBorders>
+              <w:top w:val="single" w:color="B7C3D0" w:sz="4"/>
+              <w:left w:val="single" w:color="B7C3D0" w:sz="4"/>
+              <w:bottom w:val="single" w:color="B7C3D0" w:sz="4"/>
+              <w:right w:val="single" w:color="B7C3D0" w:sz="4"/>
+            </w:tcBorders>
+            <w:shd w:fill="FFFFFF" w:color="auto" w:val="clear"/>
+            <w:tcMar>
+              <w:top w:type="dxa" w:w="70"/>
+              <w:left w:type="dxa" w:w="90"/>
+              <w:bottom w:type="dxa" w:w="70"/>
+              <w:right w:type="dxa" w:w="90"/>
+            </w:tcMar>
+          </w:tcPr>
+          <w:p>
+            <w:pPr>
+              <w:jc w:val="left"/>
+            </w:pPr>
+            <w:r>
+              <w:rPr>
+                <w:rFonts w:ascii="Calibri" w:cs="Calibri" w:eastAsia="Calibri" w:hAnsi="Calibri"/>
+                <w:b w:val="false"/>
+                <w:bCs w:val="false"/>
+                <w:color w:val="000000"/>
+                <w:sz w:val="18"/>
+                <w:szCs w:val="18"/>
+              </w:rPr>
+              <w:t xml:space="preserve">Chargeurs et exécution en mémoire</w:t>
+            </w:r>
+          </w:p>
+        </w:tc>
+        <w:tc>
+          <w:tcPr>
+            <w:tcW w:type="dxa" w:w="1280"/>
+            <w:tcBorders>
+              <w:top w:val="single" w:color="B7C3D0" w:sz="4"/>
+              <w:left w:val="single" w:color="B7C3D0" w:sz="4"/>
+              <w:bottom w:val="single" w:color="B7C3D0" w:sz="4"/>
+              <w:right w:val="single" w:color="B7C3D0" w:sz="4"/>
+            </w:tcBorders>
+            <w:shd w:fill="9EC5F4" w:color="auto" w:val="clear"/>
+            <w:tcMar>
+              <w:top w:type="dxa" w:w="70"/>
+              <w:left w:type="dxa" w:w="90"/>
+              <w:bottom w:type="dxa" w:w="70"/>
+              <w:right w:type="dxa" w:w="90"/>
+            </w:tcMar>
+          </w:tcPr>
+          <w:p>
+            <w:pPr>
+              <w:jc w:val="center"/>
+            </w:pPr>
+            <w:r>
+              <w:rPr>
+                <w:rFonts w:ascii="Calibri" w:cs="Calibri" w:eastAsia="Calibri" w:hAnsi="Calibri"/>
+                <w:b/>
+                <w:bCs/>
+                <w:color w:val="000000"/>
+                <w:sz w:val="18"/>
+                <w:szCs w:val="18"/>
+              </w:rPr>
+              <w:t xml:space="preserve">Oui</w:t>
+            </w:r>
+          </w:p>
+        </w:tc>
+        <w:tc>
+          <w:tcPr>
+            <w:tcW w:type="dxa" w:w="1280"/>
+            <w:tcBorders>
+              <w:top w:val="single" w:color="B7C3D0" w:sz="4"/>
+              <w:left w:val="single" w:color="B7C3D0" w:sz="4"/>
+              <w:bottom w:val="single" w:color="B7C3D0" w:sz="4"/>
+              <w:right w:val="single" w:color="B7C3D0" w:sz="4"/>
+            </w:tcBorders>
+            <w:shd w:fill="9EC5F4" w:color="auto" w:val="clear"/>
+            <w:tcMar>
+              <w:top w:type="dxa" w:w="70"/>
+              <w:left w:type="dxa" w:w="90"/>
+              <w:bottom w:type="dxa" w:w="70"/>
+              <w:right w:type="dxa" w:w="90"/>
+            </w:tcMar>
+          </w:tcPr>
+          <w:p>
+            <w:pPr>
+              <w:jc w:val="center"/>
+            </w:pPr>
+            <w:r>
+              <w:rPr>
+                <w:rFonts w:ascii="Calibri" w:cs="Calibri" w:eastAsia="Calibri" w:hAnsi="Calibri"/>
+                <w:b/>
+                <w:bCs/>
+                <w:color w:val="000000"/>
+                <w:sz w:val="18"/>
+                <w:szCs w:val="18"/>
+              </w:rPr>
+              <w:t xml:space="preserve">Oui</w:t>
+            </w:r>
+          </w:p>
+        </w:tc>
+        <w:tc>
+          <w:tcPr>
+            <w:tcW w:type="dxa" w:w="1280"/>
+            <w:tcBorders>
+              <w:top w:val="single" w:color="B7C3D0" w:sz="4"/>
+              <w:left w:val="single" w:color="B7C3D0" w:sz="4"/>
+              <w:bottom w:val="single" w:color="B7C3D0" w:sz="4"/>
+              <w:right w:val="single" w:color="B7C3D0" w:sz="4"/>
+            </w:tcBorders>
+            <w:shd w:fill="FFFFFF" w:color="auto" w:val="clear"/>
+            <w:tcMar>
+              <w:top w:type="dxa" w:w="70"/>
+              <w:left w:type="dxa" w:w="90"/>
+              <w:bottom w:type="dxa" w:w="70"/>
+              <w:right w:type="dxa" w:w="90"/>
+            </w:tcMar>
+          </w:tcPr>
+          <w:p>
+            <w:pPr>
+              <w:jc w:val="center"/>
+            </w:pPr>
+            <w:r>
+              <w:rPr>
+                <w:rFonts w:ascii="Calibri" w:cs="Calibri" w:eastAsia="Calibri" w:hAnsi="Calibri"/>
+                <w:b w:val="false"/>
+                <w:bCs w:val="false"/>
+                <w:color w:val="777777"/>
+                <w:sz w:val="18"/>
+                <w:szCs w:val="18"/>
+              </w:rPr>
+              <w:t xml:space="preserve">Non indiqué</w:t>
+            </w:r>
+          </w:p>
+        </w:tc>
+        <w:tc>
+          <w:tcPr>
+            <w:tcW w:type="dxa" w:w="1280"/>
+            <w:tcBorders>
+              <w:top w:val="single" w:color="B7C3D0" w:sz="4"/>
+              <w:left w:val="single" w:color="B7C3D0" w:sz="4"/>
+              <w:bottom w:val="single" w:color="B7C3D0" w:sz="4"/>
+              <w:right w:val="single" w:color="B7C3D0" w:sz="4"/>
+            </w:tcBorders>
+            <w:shd w:fill="FFFFFF" w:color="auto" w:val="clear"/>
+            <w:tcMar>
+              <w:top w:type="dxa" w:w="70"/>
+              <w:left w:type="dxa" w:w="90"/>
+              <w:bottom w:type="dxa" w:w="70"/>
+              <w:right w:type="dxa" w:w="90"/>
+            </w:tcMar>
+          </w:tcPr>
+          <w:p>
+            <w:pPr>
+              <w:jc w:val="center"/>
+            </w:pPr>
+            <w:r>
+              <w:rPr>
+                <w:rFonts w:ascii="Calibri" w:cs="Calibri" w:eastAsia="Calibri" w:hAnsi="Calibri"/>
+                <w:b w:val="false"/>
+                <w:bCs w:val="false"/>
+                <w:color w:val="777777"/>
+                <w:sz w:val="18"/>
+                <w:szCs w:val="18"/>
+              </w:rPr>
+              <w:t xml:space="preserve">Non indiqué</w:t>
+            </w:r>
+          </w:p>
+        </w:tc>
+        <w:tc>
+          <w:tcPr>
+            <w:tcW w:type="dxa" w:w="1280"/>
+            <w:tcBorders>
+              <w:top w:val="single" w:color="B7C3D0" w:sz="4"/>
+              <w:left w:val="single" w:color="B7C3D0" w:sz="4"/>
+              <w:bottom w:val="single" w:color="B7C3D0" w:sz="4"/>
+              <w:right w:val="single" w:color="B7C3D0" w:sz="4"/>
+            </w:tcBorders>
+            <w:shd w:fill="FFFFFF" w:color="auto" w:val="clear"/>
+            <w:tcMar>
+              <w:top w:type="dxa" w:w="70"/>
+              <w:left w:type="dxa" w:w="90"/>
+              <w:bottom w:type="dxa" w:w="70"/>
+              <w:right w:type="dxa" w:w="90"/>
+            </w:tcMar>
+          </w:tcPr>
+          <w:p>
+            <w:pPr>
+              <w:jc w:val="center"/>
+            </w:pPr>
+            <w:r>
+              <w:rPr>
+                <w:rFonts w:ascii="Calibri" w:cs="Calibri" w:eastAsia="Calibri" w:hAnsi="Calibri"/>
+                <w:b w:val="false"/>
+                <w:bCs w:val="false"/>
+                <w:color w:val="777777"/>
+                <w:sz w:val="18"/>
+                <w:szCs w:val="18"/>
+              </w:rPr>
+              <w:t xml:space="preserve">Non indiqué</w:t>
+            </w:r>
+          </w:p>
+        </w:tc>
+      </w:tr>
+      <w:tr>
+        <w:trPr>
+          <w:cantSplit/>
+        </w:trPr>
+        <w:tc>
+          <w:tcPr>
+            <w:tcW w:type="dxa" w:w="3238"/>
+            <w:tcBorders>
+              <w:top w:val="single" w:color="B7C3D0" w:sz="4"/>
+              <w:left w:val="single" w:color="B7C3D0" w:sz="4"/>
+              <w:bottom w:val="single" w:color="B7C3D0" w:sz="4"/>
+              <w:right w:val="single" w:color="B7C3D0" w:sz="4"/>
+            </w:tcBorders>
+            <w:shd w:fill="FFFFFF" w:color="auto" w:val="clear"/>
+            <w:tcMar>
+              <w:top w:type="dxa" w:w="70"/>
+              <w:left w:type="dxa" w:w="90"/>
+              <w:bottom w:type="dxa" w:w="70"/>
+              <w:right w:type="dxa" w:w="90"/>
+            </w:tcMar>
+          </w:tcPr>
+          <w:p>
+            <w:pPr>
+              <w:jc w:val="left"/>
+            </w:pPr>
+            <w:r>
+              <w:rPr>
+                <w:rFonts w:ascii="Calibri" w:cs="Calibri" w:eastAsia="Calibri" w:hAnsi="Calibri"/>
+                <w:b w:val="false"/>
+                <w:bCs w:val="false"/>
+                <w:color w:val="000000"/>
+                <w:sz w:val="18"/>
+                <w:szCs w:val="18"/>
+              </w:rPr>
+              <w:t xml:space="preserve">Architecture et télémétrie d'un EDR</w:t>
+            </w:r>
+          </w:p>
+        </w:tc>
+        <w:tc>
+          <w:tcPr>
+            <w:tcW w:type="dxa" w:w="1280"/>
+            <w:tcBorders>
+              <w:top w:val="single" w:color="B7C3D0" w:sz="4"/>
+              <w:left w:val="single" w:color="B7C3D0" w:sz="4"/>
+              <w:bottom w:val="single" w:color="B7C3D0" w:sz="4"/>
+              <w:right w:val="single" w:color="B7C3D0" w:sz="4"/>
+            </w:tcBorders>
+            <w:shd w:fill="FFFFFF" w:color="auto" w:val="clear"/>
+            <w:tcMar>
+              <w:top w:type="dxa" w:w="70"/>
+              <w:left w:type="dxa" w:w="90"/>
+              <w:bottom w:type="dxa" w:w="70"/>
+              <w:right w:type="dxa" w:w="90"/>
+            </w:tcMar>
+          </w:tcPr>
+          <w:p>
+            <w:pPr>
+              <w:jc w:val="center"/>
+            </w:pPr>
+            <w:r>
+              <w:rPr>
+                <w:rFonts w:ascii="Calibri" w:cs="Calibri" w:eastAsia="Calibri" w:hAnsi="Calibri"/>
+                <w:b w:val="false"/>
+                <w:bCs w:val="false"/>
+                <w:color w:val="777777"/>
+                <w:sz w:val="18"/>
+                <w:szCs w:val="18"/>
+              </w:rPr>
+              <w:t xml:space="preserve">Non indiqué</w:t>
+            </w:r>
+          </w:p>
+        </w:tc>
+        <w:tc>
+          <w:tcPr>
+            <w:tcW w:type="dxa" w:w="1280"/>
+            <w:tcBorders>
+              <w:top w:val="single" w:color="B7C3D0" w:sz="4"/>
+              <w:left w:val="single" w:color="B7C3D0" w:sz="4"/>
+              <w:bottom w:val="single" w:color="B7C3D0" w:sz="4"/>
+              <w:right w:val="single" w:color="B7C3D0" w:sz="4"/>
+            </w:tcBorders>
+            <w:shd w:fill="FFFFFF" w:color="auto" w:val="clear"/>
+            <w:tcMar>
+              <w:top w:type="dxa" w:w="70"/>
+              <w:left w:type="dxa" w:w="90"/>
+              <w:bottom w:type="dxa" w:w="70"/>
+              <w:right w:type="dxa" w:w="90"/>
+            </w:tcMar>
+          </w:tcPr>
+          <w:p>
+            <w:pPr>
+              <w:jc w:val="center"/>
+            </w:pPr>
+            <w:r>
+              <w:rPr>
+                <w:rFonts w:ascii="Calibri" w:cs="Calibri" w:eastAsia="Calibri" w:hAnsi="Calibri"/>
+                <w:b w:val="false"/>
+                <w:bCs w:val="false"/>
+                <w:color w:val="777777"/>
+                <w:sz w:val="18"/>
+                <w:szCs w:val="18"/>
+              </w:rPr>
+              <w:t xml:space="preserve">Non indiqué</w:t>
+            </w:r>
+          </w:p>
+        </w:tc>
+        <w:tc>
+          <w:tcPr>
+            <w:tcW w:type="dxa" w:w="1280"/>
+            <w:tcBorders>
+              <w:top w:val="single" w:color="B7C3D0" w:sz="4"/>
+              <w:left w:val="single" w:color="B7C3D0" w:sz="4"/>
+              <w:bottom w:val="single" w:color="B7C3D0" w:sz="4"/>
+              <w:right w:val="single" w:color="B7C3D0" w:sz="4"/>
+            </w:tcBorders>
+            <w:shd w:fill="9EC5F4" w:color="auto" w:val="clear"/>
+            <w:tcMar>
+              <w:top w:type="dxa" w:w="70"/>
+              <w:left w:type="dxa" w:w="90"/>
+              <w:bottom w:type="dxa" w:w="70"/>
+              <w:right w:type="dxa" w:w="90"/>
+            </w:tcMar>
+          </w:tcPr>
+          <w:p>
+            <w:pPr>
+              <w:jc w:val="center"/>
+            </w:pPr>
+            <w:r>
+              <w:rPr>
+                <w:rFonts w:ascii="Calibri" w:cs="Calibri" w:eastAsia="Calibri" w:hAnsi="Calibri"/>
+                <w:b/>
+                <w:bCs/>
+                <w:color w:val="000000"/>
+                <w:sz w:val="18"/>
+                <w:szCs w:val="18"/>
+              </w:rPr>
+              <w:t xml:space="preserve">Oui</w:t>
+            </w:r>
+          </w:p>
+        </w:tc>
+        <w:tc>
+          <w:tcPr>
+            <w:tcW w:type="dxa" w:w="1280"/>
+            <w:tcBorders>
+              <w:top w:val="single" w:color="B7C3D0" w:sz="4"/>
+              <w:left w:val="single" w:color="B7C3D0" w:sz="4"/>
+              <w:bottom w:val="single" w:color="B7C3D0" w:sz="4"/>
+              <w:right w:val="single" w:color="B7C3D0" w:sz="4"/>
+            </w:tcBorders>
+            <w:shd w:fill="FFFFFF" w:color="auto" w:val="clear"/>
+            <w:tcMar>
+              <w:top w:type="dxa" w:w="70"/>
+              <w:left w:type="dxa" w:w="90"/>
+              <w:bottom w:type="dxa" w:w="70"/>
+              <w:right w:type="dxa" w:w="90"/>
+            </w:tcMar>
+          </w:tcPr>
+          <w:p>
+            <w:pPr>
+              <w:jc w:val="center"/>
+            </w:pPr>
+            <w:r>
+              <w:rPr>
+                <w:rFonts w:ascii="Calibri" w:cs="Calibri" w:eastAsia="Calibri" w:hAnsi="Calibri"/>
+                <w:b w:val="false"/>
+                <w:bCs w:val="false"/>
+                <w:color w:val="777777"/>
+                <w:sz w:val="18"/>
+                <w:szCs w:val="18"/>
+              </w:rPr>
+              <w:t xml:space="preserve">Non indiqué</w:t>
+            </w:r>
+          </w:p>
+        </w:tc>
+        <w:tc>
+          <w:tcPr>
+            <w:tcW w:type="dxa" w:w="1280"/>
+            <w:tcBorders>
+              <w:top w:val="single" w:color="B7C3D0" w:sz="4"/>
+              <w:left w:val="single" w:color="B7C3D0" w:sz="4"/>
+              <w:bottom w:val="single" w:color="B7C3D0" w:sz="4"/>
+              <w:right w:val="single" w:color="B7C3D0" w:sz="4"/>
+            </w:tcBorders>
+            <w:shd w:fill="DCEAFB" w:color="auto" w:val="clear"/>
+            <w:tcMar>
+              <w:top w:type="dxa" w:w="70"/>
+              <w:left w:type="dxa" w:w="90"/>
+              <w:bottom w:type="dxa" w:w="70"/>
+              <w:right w:type="dxa" w:w="90"/>
+            </w:tcMar>
+          </w:tcPr>
+          <w:p>
+            <w:pPr>
+              <w:jc w:val="center"/>
+            </w:pPr>
+            <w:r>
+              <w:rPr>
+                <w:rFonts w:ascii="Calibri" w:cs="Calibri" w:eastAsia="Calibri" w:hAnsi="Calibri"/>
+                <w:b w:val="false"/>
+                <w:bCs w:val="false"/>
+                <w:color w:val="000000"/>
+                <w:sz w:val="18"/>
+                <w:szCs w:val="18"/>
+              </w:rPr>
+              <w:t xml:space="preserve">Partiel</w:t>
+            </w:r>
+          </w:p>
+        </w:tc>
+      </w:tr>
+      <w:tr>
+        <w:trPr>
+          <w:cantSplit/>
+        </w:trPr>
+        <w:tc>
+          <w:tcPr>
+            <w:tcW w:type="dxa" w:w="3238"/>
+            <w:tcBorders>
+              <w:top w:val="single" w:color="B7C3D0" w:sz="4"/>
+              <w:left w:val="single" w:color="B7C3D0" w:sz="4"/>
+              <w:bottom w:val="single" w:color="B7C3D0" w:sz="4"/>
+              <w:right w:val="single" w:color="B7C3D0" w:sz="4"/>
+            </w:tcBorders>
+            <w:shd w:fill="FFFFFF" w:color="auto" w:val="clear"/>
+            <w:tcMar>
+              <w:top w:type="dxa" w:w="70"/>
+              <w:left w:type="dxa" w:w="90"/>
+              <w:bottom w:type="dxa" w:w="70"/>
+              <w:right w:type="dxa" w:w="90"/>
+            </w:tcMar>
+          </w:tcPr>
+          <w:p>
+            <w:pPr>
+              <w:jc w:val="left"/>
+            </w:pPr>
+            <w:r>
+              <w:rPr>
+                <w:rFonts w:ascii="Calibri" w:cs="Calibri" w:eastAsia="Calibri" w:hAnsi="Calibri"/>
+                <w:b w:val="false"/>
+                <w:bCs w:val="false"/>
+                <w:color w:val="000000"/>
+                <w:sz w:val="18"/>
+                <w:szCs w:val="18"/>
+              </w:rPr>
+              <w:t xml:space="preserve">Développement noyau (pilotes, rappels, minifiltres)</w:t>
+            </w:r>
+          </w:p>
+        </w:tc>
+        <w:tc>
+          <w:tcPr>
+            <w:tcW w:type="dxa" w:w="1280"/>
+            <w:tcBorders>
+              <w:top w:val="single" w:color="B7C3D0" w:sz="4"/>
+              <w:left w:val="single" w:color="B7C3D0" w:sz="4"/>
+              <w:bottom w:val="single" w:color="B7C3D0" w:sz="4"/>
+              <w:right w:val="single" w:color="B7C3D0" w:sz="4"/>
+            </w:tcBorders>
+            <w:shd w:fill="FFFFFF" w:color="auto" w:val="clear"/>
+            <w:tcMar>
+              <w:top w:type="dxa" w:w="70"/>
+              <w:left w:type="dxa" w:w="90"/>
+              <w:bottom w:type="dxa" w:w="70"/>
+              <w:right w:type="dxa" w:w="90"/>
+            </w:tcMar>
+          </w:tcPr>
+          <w:p>
+            <w:pPr>
+              <w:jc w:val="center"/>
+            </w:pPr>
+            <w:r>
+              <w:rPr>
+                <w:rFonts w:ascii="Calibri" w:cs="Calibri" w:eastAsia="Calibri" w:hAnsi="Calibri"/>
+                <w:b w:val="false"/>
+                <w:bCs w:val="false"/>
+                <w:color w:val="777777"/>
+                <w:sz w:val="18"/>
+                <w:szCs w:val="18"/>
+              </w:rPr>
+              <w:t xml:space="preserve">Non indiqué</w:t>
+            </w:r>
+          </w:p>
+        </w:tc>
+        <w:tc>
+          <w:tcPr>
+            <w:tcW w:type="dxa" w:w="1280"/>
+            <w:tcBorders>
+              <w:top w:val="single" w:color="B7C3D0" w:sz="4"/>
+              <w:left w:val="single" w:color="B7C3D0" w:sz="4"/>
+              <w:bottom w:val="single" w:color="B7C3D0" w:sz="4"/>
+              <w:right w:val="single" w:color="B7C3D0" w:sz="4"/>
+            </w:tcBorders>
+            <w:shd w:fill="FFFFFF" w:color="auto" w:val="clear"/>
+            <w:tcMar>
+              <w:top w:type="dxa" w:w="70"/>
+              <w:left w:type="dxa" w:w="90"/>
+              <w:bottom w:type="dxa" w:w="70"/>
+              <w:right w:type="dxa" w:w="90"/>
+            </w:tcMar>
+          </w:tcPr>
+          <w:p>
+            <w:pPr>
+              <w:jc w:val="center"/>
+            </w:pPr>
+            <w:r>
+              <w:rPr>
+                <w:rFonts w:ascii="Calibri" w:cs="Calibri" w:eastAsia="Calibri" w:hAnsi="Calibri"/>
+                <w:b w:val="false"/>
+                <w:bCs w:val="false"/>
+                <w:color w:val="777777"/>
+                <w:sz w:val="18"/>
+                <w:szCs w:val="18"/>
+              </w:rPr>
+              <w:t xml:space="preserve">Non indiqué</w:t>
+            </w:r>
+          </w:p>
+        </w:tc>
+        <w:tc>
+          <w:tcPr>
+            <w:tcW w:type="dxa" w:w="1280"/>
+            <w:tcBorders>
+              <w:top w:val="single" w:color="B7C3D0" w:sz="4"/>
+              <w:left w:val="single" w:color="B7C3D0" w:sz="4"/>
+              <w:bottom w:val="single" w:color="B7C3D0" w:sz="4"/>
+              <w:right w:val="single" w:color="B7C3D0" w:sz="4"/>
+            </w:tcBorders>
+            <w:shd w:fill="9EC5F4" w:color="auto" w:val="clear"/>
+            <w:tcMar>
+              <w:top w:type="dxa" w:w="70"/>
+              <w:left w:type="dxa" w:w="90"/>
+              <w:bottom w:type="dxa" w:w="70"/>
+              <w:right w:type="dxa" w:w="90"/>
+            </w:tcMar>
+          </w:tcPr>
+          <w:p>
+            <w:pPr>
+              <w:jc w:val="center"/>
+            </w:pPr>
+            <w:r>
+              <w:rPr>
+                <w:rFonts w:ascii="Calibri" w:cs="Calibri" w:eastAsia="Calibri" w:hAnsi="Calibri"/>
+                <w:b/>
+                <w:bCs/>
+                <w:color w:val="000000"/>
+                <w:sz w:val="18"/>
+                <w:szCs w:val="18"/>
+              </w:rPr>
+              <w:t xml:space="preserve">Oui</w:t>
+            </w:r>
+          </w:p>
+        </w:tc>
+        <w:tc>
+          <w:tcPr>
+            <w:tcW w:type="dxa" w:w="1280"/>
+            <w:tcBorders>
+              <w:top w:val="single" w:color="B7C3D0" w:sz="4"/>
+              <w:left w:val="single" w:color="B7C3D0" w:sz="4"/>
+              <w:bottom w:val="single" w:color="B7C3D0" w:sz="4"/>
+              <w:right w:val="single" w:color="B7C3D0" w:sz="4"/>
+            </w:tcBorders>
+            <w:shd w:fill="FFFFFF" w:color="auto" w:val="clear"/>
+            <w:tcMar>
+              <w:top w:type="dxa" w:w="70"/>
+              <w:left w:type="dxa" w:w="90"/>
+              <w:bottom w:type="dxa" w:w="70"/>
+              <w:right w:type="dxa" w:w="90"/>
+            </w:tcMar>
+          </w:tcPr>
+          <w:p>
+            <w:pPr>
+              <w:jc w:val="center"/>
+            </w:pPr>
+            <w:r>
+              <w:rPr>
+                <w:rFonts w:ascii="Calibri" w:cs="Calibri" w:eastAsia="Calibri" w:hAnsi="Calibri"/>
+                <w:b w:val="false"/>
+                <w:bCs w:val="false"/>
+                <w:color w:val="777777"/>
+                <w:sz w:val="18"/>
+                <w:szCs w:val="18"/>
+              </w:rPr>
+              <w:t xml:space="preserve">Non indiqué</w:t>
+            </w:r>
+          </w:p>
+        </w:tc>
+        <w:tc>
+          <w:tcPr>
+            <w:tcW w:type="dxa" w:w="1280"/>
+            <w:tcBorders>
+              <w:top w:val="single" w:color="B7C3D0" w:sz="4"/>
+              <w:left w:val="single" w:color="B7C3D0" w:sz="4"/>
+              <w:bottom w:val="single" w:color="B7C3D0" w:sz="4"/>
+              <w:right w:val="single" w:color="B7C3D0" w:sz="4"/>
+            </w:tcBorders>
+            <w:shd w:fill="FFFFFF" w:color="auto" w:val="clear"/>
+            <w:tcMar>
+              <w:top w:type="dxa" w:w="70"/>
+              <w:left w:type="dxa" w:w="90"/>
+              <w:bottom w:type="dxa" w:w="70"/>
+              <w:right w:type="dxa" w:w="90"/>
+            </w:tcMar>
+          </w:tcPr>
+          <w:p>
+            <w:pPr>
+              <w:jc w:val="center"/>
+            </w:pPr>
+            <w:r>
+              <w:rPr>
+                <w:rFonts w:ascii="Calibri" w:cs="Calibri" w:eastAsia="Calibri" w:hAnsi="Calibri"/>
+                <w:b w:val="false"/>
+                <w:bCs w:val="false"/>
+                <w:color w:val="777777"/>
+                <w:sz w:val="18"/>
+                <w:szCs w:val="18"/>
+              </w:rPr>
+              <w:t xml:space="preserve">Non indiqué</w:t>
+            </w:r>
+          </w:p>
+        </w:tc>
+      </w:tr>
+      <w:tr>
+        <w:trPr>
+          <w:cantSplit/>
+        </w:trPr>
+        <w:tc>
+          <w:tcPr>
+            <w:tcW w:type="dxa" w:w="3238"/>
+            <w:tcBorders>
+              <w:top w:val="single" w:color="B7C3D0" w:sz="4"/>
+              <w:left w:val="single" w:color="B7C3D0" w:sz="4"/>
+              <w:bottom w:val="single" w:color="B7C3D0" w:sz="4"/>
+              <w:right w:val="single" w:color="B7C3D0" w:sz="4"/>
+            </w:tcBorders>
+            <w:shd w:fill="FFFFFF" w:color="auto" w:val="clear"/>
+            <w:tcMar>
+              <w:top w:type="dxa" w:w="70"/>
+              <w:left w:type="dxa" w:w="90"/>
+              <w:bottom w:type="dxa" w:w="70"/>
+              <w:right w:type="dxa" w:w="90"/>
+            </w:tcMar>
+          </w:tcPr>
+          <w:p>
+            <w:pPr>
+              <w:jc w:val="left"/>
+            </w:pPr>
+            <w:r>
+              <w:rPr>
+                <w:rFonts w:ascii="Calibri" w:cs="Calibri" w:eastAsia="Calibri" w:hAnsi="Calibri"/>
+                <w:b w:val="false"/>
+                <w:bCs w:val="false"/>
+                <w:color w:val="000000"/>
+                <w:sz w:val="18"/>
+                <w:szCs w:val="18"/>
+              </w:rPr>
+              <w:t xml:space="preserve">Opération avec un C2 et discrétion</w:t>
+            </w:r>
+          </w:p>
+        </w:tc>
+        <w:tc>
+          <w:tcPr>
+            <w:tcW w:type="dxa" w:w="1280"/>
+            <w:tcBorders>
+              <w:top w:val="single" w:color="B7C3D0" w:sz="4"/>
+              <w:left w:val="single" w:color="B7C3D0" w:sz="4"/>
+              <w:bottom w:val="single" w:color="B7C3D0" w:sz="4"/>
+              <w:right w:val="single" w:color="B7C3D0" w:sz="4"/>
+            </w:tcBorders>
+            <w:shd w:fill="FFFFFF" w:color="auto" w:val="clear"/>
+            <w:tcMar>
+              <w:top w:type="dxa" w:w="70"/>
+              <w:left w:type="dxa" w:w="90"/>
+              <w:bottom w:type="dxa" w:w="70"/>
+              <w:right w:type="dxa" w:w="90"/>
+            </w:tcMar>
+          </w:tcPr>
+          <w:p>
+            <w:pPr>
+              <w:jc w:val="center"/>
+            </w:pPr>
+            <w:r>
+              <w:rPr>
+                <w:rFonts w:ascii="Calibri" w:cs="Calibri" w:eastAsia="Calibri" w:hAnsi="Calibri"/>
+                <w:b w:val="false"/>
+                <w:bCs w:val="false"/>
+                <w:color w:val="777777"/>
+                <w:sz w:val="18"/>
+                <w:szCs w:val="18"/>
+              </w:rPr>
+              <w:t xml:space="preserve">Non indiqué</w:t>
+            </w:r>
+          </w:p>
+        </w:tc>
+        <w:tc>
+          <w:tcPr>
+            <w:tcW w:type="dxa" w:w="1280"/>
+            <w:tcBorders>
+              <w:top w:val="single" w:color="B7C3D0" w:sz="4"/>
+              <w:left w:val="single" w:color="B7C3D0" w:sz="4"/>
+              <w:bottom w:val="single" w:color="B7C3D0" w:sz="4"/>
+              <w:right w:val="single" w:color="B7C3D0" w:sz="4"/>
+            </w:tcBorders>
+            <w:shd w:fill="FFFFFF" w:color="auto" w:val="clear"/>
+            <w:tcMar>
+              <w:top w:type="dxa" w:w="70"/>
+              <w:left w:type="dxa" w:w="90"/>
+              <w:bottom w:type="dxa" w:w="70"/>
+              <w:right w:type="dxa" w:w="90"/>
+            </w:tcMar>
+          </w:tcPr>
+          <w:p>
+            <w:pPr>
+              <w:jc w:val="center"/>
+            </w:pPr>
+            <w:r>
+              <w:rPr>
+                <w:rFonts w:ascii="Calibri" w:cs="Calibri" w:eastAsia="Calibri" w:hAnsi="Calibri"/>
+                <w:b w:val="false"/>
+                <w:bCs w:val="false"/>
+                <w:color w:val="777777"/>
+                <w:sz w:val="18"/>
+                <w:szCs w:val="18"/>
+              </w:rPr>
+              <w:t xml:space="preserve">Non indiqué</w:t>
+            </w:r>
+          </w:p>
+        </w:tc>
+        <w:tc>
+          <w:tcPr>
+            <w:tcW w:type="dxa" w:w="1280"/>
+            <w:tcBorders>
+              <w:top w:val="single" w:color="B7C3D0" w:sz="4"/>
+              <w:left w:val="single" w:color="B7C3D0" w:sz="4"/>
+              <w:bottom w:val="single" w:color="B7C3D0" w:sz="4"/>
+              <w:right w:val="single" w:color="B7C3D0" w:sz="4"/>
+            </w:tcBorders>
+            <w:shd w:fill="FFFFFF" w:color="auto" w:val="clear"/>
+            <w:tcMar>
+              <w:top w:type="dxa" w:w="70"/>
+              <w:left w:type="dxa" w:w="90"/>
+              <w:bottom w:type="dxa" w:w="70"/>
+              <w:right w:type="dxa" w:w="90"/>
+            </w:tcMar>
+          </w:tcPr>
+          <w:p>
+            <w:pPr>
+              <w:jc w:val="center"/>
+            </w:pPr>
+            <w:r>
+              <w:rPr>
+                <w:rFonts w:ascii="Calibri" w:cs="Calibri" w:eastAsia="Calibri" w:hAnsi="Calibri"/>
+                <w:b w:val="false"/>
+                <w:bCs w:val="false"/>
+                <w:color w:val="777777"/>
+                <w:sz w:val="18"/>
+                <w:szCs w:val="18"/>
+              </w:rPr>
+              <w:t xml:space="preserve">Non indiqué</w:t>
+            </w:r>
+          </w:p>
+        </w:tc>
+        <w:tc>
+          <w:tcPr>
+            <w:tcW w:type="dxa" w:w="1280"/>
+            <w:tcBorders>
+              <w:top w:val="single" w:color="B7C3D0" w:sz="4"/>
+              <w:left w:val="single" w:color="B7C3D0" w:sz="4"/>
+              <w:bottom w:val="single" w:color="B7C3D0" w:sz="4"/>
+              <w:right w:val="single" w:color="B7C3D0" w:sz="4"/>
+            </w:tcBorders>
+            <w:shd w:fill="9EC5F4" w:color="auto" w:val="clear"/>
+            <w:tcMar>
+              <w:top w:type="dxa" w:w="70"/>
+              <w:left w:type="dxa" w:w="90"/>
+              <w:bottom w:type="dxa" w:w="70"/>
+              <w:right w:type="dxa" w:w="90"/>
+            </w:tcMar>
+          </w:tcPr>
+          <w:p>
+            <w:pPr>
+              <w:jc w:val="center"/>
+            </w:pPr>
+            <w:r>
+              <w:rPr>
+                <w:rFonts w:ascii="Calibri" w:cs="Calibri" w:eastAsia="Calibri" w:hAnsi="Calibri"/>
+                <w:b/>
+                <w:bCs/>
+                <w:color w:val="000000"/>
+                <w:sz w:val="18"/>
+                <w:szCs w:val="18"/>
+              </w:rPr>
+              <w:t xml:space="preserve">Oui</w:t>
+            </w:r>
+          </w:p>
+        </w:tc>
+        <w:tc>
+          <w:tcPr>
+            <w:tcW w:type="dxa" w:w="1280"/>
+            <w:tcBorders>
+              <w:top w:val="single" w:color="B7C3D0" w:sz="4"/>
+              <w:left w:val="single" w:color="B7C3D0" w:sz="4"/>
+              <w:bottom w:val="single" w:color="B7C3D0" w:sz="4"/>
+              <w:right w:val="single" w:color="B7C3D0" w:sz="4"/>
+            </w:tcBorders>
+            <w:shd w:fill="9EC5F4" w:color="auto" w:val="clear"/>
+            <w:tcMar>
+              <w:top w:type="dxa" w:w="70"/>
+              <w:left w:type="dxa" w:w="90"/>
+              <w:bottom w:type="dxa" w:w="70"/>
+              <w:right w:type="dxa" w:w="90"/>
+            </w:tcMar>
+          </w:tcPr>
+          <w:p>
+            <w:pPr>
+              <w:jc w:val="center"/>
+            </w:pPr>
+            <w:r>
+              <w:rPr>
+                <w:rFonts w:ascii="Calibri" w:cs="Calibri" w:eastAsia="Calibri" w:hAnsi="Calibri"/>
+                <w:b/>
+                <w:bCs/>
+                <w:color w:val="000000"/>
+                <w:sz w:val="18"/>
+                <w:szCs w:val="18"/>
+              </w:rPr>
+              <w:t xml:space="preserve">Oui</w:t>
+            </w:r>
+          </w:p>
+        </w:tc>
+      </w:tr>
+      <w:tr>
+        <w:trPr>
+          <w:cantSplit/>
+        </w:trPr>
+        <w:tc>
+          <w:tcPr>
+            <w:tcW w:type="dxa" w:w="3238"/>
+            <w:tcBorders>
+              <w:top w:val="single" w:color="B7C3D0" w:sz="4"/>
+              <w:left w:val="single" w:color="B7C3D0" w:sz="4"/>
+              <w:bottom w:val="single" w:color="B7C3D0" w:sz="4"/>
+              <w:right w:val="single" w:color="B7C3D0" w:sz="4"/>
+            </w:tcBorders>
+            <w:shd w:fill="FFFFFF" w:color="auto" w:val="clear"/>
+            <w:tcMar>
+              <w:top w:type="dxa" w:w="70"/>
+              <w:left w:type="dxa" w:w="90"/>
+              <w:bottom w:type="dxa" w:w="70"/>
+              <w:right w:type="dxa" w:w="90"/>
+            </w:tcMar>
+          </w:tcPr>
+          <w:p>
+            <w:pPr>
+              <w:jc w:val="left"/>
+            </w:pPr>
+            <w:r>
+              <w:rPr>
+                <w:rFonts w:ascii="Calibri" w:cs="Calibri" w:eastAsia="Calibri" w:hAnsi="Calibri"/>
+                <w:b w:val="false"/>
+                <w:bCs w:val="false"/>
+                <w:color w:val="000000"/>
+                <w:sz w:val="18"/>
+                <w:szCs w:val="18"/>
+              </w:rPr>
+              <w:t xml:space="preserve">Contournement de défenses avancées en opération</w:t>
+            </w:r>
+          </w:p>
+        </w:tc>
+        <w:tc>
+          <w:tcPr>
+            <w:tcW w:type="dxa" w:w="1280"/>
+            <w:tcBorders>
+              <w:top w:val="single" w:color="B7C3D0" w:sz="4"/>
+              <w:left w:val="single" w:color="B7C3D0" w:sz="4"/>
+              <w:bottom w:val="single" w:color="B7C3D0" w:sz="4"/>
+              <w:right w:val="single" w:color="B7C3D0" w:sz="4"/>
+            </w:tcBorders>
+            <w:shd w:fill="FFFFFF" w:color="auto" w:val="clear"/>
+            <w:tcMar>
+              <w:top w:type="dxa" w:w="70"/>
+              <w:left w:type="dxa" w:w="90"/>
+              <w:bottom w:type="dxa" w:w="70"/>
+              <w:right w:type="dxa" w:w="90"/>
+            </w:tcMar>
+          </w:tcPr>
+          <w:p>
+            <w:pPr>
+              <w:jc w:val="center"/>
+            </w:pPr>
+            <w:r>
+              <w:rPr>
+                <w:rFonts w:ascii="Calibri" w:cs="Calibri" w:eastAsia="Calibri" w:hAnsi="Calibri"/>
+                <w:b w:val="false"/>
+                <w:bCs w:val="false"/>
+                <w:color w:val="777777"/>
+                <w:sz w:val="18"/>
+                <w:szCs w:val="18"/>
+              </w:rPr>
+              <w:t xml:space="preserve">Non indiqué</w:t>
+            </w:r>
+          </w:p>
+        </w:tc>
+        <w:tc>
+          <w:tcPr>
+            <w:tcW w:type="dxa" w:w="1280"/>
+            <w:tcBorders>
+              <w:top w:val="single" w:color="B7C3D0" w:sz="4"/>
+              <w:left w:val="single" w:color="B7C3D0" w:sz="4"/>
+              <w:bottom w:val="single" w:color="B7C3D0" w:sz="4"/>
+              <w:right w:val="single" w:color="B7C3D0" w:sz="4"/>
+            </w:tcBorders>
+            <w:shd w:fill="FFFFFF" w:color="auto" w:val="clear"/>
+            <w:tcMar>
+              <w:top w:type="dxa" w:w="70"/>
+              <w:left w:type="dxa" w:w="90"/>
+              <w:bottom w:type="dxa" w:w="70"/>
+              <w:right w:type="dxa" w:w="90"/>
+            </w:tcMar>
+          </w:tcPr>
+          <w:p>
+            <w:pPr>
+              <w:jc w:val="center"/>
+            </w:pPr>
+            <w:r>
+              <w:rPr>
+                <w:rFonts w:ascii="Calibri" w:cs="Calibri" w:eastAsia="Calibri" w:hAnsi="Calibri"/>
+                <w:b w:val="false"/>
+                <w:bCs w:val="false"/>
+                <w:color w:val="777777"/>
+                <w:sz w:val="18"/>
+                <w:szCs w:val="18"/>
+              </w:rPr>
+              <w:t xml:space="preserve">Non indiqué</w:t>
+            </w:r>
+          </w:p>
+        </w:tc>
+        <w:tc>
+          <w:tcPr>
+            <w:tcW w:type="dxa" w:w="1280"/>
+            <w:tcBorders>
+              <w:top w:val="single" w:color="B7C3D0" w:sz="4"/>
+              <w:left w:val="single" w:color="B7C3D0" w:sz="4"/>
+              <w:bottom w:val="single" w:color="B7C3D0" w:sz="4"/>
+              <w:right w:val="single" w:color="B7C3D0" w:sz="4"/>
+            </w:tcBorders>
+            <w:shd w:fill="FFFFFF" w:color="auto" w:val="clear"/>
+            <w:tcMar>
+              <w:top w:type="dxa" w:w="70"/>
+              <w:left w:type="dxa" w:w="90"/>
+              <w:bottom w:type="dxa" w:w="70"/>
+              <w:right w:type="dxa" w:w="90"/>
+            </w:tcMar>
+          </w:tcPr>
+          <w:p>
+            <w:pPr>
+              <w:jc w:val="center"/>
+            </w:pPr>
+            <w:r>
+              <w:rPr>
+                <w:rFonts w:ascii="Calibri" w:cs="Calibri" w:eastAsia="Calibri" w:hAnsi="Calibri"/>
+                <w:b w:val="false"/>
+                <w:bCs w:val="false"/>
+                <w:color w:val="777777"/>
+                <w:sz w:val="18"/>
+                <w:szCs w:val="18"/>
+              </w:rPr>
+              <w:t xml:space="preserve">Non indiqué</w:t>
+            </w:r>
+          </w:p>
+        </w:tc>
+        <w:tc>
+          <w:tcPr>
+            <w:tcW w:type="dxa" w:w="1280"/>
+            <w:tcBorders>
+              <w:top w:val="single" w:color="B7C3D0" w:sz="4"/>
+              <w:left w:val="single" w:color="B7C3D0" w:sz="4"/>
+              <w:bottom w:val="single" w:color="B7C3D0" w:sz="4"/>
+              <w:right w:val="single" w:color="B7C3D0" w:sz="4"/>
+            </w:tcBorders>
+            <w:shd w:fill="DCEAFB" w:color="auto" w:val="clear"/>
+            <w:tcMar>
+              <w:top w:type="dxa" w:w="70"/>
+              <w:left w:type="dxa" w:w="90"/>
+              <w:bottom w:type="dxa" w:w="70"/>
+              <w:right w:type="dxa" w:w="90"/>
+            </w:tcMar>
+          </w:tcPr>
+          <w:p>
+            <w:pPr>
+              <w:jc w:val="center"/>
+            </w:pPr>
+            <w:r>
+              <w:rPr>
+                <w:rFonts w:ascii="Calibri" w:cs="Calibri" w:eastAsia="Calibri" w:hAnsi="Calibri"/>
+                <w:b w:val="false"/>
+                <w:bCs w:val="false"/>
+                <w:color w:val="000000"/>
+                <w:sz w:val="18"/>
+                <w:szCs w:val="18"/>
+              </w:rPr>
+              <w:t xml:space="preserve">Partiel</w:t>
+            </w:r>
+          </w:p>
+        </w:tc>
+        <w:tc>
+          <w:tcPr>
+            <w:tcW w:type="dxa" w:w="1280"/>
+            <w:tcBorders>
+              <w:top w:val="single" w:color="B7C3D0" w:sz="4"/>
+              <w:left w:val="single" w:color="B7C3D0" w:sz="4"/>
+              <w:bottom w:val="single" w:color="B7C3D0" w:sz="4"/>
+              <w:right w:val="single" w:color="B7C3D0" w:sz="4"/>
+            </w:tcBorders>
+            <w:shd w:fill="9EC5F4" w:color="auto" w:val="clear"/>
+            <w:tcMar>
+              <w:top w:type="dxa" w:w="70"/>
+              <w:left w:type="dxa" w:w="90"/>
+              <w:bottom w:type="dxa" w:w="70"/>
+              <w:right w:type="dxa" w:w="90"/>
+            </w:tcMar>
+          </w:tcPr>
+          <w:p>
+            <w:pPr>
+              <w:jc w:val="center"/>
+            </w:pPr>
+            <w:r>
+              <w:rPr>
+                <w:rFonts w:ascii="Calibri" w:cs="Calibri" w:eastAsia="Calibri" w:hAnsi="Calibri"/>
+                <w:b/>
+                <w:bCs/>
+                <w:color w:val="000000"/>
+                <w:sz w:val="18"/>
+                <w:szCs w:val="18"/>
+              </w:rPr>
+              <w:t xml:space="preserve">Oui</w:t>
+            </w:r>
+          </w:p>
+        </w:tc>
+      </w:tr>
+      <w:tr>
+        <w:trPr>
+          <w:cantSplit/>
+        </w:trPr>
+        <w:tc>
+          <w:tcPr>
+            <w:tcW w:type="dxa" w:w="3238"/>
+            <w:tcBorders>
+              <w:top w:val="single" w:color="B7C3D0" w:sz="4"/>
+              <w:left w:val="single" w:color="B7C3D0" w:sz="4"/>
+              <w:bottom w:val="single" w:color="B7C3D0" w:sz="4"/>
+              <w:right w:val="single" w:color="B7C3D0" w:sz="4"/>
+            </w:tcBorders>
+            <w:shd w:fill="FFFFFF" w:color="auto" w:val="clear"/>
+            <w:tcMar>
+              <w:top w:type="dxa" w:w="70"/>
+              <w:left w:type="dxa" w:w="90"/>
+              <w:bottom w:type="dxa" w:w="70"/>
+              <w:right w:type="dxa" w:w="90"/>
+            </w:tcMar>
+          </w:tcPr>
+          <w:p>
+            <w:pPr>
+              <w:jc w:val="left"/>
+            </w:pPr>
+            <w:r>
+              <w:rPr>
+                <w:rFonts w:ascii="Calibri" w:cs="Calibri" w:eastAsia="Calibri" w:hAnsi="Calibri"/>
+                <w:b w:val="false"/>
+                <w:bCs w:val="false"/>
+                <w:color w:val="000000"/>
+                <w:sz w:val="18"/>
+                <w:szCs w:val="18"/>
+              </w:rPr>
+              <w:t xml:space="preserve">Génie logiciel (tests, qualité, intégration continue)</w:t>
+            </w:r>
+          </w:p>
+        </w:tc>
+        <w:tc>
+          <w:tcPr>
+            <w:tcW w:type="dxa" w:w="1280"/>
+            <w:tcBorders>
+              <w:top w:val="single" w:color="B7C3D0" w:sz="4"/>
+              <w:left w:val="single" w:color="B7C3D0" w:sz="4"/>
+              <w:bottom w:val="single" w:color="B7C3D0" w:sz="4"/>
+              <w:right w:val="single" w:color="B7C3D0" w:sz="4"/>
+            </w:tcBorders>
+            <w:shd w:fill="FFFFFF" w:color="auto" w:val="clear"/>
+            <w:tcMar>
+              <w:top w:type="dxa" w:w="70"/>
+              <w:left w:type="dxa" w:w="90"/>
+              <w:bottom w:type="dxa" w:w="70"/>
+              <w:right w:type="dxa" w:w="90"/>
+            </w:tcMar>
+          </w:tcPr>
+          <w:p>
+            <w:pPr>
+              <w:jc w:val="center"/>
+            </w:pPr>
+            <w:r>
+              <w:rPr>
+                <w:rFonts w:ascii="Calibri" w:cs="Calibri" w:eastAsia="Calibri" w:hAnsi="Calibri"/>
+                <w:b w:val="false"/>
+                <w:bCs w:val="false"/>
+                <w:color w:val="777777"/>
+                <w:sz w:val="18"/>
+                <w:szCs w:val="18"/>
+              </w:rPr>
+              <w:t xml:space="preserve">Non indiqué</w:t>
+            </w:r>
+          </w:p>
+        </w:tc>
+        <w:tc>
+          <w:tcPr>
+            <w:tcW w:type="dxa" w:w="1280"/>
+            <w:tcBorders>
+              <w:top w:val="single" w:color="B7C3D0" w:sz="4"/>
+              <w:left w:val="single" w:color="B7C3D0" w:sz="4"/>
+              <w:bottom w:val="single" w:color="B7C3D0" w:sz="4"/>
+              <w:right w:val="single" w:color="B7C3D0" w:sz="4"/>
+            </w:tcBorders>
+            <w:shd w:fill="FFFFFF" w:color="auto" w:val="clear"/>
+            <w:tcMar>
+              <w:top w:type="dxa" w:w="70"/>
+              <w:left w:type="dxa" w:w="90"/>
+              <w:bottom w:type="dxa" w:w="70"/>
+              <w:right w:type="dxa" w:w="90"/>
+            </w:tcMar>
+          </w:tcPr>
+          <w:p>
+            <w:pPr>
+              <w:jc w:val="center"/>
+            </w:pPr>
+            <w:r>
+              <w:rPr>
+                <w:rFonts w:ascii="Calibri" w:cs="Calibri" w:eastAsia="Calibri" w:hAnsi="Calibri"/>
+                <w:b w:val="false"/>
+                <w:bCs w:val="false"/>
+                <w:color w:val="777777"/>
+                <w:sz w:val="18"/>
+                <w:szCs w:val="18"/>
+              </w:rPr>
+              <w:t xml:space="preserve">Non indiqué</w:t>
+            </w:r>
+          </w:p>
+        </w:tc>
+        <w:tc>
+          <w:tcPr>
+            <w:tcW w:type="dxa" w:w="1280"/>
+            <w:tcBorders>
+              <w:top w:val="single" w:color="B7C3D0" w:sz="4"/>
+              <w:left w:val="single" w:color="B7C3D0" w:sz="4"/>
+              <w:bottom w:val="single" w:color="B7C3D0" w:sz="4"/>
+              <w:right w:val="single" w:color="B7C3D0" w:sz="4"/>
+            </w:tcBorders>
+            <w:shd w:fill="FFFFFF" w:color="auto" w:val="clear"/>
+            <w:tcMar>
+              <w:top w:type="dxa" w:w="70"/>
+              <w:left w:type="dxa" w:w="90"/>
+              <w:bottom w:type="dxa" w:w="70"/>
+              <w:right w:type="dxa" w:w="90"/>
+            </w:tcMar>
+          </w:tcPr>
+          <w:p>
+            <w:pPr>
+              <w:jc w:val="center"/>
+            </w:pPr>
+            <w:r>
+              <w:rPr>
+                <w:rFonts w:ascii="Calibri" w:cs="Calibri" w:eastAsia="Calibri" w:hAnsi="Calibri"/>
+                <w:b w:val="false"/>
+                <w:bCs w:val="false"/>
+                <w:color w:val="777777"/>
+                <w:sz w:val="18"/>
+                <w:szCs w:val="18"/>
+              </w:rPr>
+              <w:t xml:space="preserve">Non indiqué</w:t>
+            </w:r>
+          </w:p>
+        </w:tc>
+        <w:tc>
+          <w:tcPr>
+            <w:tcW w:type="dxa" w:w="1280"/>
+            <w:tcBorders>
+              <w:top w:val="single" w:color="B7C3D0" w:sz="4"/>
+              <w:left w:val="single" w:color="B7C3D0" w:sz="4"/>
+              <w:bottom w:val="single" w:color="B7C3D0" w:sz="4"/>
+              <w:right w:val="single" w:color="B7C3D0" w:sz="4"/>
+            </w:tcBorders>
+            <w:shd w:fill="FFFFFF" w:color="auto" w:val="clear"/>
+            <w:tcMar>
+              <w:top w:type="dxa" w:w="70"/>
+              <w:left w:type="dxa" w:w="90"/>
+              <w:bottom w:type="dxa" w:w="70"/>
+              <w:right w:type="dxa" w:w="90"/>
+            </w:tcMar>
+          </w:tcPr>
+          <w:p>
+            <w:pPr>
+              <w:jc w:val="center"/>
+            </w:pPr>
+            <w:r>
+              <w:rPr>
+                <w:rFonts w:ascii="Calibri" w:cs="Calibri" w:eastAsia="Calibri" w:hAnsi="Calibri"/>
+                <w:b w:val="false"/>
+                <w:bCs w:val="false"/>
+                <w:color w:val="777777"/>
+                <w:sz w:val="18"/>
+                <w:szCs w:val="18"/>
+              </w:rPr>
+              <w:t xml:space="preserve">Non indiqué</w:t>
+            </w:r>
+          </w:p>
+        </w:tc>
+        <w:tc>
+          <w:tcPr>
+            <w:tcW w:type="dxa" w:w="1280"/>
+            <w:tcBorders>
+              <w:top w:val="single" w:color="B7C3D0" w:sz="4"/>
+              <w:left w:val="single" w:color="B7C3D0" w:sz="4"/>
+              <w:bottom w:val="single" w:color="B7C3D0" w:sz="4"/>
+              <w:right w:val="single" w:color="B7C3D0" w:sz="4"/>
+            </w:tcBorders>
+            <w:shd w:fill="FFFFFF" w:color="auto" w:val="clear"/>
+            <w:tcMar>
+              <w:top w:type="dxa" w:w="70"/>
+              <w:left w:type="dxa" w:w="90"/>
+              <w:bottom w:type="dxa" w:w="70"/>
+              <w:right w:type="dxa" w:w="90"/>
+            </w:tcMar>
+          </w:tcPr>
+          <w:p>
+            <w:pPr>
+              <w:jc w:val="center"/>
+            </w:pPr>
+            <w:r>
+              <w:rPr>
+                <w:rFonts w:ascii="Calibri" w:cs="Calibri" w:eastAsia="Calibri" w:hAnsi="Calibri"/>
+                <w:b w:val="false"/>
+                <w:bCs w:val="false"/>
+                <w:color w:val="777777"/>
+                <w:sz w:val="18"/>
+                <w:szCs w:val="18"/>
+              </w:rPr>
+              <w:t xml:space="preserve">Non indiqué</w:t>
+            </w:r>
+          </w:p>
+        </w:tc>
+      </w:tr>
+    </w:tbl>
+    <w:p>
+      <w:pPr>
+        <w:spacing w:after="160"/>
+        <w:jc w:val="left"/>
+      </w:pPr>
+      <w:r>
+        <w:rPr>
+          <w:rFonts w:ascii="Calibri" w:cs="Calibri" w:eastAsia="Calibri" w:hAnsi="Calibri"/>
+          <w:b w:val="false"/>
+          <w:bCs w:val="false"/>
+          <w:i/>
+          <w:iCs/>
+          <w:color w:val="444444"/>
+          <w:sz w:val="18"/>
+          <w:szCs w:val="18"/>
+        </w:rPr>
+        <w:t xml:space="preserve"/>
+      </w:r>
+      <w:r>
+        <w:rPr>
+          <w:rFonts w:ascii="Calibri" w:cs="Calibri" w:eastAsia="Calibri" w:hAnsi="Calibri"/>
+          <w:b/>
+          <w:bCs/>
+          <w:i/>
+          <w:iCs/>
+          <w:color w:val="444444"/>
+          <w:sz w:val="18"/>
+          <w:szCs w:val="18"/>
+        </w:rPr>
+        <w:t xml:space="preserve">Tableau de couverture (avis de lecture).</w:t>
+      </w:r>
+      <w:r>
+        <w:rPr>
+          <w:rFonts w:ascii="Calibri" w:cs="Calibri" w:eastAsia="Calibri" w:hAnsi="Calibri"/>
+          <w:b w:val="false"/>
+          <w:bCs w:val="false"/>
+          <w:i/>
+          <w:iCs/>
+          <w:color w:val="444444"/>
+          <w:sz w:val="18"/>
+          <w:szCs w:val="18"/>
+        </w:rPr>
+        <w:t xml:space="preserve"> « Oui » : couvert d'après une source citée en fin de document ; « Partiel » : couvert en partie ou à confirmer ; « Non indiqué » : les sources consultées ne le mentionnent pas, ce qui ne prouve pas l'absence. Les programmes de Sektor7 et de Maldev Academy n'ont été lus que par extraits ; le cours CRTL est jugé d'après des retours de 2022 et 2023. Lecture : les lignes vides signalent ce qu'aucune de tes formations ne t'apprendra, en particulier le génie logiciel.</w:t>
+      </w:r>
+    </w:p>
+    <w:p>
+      <w:pPr>
         <w:pStyle w:val="Heading2"/>
         <w:keepNext/>
       </w:pPr>
@@ -3750,7 +5647,7 @@
     <w:p>
       <w:pPr>
         <w:sectPr>
-          <w:footerReference w:type="default" r:id="rId7"/>
+          <w:footerReference w:type="default" r:id="rId9"/>
           <w:pgSz w:w="11906" w:h="16838" w:orient="portrait"/>
           <w:pgMar w:top="1134" w:right="1134" w:bottom="1134" w:left="1134" w:header="708" w:footer="708" w:gutter="0"/>
           <w:pgNumType/>
@@ -4746,7 +6643,7 @@
     </w:p>
     <w:p>
       <w:pPr>
-        <w:keepNext w:val="false"/>
+        <w:keepNext/>
         <w:spacing w:after="120" w:before="0" w:line="276"/>
         <w:jc w:val="both"/>
       </w:pPr>
@@ -5457,6 +7354,98 @@
           <w:szCs w:val="19"/>
         </w:rPr>
         <w:t xml:space="preserve">Avis : le M2 aura sa propre charge scolaire (cours et éventuels projets ; tu m'as indiqué qu'il n'y a ni mémoire ni soutenance). Si l'école dépasse 1 h par semaine en moyenne, c'est le lab qui cède en premier, jamais le projet logiciel.</w:t>
+      </w:r>
+    </w:p>
+    <w:p>
+      <w:pPr>
+        <w:keepNext/>
+        <w:spacing w:after="60" w:before="60"/>
+        <w:jc w:val="center"/>
+      </w:pPr>
+      <w:r>
+        <w:drawing>
+          <wp:inline distT="0" distB="0" distL="0" distR="0">
+            <wp:extent cx="8572500" cy="3733800"/>
+            <wp:effectExtent t="0" r="0" b="0" l="0"/>
+            <wp:docPr id="1" name="fig3_semaine.png" descr="Barres empilées de la répartition des 15 heures d'une semaine d'entreprise entre formation principale, lab, programmation et projets, reverse engineering, rédaction et candidatures, école et revue, pour cinq phases de octobre 2026 à l'été 2028." title="Figure 2 : semaine type par phase"/>
+            <wp:cNvGraphicFramePr>
+              <a:graphicFrameLocks xmlns:a="http://schemas.openxmlformats.org/drawingml/2006/main" noChangeAspect="1"/>
+            </wp:cNvGraphicFramePr>
+            <a:graphic xmlns:a="http://schemas.openxmlformats.org/drawingml/2006/main">
+              <a:graphicData uri="http://schemas.openxmlformats.org/drawingml/2006/picture">
+                <pic:pic xmlns:pic="http://schemas.openxmlformats.org/drawingml/2006/picture">
+                  <pic:nvPicPr>
+                    <pic:cNvPr id="0" name="" descr=""/>
+                    <pic:cNvPicPr>
+                      <a:picLocks noChangeAspect="1" noChangeArrowheads="1"/>
+                    </pic:cNvPicPr>
+                  </pic:nvPicPr>
+                  <pic:blipFill>
+                    <a:blip r:embed="rId16" cstate="none"/>
+                    <a:srcRect/>
+                    <a:stretch>
+                      <a:fillRect/>
+                    </a:stretch>
+                  </pic:blipFill>
+                  <pic:spPr bwMode="auto">
+                    <a:xfrm>
+                      <a:off x="0" y="0"/>
+                      <a:ext cx="8572500" cy="3733800"/>
+                    </a:xfrm>
+                    <a:prstGeom prst="rect">
+                      <a:avLst/>
+                    </a:prstGeom>
+                  </pic:spPr>
+                </pic:pic>
+              </a:graphicData>
+            </a:graphic>
+          </wp:inline>
+        </w:drawing>
+      </w:r>
+    </w:p>
+    <w:p>
+      <w:pPr>
+        <w:spacing w:after="160"/>
+        <w:jc w:val="left"/>
+      </w:pPr>
+      <w:r>
+        <w:rPr>
+          <w:rFonts w:ascii="Calibri" w:cs="Calibri" w:eastAsia="Calibri" w:hAnsi="Calibri"/>
+          <w:b w:val="false"/>
+          <w:bCs w:val="false"/>
+          <w:i/>
+          <w:iCs/>
+          <w:color w:val="444444"/>
+          <w:sz w:val="18"/>
+          <w:szCs w:val="18"/>
+        </w:rPr>
+        <w:t xml:space="preserve"/>
+      </w:r>
+      <w:r>
+        <w:rPr>
+          <w:rFonts w:ascii="Calibri" w:cs="Calibri" w:eastAsia="Calibri" w:hAnsi="Calibri"/>
+          <w:b/>
+          <w:bCs/>
+          <w:i/>
+          <w:iCs/>
+          <w:color w:val="444444"/>
+          <w:sz w:val="18"/>
+          <w:szCs w:val="18"/>
+        </w:rPr>
+        <w:t xml:space="preserve">Figure 2.</w:t>
+      </w:r>
+      <w:r>
+        <w:rPr>
+          <w:rFonts w:ascii="Calibri" w:cs="Calibri" w:eastAsia="Calibri" w:hAnsi="Calibri"/>
+          <w:b w:val="false"/>
+          <w:bCs w:val="false"/>
+          <w:i/>
+          <w:iCs/>
+          <w:color w:val="444444"/>
+          <w:sz w:val="18"/>
+          <w:szCs w:val="18"/>
+        </w:rPr>
+        <w:t xml:space="preserve"> Répartition d'une semaine d'entreprise (15 h) par phase. Les semaines d'école (9 h 30) suivent les mêmes proportions, détaillées dans le tableau ci-dessus.</w:t>
       </w:r>
     </w:p>
     <w:p>
@@ -6493,7 +8482,7 @@
                 <w:sz w:val="17"/>
                 <w:szCs w:val="17"/>
               </w:rPr>
-              <w:t xml:space="preserve">Examen BSCP début février. Une semaine de coupure. CRTO à partir de mi-février. Lab : début de RastaLabs.</w:t>
+              <w:t xml:space="preserve">Examen BSCP début février. Une semaine de coupure. CRTO à partir de mi-février. Lab : début de RastaLabs (version plafonnée à environ 60 h).</w:t>
             </w:r>
           </w:p>
         </w:tc>
@@ -7207,7 +9196,7 @@
                 <w:sz w:val="17"/>
                 <w:szCs w:val="17"/>
               </w:rPr>
-              <w:t xml:space="preserve">Examen CRTO. Maldev Academy (début fin juin, avec la table de correspondance Sektor7). Lab : début de Shinra (EDR et SOC simulés).</w:t>
+              <w:t xml:space="preserve">Examen CRTO. Maldev Academy (début fin juin, avec la table de correspondance Sektor7). Lab : début de Shinra (EDR et SOC simulés), version plafonnée à environ 65 h.</w:t>
             </w:r>
           </w:p>
         </w:tc>
@@ -7822,7 +9811,7 @@
     <w:p>
       <w:pPr>
         <w:sectPr>
-          <w:footerReference w:type="default" r:id="rId8"/>
+          <w:footerReference w:type="default" r:id="rId10"/>
           <w:pgSz w:w="16838" w:h="11906" w:orient="landscape"/>
           <w:pgMar w:top="1134" w:right="1134" w:bottom="1134" w:left="1134" w:header="708" w:footer="708" w:gutter="0"/>
           <w:pgNumType/>
@@ -18922,7 +20911,7 @@
                 <w:sz w:val="17"/>
                 <w:szCs w:val="17"/>
               </w:rPr>
-              <w:t xml:space="preserve">Inclus dans ton achat (conditions à vérifier)</w:t>
+              <w:t xml:space="preserve">Inclus dans ton achat (confirmé par toi ; heures et expiration à vérifier)</w:t>
             </w:r>
           </w:p>
         </w:tc>
@@ -25332,6 +27321,98 @@
     </w:tbl>
     <w:p>
       <w:pPr>
+        <w:keepNext/>
+        <w:spacing w:after="60" w:before="60"/>
+        <w:jc w:val="center"/>
+      </w:pPr>
+      <w:r>
+        <w:drawing>
+          <wp:inline distT="0" distB="0" distL="0" distR="0">
+            <wp:extent cx="8382000" cy="4476750"/>
+            <wp:effectExtent t="0" r="0" b="0" l="0"/>
+            <wp:docPr id="1" name="fig4_labs.png" descr="Nuage de points montrant, pour chaque lab, la durée d'un lab terminé en heures et la note de réalisme sur 5, avec trois catégories : dans le plan, conditionnel ou optionnel, à éviter." title="Figure 3 : réalisme et durée des labs"/>
+            <wp:cNvGraphicFramePr>
+              <a:graphicFrameLocks xmlns:a="http://schemas.openxmlformats.org/drawingml/2006/main" noChangeAspect="1"/>
+            </wp:cNvGraphicFramePr>
+            <a:graphic xmlns:a="http://schemas.openxmlformats.org/drawingml/2006/main">
+              <a:graphicData uri="http://schemas.openxmlformats.org/drawingml/2006/picture">
+                <pic:pic xmlns:pic="http://schemas.openxmlformats.org/drawingml/2006/picture">
+                  <pic:nvPicPr>
+                    <pic:cNvPr id="0" name="" descr=""/>
+                    <pic:cNvPicPr>
+                      <a:picLocks noChangeAspect="1" noChangeArrowheads="1"/>
+                    </pic:cNvPicPr>
+                  </pic:nvPicPr>
+                  <pic:blipFill>
+                    <a:blip r:embed="rId17" cstate="none"/>
+                    <a:srcRect/>
+                    <a:stretch>
+                      <a:fillRect/>
+                    </a:stretch>
+                  </pic:blipFill>
+                  <pic:spPr bwMode="auto">
+                    <a:xfrm>
+                      <a:off x="0" y="0"/>
+                      <a:ext cx="8382000" cy="4476750"/>
+                    </a:xfrm>
+                    <a:prstGeom prst="rect">
+                      <a:avLst/>
+                    </a:prstGeom>
+                  </pic:spPr>
+                </pic:pic>
+              </a:graphicData>
+            </a:graphic>
+          </wp:inline>
+        </w:drawing>
+      </w:r>
+    </w:p>
+    <w:p>
+      <w:pPr>
+        <w:spacing w:after="160"/>
+        <w:jc w:val="left"/>
+      </w:pPr>
+      <w:r>
+        <w:rPr>
+          <w:rFonts w:ascii="Calibri" w:cs="Calibri" w:eastAsia="Calibri" w:hAnsi="Calibri"/>
+          <w:b w:val="false"/>
+          <w:bCs w:val="false"/>
+          <w:i/>
+          <w:iCs/>
+          <w:color w:val="444444"/>
+          <w:sz w:val="18"/>
+          <w:szCs w:val="18"/>
+        </w:rPr>
+        <w:t xml:space="preserve"/>
+      </w:r>
+      <w:r>
+        <w:rPr>
+          <w:rFonts w:ascii="Calibri" w:cs="Calibri" w:eastAsia="Calibri" w:hAnsi="Calibri"/>
+          <w:b/>
+          <w:bCs/>
+          <w:i/>
+          <w:iCs/>
+          <w:color w:val="444444"/>
+          <w:sz w:val="18"/>
+          <w:szCs w:val="18"/>
+        </w:rPr>
+        <w:t xml:space="preserve">Figure 3.</w:t>
+      </w:r>
+      <w:r>
+        <w:rPr>
+          <w:rFonts w:ascii="Calibri" w:cs="Calibri" w:eastAsia="Calibri" w:hAnsi="Calibri"/>
+          <w:b w:val="false"/>
+          <w:bCs w:val="false"/>
+          <w:i/>
+          <w:iCs/>
+          <w:color w:val="444444"/>
+          <w:sz w:val="18"/>
+          <w:szCs w:val="18"/>
+        </w:rPr>
+        <w:t xml:space="preserve"> Note de réalisme (avis) et durée d'un lab terminé, pour les labs de l'étude. Les notes sont mes avis et non des mesures. Les labs sans durée connue (par exemple les labs inclus au CRTO) ne figurent pas.</w:t>
+      </w:r>
+    </w:p>
+    <w:p>
+      <w:pPr>
         <w:pStyle w:val="Heading2"/>
         <w:keepNext/>
       </w:pPr>
@@ -25356,7 +27437,7 @@
           <w:i w:val="false"/>
           <w:iCs w:val="false"/>
         </w:rPr>
-        <w:t xml:space="preserve">Base de calcul (avis) : 5 h par semaine en entreprise et 3 h à l'école donnent environ 18 à 20 h de lab par mois. Conséquence directe : </w:t>
+        <w:t xml:space="preserve">Base de calcul (avis) : 5 h par semaine en entreprise et 3 h à l'école donnent environ 18 à 20 h de lab par mois. Ton abonnement se termine en octobre 2027. Estimation (avis) des heures de lab disponibles d'ici là, à 4,3 h par semaine en moyenne (5 h en entreprise, 3 h à l'école) : environ 39 h de mi-octobre à mi-décembre 2026, 9 h de mi-décembre à début janvier (le lab s'arrête trois semaines avant la BSCP), 60 h de mi-février à mai 2027 et 60 h de juin à septembre 2027, soit </w:t>
       </w:r>
       <w:r>
         <w:rPr>
@@ -25366,7 +27447,7 @@
           <w:i w:val="false"/>
           <w:iCs w:val="false"/>
         </w:rPr>
-        <w:t xml:space="preserve">ton abonnement annuel permet environ deux grands labs et quelques labs courts</w:t>
+        <w:t xml:space="preserve">environ 170 h au total</w:t>
       </w:r>
       <w:r>
         <w:rPr>
@@ -25376,7 +27457,27 @@
           <w:i w:val="false"/>
           <w:iCs w:val="false"/>
         </w:rPr>
-        <w:t xml:space="preserve">, pas davantage. Ton abonnement se termine en octobre 2027. Entre octobre 2026 et octobre 2027, la préparation de la BSCP supprime environ dix semaines de lab : il reste à mon avis 150 à 170 h de lab, ce qui permet RastaLabs plafonné à 75 h et Shinra, mais pas Ifrit en plus sans renouvellement ou sans réduire RastaLabs.</w:t>
+        <w:t xml:space="preserve">. Conséquence directe : </w:t>
+      </w:r>
+      <w:r>
+        <w:rPr>
+          <w:rFonts w:ascii="Calibri" w:cs="Calibri" w:eastAsia="Calibri" w:hAnsi="Calibri"/>
+          <w:b/>
+          <w:bCs/>
+          <w:i w:val="false"/>
+          <w:iCs w:val="false"/>
+        </w:rPr>
+        <w:t xml:space="preserve">tu peux faire trois labs courts avant la BSCP, puis RastaLabs et Shinra en version plafonnée à environ 60 et 65 h</w:t>
+      </w:r>
+      <w:r>
+        <w:rPr>
+          <w:rFonts w:ascii="Calibri" w:cs="Calibri" w:eastAsia="Calibri" w:hAnsi="Calibri"/>
+          <w:b w:val="false"/>
+          <w:bCs w:val="false"/>
+          <w:i w:val="false"/>
+          <w:iCs w:val="false"/>
+        </w:rPr>
+        <w:t xml:space="preserve">, c'est-à-dire en visant les objectifs principaux et non l'exhaustivité des drapeaux. Ifrit ne tient pas dans l'abonnement actuel : il suppose un renouvellement (voir la figure 4).</w:t>
       </w:r>
     </w:p>
     <w:tbl>
@@ -26083,7 +28184,7 @@
                 <w:sz w:val="17"/>
                 <w:szCs w:val="17"/>
               </w:rPr>
-              <w:t xml:space="preserve">70 à 90 (plafond conseillé : 75)</w:t>
+              <w:t xml:space="preserve">55 à 65 (plafond conseillé : 60)</w:t>
             </w:r>
           </w:p>
         </w:tc>
@@ -26118,7 +28219,7 @@
                 <w:sz w:val="17"/>
                 <w:szCs w:val="17"/>
               </w:rPr>
-              <w:t xml:space="preserve">Plafonner : chaque heure en plus retire de la place à Shinra, que je classe plus haut pour ton objectif.</w:t>
+              <w:t xml:space="preserve">Version plafonnée : une durée complète est de 80 à 100 h. Chaque heure en plus retire de la place à Shinra, plus directement lié à l'évasion.</w:t>
             </w:r>
           </w:p>
         </w:tc>
@@ -26226,7 +28327,7 @@
                 <w:sz w:val="17"/>
                 <w:szCs w:val="17"/>
               </w:rPr>
-              <w:t xml:space="preserve">70 à 90</w:t>
+              <w:t xml:space="preserve">60 à 70 (plafond conseillé : 65)</w:t>
             </w:r>
           </w:p>
         </w:tc>
@@ -26260,7 +28361,7 @@
                 <w:sz w:val="17"/>
                 <w:szCs w:val="17"/>
               </w:rPr>
-              <w:t xml:space="preserve">Après le CRTO : c'est volontaire. À terminer avant l'expiration de l'abonnement en octobre 2027 (date exacte à vérifier dans ton compte).</w:t>
+              <w:t xml:space="preserve">Après le CRTO : c'est volontaire. Version plafonnée (durée complète : 70 à 100 h). À terminer avant l'expiration de l'abonnement en octobre 2027 (date exacte à vérifier dans ton compte).</w:t>
             </w:r>
           </w:p>
         </w:tc>
@@ -26842,6 +28943,98 @@
         </w:tc>
       </w:tr>
     </w:tbl>
+    <w:p>
+      <w:pPr>
+        <w:keepNext/>
+        <w:spacing w:after="60" w:before="60"/>
+        <w:jc w:val="center"/>
+      </w:pPr>
+      <w:r>
+        <w:drawing>
+          <wp:inline distT="0" distB="0" distL="0" distR="0">
+            <wp:extent cx="7620000" cy="3467100"/>
+            <wp:effectExtent t="0" r="0" b="0" l="0"/>
+            <wp:docPr id="1" name="fig2_capacite.png" descr="Barres groupées comparant, pour cinq périodes, les heures de lab disponibles, les heures prévues dans le plan en version plafonnée et la durée complète du lab correspondant." title="Figure 4 : capacité de lab et plan"/>
+            <wp:cNvGraphicFramePr>
+              <a:graphicFrameLocks xmlns:a="http://schemas.openxmlformats.org/drawingml/2006/main" noChangeAspect="1"/>
+            </wp:cNvGraphicFramePr>
+            <a:graphic xmlns:a="http://schemas.openxmlformats.org/drawingml/2006/main">
+              <a:graphicData uri="http://schemas.openxmlformats.org/drawingml/2006/picture">
+                <pic:pic xmlns:pic="http://schemas.openxmlformats.org/drawingml/2006/picture">
+                  <pic:nvPicPr>
+                    <pic:cNvPr id="0" name="" descr=""/>
+                    <pic:cNvPicPr>
+                      <a:picLocks noChangeAspect="1" noChangeArrowheads="1"/>
+                    </pic:cNvPicPr>
+                  </pic:nvPicPr>
+                  <pic:blipFill>
+                    <a:blip r:embed="rId18" cstate="none"/>
+                    <a:srcRect/>
+                    <a:stretch>
+                      <a:fillRect/>
+                    </a:stretch>
+                  </pic:blipFill>
+                  <pic:spPr bwMode="auto">
+                    <a:xfrm>
+                      <a:off x="0" y="0"/>
+                      <a:ext cx="7620000" cy="3467100"/>
+                    </a:xfrm>
+                    <a:prstGeom prst="rect">
+                      <a:avLst/>
+                    </a:prstGeom>
+                  </pic:spPr>
+                </pic:pic>
+              </a:graphicData>
+            </a:graphic>
+          </wp:inline>
+        </w:drawing>
+      </w:r>
+    </w:p>
+    <w:p>
+      <w:pPr>
+        <w:spacing w:after="160"/>
+        <w:jc w:val="left"/>
+      </w:pPr>
+      <w:r>
+        <w:rPr>
+          <w:rFonts w:ascii="Calibri" w:cs="Calibri" w:eastAsia="Calibri" w:hAnsi="Calibri"/>
+          <w:b w:val="false"/>
+          <w:bCs w:val="false"/>
+          <w:i/>
+          <w:iCs/>
+          <w:color w:val="444444"/>
+          <w:sz w:val="18"/>
+          <w:szCs w:val="18"/>
+        </w:rPr>
+        <w:t xml:space="preserve"/>
+      </w:r>
+      <w:r>
+        <w:rPr>
+          <w:rFonts w:ascii="Calibri" w:cs="Calibri" w:eastAsia="Calibri" w:hAnsi="Calibri"/>
+          <w:b/>
+          <w:bCs/>
+          <w:i/>
+          <w:iCs/>
+          <w:color w:val="444444"/>
+          <w:sz w:val="18"/>
+          <w:szCs w:val="18"/>
+        </w:rPr>
+        <w:t xml:space="preserve">Figure 4.</w:t>
+      </w:r>
+      <w:r>
+        <w:rPr>
+          <w:rFonts w:ascii="Calibri" w:cs="Calibri" w:eastAsia="Calibri" w:hAnsi="Calibri"/>
+          <w:b w:val="false"/>
+          <w:bCs w:val="false"/>
+          <w:i/>
+          <w:iCs/>
+          <w:color w:val="444444"/>
+          <w:sz w:val="18"/>
+          <w:szCs w:val="18"/>
+        </w:rPr>
+        <w:t xml:space="preserve"> Heures de lab disponibles (estimation, avis) comparées aux heures prévues et à la durée complète des labs. RastaLabs et Shinra ne tiennent dans l'abonnement qu'en version plafonnée ; Ifrit suppose un renouvellement.</w:t>
+      </w:r>
+    </w:p>
     <w:p>
       <w:pPr>
         <w:pStyle w:val="Heading2"/>
@@ -27097,7 +29290,7 @@
     <w:p>
       <w:pPr>
         <w:sectPr>
-          <w:footerReference w:type="default" r:id="rId9"/>
+          <w:footerReference w:type="default" r:id="rId11"/>
           <w:pgSz w:w="16838" w:h="11906" w:orient="landscape"/>
           <w:pgMar w:top="1134" w:right="1134" w:bottom="1134" w:left="1134" w:header="708" w:footer="708" w:gutter="0"/>
           <w:pgNumType/>
@@ -29000,7 +31193,7 @@
           <w:i w:val="false"/>
           <w:iCs w:val="false"/>
         </w:rPr>
-        <w:t xml:space="preserve"> : trois à cinq ans après la sortie d'école (avis, un an de plus que dans ma première version à cause de l'absence d'offensif en alternance), avec un historique de projets publics et de vraies missions.</w:t>
+        <w:t xml:space="preserve"> : trois à cinq ans après la sortie d'école (avis), en raison de l'absence d'offensif en alternance, avec un historique de projets publics et de vraies missions.</w:t>
       </w:r>
     </w:p>
     <w:p>
@@ -29289,7 +31482,7 @@
                 <w:sz w:val="17"/>
                 <w:szCs w:val="17"/>
               </w:rPr>
-              <w:t xml:space="preserve">Supprimer le lab en premier (passer aux Mini Pro Labs), garder le cours en cours et le projet logiciel. Ne jamais sacrifier le dimanche libre ni les deux semaines de congés d'été. Refaire le calcul de capacité sur 13 h par semaine.</w:t>
+              <w:t xml:space="preserve">Supprimer le lab en premier (passer aux Mini Pro Labs), garder le cours en cours et le projet logiciel. Ne jamais sacrifier le dimanche libre ni les congés planifiés (deux semaines sans objectif en été). Refaire le calcul de capacité sur 13 h par semaine.</w:t>
             </w:r>
           </w:p>
         </w:tc>
@@ -29365,7 +31558,7 @@
                 <w:sz w:val="17"/>
                 <w:szCs w:val="17"/>
               </w:rPr>
-              <w:t xml:space="preserve">Plus d'un cours, d'un lab ou d'un projet ouvert en même temps ; achat non prévu au plan ; abandon d'un lab avant 70 %.</w:t>
+              <w:t xml:space="preserve">Plus d'un cours principal, d'un lab ou d'un projet ouvert en même temps ; achat non prévu au plan ; abandon d'un lab avant 70 %.</w:t>
             </w:r>
           </w:p>
         </w:tc>
@@ -29508,7 +31701,7 @@
                 <w:sz w:val="17"/>
                 <w:szCs w:val="17"/>
               </w:rPr>
-              <w:t xml:space="preserve">Fin novembre : décaler l'examen d'un mois au plus. En cas d'échec en février : une seule reprise sous six à huit semaines (donc en mars ou avril 2027) (une nouvelle tentative doit être rachetée selon la FAQ PortSwigger ; prix actuel non confirmé, 99 $ selon une source tierce), en démarrant le CRTO à 2 h par semaine. Pas de troisième tentative avant l'été 2027 : la BSCP n'est pas critique pour ton métier cible.</w:t>
+              <w:t xml:space="preserve">Fin novembre : décaler l'examen d'un mois au plus. En cas d'échec en février : une seule reprise sous six à huit semaines (donc en mars ou avril 2027 ; une nouvelle tentative doit être rachetée selon la FAQ PortSwigger, prix actuel non confirmé, 99 $ selon une source tierce), en démarrant le CRTO à 2 h par semaine. Pas de troisième tentative avant l'été 2027 : la BSCP n'est pas critique pour ton métier cible.</w:t>
             </w:r>
           </w:p>
         </w:tc>
@@ -29562,7 +31755,7 @@
     <w:p>
       <w:pPr>
         <w:sectPr>
-          <w:footerReference w:type="default" r:id="rId10"/>
+          <w:footerReference w:type="default" r:id="rId12"/>
           <w:pgSz w:w="11906" w:h="16838" w:orient="portrait"/>
           <w:pgMar w:top="1134" w:right="1134" w:bottom="1134" w:left="1134" w:header="708" w:footer="708" w:gutter="0"/>
           <w:pgNumType/>
@@ -31038,7 +33231,7 @@
     <w:p>
       <w:pPr>
         <w:sectPr>
-          <w:footerReference w:type="default" r:id="rId11"/>
+          <w:footerReference w:type="default" r:id="rId13"/>
           <w:pgSz w:w="16838" w:h="11906" w:orient="landscape"/>
           <w:pgMar w:top="1134" w:right="1134" w:bottom="1134" w:left="1134" w:header="708" w:footer="708" w:gutter="0"/>
           <w:pgNumType/>
@@ -41097,7 +43290,7 @@
       </w:tr>
     </w:tbl>
     <w:sectPr>
-      <w:footerReference w:type="default" r:id="rId12"/>
+      <w:footerReference w:type="default" r:id="rId14"/>
       <w:pgSz w:w="11906" w:h="16838" w:orient="portrait"/>
       <w:pgMar w:top="1134" w:right="1134" w:bottom="1134" w:left="1134" w:header="708" w:footer="708" w:gutter="0"/>
       <w:pgNumType/>
@@ -41409,6 +43602,110 @@
 </file>
 
 <file path=word/footer6.xml><?xml version="1.0" encoding="utf-8"?>
+<w:ftr xmlns:wpc="http://schemas.microsoft.com/office/word/2010/wordprocessingCanvas" xmlns:mc="http://schemas.openxmlformats.org/markup-compatibility/2006" xmlns:o="urn:schemas-microsoft-com:office:office" xmlns:r="http://schemas.openxmlformats.org/officeDocument/2006/relationships" xmlns:m="http://schemas.openxmlformats.org/officeDocument/2006/math" xmlns:v="urn:schemas-microsoft-com:vml" xmlns:wp14="http://schemas.microsoft.com/office/word/2010/wordprocessingDrawing" xmlns:wp="http://schemas.openxmlformats.org/drawingml/2006/wordprocessingDrawing" xmlns:w10="urn:schemas-microsoft-com:office:word" xmlns:w="http://schemas.openxmlformats.org/wordprocessingml/2006/main" xmlns:w14="http://schemas.microsoft.com/office/word/2010/wordml" xmlns:w15="http://schemas.microsoft.com/office/word/2012/wordml" xmlns:wpg="http://schemas.microsoft.com/office/word/2010/wordprocessingGroup" xmlns:wpi="http://schemas.microsoft.com/office/word/2010/wordprocessingInk" xmlns:wne="http://schemas.microsoft.com/office/word/2006/wordml" xmlns:wps="http://schemas.microsoft.com/office/word/2010/wordprocessingShape">
+  <w:p>
+    <w:pPr>
+      <w:jc w:val="center"/>
+    </w:pPr>
+    <w:r>
+      <w:rPr>
+        <w:rFonts w:ascii="Calibri" w:cs="Calibri" w:eastAsia="Calibri" w:hAnsi="Calibri"/>
+        <w:color w:val="777777"/>
+        <w:sz w:val="16"/>
+        <w:szCs w:val="16"/>
+      </w:rPr>
+      <w:t xml:space="preserve">Plan de carrière Red Team - octobre 2026 - page </w:t>
+    </w:r>
+    <w:r>
+      <w:rPr>
+        <w:rFonts w:ascii="Calibri" w:cs="Calibri" w:eastAsia="Calibri" w:hAnsi="Calibri"/>
+        <w:color w:val="777777"/>
+        <w:sz w:val="16"/>
+        <w:szCs w:val="16"/>
+      </w:rPr>
+      <w:fldChar w:fldCharType="begin"/>
+      <w:instrText xml:space="preserve">PAGE</w:instrText>
+      <w:fldChar w:fldCharType="separate"/>
+      <w:fldChar w:fldCharType="end"/>
+    </w:r>
+    <w:r>
+      <w:rPr>
+        <w:rFonts w:ascii="Calibri" w:cs="Calibri" w:eastAsia="Calibri" w:hAnsi="Calibri"/>
+        <w:color w:val="777777"/>
+        <w:sz w:val="16"/>
+        <w:szCs w:val="16"/>
+      </w:rPr>
+      <w:t xml:space="preserve"> sur </w:t>
+    </w:r>
+    <w:r>
+      <w:rPr>
+        <w:rFonts w:ascii="Calibri" w:cs="Calibri" w:eastAsia="Calibri" w:hAnsi="Calibri"/>
+        <w:color w:val="777777"/>
+        <w:sz w:val="16"/>
+        <w:szCs w:val="16"/>
+      </w:rPr>
+      <w:fldChar w:fldCharType="begin"/>
+      <w:instrText xml:space="preserve">NUMPAGES</w:instrText>
+      <w:fldChar w:fldCharType="separate"/>
+      <w:fldChar w:fldCharType="end"/>
+    </w:r>
+  </w:p>
+</w:ftr>
+</file>
+
+<file path=word/footer7.xml><?xml version="1.0" encoding="utf-8"?>
+<w:ftr xmlns:wpc="http://schemas.microsoft.com/office/word/2010/wordprocessingCanvas" xmlns:mc="http://schemas.openxmlformats.org/markup-compatibility/2006" xmlns:o="urn:schemas-microsoft-com:office:office" xmlns:r="http://schemas.openxmlformats.org/officeDocument/2006/relationships" xmlns:m="http://schemas.openxmlformats.org/officeDocument/2006/math" xmlns:v="urn:schemas-microsoft-com:vml" xmlns:wp14="http://schemas.microsoft.com/office/word/2010/wordprocessingDrawing" xmlns:wp="http://schemas.openxmlformats.org/drawingml/2006/wordprocessingDrawing" xmlns:w10="urn:schemas-microsoft-com:office:word" xmlns:w="http://schemas.openxmlformats.org/wordprocessingml/2006/main" xmlns:w14="http://schemas.microsoft.com/office/word/2010/wordml" xmlns:w15="http://schemas.microsoft.com/office/word/2012/wordml" xmlns:wpg="http://schemas.microsoft.com/office/word/2010/wordprocessingGroup" xmlns:wpi="http://schemas.microsoft.com/office/word/2010/wordprocessingInk" xmlns:wne="http://schemas.microsoft.com/office/word/2006/wordml" xmlns:wps="http://schemas.microsoft.com/office/word/2010/wordprocessingShape">
+  <w:p>
+    <w:pPr>
+      <w:jc w:val="center"/>
+    </w:pPr>
+    <w:r>
+      <w:rPr>
+        <w:rFonts w:ascii="Calibri" w:cs="Calibri" w:eastAsia="Calibri" w:hAnsi="Calibri"/>
+        <w:color w:val="777777"/>
+        <w:sz w:val="16"/>
+        <w:szCs w:val="16"/>
+      </w:rPr>
+      <w:t xml:space="preserve">Plan de carrière Red Team - octobre 2026 - page </w:t>
+    </w:r>
+    <w:r>
+      <w:rPr>
+        <w:rFonts w:ascii="Calibri" w:cs="Calibri" w:eastAsia="Calibri" w:hAnsi="Calibri"/>
+        <w:color w:val="777777"/>
+        <w:sz w:val="16"/>
+        <w:szCs w:val="16"/>
+      </w:rPr>
+      <w:fldChar w:fldCharType="begin"/>
+      <w:instrText xml:space="preserve">PAGE</w:instrText>
+      <w:fldChar w:fldCharType="separate"/>
+      <w:fldChar w:fldCharType="end"/>
+    </w:r>
+    <w:r>
+      <w:rPr>
+        <w:rFonts w:ascii="Calibri" w:cs="Calibri" w:eastAsia="Calibri" w:hAnsi="Calibri"/>
+        <w:color w:val="777777"/>
+        <w:sz w:val="16"/>
+        <w:szCs w:val="16"/>
+      </w:rPr>
+      <w:t xml:space="preserve"> sur </w:t>
+    </w:r>
+    <w:r>
+      <w:rPr>
+        <w:rFonts w:ascii="Calibri" w:cs="Calibri" w:eastAsia="Calibri" w:hAnsi="Calibri"/>
+        <w:color w:val="777777"/>
+        <w:sz w:val="16"/>
+        <w:szCs w:val="16"/>
+      </w:rPr>
+      <w:fldChar w:fldCharType="begin"/>
+      <w:instrText xml:space="preserve">NUMPAGES</w:instrText>
+      <w:fldChar w:fldCharType="separate"/>
+      <w:fldChar w:fldCharType="end"/>
+    </w:r>
+  </w:p>
+</w:ftr>
+</file>
+
+<file path=word/footer8.xml><?xml version="1.0" encoding="utf-8"?>
 <w:ftr xmlns:wpc="http://schemas.microsoft.com/office/word/2010/wordprocessingCanvas" xmlns:mc="http://schemas.openxmlformats.org/markup-compatibility/2006" xmlns:o="urn:schemas-microsoft-com:office:office" xmlns:r="http://schemas.openxmlformats.org/officeDocument/2006/relationships" xmlns:m="http://schemas.openxmlformats.org/officeDocument/2006/math" xmlns:v="urn:schemas-microsoft-com:vml" xmlns:wp14="http://schemas.microsoft.com/office/word/2010/wordprocessingDrawing" xmlns:wp="http://schemas.openxmlformats.org/drawingml/2006/wordprocessingDrawing" xmlns:w10="urn:schemas-microsoft-com:office:word" xmlns:w="http://schemas.openxmlformats.org/wordprocessingml/2006/main" xmlns:w14="http://schemas.microsoft.com/office/word/2010/wordml" xmlns:w15="http://schemas.microsoft.com/office/word/2012/wordml" xmlns:wpg="http://schemas.microsoft.com/office/word/2010/wordprocessingGroup" xmlns:wpi="http://schemas.microsoft.com/office/word/2010/wordprocessingInk" xmlns:wne="http://schemas.microsoft.com/office/word/2006/wordml" xmlns:wps="http://schemas.microsoft.com/office/word/2010/wordprocessingShape">
   <w:p>
     <w:pPr>

</xml_diff>

<commit_message>
Ajoute les créneaux horaires dans les tableaux hebdomadaires
Co-Authored-By: Claude Sonnet 5.5 <noreply@anthropic.com>
Claude-Session: https://claude.ai/code/session_01PLMe4ge9F6B5wJA3dMBx9D
</commit_message>
<xml_diff>
--- a/05-Plan-Carriere/Plan-carriere-Red-Team-2026-2028.docx
+++ b/05-Plan-Carriere/Plan-carriere-Red-Team-2026-2028.docx
@@ -9651,7 +9651,27 @@
           <w:i w:val="false"/>
           <w:iCs w:val="false"/>
         </w:rPr>
-        <w:t xml:space="preserve">, comme tu l'avais prévu. Les totaux (15 h en semaine d'entreprise, 9 h 30 en semaine d'école) sont ceux du tableau 4.1 ; déplace les blocs d'un jour à l'autre si besoin, sans changer les totaux. Pendant la préparation de la BSCP, le lab s'arrête trois semaines avant l'examen et ses heures vont à la BSCP.</w:t>
+        <w:t xml:space="preserve">, comme tu l'avais prévu. Les totaux (15 h en semaine d'entreprise, 9 h 30 en semaine d'école) sont ceux du tableau 4.1 ; déplace les blocs d'un jour à l'autre si besoin, sans changer les totaux. Pendant la préparation de la BSCP, le lab s'arrête trois semaines avant l'examen et ses heures vont à la BSCP. </w:t>
+      </w:r>
+      <w:r>
+        <w:rPr>
+          <w:rFonts w:ascii="Calibri" w:cs="Calibri" w:eastAsia="Calibri" w:hAnsi="Calibri"/>
+          <w:b/>
+          <w:bCs/>
+          <w:i w:val="false"/>
+          <w:iCs w:val="false"/>
+        </w:rPr>
+        <w:t xml:space="preserve">Créneaux horaires (hypothèse à ajuster) :</w:t>
+      </w:r>
+      <w:r>
+        <w:rPr>
+          <w:rFonts w:ascii="Calibri" w:cs="Calibri" w:eastAsia="Calibri" w:hAnsi="Calibri"/>
+          <w:b w:val="false"/>
+          <w:bCs w:val="false"/>
+          <w:i w:val="false"/>
+          <w:iCs w:val="false"/>
+        </w:rPr>
+        <w:t xml:space="preserve"> faute de connaître tes horaires de travail et de cours, j'ai placé les blocs en soirée à partir de 19 h du lundi au vendredi, et le samedi à partir de 9 h avec 15 min de pause entre deux blocs ; le dimanche reste libre. Décale simplement l'heure de départ de chaque jour si tes horaires diffèrent.</w:t>
       </w:r>
     </w:p>
     <w:p>
@@ -9743,7 +9763,7 @@
           <w:sz w:val="18"/>
           <w:szCs w:val="18"/>
         </w:rPr>
-        <w:t xml:space="preserve"> Semaine type jour par jour, en heures (les segments inférieurs à 1 h ne sont pas numérotés). Les tableaux suivants détaillent chaque case.</w:t>
+        <w:t xml:space="preserve"> Semaine type jour par jour, en heures (les segments inférieurs à 1 h ne sont pas numérotés). Les tableaux suivants détaillent chaque case avec ses créneaux horaires (hypothèse).</w:t>
       </w:r>
     </w:p>
     <w:p>
@@ -10118,25 +10138,38 @@
             <w:tcMar>
               <w:top w:type="dxa" w:w="50"/>
               <w:left w:type="dxa" w:w="70"/>
-              <w:bottom w:type="dxa" w:w="50"/>
+              <w:bottom w:type="dxa" w:w="40"/>
               <w:right w:type="dxa" w:w="70"/>
             </w:tcMar>
           </w:tcPr>
           <w:p>
             <w:pPr>
-              <w:spacing w:after="20"/>
-              <w:jc w:val="left"/>
-            </w:pPr>
-            <w:r>
-              <w:rPr>
-                <w:rFonts w:ascii="Calibri" w:cs="Calibri" w:eastAsia="Calibri" w:hAnsi="Calibri"/>
-                <w:b w:val="false"/>
-                <w:bCs w:val="false"/>
-                <w:color w:val="000000"/>
+              <w:keepNext/>
+              <w:spacing w:after="0"/>
+            </w:pPr>
+            <w:r>
+              <w:rPr>
+                <w:rFonts w:ascii="Calibri" w:cs="Calibri" w:eastAsia="Calibri" w:hAnsi="Calibri"/>
+                <w:b/>
+                <w:bCs/>
+                <w:color w:val="1F3A5F"/>
+                <w:sz w:val="15"/>
+                <w:szCs w:val="15"/>
+              </w:rPr>
+              <w:t xml:space="preserve">19:00-21:00</w:t>
+            </w:r>
+          </w:p>
+          <w:p>
+            <w:pPr>
+              <w:spacing w:after="50"/>
+            </w:pPr>
+            <w:r>
+              <w:rPr>
+                <w:rFonts w:ascii="Calibri" w:cs="Calibri" w:eastAsia="Calibri" w:hAnsi="Calibri"/>
                 <w:sz w:val="16"/>
                 <w:szCs w:val="16"/>
               </w:rPr>
-              <w:t xml:space="preserve">BSCP 2 h</w:t>
+              <w:t xml:space="preserve">BSCP (2 h)</w:t>
             </w:r>
           </w:p>
         </w:tc>
@@ -10153,25 +10186,38 @@
             <w:tcMar>
               <w:top w:type="dxa" w:w="50"/>
               <w:left w:type="dxa" w:w="70"/>
-              <w:bottom w:type="dxa" w:w="50"/>
+              <w:bottom w:type="dxa" w:w="40"/>
               <w:right w:type="dxa" w:w="70"/>
             </w:tcMar>
           </w:tcPr>
           <w:p>
             <w:pPr>
-              <w:spacing w:after="20"/>
-              <w:jc w:val="left"/>
-            </w:pPr>
-            <w:r>
-              <w:rPr>
-                <w:rFonts w:ascii="Calibri" w:cs="Calibri" w:eastAsia="Calibri" w:hAnsi="Calibri"/>
-                <w:b w:val="false"/>
-                <w:bCs w:val="false"/>
-                <w:color w:val="000000"/>
+              <w:keepNext/>
+              <w:spacing w:after="0"/>
+            </w:pPr>
+            <w:r>
+              <w:rPr>
+                <w:rFonts w:ascii="Calibri" w:cs="Calibri" w:eastAsia="Calibri" w:hAnsi="Calibri"/>
+                <w:b/>
+                <w:bCs/>
+                <w:color w:val="1F3A5F"/>
+                <w:sz w:val="15"/>
+                <w:szCs w:val="15"/>
+              </w:rPr>
+              <w:t xml:space="preserve">19:00-21:30</w:t>
+            </w:r>
+          </w:p>
+          <w:p>
+            <w:pPr>
+              <w:spacing w:after="50"/>
+            </w:pPr>
+            <w:r>
+              <w:rPr>
+                <w:rFonts w:ascii="Calibri" w:cs="Calibri" w:eastAsia="Calibri" w:hAnsi="Calibri"/>
                 <w:sz w:val="16"/>
                 <w:szCs w:val="16"/>
               </w:rPr>
-              <w:t xml:space="preserve">Lab 2 h 30</w:t>
+              <w:t xml:space="preserve">Lab (2 h 30)</w:t>
             </w:r>
           </w:p>
         </w:tc>
@@ -10188,42 +10234,68 @@
             <w:tcMar>
               <w:top w:type="dxa" w:w="50"/>
               <w:left w:type="dxa" w:w="70"/>
-              <w:bottom w:type="dxa" w:w="50"/>
+              <w:bottom w:type="dxa" w:w="40"/>
               <w:right w:type="dxa" w:w="70"/>
             </w:tcMar>
           </w:tcPr>
           <w:p>
             <w:pPr>
-              <w:spacing w:after="20"/>
-              <w:jc w:val="left"/>
-            </w:pPr>
-            <w:r>
-              <w:rPr>
-                <w:rFonts w:ascii="Calibri" w:cs="Calibri" w:eastAsia="Calibri" w:hAnsi="Calibri"/>
-                <w:b w:val="false"/>
-                <w:bCs w:val="false"/>
-                <w:color w:val="000000"/>
+              <w:keepNext/>
+              <w:spacing w:after="0"/>
+            </w:pPr>
+            <w:r>
+              <w:rPr>
+                <w:rFonts w:ascii="Calibri" w:cs="Calibri" w:eastAsia="Calibri" w:hAnsi="Calibri"/>
+                <w:b/>
+                <w:bCs/>
+                <w:color w:val="1F3A5F"/>
+                <w:sz w:val="15"/>
+                <w:szCs w:val="15"/>
+              </w:rPr>
+              <w:t xml:space="preserve">19:00-20:30</w:t>
+            </w:r>
+          </w:p>
+          <w:p>
+            <w:pPr>
+              <w:spacing w:after="50"/>
+            </w:pPr>
+            <w:r>
+              <w:rPr>
+                <w:rFonts w:ascii="Calibri" w:cs="Calibri" w:eastAsia="Calibri" w:hAnsi="Calibri"/>
                 <w:sz w:val="16"/>
                 <w:szCs w:val="16"/>
               </w:rPr>
-              <w:t xml:space="preserve">C, Sektor7 1 h 30</w:t>
-            </w:r>
-          </w:p>
-          <w:p>
-            <w:pPr>
-              <w:spacing w:after="20"/>
-              <w:jc w:val="left"/>
-            </w:pPr>
-            <w:r>
-              <w:rPr>
-                <w:rFonts w:ascii="Calibri" w:cs="Calibri" w:eastAsia="Calibri" w:hAnsi="Calibri"/>
-                <w:b w:val="false"/>
-                <w:bCs w:val="false"/>
-                <w:color w:val="000000"/>
+              <w:t xml:space="preserve">C, Sektor7 (1 h 30)</w:t>
+            </w:r>
+          </w:p>
+          <w:p>
+            <w:pPr>
+              <w:keepNext/>
+              <w:spacing w:after="0"/>
+            </w:pPr>
+            <w:r>
+              <w:rPr>
+                <w:rFonts w:ascii="Calibri" w:cs="Calibri" w:eastAsia="Calibri" w:hAnsi="Calibri"/>
+                <w:b/>
+                <w:bCs/>
+                <w:color w:val="1F3A5F"/>
+                <w:sz w:val="15"/>
+                <w:szCs w:val="15"/>
+              </w:rPr>
+              <w:t xml:space="preserve">20:30-21:00</w:t>
+            </w:r>
+          </w:p>
+          <w:p>
+            <w:pPr>
+              <w:spacing w:after="50"/>
+            </w:pPr>
+            <w:r>
+              <w:rPr>
+                <w:rFonts w:ascii="Calibri" w:cs="Calibri" w:eastAsia="Calibri" w:hAnsi="Calibri"/>
                 <w:sz w:val="16"/>
                 <w:szCs w:val="16"/>
               </w:rPr>
-              <w:t xml:space="preserve">École 30 min</w:t>
+              <w:t xml:space="preserve">École (30 min)</w:t>
             </w:r>
           </w:p>
         </w:tc>
@@ -10240,25 +10312,38 @@
             <w:tcMar>
               <w:top w:type="dxa" w:w="50"/>
               <w:left w:type="dxa" w:w="70"/>
-              <w:bottom w:type="dxa" w:w="50"/>
+              <w:bottom w:type="dxa" w:w="40"/>
               <w:right w:type="dxa" w:w="70"/>
             </w:tcMar>
           </w:tcPr>
           <w:p>
             <w:pPr>
-              <w:spacing w:after="20"/>
-              <w:jc w:val="left"/>
-            </w:pPr>
-            <w:r>
-              <w:rPr>
-                <w:rFonts w:ascii="Calibri" w:cs="Calibri" w:eastAsia="Calibri" w:hAnsi="Calibri"/>
-                <w:b w:val="false"/>
-                <w:bCs w:val="false"/>
-                <w:color w:val="000000"/>
+              <w:keepNext/>
+              <w:spacing w:after="0"/>
+            </w:pPr>
+            <w:r>
+              <w:rPr>
+                <w:rFonts w:ascii="Calibri" w:cs="Calibri" w:eastAsia="Calibri" w:hAnsi="Calibri"/>
+                <w:b/>
+                <w:bCs/>
+                <w:color w:val="1F3A5F"/>
+                <w:sz w:val="15"/>
+                <w:szCs w:val="15"/>
+              </w:rPr>
+              <w:t xml:space="preserve">19:00-21:00</w:t>
+            </w:r>
+          </w:p>
+          <w:p>
+            <w:pPr>
+              <w:spacing w:after="50"/>
+            </w:pPr>
+            <w:r>
+              <w:rPr>
+                <w:rFonts w:ascii="Calibri" w:cs="Calibri" w:eastAsia="Calibri" w:hAnsi="Calibri"/>
                 <w:sz w:val="16"/>
                 <w:szCs w:val="16"/>
               </w:rPr>
-              <w:t xml:space="preserve">BSCP 2 h</w:t>
+              <w:t xml:space="preserve">BSCP (2 h)</w:t>
             </w:r>
           </w:p>
         </w:tc>
@@ -10275,42 +10360,68 @@
             <w:tcMar>
               <w:top w:type="dxa" w:w="50"/>
               <w:left w:type="dxa" w:w="70"/>
-              <w:bottom w:type="dxa" w:w="50"/>
+              <w:bottom w:type="dxa" w:w="40"/>
               <w:right w:type="dxa" w:w="70"/>
             </w:tcMar>
           </w:tcPr>
           <w:p>
             <w:pPr>
-              <w:spacing w:after="20"/>
-              <w:jc w:val="left"/>
-            </w:pPr>
-            <w:r>
-              <w:rPr>
-                <w:rFonts w:ascii="Calibri" w:cs="Calibri" w:eastAsia="Calibri" w:hAnsi="Calibri"/>
-                <w:b w:val="false"/>
-                <w:bCs w:val="false"/>
-                <w:color w:val="000000"/>
+              <w:keepNext/>
+              <w:spacing w:after="0"/>
+            </w:pPr>
+            <w:r>
+              <w:rPr>
+                <w:rFonts w:ascii="Calibri" w:cs="Calibri" w:eastAsia="Calibri" w:hAnsi="Calibri"/>
+                <w:b/>
+                <w:bCs/>
+                <w:color w:val="1F3A5F"/>
+                <w:sz w:val="15"/>
+                <w:szCs w:val="15"/>
+              </w:rPr>
+              <w:t xml:space="preserve">19:00-19:30</w:t>
+            </w:r>
+          </w:p>
+          <w:p>
+            <w:pPr>
+              <w:spacing w:after="50"/>
+            </w:pPr>
+            <w:r>
+              <w:rPr>
+                <w:rFonts w:ascii="Calibri" w:cs="Calibri" w:eastAsia="Calibri" w:hAnsi="Calibri"/>
                 <w:sz w:val="16"/>
                 <w:szCs w:val="16"/>
               </w:rPr>
-              <w:t xml:space="preserve">École 30 min</w:t>
-            </w:r>
-          </w:p>
-          <w:p>
-            <w:pPr>
-              <w:spacing w:after="20"/>
-              <w:jc w:val="left"/>
-            </w:pPr>
-            <w:r>
-              <w:rPr>
-                <w:rFonts w:ascii="Calibri" w:cs="Calibri" w:eastAsia="Calibri" w:hAnsi="Calibri"/>
-                <w:b w:val="false"/>
-                <w:bCs w:val="false"/>
-                <w:color w:val="000000"/>
+              <w:t xml:space="preserve">École (30 min)</w:t>
+            </w:r>
+          </w:p>
+          <w:p>
+            <w:pPr>
+              <w:keepNext/>
+              <w:spacing w:after="0"/>
+            </w:pPr>
+            <w:r>
+              <w:rPr>
+                <w:rFonts w:ascii="Calibri" w:cs="Calibri" w:eastAsia="Calibri" w:hAnsi="Calibri"/>
+                <w:b/>
+                <w:bCs/>
+                <w:color w:val="1F3A5F"/>
+                <w:sz w:val="15"/>
+                <w:szCs w:val="15"/>
+              </w:rPr>
+              <w:t xml:space="preserve">19:30-20:00</w:t>
+            </w:r>
+          </w:p>
+          <w:p>
+            <w:pPr>
+              <w:spacing w:after="50"/>
+            </w:pPr>
+            <w:r>
+              <w:rPr>
+                <w:rFonts w:ascii="Calibri" w:cs="Calibri" w:eastAsia="Calibri" w:hAnsi="Calibri"/>
                 <w:sz w:val="16"/>
                 <w:szCs w:val="16"/>
               </w:rPr>
-              <w:t xml:space="preserve">Revue 30 min</w:t>
+              <w:t xml:space="preserve">Revue (30 min)</w:t>
             </w:r>
           </w:p>
         </w:tc>
@@ -10327,59 +10438,98 @@
             <w:tcMar>
               <w:top w:type="dxa" w:w="50"/>
               <w:left w:type="dxa" w:w="70"/>
-              <w:bottom w:type="dxa" w:w="50"/>
+              <w:bottom w:type="dxa" w:w="40"/>
               <w:right w:type="dxa" w:w="70"/>
             </w:tcMar>
           </w:tcPr>
           <w:p>
             <w:pPr>
-              <w:spacing w:after="20"/>
-              <w:jc w:val="left"/>
-            </w:pPr>
-            <w:r>
-              <w:rPr>
-                <w:rFonts w:ascii="Calibri" w:cs="Calibri" w:eastAsia="Calibri" w:hAnsi="Calibri"/>
-                <w:b w:val="false"/>
-                <w:bCs w:val="false"/>
-                <w:color w:val="000000"/>
+              <w:keepNext/>
+              <w:spacing w:after="0"/>
+            </w:pPr>
+            <w:r>
+              <w:rPr>
+                <w:rFonts w:ascii="Calibri" w:cs="Calibri" w:eastAsia="Calibri" w:hAnsi="Calibri"/>
+                <w:b/>
+                <w:bCs/>
+                <w:color w:val="1F3A5F"/>
+                <w:sz w:val="15"/>
+                <w:szCs w:val="15"/>
+              </w:rPr>
+              <w:t xml:space="preserve">09:00-11:00</w:t>
+            </w:r>
+          </w:p>
+          <w:p>
+            <w:pPr>
+              <w:spacing w:after="50"/>
+            </w:pPr>
+            <w:r>
+              <w:rPr>
+                <w:rFonts w:ascii="Calibri" w:cs="Calibri" w:eastAsia="Calibri" w:hAnsi="Calibri"/>
                 <w:sz w:val="16"/>
                 <w:szCs w:val="16"/>
               </w:rPr>
-              <w:t xml:space="preserve">BSCP 2 h</w:t>
-            </w:r>
-          </w:p>
-          <w:p>
-            <w:pPr>
-              <w:spacing w:after="20"/>
-              <w:jc w:val="left"/>
-            </w:pPr>
-            <w:r>
-              <w:rPr>
-                <w:rFonts w:ascii="Calibri" w:cs="Calibri" w:eastAsia="Calibri" w:hAnsi="Calibri"/>
-                <w:b w:val="false"/>
-                <w:bCs w:val="false"/>
-                <w:color w:val="000000"/>
+              <w:t xml:space="preserve">BSCP (2 h)</w:t>
+            </w:r>
+          </w:p>
+          <w:p>
+            <w:pPr>
+              <w:keepNext/>
+              <w:spacing w:after="0"/>
+            </w:pPr>
+            <w:r>
+              <w:rPr>
+                <w:rFonts w:ascii="Calibri" w:cs="Calibri" w:eastAsia="Calibri" w:hAnsi="Calibri"/>
+                <w:b/>
+                <w:bCs/>
+                <w:color w:val="1F3A5F"/>
+                <w:sz w:val="15"/>
+                <w:szCs w:val="15"/>
+              </w:rPr>
+              <w:t xml:space="preserve">11:15-13:45</w:t>
+            </w:r>
+          </w:p>
+          <w:p>
+            <w:pPr>
+              <w:spacing w:after="50"/>
+            </w:pPr>
+            <w:r>
+              <w:rPr>
+                <w:rFonts w:ascii="Calibri" w:cs="Calibri" w:eastAsia="Calibri" w:hAnsi="Calibri"/>
                 <w:sz w:val="16"/>
                 <w:szCs w:val="16"/>
               </w:rPr>
-              <w:t xml:space="preserve">Lab 2 h 30</w:t>
-            </w:r>
-          </w:p>
-          <w:p>
-            <w:pPr>
-              <w:spacing w:after="20"/>
-              <w:jc w:val="left"/>
-            </w:pPr>
-            <w:r>
-              <w:rPr>
-                <w:rFonts w:ascii="Calibri" w:cs="Calibri" w:eastAsia="Calibri" w:hAnsi="Calibri"/>
-                <w:b w:val="false"/>
-                <w:bCs w:val="false"/>
-                <w:color w:val="000000"/>
+              <w:t xml:space="preserve">Lab (2 h 30)</w:t>
+            </w:r>
+          </w:p>
+          <w:p>
+            <w:pPr>
+              <w:keepNext/>
+              <w:spacing w:after="0"/>
+            </w:pPr>
+            <w:r>
+              <w:rPr>
+                <w:rFonts w:ascii="Calibri" w:cs="Calibri" w:eastAsia="Calibri" w:hAnsi="Calibri"/>
+                <w:b/>
+                <w:bCs/>
+                <w:color w:val="1F3A5F"/>
+                <w:sz w:val="15"/>
+                <w:szCs w:val="15"/>
+              </w:rPr>
+              <w:t xml:space="preserve">14:00-15:00</w:t>
+            </w:r>
+          </w:p>
+          <w:p>
+            <w:pPr>
+              <w:spacing w:after="50"/>
+            </w:pPr>
+            <w:r>
+              <w:rPr>
+                <w:rFonts w:ascii="Calibri" w:cs="Calibri" w:eastAsia="Calibri" w:hAnsi="Calibri"/>
                 <w:sz w:val="16"/>
                 <w:szCs w:val="16"/>
               </w:rPr>
-              <w:t xml:space="preserve">C 1 h</w:t>
+              <w:t xml:space="preserve">C (1 h)</w:t>
             </w:r>
           </w:p>
         </w:tc>
@@ -10396,20 +10546,14 @@
             <w:tcMar>
               <w:top w:type="dxa" w:w="50"/>
               <w:left w:type="dxa" w:w="70"/>
-              <w:bottom w:type="dxa" w:w="50"/>
+              <w:bottom w:type="dxa" w:w="40"/>
               <w:right w:type="dxa" w:w="70"/>
             </w:tcMar>
           </w:tcPr>
           <w:p>
-            <w:pPr>
-              <w:spacing w:after="20"/>
-              <w:jc w:val="left"/>
-            </w:pPr>
-            <w:r>
-              <w:rPr>
-                <w:rFonts w:ascii="Calibri" w:cs="Calibri" w:eastAsia="Calibri" w:hAnsi="Calibri"/>
-                <w:b w:val="false"/>
-                <w:bCs w:val="false"/>
+            <w:r>
+              <w:rPr>
+                <w:rFonts w:ascii="Calibri" w:cs="Calibri" w:eastAsia="Calibri" w:hAnsi="Calibri"/>
                 <w:color w:val="777777"/>
                 <w:sz w:val="16"/>
                 <w:szCs w:val="16"/>
@@ -10471,25 +10615,38 @@
             <w:tcMar>
               <w:top w:type="dxa" w:w="50"/>
               <w:left w:type="dxa" w:w="70"/>
-              <w:bottom w:type="dxa" w:w="50"/>
+              <w:bottom w:type="dxa" w:w="40"/>
               <w:right w:type="dxa" w:w="70"/>
             </w:tcMar>
           </w:tcPr>
           <w:p>
             <w:pPr>
-              <w:spacing w:after="20"/>
-              <w:jc w:val="left"/>
-            </w:pPr>
-            <w:r>
-              <w:rPr>
-                <w:rFonts w:ascii="Calibri" w:cs="Calibri" w:eastAsia="Calibri" w:hAnsi="Calibri"/>
-                <w:b w:val="false"/>
-                <w:bCs w:val="false"/>
-                <w:color w:val="000000"/>
+              <w:keepNext/>
+              <w:spacing w:after="0"/>
+            </w:pPr>
+            <w:r>
+              <w:rPr>
+                <w:rFonts w:ascii="Calibri" w:cs="Calibri" w:eastAsia="Calibri" w:hAnsi="Calibri"/>
+                <w:b/>
+                <w:bCs/>
+                <w:color w:val="1F3A5F"/>
+                <w:sz w:val="15"/>
+                <w:szCs w:val="15"/>
+              </w:rPr>
+              <w:t xml:space="preserve">19:00-21:00</w:t>
+            </w:r>
+          </w:p>
+          <w:p>
+            <w:pPr>
+              <w:spacing w:after="50"/>
+            </w:pPr>
+            <w:r>
+              <w:rPr>
+                <w:rFonts w:ascii="Calibri" w:cs="Calibri" w:eastAsia="Calibri" w:hAnsi="Calibri"/>
                 <w:sz w:val="16"/>
                 <w:szCs w:val="16"/>
               </w:rPr>
-              <w:t xml:space="preserve">BSCP 2 h</w:t>
+              <w:t xml:space="preserve">BSCP (2 h)</w:t>
             </w:r>
           </w:p>
         </w:tc>
@@ -10506,25 +10663,38 @@
             <w:tcMar>
               <w:top w:type="dxa" w:w="50"/>
               <w:left w:type="dxa" w:w="70"/>
-              <w:bottom w:type="dxa" w:w="50"/>
+              <w:bottom w:type="dxa" w:w="40"/>
               <w:right w:type="dxa" w:w="70"/>
             </w:tcMar>
           </w:tcPr>
           <w:p>
             <w:pPr>
-              <w:spacing w:after="20"/>
-              <w:jc w:val="left"/>
-            </w:pPr>
-            <w:r>
-              <w:rPr>
-                <w:rFonts w:ascii="Calibri" w:cs="Calibri" w:eastAsia="Calibri" w:hAnsi="Calibri"/>
-                <w:b w:val="false"/>
-                <w:bCs w:val="false"/>
-                <w:color w:val="000000"/>
+              <w:keepNext/>
+              <w:spacing w:after="0"/>
+            </w:pPr>
+            <w:r>
+              <w:rPr>
+                <w:rFonts w:ascii="Calibri" w:cs="Calibri" w:eastAsia="Calibri" w:hAnsi="Calibri"/>
+                <w:b/>
+                <w:bCs/>
+                <w:color w:val="1F3A5F"/>
+                <w:sz w:val="15"/>
+                <w:szCs w:val="15"/>
+              </w:rPr>
+              <w:t xml:space="preserve">19:00-21:30</w:t>
+            </w:r>
+          </w:p>
+          <w:p>
+            <w:pPr>
+              <w:spacing w:after="50"/>
+            </w:pPr>
+            <w:r>
+              <w:rPr>
+                <w:rFonts w:ascii="Calibri" w:cs="Calibri" w:eastAsia="Calibri" w:hAnsi="Calibri"/>
                 <w:sz w:val="16"/>
                 <w:szCs w:val="16"/>
               </w:rPr>
-              <w:t xml:space="preserve">BSCP 2 h 30</w:t>
+              <w:t xml:space="preserve">BSCP (2 h 30)</w:t>
             </w:r>
           </w:p>
         </w:tc>
@@ -10541,42 +10711,68 @@
             <w:tcMar>
               <w:top w:type="dxa" w:w="50"/>
               <w:left w:type="dxa" w:w="70"/>
-              <w:bottom w:type="dxa" w:w="50"/>
+              <w:bottom w:type="dxa" w:w="40"/>
               <w:right w:type="dxa" w:w="70"/>
             </w:tcMar>
           </w:tcPr>
           <w:p>
             <w:pPr>
-              <w:spacing w:after="20"/>
-              <w:jc w:val="left"/>
-            </w:pPr>
-            <w:r>
-              <w:rPr>
-                <w:rFonts w:ascii="Calibri" w:cs="Calibri" w:eastAsia="Calibri" w:hAnsi="Calibri"/>
-                <w:b w:val="false"/>
-                <w:bCs w:val="false"/>
-                <w:color w:val="000000"/>
+              <w:keepNext/>
+              <w:spacing w:after="0"/>
+            </w:pPr>
+            <w:r>
+              <w:rPr>
+                <w:rFonts w:ascii="Calibri" w:cs="Calibri" w:eastAsia="Calibri" w:hAnsi="Calibri"/>
+                <w:b/>
+                <w:bCs/>
+                <w:color w:val="1F3A5F"/>
+                <w:sz w:val="15"/>
+                <w:szCs w:val="15"/>
+              </w:rPr>
+              <w:t xml:space="preserve">19:00-21:00</w:t>
+            </w:r>
+          </w:p>
+          <w:p>
+            <w:pPr>
+              <w:spacing w:after="50"/>
+            </w:pPr>
+            <w:r>
+              <w:rPr>
+                <w:rFonts w:ascii="Calibri" w:cs="Calibri" w:eastAsia="Calibri" w:hAnsi="Calibri"/>
                 <w:sz w:val="16"/>
                 <w:szCs w:val="16"/>
               </w:rPr>
-              <w:t xml:space="preserve">Lab 2 h</w:t>
-            </w:r>
-          </w:p>
-          <w:p>
-            <w:pPr>
-              <w:spacing w:after="20"/>
-              <w:jc w:val="left"/>
-            </w:pPr>
-            <w:r>
-              <w:rPr>
-                <w:rFonts w:ascii="Calibri" w:cs="Calibri" w:eastAsia="Calibri" w:hAnsi="Calibri"/>
-                <w:b w:val="false"/>
-                <w:bCs w:val="false"/>
-                <w:color w:val="000000"/>
+              <w:t xml:space="preserve">Lab (2 h)</w:t>
+            </w:r>
+          </w:p>
+          <w:p>
+            <w:pPr>
+              <w:keepNext/>
+              <w:spacing w:after="0"/>
+            </w:pPr>
+            <w:r>
+              <w:rPr>
+                <w:rFonts w:ascii="Calibri" w:cs="Calibri" w:eastAsia="Calibri" w:hAnsi="Calibri"/>
+                <w:b/>
+                <w:bCs/>
+                <w:color w:val="1F3A5F"/>
+                <w:sz w:val="15"/>
+                <w:szCs w:val="15"/>
+              </w:rPr>
+              <w:t xml:space="preserve">21:00-21:30</w:t>
+            </w:r>
+          </w:p>
+          <w:p>
+            <w:pPr>
+              <w:spacing w:after="50"/>
+            </w:pPr>
+            <w:r>
+              <w:rPr>
+                <w:rFonts w:ascii="Calibri" w:cs="Calibri" w:eastAsia="Calibri" w:hAnsi="Calibri"/>
                 <w:sz w:val="16"/>
                 <w:szCs w:val="16"/>
               </w:rPr>
-              <w:t xml:space="preserve">École 30 min</w:t>
+              <w:t xml:space="preserve">École (30 min)</w:t>
             </w:r>
           </w:p>
         </w:tc>
@@ -10593,25 +10789,38 @@
             <w:tcMar>
               <w:top w:type="dxa" w:w="50"/>
               <w:left w:type="dxa" w:w="70"/>
-              <w:bottom w:type="dxa" w:w="50"/>
+              <w:bottom w:type="dxa" w:w="40"/>
               <w:right w:type="dxa" w:w="70"/>
             </w:tcMar>
           </w:tcPr>
           <w:p>
             <w:pPr>
-              <w:spacing w:after="20"/>
-              <w:jc w:val="left"/>
-            </w:pPr>
-            <w:r>
-              <w:rPr>
-                <w:rFonts w:ascii="Calibri" w:cs="Calibri" w:eastAsia="Calibri" w:hAnsi="Calibri"/>
-                <w:b w:val="false"/>
-                <w:bCs w:val="false"/>
-                <w:color w:val="000000"/>
+              <w:keepNext/>
+              <w:spacing w:after="0"/>
+            </w:pPr>
+            <w:r>
+              <w:rPr>
+                <w:rFonts w:ascii="Calibri" w:cs="Calibri" w:eastAsia="Calibri" w:hAnsi="Calibri"/>
+                <w:b/>
+                <w:bCs/>
+                <w:color w:val="1F3A5F"/>
+                <w:sz w:val="15"/>
+                <w:szCs w:val="15"/>
+              </w:rPr>
+              <w:t xml:space="preserve">19:00-21:00</w:t>
+            </w:r>
+          </w:p>
+          <w:p>
+            <w:pPr>
+              <w:spacing w:after="50"/>
+            </w:pPr>
+            <w:r>
+              <w:rPr>
+                <w:rFonts w:ascii="Calibri" w:cs="Calibri" w:eastAsia="Calibri" w:hAnsi="Calibri"/>
                 <w:sz w:val="16"/>
                 <w:szCs w:val="16"/>
               </w:rPr>
-              <w:t xml:space="preserve">BSCP 2 h</w:t>
+              <w:t xml:space="preserve">BSCP (2 h)</w:t>
             </w:r>
           </w:p>
         </w:tc>
@@ -10628,42 +10837,68 @@
             <w:tcMar>
               <w:top w:type="dxa" w:w="50"/>
               <w:left w:type="dxa" w:w="70"/>
-              <w:bottom w:type="dxa" w:w="50"/>
+              <w:bottom w:type="dxa" w:w="40"/>
               <w:right w:type="dxa" w:w="70"/>
             </w:tcMar>
           </w:tcPr>
           <w:p>
             <w:pPr>
-              <w:spacing w:after="20"/>
-              <w:jc w:val="left"/>
-            </w:pPr>
-            <w:r>
-              <w:rPr>
-                <w:rFonts w:ascii="Calibri" w:cs="Calibri" w:eastAsia="Calibri" w:hAnsi="Calibri"/>
-                <w:b w:val="false"/>
-                <w:bCs w:val="false"/>
-                <w:color w:val="000000"/>
+              <w:keepNext/>
+              <w:spacing w:after="0"/>
+            </w:pPr>
+            <w:r>
+              <w:rPr>
+                <w:rFonts w:ascii="Calibri" w:cs="Calibri" w:eastAsia="Calibri" w:hAnsi="Calibri"/>
+                <w:b/>
+                <w:bCs/>
+                <w:color w:val="1F3A5F"/>
+                <w:sz w:val="15"/>
+                <w:szCs w:val="15"/>
+              </w:rPr>
+              <w:t xml:space="preserve">19:00-19:30</w:t>
+            </w:r>
+          </w:p>
+          <w:p>
+            <w:pPr>
+              <w:spacing w:after="50"/>
+            </w:pPr>
+            <w:r>
+              <w:rPr>
+                <w:rFonts w:ascii="Calibri" w:cs="Calibri" w:eastAsia="Calibri" w:hAnsi="Calibri"/>
                 <w:sz w:val="16"/>
                 <w:szCs w:val="16"/>
               </w:rPr>
-              <w:t xml:space="preserve">École 30 min</w:t>
-            </w:r>
-          </w:p>
-          <w:p>
-            <w:pPr>
-              <w:spacing w:after="20"/>
-              <w:jc w:val="left"/>
-            </w:pPr>
-            <w:r>
-              <w:rPr>
-                <w:rFonts w:ascii="Calibri" w:cs="Calibri" w:eastAsia="Calibri" w:hAnsi="Calibri"/>
-                <w:b w:val="false"/>
-                <w:bCs w:val="false"/>
-                <w:color w:val="000000"/>
+              <w:t xml:space="preserve">École (30 min)</w:t>
+            </w:r>
+          </w:p>
+          <w:p>
+            <w:pPr>
+              <w:keepNext/>
+              <w:spacing w:after="0"/>
+            </w:pPr>
+            <w:r>
+              <w:rPr>
+                <w:rFonts w:ascii="Calibri" w:cs="Calibri" w:eastAsia="Calibri" w:hAnsi="Calibri"/>
+                <w:b/>
+                <w:bCs/>
+                <w:color w:val="1F3A5F"/>
+                <w:sz w:val="15"/>
+                <w:szCs w:val="15"/>
+              </w:rPr>
+              <w:t xml:space="preserve">19:30-20:00</w:t>
+            </w:r>
+          </w:p>
+          <w:p>
+            <w:pPr>
+              <w:spacing w:after="50"/>
+            </w:pPr>
+            <w:r>
+              <w:rPr>
+                <w:rFonts w:ascii="Calibri" w:cs="Calibri" w:eastAsia="Calibri" w:hAnsi="Calibri"/>
                 <w:sz w:val="16"/>
                 <w:szCs w:val="16"/>
               </w:rPr>
-              <w:t xml:space="preserve">Revue 30 min</w:t>
+              <w:t xml:space="preserve">Revue (30 min)</w:t>
             </w:r>
           </w:p>
         </w:tc>
@@ -10680,42 +10915,68 @@
             <w:tcMar>
               <w:top w:type="dxa" w:w="50"/>
               <w:left w:type="dxa" w:w="70"/>
-              <w:bottom w:type="dxa" w:w="50"/>
+              <w:bottom w:type="dxa" w:w="40"/>
               <w:right w:type="dxa" w:w="70"/>
             </w:tcMar>
           </w:tcPr>
           <w:p>
             <w:pPr>
-              <w:spacing w:after="20"/>
-              <w:jc w:val="left"/>
-            </w:pPr>
-            <w:r>
-              <w:rPr>
-                <w:rFonts w:ascii="Calibri" w:cs="Calibri" w:eastAsia="Calibri" w:hAnsi="Calibri"/>
-                <w:b w:val="false"/>
-                <w:bCs w:val="false"/>
-                <w:color w:val="000000"/>
+              <w:keepNext/>
+              <w:spacing w:after="0"/>
+            </w:pPr>
+            <w:r>
+              <w:rPr>
+                <w:rFonts w:ascii="Calibri" w:cs="Calibri" w:eastAsia="Calibri" w:hAnsi="Calibri"/>
+                <w:b/>
+                <w:bCs/>
+                <w:color w:val="1F3A5F"/>
+                <w:sz w:val="15"/>
+                <w:szCs w:val="15"/>
+              </w:rPr>
+              <w:t xml:space="preserve">09:00-11:00</w:t>
+            </w:r>
+          </w:p>
+          <w:p>
+            <w:pPr>
+              <w:spacing w:after="50"/>
+            </w:pPr>
+            <w:r>
+              <w:rPr>
+                <w:rFonts w:ascii="Calibri" w:cs="Calibri" w:eastAsia="Calibri" w:hAnsi="Calibri"/>
                 <w:sz w:val="16"/>
                 <w:szCs w:val="16"/>
               </w:rPr>
-              <w:t xml:space="preserve">BSCP 2 h</w:t>
-            </w:r>
-          </w:p>
-          <w:p>
-            <w:pPr>
-              <w:spacing w:after="20"/>
-              <w:jc w:val="left"/>
-            </w:pPr>
-            <w:r>
-              <w:rPr>
-                <w:rFonts w:ascii="Calibri" w:cs="Calibri" w:eastAsia="Calibri" w:hAnsi="Calibri"/>
-                <w:b w:val="false"/>
-                <w:bCs w:val="false"/>
-                <w:color w:val="000000"/>
+              <w:t xml:space="preserve">BSCP (2 h)</w:t>
+            </w:r>
+          </w:p>
+          <w:p>
+            <w:pPr>
+              <w:keepNext/>
+              <w:spacing w:after="0"/>
+            </w:pPr>
+            <w:r>
+              <w:rPr>
+                <w:rFonts w:ascii="Calibri" w:cs="Calibri" w:eastAsia="Calibri" w:hAnsi="Calibri"/>
+                <w:b/>
+                <w:bCs/>
+                <w:color w:val="1F3A5F"/>
+                <w:sz w:val="15"/>
+                <w:szCs w:val="15"/>
+              </w:rPr>
+              <w:t xml:space="preserve">11:15-14:15</w:t>
+            </w:r>
+          </w:p>
+          <w:p>
+            <w:pPr>
+              <w:spacing w:after="50"/>
+            </w:pPr>
+            <w:r>
+              <w:rPr>
+                <w:rFonts w:ascii="Calibri" w:cs="Calibri" w:eastAsia="Calibri" w:hAnsi="Calibri"/>
                 <w:sz w:val="16"/>
                 <w:szCs w:val="16"/>
               </w:rPr>
-              <w:t xml:space="preserve">Lab 3 h</w:t>
+              <w:t xml:space="preserve">Lab (3 h)</w:t>
             </w:r>
           </w:p>
         </w:tc>
@@ -10732,20 +10993,14 @@
             <w:tcMar>
               <w:top w:type="dxa" w:w="50"/>
               <w:left w:type="dxa" w:w="70"/>
-              <w:bottom w:type="dxa" w:w="50"/>
+              <w:bottom w:type="dxa" w:w="40"/>
               <w:right w:type="dxa" w:w="70"/>
             </w:tcMar>
           </w:tcPr>
           <w:p>
-            <w:pPr>
-              <w:spacing w:after="20"/>
-              <w:jc w:val="left"/>
-            </w:pPr>
-            <w:r>
-              <w:rPr>
-                <w:rFonts w:ascii="Calibri" w:cs="Calibri" w:eastAsia="Calibri" w:hAnsi="Calibri"/>
-                <w:b w:val="false"/>
-                <w:bCs w:val="false"/>
+            <w:r>
+              <w:rPr>
+                <w:rFonts w:ascii="Calibri" w:cs="Calibri" w:eastAsia="Calibri" w:hAnsi="Calibri"/>
                 <w:color w:val="777777"/>
                 <w:sz w:val="16"/>
                 <w:szCs w:val="16"/>
@@ -10807,25 +11062,38 @@
             <w:tcMar>
               <w:top w:type="dxa" w:w="50"/>
               <w:left w:type="dxa" w:w="70"/>
-              <w:bottom w:type="dxa" w:w="50"/>
+              <w:bottom w:type="dxa" w:w="40"/>
               <w:right w:type="dxa" w:w="70"/>
             </w:tcMar>
           </w:tcPr>
           <w:p>
             <w:pPr>
-              <w:spacing w:after="20"/>
-              <w:jc w:val="left"/>
-            </w:pPr>
-            <w:r>
-              <w:rPr>
-                <w:rFonts w:ascii="Calibri" w:cs="Calibri" w:eastAsia="Calibri" w:hAnsi="Calibri"/>
-                <w:b w:val="false"/>
-                <w:bCs w:val="false"/>
-                <w:color w:val="000000"/>
+              <w:keepNext/>
+              <w:spacing w:after="0"/>
+            </w:pPr>
+            <w:r>
+              <w:rPr>
+                <w:rFonts w:ascii="Calibri" w:cs="Calibri" w:eastAsia="Calibri" w:hAnsi="Calibri"/>
+                <w:b/>
+                <w:bCs/>
+                <w:color w:val="1F3A5F"/>
+                <w:sz w:val="15"/>
+                <w:szCs w:val="15"/>
+              </w:rPr>
+              <w:t xml:space="preserve">19:00-21:00</w:t>
+            </w:r>
+          </w:p>
+          <w:p>
+            <w:pPr>
+              <w:spacing w:after="50"/>
+            </w:pPr>
+            <w:r>
+              <w:rPr>
+                <w:rFonts w:ascii="Calibri" w:cs="Calibri" w:eastAsia="Calibri" w:hAnsi="Calibri"/>
                 <w:sz w:val="16"/>
                 <w:szCs w:val="16"/>
               </w:rPr>
-              <w:t xml:space="preserve">CRTO 2 h</w:t>
+              <w:t xml:space="preserve">CRTO (2 h)</w:t>
             </w:r>
           </w:p>
         </w:tc>
@@ -10842,25 +11110,38 @@
             <w:tcMar>
               <w:top w:type="dxa" w:w="50"/>
               <w:left w:type="dxa" w:w="70"/>
-              <w:bottom w:type="dxa" w:w="50"/>
+              <w:bottom w:type="dxa" w:w="40"/>
               <w:right w:type="dxa" w:w="70"/>
             </w:tcMar>
           </w:tcPr>
           <w:p>
             <w:pPr>
-              <w:spacing w:after="20"/>
-              <w:jc w:val="left"/>
-            </w:pPr>
-            <w:r>
-              <w:rPr>
-                <w:rFonts w:ascii="Calibri" w:cs="Calibri" w:eastAsia="Calibri" w:hAnsi="Calibri"/>
-                <w:b w:val="false"/>
-                <w:bCs w:val="false"/>
-                <w:color w:val="000000"/>
+              <w:keepNext/>
+              <w:spacing w:after="0"/>
+            </w:pPr>
+            <w:r>
+              <w:rPr>
+                <w:rFonts w:ascii="Calibri" w:cs="Calibri" w:eastAsia="Calibri" w:hAnsi="Calibri"/>
+                <w:b/>
+                <w:bCs/>
+                <w:color w:val="1F3A5F"/>
+                <w:sz w:val="15"/>
+                <w:szCs w:val="15"/>
+              </w:rPr>
+              <w:t xml:space="preserve">19:00-21:30</w:t>
+            </w:r>
+          </w:p>
+          <w:p>
+            <w:pPr>
+              <w:spacing w:after="50"/>
+            </w:pPr>
+            <w:r>
+              <w:rPr>
+                <w:rFonts w:ascii="Calibri" w:cs="Calibri" w:eastAsia="Calibri" w:hAnsi="Calibri"/>
                 <w:sz w:val="16"/>
                 <w:szCs w:val="16"/>
               </w:rPr>
-              <w:t xml:space="preserve">Lab 2 h 30</w:t>
+              <w:t xml:space="preserve">Lab (2 h 30)</w:t>
             </w:r>
           </w:p>
         </w:tc>
@@ -10877,42 +11158,68 @@
             <w:tcMar>
               <w:top w:type="dxa" w:w="50"/>
               <w:left w:type="dxa" w:w="70"/>
-              <w:bottom w:type="dxa" w:w="50"/>
+              <w:bottom w:type="dxa" w:w="40"/>
               <w:right w:type="dxa" w:w="70"/>
             </w:tcMar>
           </w:tcPr>
           <w:p>
             <w:pPr>
-              <w:spacing w:after="20"/>
-              <w:jc w:val="left"/>
-            </w:pPr>
-            <w:r>
-              <w:rPr>
-                <w:rFonts w:ascii="Calibri" w:cs="Calibri" w:eastAsia="Calibri" w:hAnsi="Calibri"/>
-                <w:b w:val="false"/>
-                <w:bCs w:val="false"/>
-                <w:color w:val="000000"/>
+              <w:keepNext/>
+              <w:spacing w:after="0"/>
+            </w:pPr>
+            <w:r>
+              <w:rPr>
+                <w:rFonts w:ascii="Calibri" w:cs="Calibri" w:eastAsia="Calibri" w:hAnsi="Calibri"/>
+                <w:b/>
+                <w:bCs/>
+                <w:color w:val="1F3A5F"/>
+                <w:sz w:val="15"/>
+                <w:szCs w:val="15"/>
+              </w:rPr>
+              <w:t xml:space="preserve">19:00-21:00</w:t>
+            </w:r>
+          </w:p>
+          <w:p>
+            <w:pPr>
+              <w:spacing w:after="50"/>
+            </w:pPr>
+            <w:r>
+              <w:rPr>
+                <w:rFonts w:ascii="Calibri" w:cs="Calibri" w:eastAsia="Calibri" w:hAnsi="Calibri"/>
                 <w:sz w:val="16"/>
                 <w:szCs w:val="16"/>
               </w:rPr>
-              <w:t xml:space="preserve">C, Sektor7 2 h</w:t>
-            </w:r>
-          </w:p>
-          <w:p>
-            <w:pPr>
-              <w:spacing w:after="20"/>
-              <w:jc w:val="left"/>
-            </w:pPr>
-            <w:r>
-              <w:rPr>
-                <w:rFonts w:ascii="Calibri" w:cs="Calibri" w:eastAsia="Calibri" w:hAnsi="Calibri"/>
-                <w:b w:val="false"/>
-                <w:bCs w:val="false"/>
-                <w:color w:val="000000"/>
+              <w:t xml:space="preserve">C, Sektor7 (2 h)</w:t>
+            </w:r>
+          </w:p>
+          <w:p>
+            <w:pPr>
+              <w:keepNext/>
+              <w:spacing w:after="0"/>
+            </w:pPr>
+            <w:r>
+              <w:rPr>
+                <w:rFonts w:ascii="Calibri" w:cs="Calibri" w:eastAsia="Calibri" w:hAnsi="Calibri"/>
+                <w:b/>
+                <w:bCs/>
+                <w:color w:val="1F3A5F"/>
+                <w:sz w:val="15"/>
+                <w:szCs w:val="15"/>
+              </w:rPr>
+              <w:t xml:space="preserve">21:00-21:30</w:t>
+            </w:r>
+          </w:p>
+          <w:p>
+            <w:pPr>
+              <w:spacing w:after="50"/>
+            </w:pPr>
+            <w:r>
+              <w:rPr>
+                <w:rFonts w:ascii="Calibri" w:cs="Calibri" w:eastAsia="Calibri" w:hAnsi="Calibri"/>
                 <w:sz w:val="16"/>
                 <w:szCs w:val="16"/>
               </w:rPr>
-              <w:t xml:space="preserve">Rédaction 30 min</w:t>
+              <w:t xml:space="preserve">Rédaction (30 min)</w:t>
             </w:r>
           </w:p>
         </w:tc>
@@ -10929,25 +11236,38 @@
             <w:tcMar>
               <w:top w:type="dxa" w:w="50"/>
               <w:left w:type="dxa" w:w="70"/>
-              <w:bottom w:type="dxa" w:w="50"/>
+              <w:bottom w:type="dxa" w:w="40"/>
               <w:right w:type="dxa" w:w="70"/>
             </w:tcMar>
           </w:tcPr>
           <w:p>
             <w:pPr>
-              <w:spacing w:after="20"/>
-              <w:jc w:val="left"/>
-            </w:pPr>
-            <w:r>
-              <w:rPr>
-                <w:rFonts w:ascii="Calibri" w:cs="Calibri" w:eastAsia="Calibri" w:hAnsi="Calibri"/>
-                <w:b w:val="false"/>
-                <w:bCs w:val="false"/>
-                <w:color w:val="000000"/>
+              <w:keepNext/>
+              <w:spacing w:after="0"/>
+            </w:pPr>
+            <w:r>
+              <w:rPr>
+                <w:rFonts w:ascii="Calibri" w:cs="Calibri" w:eastAsia="Calibri" w:hAnsi="Calibri"/>
+                <w:b/>
+                <w:bCs/>
+                <w:color w:val="1F3A5F"/>
+                <w:sz w:val="15"/>
+                <w:szCs w:val="15"/>
+              </w:rPr>
+              <w:t xml:space="preserve">19:00-21:00</w:t>
+            </w:r>
+          </w:p>
+          <w:p>
+            <w:pPr>
+              <w:spacing w:after="50"/>
+            </w:pPr>
+            <w:r>
+              <w:rPr>
+                <w:rFonts w:ascii="Calibri" w:cs="Calibri" w:eastAsia="Calibri" w:hAnsi="Calibri"/>
                 <w:sz w:val="16"/>
                 <w:szCs w:val="16"/>
               </w:rPr>
-              <w:t xml:space="preserve">CRTO 2 h</w:t>
+              <w:t xml:space="preserve">CRTO (2 h)</w:t>
             </w:r>
           </w:p>
         </w:tc>
@@ -10964,59 +11284,98 @@
             <w:tcMar>
               <w:top w:type="dxa" w:w="50"/>
               <w:left w:type="dxa" w:w="70"/>
-              <w:bottom w:type="dxa" w:w="50"/>
+              <w:bottom w:type="dxa" w:w="40"/>
               <w:right w:type="dxa" w:w="70"/>
             </w:tcMar>
           </w:tcPr>
           <w:p>
             <w:pPr>
-              <w:spacing w:after="20"/>
-              <w:jc w:val="left"/>
-            </w:pPr>
-            <w:r>
-              <w:rPr>
-                <w:rFonts w:ascii="Calibri" w:cs="Calibri" w:eastAsia="Calibri" w:hAnsi="Calibri"/>
-                <w:b w:val="false"/>
-                <w:bCs w:val="false"/>
-                <w:color w:val="000000"/>
+              <w:keepNext/>
+              <w:spacing w:after="0"/>
+            </w:pPr>
+            <w:r>
+              <w:rPr>
+                <w:rFonts w:ascii="Calibri" w:cs="Calibri" w:eastAsia="Calibri" w:hAnsi="Calibri"/>
+                <w:b/>
+                <w:bCs/>
+                <w:color w:val="1F3A5F"/>
+                <w:sz w:val="15"/>
+                <w:szCs w:val="15"/>
+              </w:rPr>
+              <w:t xml:space="preserve">19:00-19:30</w:t>
+            </w:r>
+          </w:p>
+          <w:p>
+            <w:pPr>
+              <w:spacing w:after="50"/>
+            </w:pPr>
+            <w:r>
+              <w:rPr>
+                <w:rFonts w:ascii="Calibri" w:cs="Calibri" w:eastAsia="Calibri" w:hAnsi="Calibri"/>
                 <w:sz w:val="16"/>
                 <w:szCs w:val="16"/>
               </w:rPr>
-              <w:t xml:space="preserve">École 30 min</w:t>
-            </w:r>
-          </w:p>
-          <w:p>
-            <w:pPr>
-              <w:spacing w:after="20"/>
-              <w:jc w:val="left"/>
-            </w:pPr>
-            <w:r>
-              <w:rPr>
-                <w:rFonts w:ascii="Calibri" w:cs="Calibri" w:eastAsia="Calibri" w:hAnsi="Calibri"/>
-                <w:b w:val="false"/>
-                <w:bCs w:val="false"/>
-                <w:color w:val="000000"/>
+              <w:t xml:space="preserve">École (30 min)</w:t>
+            </w:r>
+          </w:p>
+          <w:p>
+            <w:pPr>
+              <w:keepNext/>
+              <w:spacing w:after="0"/>
+            </w:pPr>
+            <w:r>
+              <w:rPr>
+                <w:rFonts w:ascii="Calibri" w:cs="Calibri" w:eastAsia="Calibri" w:hAnsi="Calibri"/>
+                <w:b/>
+                <w:bCs/>
+                <w:color w:val="1F3A5F"/>
+                <w:sz w:val="15"/>
+                <w:szCs w:val="15"/>
+              </w:rPr>
+              <w:t xml:space="preserve">19:30-20:00</w:t>
+            </w:r>
+          </w:p>
+          <w:p>
+            <w:pPr>
+              <w:spacing w:after="50"/>
+            </w:pPr>
+            <w:r>
+              <w:rPr>
+                <w:rFonts w:ascii="Calibri" w:cs="Calibri" w:eastAsia="Calibri" w:hAnsi="Calibri"/>
                 <w:sz w:val="16"/>
                 <w:szCs w:val="16"/>
               </w:rPr>
-              <w:t xml:space="preserve">Revue 30 min</w:t>
-            </w:r>
-          </w:p>
-          <w:p>
-            <w:pPr>
-              <w:spacing w:after="20"/>
-              <w:jc w:val="left"/>
-            </w:pPr>
-            <w:r>
-              <w:rPr>
-                <w:rFonts w:ascii="Calibri" w:cs="Calibri" w:eastAsia="Calibri" w:hAnsi="Calibri"/>
-                <w:b w:val="false"/>
-                <w:bCs w:val="false"/>
-                <w:color w:val="000000"/>
+              <w:t xml:space="preserve">Revue (30 min)</w:t>
+            </w:r>
+          </w:p>
+          <w:p>
+            <w:pPr>
+              <w:keepNext/>
+              <w:spacing w:after="0"/>
+            </w:pPr>
+            <w:r>
+              <w:rPr>
+                <w:rFonts w:ascii="Calibri" w:cs="Calibri" w:eastAsia="Calibri" w:hAnsi="Calibri"/>
+                <w:b/>
+                <w:bCs/>
+                <w:color w:val="1F3A5F"/>
+                <w:sz w:val="15"/>
+                <w:szCs w:val="15"/>
+              </w:rPr>
+              <w:t xml:space="preserve">20:00-20:30</w:t>
+            </w:r>
+          </w:p>
+          <w:p>
+            <w:pPr>
+              <w:spacing w:after="50"/>
+            </w:pPr>
+            <w:r>
+              <w:rPr>
+                <w:rFonts w:ascii="Calibri" w:cs="Calibri" w:eastAsia="Calibri" w:hAnsi="Calibri"/>
                 <w:sz w:val="16"/>
                 <w:szCs w:val="16"/>
               </w:rPr>
-              <w:t xml:space="preserve">Rédaction 30 min</w:t>
+              <w:t xml:space="preserve">Rédaction (30 min)</w:t>
             </w:r>
           </w:p>
         </w:tc>
@@ -11033,42 +11392,68 @@
             <w:tcMar>
               <w:top w:type="dxa" w:w="50"/>
               <w:left w:type="dxa" w:w="70"/>
-              <w:bottom w:type="dxa" w:w="50"/>
+              <w:bottom w:type="dxa" w:w="40"/>
               <w:right w:type="dxa" w:w="70"/>
             </w:tcMar>
           </w:tcPr>
           <w:p>
             <w:pPr>
-              <w:spacing w:after="20"/>
-              <w:jc w:val="left"/>
-            </w:pPr>
-            <w:r>
-              <w:rPr>
-                <w:rFonts w:ascii="Calibri" w:cs="Calibri" w:eastAsia="Calibri" w:hAnsi="Calibri"/>
-                <w:b w:val="false"/>
-                <w:bCs w:val="false"/>
-                <w:color w:val="000000"/>
+              <w:keepNext/>
+              <w:spacing w:after="0"/>
+            </w:pPr>
+            <w:r>
+              <w:rPr>
+                <w:rFonts w:ascii="Calibri" w:cs="Calibri" w:eastAsia="Calibri" w:hAnsi="Calibri"/>
+                <w:b/>
+                <w:bCs/>
+                <w:color w:val="1F3A5F"/>
+                <w:sz w:val="15"/>
+                <w:szCs w:val="15"/>
+              </w:rPr>
+              <w:t xml:space="preserve">09:00-11:30</w:t>
+            </w:r>
+          </w:p>
+          <w:p>
+            <w:pPr>
+              <w:spacing w:after="50"/>
+            </w:pPr>
+            <w:r>
+              <w:rPr>
+                <w:rFonts w:ascii="Calibri" w:cs="Calibri" w:eastAsia="Calibri" w:hAnsi="Calibri"/>
                 <w:sz w:val="16"/>
                 <w:szCs w:val="16"/>
               </w:rPr>
-              <w:t xml:space="preserve">Lab 2 h 30</w:t>
-            </w:r>
-          </w:p>
-          <w:p>
-            <w:pPr>
-              <w:spacing w:after="20"/>
-              <w:jc w:val="left"/>
-            </w:pPr>
-            <w:r>
-              <w:rPr>
-                <w:rFonts w:ascii="Calibri" w:cs="Calibri" w:eastAsia="Calibri" w:hAnsi="Calibri"/>
-                <w:b w:val="false"/>
-                <w:bCs w:val="false"/>
-                <w:color w:val="000000"/>
+              <w:t xml:space="preserve">Lab (2 h 30)</w:t>
+            </w:r>
+          </w:p>
+          <w:p>
+            <w:pPr>
+              <w:keepNext/>
+              <w:spacing w:after="0"/>
+            </w:pPr>
+            <w:r>
+              <w:rPr>
+                <w:rFonts w:ascii="Calibri" w:cs="Calibri" w:eastAsia="Calibri" w:hAnsi="Calibri"/>
+                <w:b/>
+                <w:bCs/>
+                <w:color w:val="1F3A5F"/>
+                <w:sz w:val="15"/>
+                <w:szCs w:val="15"/>
+              </w:rPr>
+              <w:t xml:space="preserve">11:45-13:45</w:t>
+            </w:r>
+          </w:p>
+          <w:p>
+            <w:pPr>
+              <w:spacing w:after="50"/>
+            </w:pPr>
+            <w:r>
+              <w:rPr>
+                <w:rFonts w:ascii="Calibri" w:cs="Calibri" w:eastAsia="Calibri" w:hAnsi="Calibri"/>
                 <w:sz w:val="16"/>
                 <w:szCs w:val="16"/>
               </w:rPr>
-              <w:t xml:space="preserve">C, projet 2 h</w:t>
+              <w:t xml:space="preserve">C, projet (2 h)</w:t>
             </w:r>
           </w:p>
         </w:tc>
@@ -11085,20 +11470,14 @@
             <w:tcMar>
               <w:top w:type="dxa" w:w="50"/>
               <w:left w:type="dxa" w:w="70"/>
-              <w:bottom w:type="dxa" w:w="50"/>
+              <w:bottom w:type="dxa" w:w="40"/>
               <w:right w:type="dxa" w:w="70"/>
             </w:tcMar>
           </w:tcPr>
           <w:p>
-            <w:pPr>
-              <w:spacing w:after="20"/>
-              <w:jc w:val="left"/>
-            </w:pPr>
-            <w:r>
-              <w:rPr>
-                <w:rFonts w:ascii="Calibri" w:cs="Calibri" w:eastAsia="Calibri" w:hAnsi="Calibri"/>
-                <w:b w:val="false"/>
-                <w:bCs w:val="false"/>
+            <w:r>
+              <w:rPr>
+                <w:rFonts w:ascii="Calibri" w:cs="Calibri" w:eastAsia="Calibri" w:hAnsi="Calibri"/>
                 <w:color w:val="777777"/>
                 <w:sz w:val="16"/>
                 <w:szCs w:val="16"/>
@@ -11160,25 +11539,38 @@
             <w:tcMar>
               <w:top w:type="dxa" w:w="50"/>
               <w:left w:type="dxa" w:w="70"/>
-              <w:bottom w:type="dxa" w:w="50"/>
+              <w:bottom w:type="dxa" w:w="40"/>
               <w:right w:type="dxa" w:w="70"/>
             </w:tcMar>
           </w:tcPr>
           <w:p>
             <w:pPr>
-              <w:spacing w:after="20"/>
-              <w:jc w:val="left"/>
-            </w:pPr>
-            <w:r>
-              <w:rPr>
-                <w:rFonts w:ascii="Calibri" w:cs="Calibri" w:eastAsia="Calibri" w:hAnsi="Calibri"/>
-                <w:b w:val="false"/>
-                <w:bCs w:val="false"/>
-                <w:color w:val="000000"/>
+              <w:keepNext/>
+              <w:spacing w:after="0"/>
+            </w:pPr>
+            <w:r>
+              <w:rPr>
+                <w:rFonts w:ascii="Calibri" w:cs="Calibri" w:eastAsia="Calibri" w:hAnsi="Calibri"/>
+                <w:b/>
+                <w:bCs/>
+                <w:color w:val="1F3A5F"/>
+                <w:sz w:val="15"/>
+                <w:szCs w:val="15"/>
+              </w:rPr>
+              <w:t xml:space="preserve">19:00-21:00</w:t>
+            </w:r>
+          </w:p>
+          <w:p>
+            <w:pPr>
+              <w:spacing w:after="50"/>
+            </w:pPr>
+            <w:r>
+              <w:rPr>
+                <w:rFonts w:ascii="Calibri" w:cs="Calibri" w:eastAsia="Calibri" w:hAnsi="Calibri"/>
                 <w:sz w:val="16"/>
                 <w:szCs w:val="16"/>
               </w:rPr>
-              <w:t xml:space="preserve">Cours 2 h</w:t>
+              <w:t xml:space="preserve">Cours (2 h)</w:t>
             </w:r>
           </w:p>
         </w:tc>
@@ -11195,25 +11587,38 @@
             <w:tcMar>
               <w:top w:type="dxa" w:w="50"/>
               <w:left w:type="dxa" w:w="70"/>
-              <w:bottom w:type="dxa" w:w="50"/>
+              <w:bottom w:type="dxa" w:w="40"/>
               <w:right w:type="dxa" w:w="70"/>
             </w:tcMar>
           </w:tcPr>
           <w:p>
             <w:pPr>
-              <w:spacing w:after="20"/>
-              <w:jc w:val="left"/>
-            </w:pPr>
-            <w:r>
-              <w:rPr>
-                <w:rFonts w:ascii="Calibri" w:cs="Calibri" w:eastAsia="Calibri" w:hAnsi="Calibri"/>
-                <w:b w:val="false"/>
-                <w:bCs w:val="false"/>
-                <w:color w:val="000000"/>
+              <w:keepNext/>
+              <w:spacing w:after="0"/>
+            </w:pPr>
+            <w:r>
+              <w:rPr>
+                <w:rFonts w:ascii="Calibri" w:cs="Calibri" w:eastAsia="Calibri" w:hAnsi="Calibri"/>
+                <w:b/>
+                <w:bCs/>
+                <w:color w:val="1F3A5F"/>
+                <w:sz w:val="15"/>
+                <w:szCs w:val="15"/>
+              </w:rPr>
+              <w:t xml:space="preserve">19:00-21:30</w:t>
+            </w:r>
+          </w:p>
+          <w:p>
+            <w:pPr>
+              <w:spacing w:after="50"/>
+            </w:pPr>
+            <w:r>
+              <w:rPr>
+                <w:rFonts w:ascii="Calibri" w:cs="Calibri" w:eastAsia="Calibri" w:hAnsi="Calibri"/>
                 <w:sz w:val="16"/>
                 <w:szCs w:val="16"/>
               </w:rPr>
-              <w:t xml:space="preserve">Lab 2 h 30</w:t>
+              <w:t xml:space="preserve">Lab (2 h 30)</w:t>
             </w:r>
           </w:p>
         </w:tc>
@@ -11230,25 +11635,38 @@
             <w:tcMar>
               <w:top w:type="dxa" w:w="50"/>
               <w:left w:type="dxa" w:w="70"/>
-              <w:bottom w:type="dxa" w:w="50"/>
+              <w:bottom w:type="dxa" w:w="40"/>
               <w:right w:type="dxa" w:w="70"/>
             </w:tcMar>
           </w:tcPr>
           <w:p>
             <w:pPr>
-              <w:spacing w:after="20"/>
-              <w:jc w:val="left"/>
-            </w:pPr>
-            <w:r>
-              <w:rPr>
-                <w:rFonts w:ascii="Calibri" w:cs="Calibri" w:eastAsia="Calibri" w:hAnsi="Calibri"/>
-                <w:b w:val="false"/>
-                <w:bCs w:val="false"/>
-                <w:color w:val="000000"/>
+              <w:keepNext/>
+              <w:spacing w:after="0"/>
+            </w:pPr>
+            <w:r>
+              <w:rPr>
+                <w:rFonts w:ascii="Calibri" w:cs="Calibri" w:eastAsia="Calibri" w:hAnsi="Calibri"/>
+                <w:b/>
+                <w:bCs/>
+                <w:color w:val="1F3A5F"/>
+                <w:sz w:val="15"/>
+                <w:szCs w:val="15"/>
+              </w:rPr>
+              <w:t xml:space="preserve">19:00-21:00</w:t>
+            </w:r>
+          </w:p>
+          <w:p>
+            <w:pPr>
+              <w:spacing w:after="50"/>
+            </w:pPr>
+            <w:r>
+              <w:rPr>
+                <w:rFonts w:ascii="Calibri" w:cs="Calibri" w:eastAsia="Calibri" w:hAnsi="Calibri"/>
                 <w:sz w:val="16"/>
                 <w:szCs w:val="16"/>
               </w:rPr>
-              <w:t xml:space="preserve">Reverse eng. 2 h</w:t>
+              <w:t xml:space="preserve">Reverse eng. (2 h)</w:t>
             </w:r>
           </w:p>
         </w:tc>
@@ -11265,25 +11683,38 @@
             <w:tcMar>
               <w:top w:type="dxa" w:w="50"/>
               <w:left w:type="dxa" w:w="70"/>
-              <w:bottom w:type="dxa" w:w="50"/>
+              <w:bottom w:type="dxa" w:w="40"/>
               <w:right w:type="dxa" w:w="70"/>
             </w:tcMar>
           </w:tcPr>
           <w:p>
             <w:pPr>
-              <w:spacing w:after="20"/>
-              <w:jc w:val="left"/>
-            </w:pPr>
-            <w:r>
-              <w:rPr>
-                <w:rFonts w:ascii="Calibri" w:cs="Calibri" w:eastAsia="Calibri" w:hAnsi="Calibri"/>
-                <w:b w:val="false"/>
-                <w:bCs w:val="false"/>
-                <w:color w:val="000000"/>
+              <w:keepNext/>
+              <w:spacing w:after="0"/>
+            </w:pPr>
+            <w:r>
+              <w:rPr>
+                <w:rFonts w:ascii="Calibri" w:cs="Calibri" w:eastAsia="Calibri" w:hAnsi="Calibri"/>
+                <w:b/>
+                <w:bCs/>
+                <w:color w:val="1F3A5F"/>
+                <w:sz w:val="15"/>
+                <w:szCs w:val="15"/>
+              </w:rPr>
+              <w:t xml:space="preserve">19:00-21:00</w:t>
+            </w:r>
+          </w:p>
+          <w:p>
+            <w:pPr>
+              <w:spacing w:after="50"/>
+            </w:pPr>
+            <w:r>
+              <w:rPr>
+                <w:rFonts w:ascii="Calibri" w:cs="Calibri" w:eastAsia="Calibri" w:hAnsi="Calibri"/>
                 <w:sz w:val="16"/>
                 <w:szCs w:val="16"/>
               </w:rPr>
-              <w:t xml:space="preserve">Cours 2 h</w:t>
+              <w:t xml:space="preserve">Cours (2 h)</w:t>
             </w:r>
           </w:p>
         </w:tc>
@@ -11300,42 +11731,68 @@
             <w:tcMar>
               <w:top w:type="dxa" w:w="50"/>
               <w:left w:type="dxa" w:w="70"/>
-              <w:bottom w:type="dxa" w:w="50"/>
+              <w:bottom w:type="dxa" w:w="40"/>
               <w:right w:type="dxa" w:w="70"/>
             </w:tcMar>
           </w:tcPr>
           <w:p>
             <w:pPr>
-              <w:spacing w:after="20"/>
-              <w:jc w:val="left"/>
-            </w:pPr>
-            <w:r>
-              <w:rPr>
-                <w:rFonts w:ascii="Calibri" w:cs="Calibri" w:eastAsia="Calibri" w:hAnsi="Calibri"/>
-                <w:b w:val="false"/>
-                <w:bCs w:val="false"/>
-                <w:color w:val="000000"/>
+              <w:keepNext/>
+              <w:spacing w:after="0"/>
+            </w:pPr>
+            <w:r>
+              <w:rPr>
+                <w:rFonts w:ascii="Calibri" w:cs="Calibri" w:eastAsia="Calibri" w:hAnsi="Calibri"/>
+                <w:b/>
+                <w:bCs/>
+                <w:color w:val="1F3A5F"/>
+                <w:sz w:val="15"/>
+                <w:szCs w:val="15"/>
+              </w:rPr>
+              <w:t xml:space="preserve">19:00-20:00</w:t>
+            </w:r>
+          </w:p>
+          <w:p>
+            <w:pPr>
+              <w:spacing w:after="50"/>
+            </w:pPr>
+            <w:r>
+              <w:rPr>
+                <w:rFonts w:ascii="Calibri" w:cs="Calibri" w:eastAsia="Calibri" w:hAnsi="Calibri"/>
                 <w:sz w:val="16"/>
                 <w:szCs w:val="16"/>
               </w:rPr>
-              <w:t xml:space="preserve">Rédaction 1 h</w:t>
-            </w:r>
-          </w:p>
-          <w:p>
-            <w:pPr>
-              <w:spacing w:after="20"/>
-              <w:jc w:val="left"/>
-            </w:pPr>
-            <w:r>
-              <w:rPr>
-                <w:rFonts w:ascii="Calibri" w:cs="Calibri" w:eastAsia="Calibri" w:hAnsi="Calibri"/>
-                <w:b w:val="false"/>
-                <w:bCs w:val="false"/>
-                <w:color w:val="000000"/>
+              <w:t xml:space="preserve">Rédaction (1 h)</w:t>
+            </w:r>
+          </w:p>
+          <w:p>
+            <w:pPr>
+              <w:keepNext/>
+              <w:spacing w:after="0"/>
+            </w:pPr>
+            <w:r>
+              <w:rPr>
+                <w:rFonts w:ascii="Calibri" w:cs="Calibri" w:eastAsia="Calibri" w:hAnsi="Calibri"/>
+                <w:b/>
+                <w:bCs/>
+                <w:color w:val="1F3A5F"/>
+                <w:sz w:val="15"/>
+                <w:szCs w:val="15"/>
+              </w:rPr>
+              <w:t xml:space="preserve">20:00-20:30</w:t>
+            </w:r>
+          </w:p>
+          <w:p>
+            <w:pPr>
+              <w:spacing w:after="50"/>
+            </w:pPr>
+            <w:r>
+              <w:rPr>
+                <w:rFonts w:ascii="Calibri" w:cs="Calibri" w:eastAsia="Calibri" w:hAnsi="Calibri"/>
                 <w:sz w:val="16"/>
                 <w:szCs w:val="16"/>
               </w:rPr>
-              <w:t xml:space="preserve">Revue 30 min</w:t>
+              <w:t xml:space="preserve">Revue (30 min)</w:t>
             </w:r>
           </w:p>
         </w:tc>
@@ -11352,59 +11809,98 @@
             <w:tcMar>
               <w:top w:type="dxa" w:w="50"/>
               <w:left w:type="dxa" w:w="70"/>
-              <w:bottom w:type="dxa" w:w="50"/>
+              <w:bottom w:type="dxa" w:w="40"/>
               <w:right w:type="dxa" w:w="70"/>
             </w:tcMar>
           </w:tcPr>
           <w:p>
             <w:pPr>
-              <w:spacing w:after="20"/>
-              <w:jc w:val="left"/>
-            </w:pPr>
-            <w:r>
-              <w:rPr>
-                <w:rFonts w:ascii="Calibri" w:cs="Calibri" w:eastAsia="Calibri" w:hAnsi="Calibri"/>
-                <w:b w:val="false"/>
-                <w:bCs w:val="false"/>
-                <w:color w:val="000000"/>
+              <w:keepNext/>
+              <w:spacing w:after="0"/>
+            </w:pPr>
+            <w:r>
+              <w:rPr>
+                <w:rFonts w:ascii="Calibri" w:cs="Calibri" w:eastAsia="Calibri" w:hAnsi="Calibri"/>
+                <w:b/>
+                <w:bCs/>
+                <w:color w:val="1F3A5F"/>
+                <w:sz w:val="15"/>
+                <w:szCs w:val="15"/>
+              </w:rPr>
+              <w:t xml:space="preserve">09:00-11:30</w:t>
+            </w:r>
+          </w:p>
+          <w:p>
+            <w:pPr>
+              <w:spacing w:after="50"/>
+            </w:pPr>
+            <w:r>
+              <w:rPr>
+                <w:rFonts w:ascii="Calibri" w:cs="Calibri" w:eastAsia="Calibri" w:hAnsi="Calibri"/>
                 <w:sz w:val="16"/>
                 <w:szCs w:val="16"/>
               </w:rPr>
-              <w:t xml:space="preserve">Lab 2 h 30</w:t>
-            </w:r>
-          </w:p>
-          <w:p>
-            <w:pPr>
-              <w:spacing w:after="20"/>
-              <w:jc w:val="left"/>
-            </w:pPr>
-            <w:r>
-              <w:rPr>
-                <w:rFonts w:ascii="Calibri" w:cs="Calibri" w:eastAsia="Calibri" w:hAnsi="Calibri"/>
-                <w:b w:val="false"/>
-                <w:bCs w:val="false"/>
-                <w:color w:val="000000"/>
+              <w:t xml:space="preserve">Lab (2 h 30)</w:t>
+            </w:r>
+          </w:p>
+          <w:p>
+            <w:pPr>
+              <w:keepNext/>
+              <w:spacing w:after="0"/>
+            </w:pPr>
+            <w:r>
+              <w:rPr>
+                <w:rFonts w:ascii="Calibri" w:cs="Calibri" w:eastAsia="Calibri" w:hAnsi="Calibri"/>
+                <w:b/>
+                <w:bCs/>
+                <w:color w:val="1F3A5F"/>
+                <w:sz w:val="15"/>
+                <w:szCs w:val="15"/>
+              </w:rPr>
+              <w:t xml:space="preserve">11:45-13:45</w:t>
+            </w:r>
+          </w:p>
+          <w:p>
+            <w:pPr>
+              <w:spacing w:after="50"/>
+            </w:pPr>
+            <w:r>
+              <w:rPr>
+                <w:rFonts w:ascii="Calibri" w:cs="Calibri" w:eastAsia="Calibri" w:hAnsi="Calibri"/>
                 <w:sz w:val="16"/>
                 <w:szCs w:val="16"/>
               </w:rPr>
-              <w:t xml:space="preserve">Projet 2 h</w:t>
-            </w:r>
-          </w:p>
-          <w:p>
-            <w:pPr>
-              <w:spacing w:after="20"/>
-              <w:jc w:val="left"/>
-            </w:pPr>
-            <w:r>
-              <w:rPr>
-                <w:rFonts w:ascii="Calibri" w:cs="Calibri" w:eastAsia="Calibri" w:hAnsi="Calibri"/>
-                <w:b w:val="false"/>
-                <w:bCs w:val="false"/>
-                <w:color w:val="000000"/>
+              <w:t xml:space="preserve">Projet (2 h)</w:t>
+            </w:r>
+          </w:p>
+          <w:p>
+            <w:pPr>
+              <w:keepNext/>
+              <w:spacing w:after="0"/>
+            </w:pPr>
+            <w:r>
+              <w:rPr>
+                <w:rFonts w:ascii="Calibri" w:cs="Calibri" w:eastAsia="Calibri" w:hAnsi="Calibri"/>
+                <w:b/>
+                <w:bCs/>
+                <w:color w:val="1F3A5F"/>
+                <w:sz w:val="15"/>
+                <w:szCs w:val="15"/>
+              </w:rPr>
+              <w:t xml:space="preserve">14:00-14:30</w:t>
+            </w:r>
+          </w:p>
+          <w:p>
+            <w:pPr>
+              <w:spacing w:after="50"/>
+            </w:pPr>
+            <w:r>
+              <w:rPr>
+                <w:rFonts w:ascii="Calibri" w:cs="Calibri" w:eastAsia="Calibri" w:hAnsi="Calibri"/>
                 <w:sz w:val="16"/>
                 <w:szCs w:val="16"/>
               </w:rPr>
-              <w:t xml:space="preserve">Revue 30 min</w:t>
+              <w:t xml:space="preserve">Revue (30 min)</w:t>
             </w:r>
           </w:p>
         </w:tc>
@@ -11421,20 +11917,14 @@
             <w:tcMar>
               <w:top w:type="dxa" w:w="50"/>
               <w:left w:type="dxa" w:w="70"/>
-              <w:bottom w:type="dxa" w:w="50"/>
+              <w:bottom w:type="dxa" w:w="40"/>
               <w:right w:type="dxa" w:w="70"/>
             </w:tcMar>
           </w:tcPr>
           <w:p>
-            <w:pPr>
-              <w:spacing w:after="20"/>
-              <w:jc w:val="left"/>
-            </w:pPr>
-            <w:r>
-              <w:rPr>
-                <w:rFonts w:ascii="Calibri" w:cs="Calibri" w:eastAsia="Calibri" w:hAnsi="Calibri"/>
-                <w:b w:val="false"/>
-                <w:bCs w:val="false"/>
+            <w:r>
+              <w:rPr>
+                <w:rFonts w:ascii="Calibri" w:cs="Calibri" w:eastAsia="Calibri" w:hAnsi="Calibri"/>
                 <w:color w:val="777777"/>
                 <w:sz w:val="16"/>
                 <w:szCs w:val="16"/>
@@ -11496,25 +11986,38 @@
             <w:tcMar>
               <w:top w:type="dxa" w:w="50"/>
               <w:left w:type="dxa" w:w="70"/>
-              <w:bottom w:type="dxa" w:w="50"/>
+              <w:bottom w:type="dxa" w:w="40"/>
               <w:right w:type="dxa" w:w="70"/>
             </w:tcMar>
           </w:tcPr>
           <w:p>
             <w:pPr>
-              <w:spacing w:after="20"/>
-              <w:jc w:val="left"/>
-            </w:pPr>
-            <w:r>
-              <w:rPr>
-                <w:rFonts w:ascii="Calibri" w:cs="Calibri" w:eastAsia="Calibri" w:hAnsi="Calibri"/>
-                <w:b w:val="false"/>
-                <w:bCs w:val="false"/>
-                <w:color w:val="000000"/>
+              <w:keepNext/>
+              <w:spacing w:after="0"/>
+            </w:pPr>
+            <w:r>
+              <w:rPr>
+                <w:rFonts w:ascii="Calibri" w:cs="Calibri" w:eastAsia="Calibri" w:hAnsi="Calibri"/>
+                <w:b/>
+                <w:bCs/>
+                <w:color w:val="1F3A5F"/>
+                <w:sz w:val="15"/>
+                <w:szCs w:val="15"/>
+              </w:rPr>
+              <w:t xml:space="preserve">19:00-21:00</w:t>
+            </w:r>
+          </w:p>
+          <w:p>
+            <w:pPr>
+              <w:spacing w:after="50"/>
+            </w:pPr>
+            <w:r>
+              <w:rPr>
+                <w:rFonts w:ascii="Calibri" w:cs="Calibri" w:eastAsia="Calibri" w:hAnsi="Calibri"/>
                 <w:sz w:val="16"/>
                 <w:szCs w:val="16"/>
               </w:rPr>
-              <w:t xml:space="preserve">CRTL 2 h</w:t>
+              <w:t xml:space="preserve">CRTL (2 h)</w:t>
             </w:r>
           </w:p>
         </w:tc>
@@ -11531,25 +12034,38 @@
             <w:tcMar>
               <w:top w:type="dxa" w:w="50"/>
               <w:left w:type="dxa" w:w="70"/>
-              <w:bottom w:type="dxa" w:w="50"/>
+              <w:bottom w:type="dxa" w:w="40"/>
               <w:right w:type="dxa" w:w="70"/>
             </w:tcMar>
           </w:tcPr>
           <w:p>
             <w:pPr>
-              <w:spacing w:after="20"/>
-              <w:jc w:val="left"/>
-            </w:pPr>
-            <w:r>
-              <w:rPr>
-                <w:rFonts w:ascii="Calibri" w:cs="Calibri" w:eastAsia="Calibri" w:hAnsi="Calibri"/>
-                <w:b w:val="false"/>
-                <w:bCs w:val="false"/>
-                <w:color w:val="000000"/>
+              <w:keepNext/>
+              <w:spacing w:after="0"/>
+            </w:pPr>
+            <w:r>
+              <w:rPr>
+                <w:rFonts w:ascii="Calibri" w:cs="Calibri" w:eastAsia="Calibri" w:hAnsi="Calibri"/>
+                <w:b/>
+                <w:bCs/>
+                <w:color w:val="1F3A5F"/>
+                <w:sz w:val="15"/>
+                <w:szCs w:val="15"/>
+              </w:rPr>
+              <w:t xml:space="preserve">19:00-21:30</w:t>
+            </w:r>
+          </w:p>
+          <w:p>
+            <w:pPr>
+              <w:spacing w:after="50"/>
+            </w:pPr>
+            <w:r>
+              <w:rPr>
+                <w:rFonts w:ascii="Calibri" w:cs="Calibri" w:eastAsia="Calibri" w:hAnsi="Calibri"/>
                 <w:sz w:val="16"/>
                 <w:szCs w:val="16"/>
               </w:rPr>
-              <w:t xml:space="preserve">Lab 2 h 30</w:t>
+              <w:t xml:space="preserve">Lab (2 h 30)</w:t>
             </w:r>
           </w:p>
         </w:tc>
@@ -11566,25 +12082,38 @@
             <w:tcMar>
               <w:top w:type="dxa" w:w="50"/>
               <w:left w:type="dxa" w:w="70"/>
-              <w:bottom w:type="dxa" w:w="50"/>
+              <w:bottom w:type="dxa" w:w="40"/>
               <w:right w:type="dxa" w:w="70"/>
             </w:tcMar>
           </w:tcPr>
           <w:p>
             <w:pPr>
-              <w:spacing w:after="20"/>
-              <w:jc w:val="left"/>
-            </w:pPr>
-            <w:r>
-              <w:rPr>
-                <w:rFonts w:ascii="Calibri" w:cs="Calibri" w:eastAsia="Calibri" w:hAnsi="Calibri"/>
-                <w:b w:val="false"/>
-                <w:bCs w:val="false"/>
-                <w:color w:val="000000"/>
+              <w:keepNext/>
+              <w:spacing w:after="0"/>
+            </w:pPr>
+            <w:r>
+              <w:rPr>
+                <w:rFonts w:ascii="Calibri" w:cs="Calibri" w:eastAsia="Calibri" w:hAnsi="Calibri"/>
+                <w:b/>
+                <w:bCs/>
+                <w:color w:val="1F3A5F"/>
+                <w:sz w:val="15"/>
+                <w:szCs w:val="15"/>
+              </w:rPr>
+              <w:t xml:space="preserve">19:00-21:00</w:t>
+            </w:r>
+          </w:p>
+          <w:p>
+            <w:pPr>
+              <w:spacing w:after="50"/>
+            </w:pPr>
+            <w:r>
+              <w:rPr>
+                <w:rFonts w:ascii="Calibri" w:cs="Calibri" w:eastAsia="Calibri" w:hAnsi="Calibri"/>
                 <w:sz w:val="16"/>
                 <w:szCs w:val="16"/>
               </w:rPr>
-              <w:t xml:space="preserve">Projet 2 h</w:t>
+              <w:t xml:space="preserve">Projet (2 h)</w:t>
             </w:r>
           </w:p>
         </w:tc>
@@ -11601,25 +12130,38 @@
             <w:tcMar>
               <w:top w:type="dxa" w:w="50"/>
               <w:left w:type="dxa" w:w="70"/>
-              <w:bottom w:type="dxa" w:w="50"/>
+              <w:bottom w:type="dxa" w:w="40"/>
               <w:right w:type="dxa" w:w="70"/>
             </w:tcMar>
           </w:tcPr>
           <w:p>
             <w:pPr>
-              <w:spacing w:after="20"/>
-              <w:jc w:val="left"/>
-            </w:pPr>
-            <w:r>
-              <w:rPr>
-                <w:rFonts w:ascii="Calibri" w:cs="Calibri" w:eastAsia="Calibri" w:hAnsi="Calibri"/>
-                <w:b w:val="false"/>
-                <w:bCs w:val="false"/>
-                <w:color w:val="000000"/>
+              <w:keepNext/>
+              <w:spacing w:after="0"/>
+            </w:pPr>
+            <w:r>
+              <w:rPr>
+                <w:rFonts w:ascii="Calibri" w:cs="Calibri" w:eastAsia="Calibri" w:hAnsi="Calibri"/>
+                <w:b/>
+                <w:bCs/>
+                <w:color w:val="1F3A5F"/>
+                <w:sz w:val="15"/>
+                <w:szCs w:val="15"/>
+              </w:rPr>
+              <w:t xml:space="preserve">19:00-21:00</w:t>
+            </w:r>
+          </w:p>
+          <w:p>
+            <w:pPr>
+              <w:spacing w:after="50"/>
+            </w:pPr>
+            <w:r>
+              <w:rPr>
+                <w:rFonts w:ascii="Calibri" w:cs="Calibri" w:eastAsia="Calibri" w:hAnsi="Calibri"/>
                 <w:sz w:val="16"/>
                 <w:szCs w:val="16"/>
               </w:rPr>
-              <w:t xml:space="preserve">CRTL 2 h</w:t>
+              <w:t xml:space="preserve">CRTL (2 h)</w:t>
             </w:r>
           </w:p>
         </w:tc>
@@ -11636,42 +12178,68 @@
             <w:tcMar>
               <w:top w:type="dxa" w:w="50"/>
               <w:left w:type="dxa" w:w="70"/>
-              <w:bottom w:type="dxa" w:w="50"/>
+              <w:bottom w:type="dxa" w:w="40"/>
               <w:right w:type="dxa" w:w="70"/>
             </w:tcMar>
           </w:tcPr>
           <w:p>
             <w:pPr>
-              <w:spacing w:after="20"/>
-              <w:jc w:val="left"/>
-            </w:pPr>
-            <w:r>
-              <w:rPr>
-                <w:rFonts w:ascii="Calibri" w:cs="Calibri" w:eastAsia="Calibri" w:hAnsi="Calibri"/>
-                <w:b w:val="false"/>
-                <w:bCs w:val="false"/>
-                <w:color w:val="000000"/>
+              <w:keepNext/>
+              <w:spacing w:after="0"/>
+            </w:pPr>
+            <w:r>
+              <w:rPr>
+                <w:rFonts w:ascii="Calibri" w:cs="Calibri" w:eastAsia="Calibri" w:hAnsi="Calibri"/>
+                <w:b/>
+                <w:bCs/>
+                <w:color w:val="1F3A5F"/>
+                <w:sz w:val="15"/>
+                <w:szCs w:val="15"/>
+              </w:rPr>
+              <w:t xml:space="preserve">19:00-20:00</w:t>
+            </w:r>
+          </w:p>
+          <w:p>
+            <w:pPr>
+              <w:spacing w:after="50"/>
+            </w:pPr>
+            <w:r>
+              <w:rPr>
+                <w:rFonts w:ascii="Calibri" w:cs="Calibri" w:eastAsia="Calibri" w:hAnsi="Calibri"/>
                 <w:sz w:val="16"/>
                 <w:szCs w:val="16"/>
               </w:rPr>
-              <w:t xml:space="preserve">Reverse eng. 1 h</w:t>
-            </w:r>
-          </w:p>
-          <w:p>
-            <w:pPr>
-              <w:spacing w:after="20"/>
-              <w:jc w:val="left"/>
-            </w:pPr>
-            <w:r>
-              <w:rPr>
-                <w:rFonts w:ascii="Calibri" w:cs="Calibri" w:eastAsia="Calibri" w:hAnsi="Calibri"/>
-                <w:b w:val="false"/>
-                <w:bCs w:val="false"/>
-                <w:color w:val="000000"/>
+              <w:t xml:space="preserve">Reverse eng. (1 h)</w:t>
+            </w:r>
+          </w:p>
+          <w:p>
+            <w:pPr>
+              <w:keepNext/>
+              <w:spacing w:after="0"/>
+            </w:pPr>
+            <w:r>
+              <w:rPr>
+                <w:rFonts w:ascii="Calibri" w:cs="Calibri" w:eastAsia="Calibri" w:hAnsi="Calibri"/>
+                <w:b/>
+                <w:bCs/>
+                <w:color w:val="1F3A5F"/>
+                <w:sz w:val="15"/>
+                <w:szCs w:val="15"/>
+              </w:rPr>
+              <w:t xml:space="preserve">20:00-20:30</w:t>
+            </w:r>
+          </w:p>
+          <w:p>
+            <w:pPr>
+              <w:spacing w:after="50"/>
+            </w:pPr>
+            <w:r>
+              <w:rPr>
+                <w:rFonts w:ascii="Calibri" w:cs="Calibri" w:eastAsia="Calibri" w:hAnsi="Calibri"/>
                 <w:sz w:val="16"/>
                 <w:szCs w:val="16"/>
               </w:rPr>
-              <w:t xml:space="preserve">Revue 30 min</w:t>
+              <w:t xml:space="preserve">Revue (30 min)</w:t>
             </w:r>
           </w:p>
         </w:tc>
@@ -11688,59 +12256,98 @@
             <w:tcMar>
               <w:top w:type="dxa" w:w="50"/>
               <w:left w:type="dxa" w:w="70"/>
-              <w:bottom w:type="dxa" w:w="50"/>
+              <w:bottom w:type="dxa" w:w="40"/>
               <w:right w:type="dxa" w:w="70"/>
             </w:tcMar>
           </w:tcPr>
           <w:p>
             <w:pPr>
-              <w:spacing w:after="20"/>
-              <w:jc w:val="left"/>
-            </w:pPr>
-            <w:r>
-              <w:rPr>
-                <w:rFonts w:ascii="Calibri" w:cs="Calibri" w:eastAsia="Calibri" w:hAnsi="Calibri"/>
-                <w:b w:val="false"/>
-                <w:bCs w:val="false"/>
-                <w:color w:val="000000"/>
+              <w:keepNext/>
+              <w:spacing w:after="0"/>
+            </w:pPr>
+            <w:r>
+              <w:rPr>
+                <w:rFonts w:ascii="Calibri" w:cs="Calibri" w:eastAsia="Calibri" w:hAnsi="Calibri"/>
+                <w:b/>
+                <w:bCs/>
+                <w:color w:val="1F3A5F"/>
+                <w:sz w:val="15"/>
+                <w:szCs w:val="15"/>
+              </w:rPr>
+              <w:t xml:space="preserve">09:00-11:30</w:t>
+            </w:r>
+          </w:p>
+          <w:p>
+            <w:pPr>
+              <w:spacing w:after="50"/>
+            </w:pPr>
+            <w:r>
+              <w:rPr>
+                <w:rFonts w:ascii="Calibri" w:cs="Calibri" w:eastAsia="Calibri" w:hAnsi="Calibri"/>
                 <w:sz w:val="16"/>
                 <w:szCs w:val="16"/>
               </w:rPr>
-              <w:t xml:space="preserve">Lab 2 h 30</w:t>
-            </w:r>
-          </w:p>
-          <w:p>
-            <w:pPr>
-              <w:spacing w:after="20"/>
-              <w:jc w:val="left"/>
-            </w:pPr>
-            <w:r>
-              <w:rPr>
-                <w:rFonts w:ascii="Calibri" w:cs="Calibri" w:eastAsia="Calibri" w:hAnsi="Calibri"/>
-                <w:b w:val="false"/>
-                <w:bCs w:val="false"/>
-                <w:color w:val="000000"/>
+              <w:t xml:space="preserve">Lab (2 h 30)</w:t>
+            </w:r>
+          </w:p>
+          <w:p>
+            <w:pPr>
+              <w:keepNext/>
+              <w:spacing w:after="0"/>
+            </w:pPr>
+            <w:r>
+              <w:rPr>
+                <w:rFonts w:ascii="Calibri" w:cs="Calibri" w:eastAsia="Calibri" w:hAnsi="Calibri"/>
+                <w:b/>
+                <w:bCs/>
+                <w:color w:val="1F3A5F"/>
+                <w:sz w:val="15"/>
+                <w:szCs w:val="15"/>
+              </w:rPr>
+              <w:t xml:space="preserve">11:45-12:45</w:t>
+            </w:r>
+          </w:p>
+          <w:p>
+            <w:pPr>
+              <w:spacing w:after="50"/>
+            </w:pPr>
+            <w:r>
+              <w:rPr>
+                <w:rFonts w:ascii="Calibri" w:cs="Calibri" w:eastAsia="Calibri" w:hAnsi="Calibri"/>
                 <w:sz w:val="16"/>
                 <w:szCs w:val="16"/>
               </w:rPr>
-              <w:t xml:space="preserve">Projet 1 h</w:t>
-            </w:r>
-          </w:p>
-          <w:p>
-            <w:pPr>
-              <w:spacing w:after="20"/>
-              <w:jc w:val="left"/>
-            </w:pPr>
-            <w:r>
-              <w:rPr>
-                <w:rFonts w:ascii="Calibri" w:cs="Calibri" w:eastAsia="Calibri" w:hAnsi="Calibri"/>
-                <w:b w:val="false"/>
-                <w:bCs w:val="false"/>
-                <w:color w:val="000000"/>
+              <w:t xml:space="preserve">Projet (1 h)</w:t>
+            </w:r>
+          </w:p>
+          <w:p>
+            <w:pPr>
+              <w:keepNext/>
+              <w:spacing w:after="0"/>
+            </w:pPr>
+            <w:r>
+              <w:rPr>
+                <w:rFonts w:ascii="Calibri" w:cs="Calibri" w:eastAsia="Calibri" w:hAnsi="Calibri"/>
+                <w:b/>
+                <w:bCs/>
+                <w:color w:val="1F3A5F"/>
+                <w:sz w:val="15"/>
+                <w:szCs w:val="15"/>
+              </w:rPr>
+              <w:t xml:space="preserve">13:00-14:30</w:t>
+            </w:r>
+          </w:p>
+          <w:p>
+            <w:pPr>
+              <w:spacing w:after="50"/>
+            </w:pPr>
+            <w:r>
+              <w:rPr>
+                <w:rFonts w:ascii="Calibri" w:cs="Calibri" w:eastAsia="Calibri" w:hAnsi="Calibri"/>
                 <w:sz w:val="16"/>
                 <w:szCs w:val="16"/>
               </w:rPr>
-              <w:t xml:space="preserve">Candidatures 1 h 30</w:t>
+              <w:t xml:space="preserve">Candidatures (1 h 30)</w:t>
             </w:r>
           </w:p>
         </w:tc>
@@ -11757,20 +12364,14 @@
             <w:tcMar>
               <w:top w:type="dxa" w:w="50"/>
               <w:left w:type="dxa" w:w="70"/>
-              <w:bottom w:type="dxa" w:w="50"/>
+              <w:bottom w:type="dxa" w:w="40"/>
               <w:right w:type="dxa" w:w="70"/>
             </w:tcMar>
           </w:tcPr>
           <w:p>
-            <w:pPr>
-              <w:spacing w:after="20"/>
-              <w:jc w:val="left"/>
-            </w:pPr>
-            <w:r>
-              <w:rPr>
-                <w:rFonts w:ascii="Calibri" w:cs="Calibri" w:eastAsia="Calibri" w:hAnsi="Calibri"/>
-                <w:b w:val="false"/>
-                <w:bCs w:val="false"/>
+            <w:r>
+              <w:rPr>
+                <w:rFonts w:ascii="Calibri" w:cs="Calibri" w:eastAsia="Calibri" w:hAnsi="Calibri"/>
                 <w:color w:val="777777"/>
                 <w:sz w:val="16"/>
                 <w:szCs w:val="16"/>
@@ -11790,6 +12391,7 @@
       <w:pPr>
         <w:pStyle w:val="Heading3"/>
         <w:keepNext/>
+        <w:pageBreakBefore/>
       </w:pPr>
       <w:r>
         <w:rPr>
@@ -12158,42 +12760,68 @@
             <w:tcMar>
               <w:top w:type="dxa" w:w="50"/>
               <w:left w:type="dxa" w:w="70"/>
-              <w:bottom w:type="dxa" w:w="50"/>
+              <w:bottom w:type="dxa" w:w="40"/>
               <w:right w:type="dxa" w:w="70"/>
             </w:tcMar>
           </w:tcPr>
           <w:p>
             <w:pPr>
-              <w:spacing w:after="20"/>
-              <w:jc w:val="left"/>
-            </w:pPr>
-            <w:r>
-              <w:rPr>
-                <w:rFonts w:ascii="Calibri" w:cs="Calibri" w:eastAsia="Calibri" w:hAnsi="Calibri"/>
-                <w:b w:val="false"/>
-                <w:bCs w:val="false"/>
-                <w:color w:val="000000"/>
+              <w:keepNext/>
+              <w:spacing w:after="0"/>
+            </w:pPr>
+            <w:r>
+              <w:rPr>
+                <w:rFonts w:ascii="Calibri" w:cs="Calibri" w:eastAsia="Calibri" w:hAnsi="Calibri"/>
+                <w:b/>
+                <w:bCs/>
+                <w:color w:val="1F3A5F"/>
+                <w:sz w:val="15"/>
+                <w:szCs w:val="15"/>
+              </w:rPr>
+              <w:t xml:space="preserve">19:00-20:00</w:t>
+            </w:r>
+          </w:p>
+          <w:p>
+            <w:pPr>
+              <w:spacing w:after="50"/>
+            </w:pPr>
+            <w:r>
+              <w:rPr>
+                <w:rFonts w:ascii="Calibri" w:cs="Calibri" w:eastAsia="Calibri" w:hAnsi="Calibri"/>
                 <w:sz w:val="16"/>
                 <w:szCs w:val="16"/>
               </w:rPr>
-              <w:t xml:space="preserve">BSCP 1 h</w:t>
-            </w:r>
-          </w:p>
-          <w:p>
-            <w:pPr>
-              <w:spacing w:after="20"/>
-              <w:jc w:val="left"/>
-            </w:pPr>
-            <w:r>
-              <w:rPr>
-                <w:rFonts w:ascii="Calibri" w:cs="Calibri" w:eastAsia="Calibri" w:hAnsi="Calibri"/>
-                <w:b w:val="false"/>
-                <w:bCs w:val="false"/>
-                <w:color w:val="000000"/>
+              <w:t xml:space="preserve">BSCP (1 h)</w:t>
+            </w:r>
+          </w:p>
+          <w:p>
+            <w:pPr>
+              <w:keepNext/>
+              <w:spacing w:after="0"/>
+            </w:pPr>
+            <w:r>
+              <w:rPr>
+                <w:rFonts w:ascii="Calibri" w:cs="Calibri" w:eastAsia="Calibri" w:hAnsi="Calibri"/>
+                <w:b/>
+                <w:bCs/>
+                <w:color w:val="1F3A5F"/>
+                <w:sz w:val="15"/>
+                <w:szCs w:val="15"/>
+              </w:rPr>
+              <w:t xml:space="preserve">20:00-20:30</w:t>
+            </w:r>
+          </w:p>
+          <w:p>
+            <w:pPr>
+              <w:spacing w:after="50"/>
+            </w:pPr>
+            <w:r>
+              <w:rPr>
+                <w:rFonts w:ascii="Calibri" w:cs="Calibri" w:eastAsia="Calibri" w:hAnsi="Calibri"/>
                 <w:sz w:val="16"/>
                 <w:szCs w:val="16"/>
               </w:rPr>
-              <w:t xml:space="preserve">École 30 min</w:t>
+              <w:t xml:space="preserve">École (30 min)</w:t>
             </w:r>
           </w:p>
         </w:tc>
@@ -12210,25 +12838,38 @@
             <w:tcMar>
               <w:top w:type="dxa" w:w="50"/>
               <w:left w:type="dxa" w:w="70"/>
-              <w:bottom w:type="dxa" w:w="50"/>
+              <w:bottom w:type="dxa" w:w="40"/>
               <w:right w:type="dxa" w:w="70"/>
             </w:tcMar>
           </w:tcPr>
           <w:p>
             <w:pPr>
-              <w:spacing w:after="20"/>
-              <w:jc w:val="left"/>
-            </w:pPr>
-            <w:r>
-              <w:rPr>
-                <w:rFonts w:ascii="Calibri" w:cs="Calibri" w:eastAsia="Calibri" w:hAnsi="Calibri"/>
-                <w:b w:val="false"/>
-                <w:bCs w:val="false"/>
-                <w:color w:val="000000"/>
+              <w:keepNext/>
+              <w:spacing w:after="0"/>
+            </w:pPr>
+            <w:r>
+              <w:rPr>
+                <w:rFonts w:ascii="Calibri" w:cs="Calibri" w:eastAsia="Calibri" w:hAnsi="Calibri"/>
+                <w:b/>
+                <w:bCs/>
+                <w:color w:val="1F3A5F"/>
+                <w:sz w:val="15"/>
+                <w:szCs w:val="15"/>
+              </w:rPr>
+              <w:t xml:space="preserve">19:00-20:00</w:t>
+            </w:r>
+          </w:p>
+          <w:p>
+            <w:pPr>
+              <w:spacing w:after="50"/>
+            </w:pPr>
+            <w:r>
+              <w:rPr>
+                <w:rFonts w:ascii="Calibri" w:cs="Calibri" w:eastAsia="Calibri" w:hAnsi="Calibri"/>
                 <w:sz w:val="16"/>
                 <w:szCs w:val="16"/>
               </w:rPr>
-              <w:t xml:space="preserve">Lab 1 h</w:t>
+              <w:t xml:space="preserve">Lab (1 h)</w:t>
             </w:r>
           </w:p>
         </w:tc>
@@ -12245,25 +12886,38 @@
             <w:tcMar>
               <w:top w:type="dxa" w:w="50"/>
               <w:left w:type="dxa" w:w="70"/>
-              <w:bottom w:type="dxa" w:w="50"/>
+              <w:bottom w:type="dxa" w:w="40"/>
               <w:right w:type="dxa" w:w="70"/>
             </w:tcMar>
           </w:tcPr>
           <w:p>
             <w:pPr>
-              <w:spacing w:after="20"/>
-              <w:jc w:val="left"/>
-            </w:pPr>
-            <w:r>
-              <w:rPr>
-                <w:rFonts w:ascii="Calibri" w:cs="Calibri" w:eastAsia="Calibri" w:hAnsi="Calibri"/>
-                <w:b w:val="false"/>
-                <w:bCs w:val="false"/>
-                <w:color w:val="000000"/>
+              <w:keepNext/>
+              <w:spacing w:after="0"/>
+            </w:pPr>
+            <w:r>
+              <w:rPr>
+                <w:rFonts w:ascii="Calibri" w:cs="Calibri" w:eastAsia="Calibri" w:hAnsi="Calibri"/>
+                <w:b/>
+                <w:bCs/>
+                <w:color w:val="1F3A5F"/>
+                <w:sz w:val="15"/>
+                <w:szCs w:val="15"/>
+              </w:rPr>
+              <w:t xml:space="preserve">19:00-20:00</w:t>
+            </w:r>
+          </w:p>
+          <w:p>
+            <w:pPr>
+              <w:spacing w:after="50"/>
+            </w:pPr>
+            <w:r>
+              <w:rPr>
+                <w:rFonts w:ascii="Calibri" w:cs="Calibri" w:eastAsia="Calibri" w:hAnsi="Calibri"/>
                 <w:sz w:val="16"/>
                 <w:szCs w:val="16"/>
               </w:rPr>
-              <w:t xml:space="preserve">C, Sektor7 1 h</w:t>
+              <w:t xml:space="preserve">C, Sektor7 (1 h)</w:t>
             </w:r>
           </w:p>
         </w:tc>
@@ -12280,42 +12934,68 @@
             <w:tcMar>
               <w:top w:type="dxa" w:w="50"/>
               <w:left w:type="dxa" w:w="70"/>
-              <w:bottom w:type="dxa" w:w="50"/>
+              <w:bottom w:type="dxa" w:w="40"/>
               <w:right w:type="dxa" w:w="70"/>
             </w:tcMar>
           </w:tcPr>
           <w:p>
             <w:pPr>
-              <w:spacing w:after="20"/>
-              <w:jc w:val="left"/>
-            </w:pPr>
-            <w:r>
-              <w:rPr>
-                <w:rFonts w:ascii="Calibri" w:cs="Calibri" w:eastAsia="Calibri" w:hAnsi="Calibri"/>
-                <w:b w:val="false"/>
-                <w:bCs w:val="false"/>
-                <w:color w:val="000000"/>
+              <w:keepNext/>
+              <w:spacing w:after="0"/>
+            </w:pPr>
+            <w:r>
+              <w:rPr>
+                <w:rFonts w:ascii="Calibri" w:cs="Calibri" w:eastAsia="Calibri" w:hAnsi="Calibri"/>
+                <w:b/>
+                <w:bCs/>
+                <w:color w:val="1F3A5F"/>
+                <w:sz w:val="15"/>
+                <w:szCs w:val="15"/>
+              </w:rPr>
+              <w:t xml:space="preserve">19:00-19:30</w:t>
+            </w:r>
+          </w:p>
+          <w:p>
+            <w:pPr>
+              <w:spacing w:after="50"/>
+            </w:pPr>
+            <w:r>
+              <w:rPr>
+                <w:rFonts w:ascii="Calibri" w:cs="Calibri" w:eastAsia="Calibri" w:hAnsi="Calibri"/>
                 <w:sz w:val="16"/>
                 <w:szCs w:val="16"/>
               </w:rPr>
-              <w:t xml:space="preserve">École 30 min</w:t>
-            </w:r>
-          </w:p>
-          <w:p>
-            <w:pPr>
-              <w:spacing w:after="20"/>
-              <w:jc w:val="left"/>
-            </w:pPr>
-            <w:r>
-              <w:rPr>
-                <w:rFonts w:ascii="Calibri" w:cs="Calibri" w:eastAsia="Calibri" w:hAnsi="Calibri"/>
-                <w:b w:val="false"/>
-                <w:bCs w:val="false"/>
-                <w:color w:val="000000"/>
+              <w:t xml:space="preserve">École (30 min)</w:t>
+            </w:r>
+          </w:p>
+          <w:p>
+            <w:pPr>
+              <w:keepNext/>
+              <w:spacing w:after="0"/>
+            </w:pPr>
+            <w:r>
+              <w:rPr>
+                <w:rFonts w:ascii="Calibri" w:cs="Calibri" w:eastAsia="Calibri" w:hAnsi="Calibri"/>
+                <w:b/>
+                <w:bCs/>
+                <w:color w:val="1F3A5F"/>
+                <w:sz w:val="15"/>
+                <w:szCs w:val="15"/>
+              </w:rPr>
+              <w:t xml:space="preserve">19:30-20:00</w:t>
+            </w:r>
+          </w:p>
+          <w:p>
+            <w:pPr>
+              <w:spacing w:after="50"/>
+            </w:pPr>
+            <w:r>
+              <w:rPr>
+                <w:rFonts w:ascii="Calibri" w:cs="Calibri" w:eastAsia="Calibri" w:hAnsi="Calibri"/>
                 <w:sz w:val="16"/>
                 <w:szCs w:val="16"/>
               </w:rPr>
-              <w:t xml:space="preserve">Revue 30 min</w:t>
+              <w:t xml:space="preserve">Revue (30 min)</w:t>
             </w:r>
           </w:p>
         </w:tc>
@@ -12332,25 +13012,38 @@
             <w:tcMar>
               <w:top w:type="dxa" w:w="50"/>
               <w:left w:type="dxa" w:w="70"/>
-              <w:bottom w:type="dxa" w:w="50"/>
+              <w:bottom w:type="dxa" w:w="40"/>
               <w:right w:type="dxa" w:w="70"/>
             </w:tcMar>
           </w:tcPr>
           <w:p>
             <w:pPr>
-              <w:spacing w:after="20"/>
-              <w:jc w:val="left"/>
-            </w:pPr>
-            <w:r>
-              <w:rPr>
-                <w:rFonts w:ascii="Calibri" w:cs="Calibri" w:eastAsia="Calibri" w:hAnsi="Calibri"/>
-                <w:b w:val="false"/>
-                <w:bCs w:val="false"/>
-                <w:color w:val="000000"/>
+              <w:keepNext/>
+              <w:spacing w:after="0"/>
+            </w:pPr>
+            <w:r>
+              <w:rPr>
+                <w:rFonts w:ascii="Calibri" w:cs="Calibri" w:eastAsia="Calibri" w:hAnsi="Calibri"/>
+                <w:b/>
+                <w:bCs/>
+                <w:color w:val="1F3A5F"/>
+                <w:sz w:val="15"/>
+                <w:szCs w:val="15"/>
+              </w:rPr>
+              <w:t xml:space="preserve">19:00-20:00</w:t>
+            </w:r>
+          </w:p>
+          <w:p>
+            <w:pPr>
+              <w:spacing w:after="50"/>
+            </w:pPr>
+            <w:r>
+              <w:rPr>
+                <w:rFonts w:ascii="Calibri" w:cs="Calibri" w:eastAsia="Calibri" w:hAnsi="Calibri"/>
                 <w:sz w:val="16"/>
                 <w:szCs w:val="16"/>
               </w:rPr>
-              <w:t xml:space="preserve">BSCP 1 h</w:t>
+              <w:t xml:space="preserve">BSCP (1 h)</w:t>
             </w:r>
           </w:p>
         </w:tc>
@@ -12367,42 +13060,68 @@
             <w:tcMar>
               <w:top w:type="dxa" w:w="50"/>
               <w:left w:type="dxa" w:w="70"/>
-              <w:bottom w:type="dxa" w:w="50"/>
+              <w:bottom w:type="dxa" w:w="40"/>
               <w:right w:type="dxa" w:w="70"/>
             </w:tcMar>
           </w:tcPr>
           <w:p>
             <w:pPr>
-              <w:spacing w:after="20"/>
-              <w:jc w:val="left"/>
-            </w:pPr>
-            <w:r>
-              <w:rPr>
-                <w:rFonts w:ascii="Calibri" w:cs="Calibri" w:eastAsia="Calibri" w:hAnsi="Calibri"/>
-                <w:b w:val="false"/>
-                <w:bCs w:val="false"/>
-                <w:color w:val="000000"/>
+              <w:keepNext/>
+              <w:spacing w:after="0"/>
+            </w:pPr>
+            <w:r>
+              <w:rPr>
+                <w:rFonts w:ascii="Calibri" w:cs="Calibri" w:eastAsia="Calibri" w:hAnsi="Calibri"/>
+                <w:b/>
+                <w:bCs/>
+                <w:color w:val="1F3A5F"/>
+                <w:sz w:val="15"/>
+                <w:szCs w:val="15"/>
+              </w:rPr>
+              <w:t xml:space="preserve">09:00-11:00</w:t>
+            </w:r>
+          </w:p>
+          <w:p>
+            <w:pPr>
+              <w:spacing w:after="50"/>
+            </w:pPr>
+            <w:r>
+              <w:rPr>
+                <w:rFonts w:ascii="Calibri" w:cs="Calibri" w:eastAsia="Calibri" w:hAnsi="Calibri"/>
                 <w:sz w:val="16"/>
                 <w:szCs w:val="16"/>
               </w:rPr>
-              <w:t xml:space="preserve">BSCP 2 h</w:t>
-            </w:r>
-          </w:p>
-          <w:p>
-            <w:pPr>
-              <w:spacing w:after="20"/>
-              <w:jc w:val="left"/>
-            </w:pPr>
-            <w:r>
-              <w:rPr>
-                <w:rFonts w:ascii="Calibri" w:cs="Calibri" w:eastAsia="Calibri" w:hAnsi="Calibri"/>
-                <w:b w:val="false"/>
-                <w:bCs w:val="false"/>
-                <w:color w:val="000000"/>
+              <w:t xml:space="preserve">BSCP (2 h)</w:t>
+            </w:r>
+          </w:p>
+          <w:p>
+            <w:pPr>
+              <w:keepNext/>
+              <w:spacing w:after="0"/>
+            </w:pPr>
+            <w:r>
+              <w:rPr>
+                <w:rFonts w:ascii="Calibri" w:cs="Calibri" w:eastAsia="Calibri" w:hAnsi="Calibri"/>
+                <w:b/>
+                <w:bCs/>
+                <w:color w:val="1F3A5F"/>
+                <w:sz w:val="15"/>
+                <w:szCs w:val="15"/>
+              </w:rPr>
+              <w:t xml:space="preserve">11:15-13:15</w:t>
+            </w:r>
+          </w:p>
+          <w:p>
+            <w:pPr>
+              <w:spacing w:after="50"/>
+            </w:pPr>
+            <w:r>
+              <w:rPr>
+                <w:rFonts w:ascii="Calibri" w:cs="Calibri" w:eastAsia="Calibri" w:hAnsi="Calibri"/>
                 <w:sz w:val="16"/>
                 <w:szCs w:val="16"/>
               </w:rPr>
-              <w:t xml:space="preserve">Lab 2 h</w:t>
+              <w:t xml:space="preserve">Lab (2 h)</w:t>
             </w:r>
           </w:p>
         </w:tc>
@@ -12419,20 +13138,14 @@
             <w:tcMar>
               <w:top w:type="dxa" w:w="50"/>
               <w:left w:type="dxa" w:w="70"/>
-              <w:bottom w:type="dxa" w:w="50"/>
+              <w:bottom w:type="dxa" w:w="40"/>
               <w:right w:type="dxa" w:w="70"/>
             </w:tcMar>
           </w:tcPr>
           <w:p>
-            <w:pPr>
-              <w:spacing w:after="20"/>
-              <w:jc w:val="left"/>
-            </w:pPr>
-            <w:r>
-              <w:rPr>
-                <w:rFonts w:ascii="Calibri" w:cs="Calibri" w:eastAsia="Calibri" w:hAnsi="Calibri"/>
-                <w:b w:val="false"/>
-                <w:bCs w:val="false"/>
+            <w:r>
+              <w:rPr>
+                <w:rFonts w:ascii="Calibri" w:cs="Calibri" w:eastAsia="Calibri" w:hAnsi="Calibri"/>
                 <w:color w:val="777777"/>
                 <w:sz w:val="16"/>
                 <w:szCs w:val="16"/>
@@ -12494,42 +13207,68 @@
             <w:tcMar>
               <w:top w:type="dxa" w:w="50"/>
               <w:left w:type="dxa" w:w="70"/>
-              <w:bottom w:type="dxa" w:w="50"/>
+              <w:bottom w:type="dxa" w:w="40"/>
               <w:right w:type="dxa" w:w="70"/>
             </w:tcMar>
           </w:tcPr>
           <w:p>
             <w:pPr>
-              <w:spacing w:after="20"/>
-              <w:jc w:val="left"/>
-            </w:pPr>
-            <w:r>
-              <w:rPr>
-                <w:rFonts w:ascii="Calibri" w:cs="Calibri" w:eastAsia="Calibri" w:hAnsi="Calibri"/>
-                <w:b w:val="false"/>
-                <w:bCs w:val="false"/>
-                <w:color w:val="000000"/>
+              <w:keepNext/>
+              <w:spacing w:after="0"/>
+            </w:pPr>
+            <w:r>
+              <w:rPr>
+                <w:rFonts w:ascii="Calibri" w:cs="Calibri" w:eastAsia="Calibri" w:hAnsi="Calibri"/>
+                <w:b/>
+                <w:bCs/>
+                <w:color w:val="1F3A5F"/>
+                <w:sz w:val="15"/>
+                <w:szCs w:val="15"/>
+              </w:rPr>
+              <w:t xml:space="preserve">19:00-20:00</w:t>
+            </w:r>
+          </w:p>
+          <w:p>
+            <w:pPr>
+              <w:spacing w:after="50"/>
+            </w:pPr>
+            <w:r>
+              <w:rPr>
+                <w:rFonts w:ascii="Calibri" w:cs="Calibri" w:eastAsia="Calibri" w:hAnsi="Calibri"/>
                 <w:sz w:val="16"/>
                 <w:szCs w:val="16"/>
               </w:rPr>
-              <w:t xml:space="preserve">BSCP 1 h</w:t>
-            </w:r>
-          </w:p>
-          <w:p>
-            <w:pPr>
-              <w:spacing w:after="20"/>
-              <w:jc w:val="left"/>
-            </w:pPr>
-            <w:r>
-              <w:rPr>
-                <w:rFonts w:ascii="Calibri" w:cs="Calibri" w:eastAsia="Calibri" w:hAnsi="Calibri"/>
-                <w:b w:val="false"/>
-                <w:bCs w:val="false"/>
-                <w:color w:val="000000"/>
+              <w:t xml:space="preserve">BSCP (1 h)</w:t>
+            </w:r>
+          </w:p>
+          <w:p>
+            <w:pPr>
+              <w:keepNext/>
+              <w:spacing w:after="0"/>
+            </w:pPr>
+            <w:r>
+              <w:rPr>
+                <w:rFonts w:ascii="Calibri" w:cs="Calibri" w:eastAsia="Calibri" w:hAnsi="Calibri"/>
+                <w:b/>
+                <w:bCs/>
+                <w:color w:val="1F3A5F"/>
+                <w:sz w:val="15"/>
+                <w:szCs w:val="15"/>
+              </w:rPr>
+              <w:t xml:space="preserve">20:00-20:30</w:t>
+            </w:r>
+          </w:p>
+          <w:p>
+            <w:pPr>
+              <w:spacing w:after="50"/>
+            </w:pPr>
+            <w:r>
+              <w:rPr>
+                <w:rFonts w:ascii="Calibri" w:cs="Calibri" w:eastAsia="Calibri" w:hAnsi="Calibri"/>
                 <w:sz w:val="16"/>
                 <w:szCs w:val="16"/>
               </w:rPr>
-              <w:t xml:space="preserve">École 30 min</w:t>
+              <w:t xml:space="preserve">École (30 min)</w:t>
             </w:r>
           </w:p>
         </w:tc>
@@ -12546,25 +13285,38 @@
             <w:tcMar>
               <w:top w:type="dxa" w:w="50"/>
               <w:left w:type="dxa" w:w="70"/>
-              <w:bottom w:type="dxa" w:w="50"/>
+              <w:bottom w:type="dxa" w:w="40"/>
               <w:right w:type="dxa" w:w="70"/>
             </w:tcMar>
           </w:tcPr>
           <w:p>
             <w:pPr>
-              <w:spacing w:after="20"/>
-              <w:jc w:val="left"/>
-            </w:pPr>
-            <w:r>
-              <w:rPr>
-                <w:rFonts w:ascii="Calibri" w:cs="Calibri" w:eastAsia="Calibri" w:hAnsi="Calibri"/>
-                <w:b w:val="false"/>
-                <w:bCs w:val="false"/>
-                <w:color w:val="000000"/>
+              <w:keepNext/>
+              <w:spacing w:after="0"/>
+            </w:pPr>
+            <w:r>
+              <w:rPr>
+                <w:rFonts w:ascii="Calibri" w:cs="Calibri" w:eastAsia="Calibri" w:hAnsi="Calibri"/>
+                <w:b/>
+                <w:bCs/>
+                <w:color w:val="1F3A5F"/>
+                <w:sz w:val="15"/>
+                <w:szCs w:val="15"/>
+              </w:rPr>
+              <w:t xml:space="preserve">19:00-20:30</w:t>
+            </w:r>
+          </w:p>
+          <w:p>
+            <w:pPr>
+              <w:spacing w:after="50"/>
+            </w:pPr>
+            <w:r>
+              <w:rPr>
+                <w:rFonts w:ascii="Calibri" w:cs="Calibri" w:eastAsia="Calibri" w:hAnsi="Calibri"/>
                 <w:sz w:val="16"/>
                 <w:szCs w:val="16"/>
               </w:rPr>
-              <w:t xml:space="preserve">BSCP 1 h 30</w:t>
+              <w:t xml:space="preserve">BSCP (1 h 30)</w:t>
             </w:r>
           </w:p>
         </w:tc>
@@ -12581,25 +13333,38 @@
             <w:tcMar>
               <w:top w:type="dxa" w:w="50"/>
               <w:left w:type="dxa" w:w="70"/>
-              <w:bottom w:type="dxa" w:w="50"/>
+              <w:bottom w:type="dxa" w:w="40"/>
               <w:right w:type="dxa" w:w="70"/>
             </w:tcMar>
           </w:tcPr>
           <w:p>
             <w:pPr>
-              <w:spacing w:after="20"/>
-              <w:jc w:val="left"/>
-            </w:pPr>
-            <w:r>
-              <w:rPr>
-                <w:rFonts w:ascii="Calibri" w:cs="Calibri" w:eastAsia="Calibri" w:hAnsi="Calibri"/>
-                <w:b w:val="false"/>
-                <w:bCs w:val="false"/>
-                <w:color w:val="000000"/>
+              <w:keepNext/>
+              <w:spacing w:after="0"/>
+            </w:pPr>
+            <w:r>
+              <w:rPr>
+                <w:rFonts w:ascii="Calibri" w:cs="Calibri" w:eastAsia="Calibri" w:hAnsi="Calibri"/>
+                <w:b/>
+                <w:bCs/>
+                <w:color w:val="1F3A5F"/>
+                <w:sz w:val="15"/>
+                <w:szCs w:val="15"/>
+              </w:rPr>
+              <w:t xml:space="preserve">19:00-20:00</w:t>
+            </w:r>
+          </w:p>
+          <w:p>
+            <w:pPr>
+              <w:spacing w:after="50"/>
+            </w:pPr>
+            <w:r>
+              <w:rPr>
+                <w:rFonts w:ascii="Calibri" w:cs="Calibri" w:eastAsia="Calibri" w:hAnsi="Calibri"/>
                 <w:sz w:val="16"/>
                 <w:szCs w:val="16"/>
               </w:rPr>
-              <w:t xml:space="preserve">Lab 1 h</w:t>
+              <w:t xml:space="preserve">Lab (1 h)</w:t>
             </w:r>
           </w:p>
         </w:tc>
@@ -12616,42 +13381,68 @@
             <w:tcMar>
               <w:top w:type="dxa" w:w="50"/>
               <w:left w:type="dxa" w:w="70"/>
-              <w:bottom w:type="dxa" w:w="50"/>
+              <w:bottom w:type="dxa" w:w="40"/>
               <w:right w:type="dxa" w:w="70"/>
             </w:tcMar>
           </w:tcPr>
           <w:p>
             <w:pPr>
-              <w:spacing w:after="20"/>
-              <w:jc w:val="left"/>
-            </w:pPr>
-            <w:r>
-              <w:rPr>
-                <w:rFonts w:ascii="Calibri" w:cs="Calibri" w:eastAsia="Calibri" w:hAnsi="Calibri"/>
-                <w:b w:val="false"/>
-                <w:bCs w:val="false"/>
-                <w:color w:val="000000"/>
+              <w:keepNext/>
+              <w:spacing w:after="0"/>
+            </w:pPr>
+            <w:r>
+              <w:rPr>
+                <w:rFonts w:ascii="Calibri" w:cs="Calibri" w:eastAsia="Calibri" w:hAnsi="Calibri"/>
+                <w:b/>
+                <w:bCs/>
+                <w:color w:val="1F3A5F"/>
+                <w:sz w:val="15"/>
+                <w:szCs w:val="15"/>
+              </w:rPr>
+              <w:t xml:space="preserve">19:00-20:00</w:t>
+            </w:r>
+          </w:p>
+          <w:p>
+            <w:pPr>
+              <w:spacing w:after="50"/>
+            </w:pPr>
+            <w:r>
+              <w:rPr>
+                <w:rFonts w:ascii="Calibri" w:cs="Calibri" w:eastAsia="Calibri" w:hAnsi="Calibri"/>
                 <w:sz w:val="16"/>
                 <w:szCs w:val="16"/>
               </w:rPr>
-              <w:t xml:space="preserve">BSCP 1 h</w:t>
-            </w:r>
-          </w:p>
-          <w:p>
-            <w:pPr>
-              <w:spacing w:after="20"/>
-              <w:jc w:val="left"/>
-            </w:pPr>
-            <w:r>
-              <w:rPr>
-                <w:rFonts w:ascii="Calibri" w:cs="Calibri" w:eastAsia="Calibri" w:hAnsi="Calibri"/>
-                <w:b w:val="false"/>
-                <w:bCs w:val="false"/>
-                <w:color w:val="000000"/>
+              <w:t xml:space="preserve">BSCP (1 h)</w:t>
+            </w:r>
+          </w:p>
+          <w:p>
+            <w:pPr>
+              <w:keepNext/>
+              <w:spacing w:after="0"/>
+            </w:pPr>
+            <w:r>
+              <w:rPr>
+                <w:rFonts w:ascii="Calibri" w:cs="Calibri" w:eastAsia="Calibri" w:hAnsi="Calibri"/>
+                <w:b/>
+                <w:bCs/>
+                <w:color w:val="1F3A5F"/>
+                <w:sz w:val="15"/>
+                <w:szCs w:val="15"/>
+              </w:rPr>
+              <w:t xml:space="preserve">20:00-20:30</w:t>
+            </w:r>
+          </w:p>
+          <w:p>
+            <w:pPr>
+              <w:spacing w:after="50"/>
+            </w:pPr>
+            <w:r>
+              <w:rPr>
+                <w:rFonts w:ascii="Calibri" w:cs="Calibri" w:eastAsia="Calibri" w:hAnsi="Calibri"/>
                 <w:sz w:val="16"/>
                 <w:szCs w:val="16"/>
               </w:rPr>
-              <w:t xml:space="preserve">Revue 30 min</w:t>
+              <w:t xml:space="preserve">Revue (30 min)</w:t>
             </w:r>
           </w:p>
         </w:tc>
@@ -12668,42 +13459,68 @@
             <w:tcMar>
               <w:top w:type="dxa" w:w="50"/>
               <w:left w:type="dxa" w:w="70"/>
-              <w:bottom w:type="dxa" w:w="50"/>
+              <w:bottom w:type="dxa" w:w="40"/>
               <w:right w:type="dxa" w:w="70"/>
             </w:tcMar>
           </w:tcPr>
           <w:p>
             <w:pPr>
-              <w:spacing w:after="20"/>
-              <w:jc w:val="left"/>
-            </w:pPr>
-            <w:r>
-              <w:rPr>
-                <w:rFonts w:ascii="Calibri" w:cs="Calibri" w:eastAsia="Calibri" w:hAnsi="Calibri"/>
-                <w:b w:val="false"/>
-                <w:bCs w:val="false"/>
-                <w:color w:val="000000"/>
+              <w:keepNext/>
+              <w:spacing w:after="0"/>
+            </w:pPr>
+            <w:r>
+              <w:rPr>
+                <w:rFonts w:ascii="Calibri" w:cs="Calibri" w:eastAsia="Calibri" w:hAnsi="Calibri"/>
+                <w:b/>
+                <w:bCs/>
+                <w:color w:val="1F3A5F"/>
+                <w:sz w:val="15"/>
+                <w:szCs w:val="15"/>
+              </w:rPr>
+              <w:t xml:space="preserve">19:00-20:00</w:t>
+            </w:r>
+          </w:p>
+          <w:p>
+            <w:pPr>
+              <w:spacing w:after="50"/>
+            </w:pPr>
+            <w:r>
+              <w:rPr>
+                <w:rFonts w:ascii="Calibri" w:cs="Calibri" w:eastAsia="Calibri" w:hAnsi="Calibri"/>
                 <w:sz w:val="16"/>
                 <w:szCs w:val="16"/>
               </w:rPr>
-              <w:t xml:space="preserve">Lab 1 h</w:t>
-            </w:r>
-          </w:p>
-          <w:p>
-            <w:pPr>
-              <w:spacing w:after="20"/>
-              <w:jc w:val="left"/>
-            </w:pPr>
-            <w:r>
-              <w:rPr>
-                <w:rFonts w:ascii="Calibri" w:cs="Calibri" w:eastAsia="Calibri" w:hAnsi="Calibri"/>
-                <w:b w:val="false"/>
-                <w:bCs w:val="false"/>
-                <w:color w:val="000000"/>
+              <w:t xml:space="preserve">Lab (1 h)</w:t>
+            </w:r>
+          </w:p>
+          <w:p>
+            <w:pPr>
+              <w:keepNext/>
+              <w:spacing w:after="0"/>
+            </w:pPr>
+            <w:r>
+              <w:rPr>
+                <w:rFonts w:ascii="Calibri" w:cs="Calibri" w:eastAsia="Calibri" w:hAnsi="Calibri"/>
+                <w:b/>
+                <w:bCs/>
+                <w:color w:val="1F3A5F"/>
+                <w:sz w:val="15"/>
+                <w:szCs w:val="15"/>
+              </w:rPr>
+              <w:t xml:space="preserve">20:00-20:30</w:t>
+            </w:r>
+          </w:p>
+          <w:p>
+            <w:pPr>
+              <w:spacing w:after="50"/>
+            </w:pPr>
+            <w:r>
+              <w:rPr>
+                <w:rFonts w:ascii="Calibri" w:cs="Calibri" w:eastAsia="Calibri" w:hAnsi="Calibri"/>
                 <w:sz w:val="16"/>
                 <w:szCs w:val="16"/>
               </w:rPr>
-              <w:t xml:space="preserve">École 30 min</w:t>
+              <w:t xml:space="preserve">École (30 min)</w:t>
             </w:r>
           </w:p>
         </w:tc>
@@ -12720,25 +13537,38 @@
             <w:tcMar>
               <w:top w:type="dxa" w:w="50"/>
               <w:left w:type="dxa" w:w="70"/>
-              <w:bottom w:type="dxa" w:w="50"/>
+              <w:bottom w:type="dxa" w:w="40"/>
               <w:right w:type="dxa" w:w="70"/>
             </w:tcMar>
           </w:tcPr>
           <w:p>
             <w:pPr>
-              <w:spacing w:after="20"/>
-              <w:jc w:val="left"/>
-            </w:pPr>
-            <w:r>
-              <w:rPr>
-                <w:rFonts w:ascii="Calibri" w:cs="Calibri" w:eastAsia="Calibri" w:hAnsi="Calibri"/>
-                <w:b w:val="false"/>
-                <w:bCs w:val="false"/>
-                <w:color w:val="000000"/>
+              <w:keepNext/>
+              <w:spacing w:after="0"/>
+            </w:pPr>
+            <w:r>
+              <w:rPr>
+                <w:rFonts w:ascii="Calibri" w:cs="Calibri" w:eastAsia="Calibri" w:hAnsi="Calibri"/>
+                <w:b/>
+                <w:bCs/>
+                <w:color w:val="1F3A5F"/>
+                <w:sz w:val="15"/>
+                <w:szCs w:val="15"/>
+              </w:rPr>
+              <w:t xml:space="preserve">09:00-11:30</w:t>
+            </w:r>
+          </w:p>
+          <w:p>
+            <w:pPr>
+              <w:spacing w:after="50"/>
+            </w:pPr>
+            <w:r>
+              <w:rPr>
+                <w:rFonts w:ascii="Calibri" w:cs="Calibri" w:eastAsia="Calibri" w:hAnsi="Calibri"/>
                 <w:sz w:val="16"/>
                 <w:szCs w:val="16"/>
               </w:rPr>
-              <w:t xml:space="preserve">BSCP 2 h 30</w:t>
+              <w:t xml:space="preserve">BSCP (2 h 30)</w:t>
             </w:r>
           </w:p>
         </w:tc>
@@ -12755,20 +13585,14 @@
             <w:tcMar>
               <w:top w:type="dxa" w:w="50"/>
               <w:left w:type="dxa" w:w="70"/>
-              <w:bottom w:type="dxa" w:w="50"/>
+              <w:bottom w:type="dxa" w:w="40"/>
               <w:right w:type="dxa" w:w="70"/>
             </w:tcMar>
           </w:tcPr>
           <w:p>
-            <w:pPr>
-              <w:spacing w:after="20"/>
-              <w:jc w:val="left"/>
-            </w:pPr>
-            <w:r>
-              <w:rPr>
-                <w:rFonts w:ascii="Calibri" w:cs="Calibri" w:eastAsia="Calibri" w:hAnsi="Calibri"/>
-                <w:b w:val="false"/>
-                <w:bCs w:val="false"/>
+            <w:r>
+              <w:rPr>
+                <w:rFonts w:ascii="Calibri" w:cs="Calibri" w:eastAsia="Calibri" w:hAnsi="Calibri"/>
                 <w:color w:val="777777"/>
                 <w:sz w:val="16"/>
                 <w:szCs w:val="16"/>
@@ -12830,42 +13654,68 @@
             <w:tcMar>
               <w:top w:type="dxa" w:w="50"/>
               <w:left w:type="dxa" w:w="70"/>
-              <w:bottom w:type="dxa" w:w="50"/>
+              <w:bottom w:type="dxa" w:w="40"/>
               <w:right w:type="dxa" w:w="70"/>
             </w:tcMar>
           </w:tcPr>
           <w:p>
             <w:pPr>
-              <w:spacing w:after="20"/>
-              <w:jc w:val="left"/>
-            </w:pPr>
-            <w:r>
-              <w:rPr>
-                <w:rFonts w:ascii="Calibri" w:cs="Calibri" w:eastAsia="Calibri" w:hAnsi="Calibri"/>
-                <w:b w:val="false"/>
-                <w:bCs w:val="false"/>
-                <w:color w:val="000000"/>
+              <w:keepNext/>
+              <w:spacing w:after="0"/>
+            </w:pPr>
+            <w:r>
+              <w:rPr>
+                <w:rFonts w:ascii="Calibri" w:cs="Calibri" w:eastAsia="Calibri" w:hAnsi="Calibri"/>
+                <w:b/>
+                <w:bCs/>
+                <w:color w:val="1F3A5F"/>
+                <w:sz w:val="15"/>
+                <w:szCs w:val="15"/>
+              </w:rPr>
+              <w:t xml:space="preserve">19:00-20:00</w:t>
+            </w:r>
+          </w:p>
+          <w:p>
+            <w:pPr>
+              <w:spacing w:after="50"/>
+            </w:pPr>
+            <w:r>
+              <w:rPr>
+                <w:rFonts w:ascii="Calibri" w:cs="Calibri" w:eastAsia="Calibri" w:hAnsi="Calibri"/>
                 <w:sz w:val="16"/>
                 <w:szCs w:val="16"/>
               </w:rPr>
-              <w:t xml:space="preserve">CRTO 1 h</w:t>
-            </w:r>
-          </w:p>
-          <w:p>
-            <w:pPr>
-              <w:spacing w:after="20"/>
-              <w:jc w:val="left"/>
-            </w:pPr>
-            <w:r>
-              <w:rPr>
-                <w:rFonts w:ascii="Calibri" w:cs="Calibri" w:eastAsia="Calibri" w:hAnsi="Calibri"/>
-                <w:b w:val="false"/>
-                <w:bCs w:val="false"/>
-                <w:color w:val="000000"/>
+              <w:t xml:space="preserve">CRTO (1 h)</w:t>
+            </w:r>
+          </w:p>
+          <w:p>
+            <w:pPr>
+              <w:keepNext/>
+              <w:spacing w:after="0"/>
+            </w:pPr>
+            <w:r>
+              <w:rPr>
+                <w:rFonts w:ascii="Calibri" w:cs="Calibri" w:eastAsia="Calibri" w:hAnsi="Calibri"/>
+                <w:b/>
+                <w:bCs/>
+                <w:color w:val="1F3A5F"/>
+                <w:sz w:val="15"/>
+                <w:szCs w:val="15"/>
+              </w:rPr>
+              <w:t xml:space="preserve">20:00-20:30</w:t>
+            </w:r>
+          </w:p>
+          <w:p>
+            <w:pPr>
+              <w:spacing w:after="50"/>
+            </w:pPr>
+            <w:r>
+              <w:rPr>
+                <w:rFonts w:ascii="Calibri" w:cs="Calibri" w:eastAsia="Calibri" w:hAnsi="Calibri"/>
                 <w:sz w:val="16"/>
                 <w:szCs w:val="16"/>
               </w:rPr>
-              <w:t xml:space="preserve">École 30 min</w:t>
+              <w:t xml:space="preserve">École (30 min)</w:t>
             </w:r>
           </w:p>
         </w:tc>
@@ -12882,25 +13732,38 @@
             <w:tcMar>
               <w:top w:type="dxa" w:w="50"/>
               <w:left w:type="dxa" w:w="70"/>
-              <w:bottom w:type="dxa" w:w="50"/>
+              <w:bottom w:type="dxa" w:w="40"/>
               <w:right w:type="dxa" w:w="70"/>
             </w:tcMar>
           </w:tcPr>
           <w:p>
             <w:pPr>
-              <w:spacing w:after="20"/>
-              <w:jc w:val="left"/>
-            </w:pPr>
-            <w:r>
-              <w:rPr>
-                <w:rFonts w:ascii="Calibri" w:cs="Calibri" w:eastAsia="Calibri" w:hAnsi="Calibri"/>
-                <w:b w:val="false"/>
-                <w:bCs w:val="false"/>
-                <w:color w:val="000000"/>
+              <w:keepNext/>
+              <w:spacing w:after="0"/>
+            </w:pPr>
+            <w:r>
+              <w:rPr>
+                <w:rFonts w:ascii="Calibri" w:cs="Calibri" w:eastAsia="Calibri" w:hAnsi="Calibri"/>
+                <w:b/>
+                <w:bCs/>
+                <w:color w:val="1F3A5F"/>
+                <w:sz w:val="15"/>
+                <w:szCs w:val="15"/>
+              </w:rPr>
+              <w:t xml:space="preserve">19:00-20:00</w:t>
+            </w:r>
+          </w:p>
+          <w:p>
+            <w:pPr>
+              <w:spacing w:after="50"/>
+            </w:pPr>
+            <w:r>
+              <w:rPr>
+                <w:rFonts w:ascii="Calibri" w:cs="Calibri" w:eastAsia="Calibri" w:hAnsi="Calibri"/>
                 <w:sz w:val="16"/>
                 <w:szCs w:val="16"/>
               </w:rPr>
-              <w:t xml:space="preserve">Lab 1 h</w:t>
+              <w:t xml:space="preserve">Lab (1 h)</w:t>
             </w:r>
           </w:p>
         </w:tc>
@@ -12917,25 +13780,38 @@
             <w:tcMar>
               <w:top w:type="dxa" w:w="50"/>
               <w:left w:type="dxa" w:w="70"/>
-              <w:bottom w:type="dxa" w:w="50"/>
+              <w:bottom w:type="dxa" w:w="40"/>
               <w:right w:type="dxa" w:w="70"/>
             </w:tcMar>
           </w:tcPr>
           <w:p>
             <w:pPr>
-              <w:spacing w:after="20"/>
-              <w:jc w:val="left"/>
-            </w:pPr>
-            <w:r>
-              <w:rPr>
-                <w:rFonts w:ascii="Calibri" w:cs="Calibri" w:eastAsia="Calibri" w:hAnsi="Calibri"/>
-                <w:b w:val="false"/>
-                <w:bCs w:val="false"/>
-                <w:color w:val="000000"/>
+              <w:keepNext/>
+              <w:spacing w:after="0"/>
+            </w:pPr>
+            <w:r>
+              <w:rPr>
+                <w:rFonts w:ascii="Calibri" w:cs="Calibri" w:eastAsia="Calibri" w:hAnsi="Calibri"/>
+                <w:b/>
+                <w:bCs/>
+                <w:color w:val="1F3A5F"/>
+                <w:sz w:val="15"/>
+                <w:szCs w:val="15"/>
+              </w:rPr>
+              <w:t xml:space="preserve">19:00-20:00</w:t>
+            </w:r>
+          </w:p>
+          <w:p>
+            <w:pPr>
+              <w:spacing w:after="50"/>
+            </w:pPr>
+            <w:r>
+              <w:rPr>
+                <w:rFonts w:ascii="Calibri" w:cs="Calibri" w:eastAsia="Calibri" w:hAnsi="Calibri"/>
                 <w:sz w:val="16"/>
                 <w:szCs w:val="16"/>
               </w:rPr>
-              <w:t xml:space="preserve">C, Sektor7 1 h</w:t>
+              <w:t xml:space="preserve">C, Sektor7 (1 h)</w:t>
             </w:r>
           </w:p>
         </w:tc>
@@ -12952,42 +13828,68 @@
             <w:tcMar>
               <w:top w:type="dxa" w:w="50"/>
               <w:left w:type="dxa" w:w="70"/>
-              <w:bottom w:type="dxa" w:w="50"/>
+              <w:bottom w:type="dxa" w:w="40"/>
               <w:right w:type="dxa" w:w="70"/>
             </w:tcMar>
           </w:tcPr>
           <w:p>
             <w:pPr>
-              <w:spacing w:after="20"/>
-              <w:jc w:val="left"/>
-            </w:pPr>
-            <w:r>
-              <w:rPr>
-                <w:rFonts w:ascii="Calibri" w:cs="Calibri" w:eastAsia="Calibri" w:hAnsi="Calibri"/>
-                <w:b w:val="false"/>
-                <w:bCs w:val="false"/>
-                <w:color w:val="000000"/>
+              <w:keepNext/>
+              <w:spacing w:after="0"/>
+            </w:pPr>
+            <w:r>
+              <w:rPr>
+                <w:rFonts w:ascii="Calibri" w:cs="Calibri" w:eastAsia="Calibri" w:hAnsi="Calibri"/>
+                <w:b/>
+                <w:bCs/>
+                <w:color w:val="1F3A5F"/>
+                <w:sz w:val="15"/>
+                <w:szCs w:val="15"/>
+              </w:rPr>
+              <w:t xml:space="preserve">19:00-20:00</w:t>
+            </w:r>
+          </w:p>
+          <w:p>
+            <w:pPr>
+              <w:spacing w:after="50"/>
+            </w:pPr>
+            <w:r>
+              <w:rPr>
+                <w:rFonts w:ascii="Calibri" w:cs="Calibri" w:eastAsia="Calibri" w:hAnsi="Calibri"/>
                 <w:sz w:val="16"/>
                 <w:szCs w:val="16"/>
               </w:rPr>
-              <w:t xml:space="preserve">CRTO 1 h</w:t>
-            </w:r>
-          </w:p>
-          <w:p>
-            <w:pPr>
-              <w:spacing w:after="20"/>
-              <w:jc w:val="left"/>
-            </w:pPr>
-            <w:r>
-              <w:rPr>
-                <w:rFonts w:ascii="Calibri" w:cs="Calibri" w:eastAsia="Calibri" w:hAnsi="Calibri"/>
-                <w:b w:val="false"/>
-                <w:bCs w:val="false"/>
-                <w:color w:val="000000"/>
+              <w:t xml:space="preserve">CRTO (1 h)</w:t>
+            </w:r>
+          </w:p>
+          <w:p>
+            <w:pPr>
+              <w:keepNext/>
+              <w:spacing w:after="0"/>
+            </w:pPr>
+            <w:r>
+              <w:rPr>
+                <w:rFonts w:ascii="Calibri" w:cs="Calibri" w:eastAsia="Calibri" w:hAnsi="Calibri"/>
+                <w:b/>
+                <w:bCs/>
+                <w:color w:val="1F3A5F"/>
+                <w:sz w:val="15"/>
+                <w:szCs w:val="15"/>
+              </w:rPr>
+              <w:t xml:space="preserve">20:00-20:30</w:t>
+            </w:r>
+          </w:p>
+          <w:p>
+            <w:pPr>
+              <w:spacing w:after="50"/>
+            </w:pPr>
+            <w:r>
+              <w:rPr>
+                <w:rFonts w:ascii="Calibri" w:cs="Calibri" w:eastAsia="Calibri" w:hAnsi="Calibri"/>
                 <w:sz w:val="16"/>
                 <w:szCs w:val="16"/>
               </w:rPr>
-              <w:t xml:space="preserve">Rédaction 30 min</w:t>
+              <w:t xml:space="preserve">Rédaction (30 min)</w:t>
             </w:r>
           </w:p>
         </w:tc>
@@ -13004,42 +13906,68 @@
             <w:tcMar>
               <w:top w:type="dxa" w:w="50"/>
               <w:left w:type="dxa" w:w="70"/>
-              <w:bottom w:type="dxa" w:w="50"/>
+              <w:bottom w:type="dxa" w:w="40"/>
               <w:right w:type="dxa" w:w="70"/>
             </w:tcMar>
           </w:tcPr>
           <w:p>
             <w:pPr>
-              <w:spacing w:after="20"/>
-              <w:jc w:val="left"/>
-            </w:pPr>
-            <w:r>
-              <w:rPr>
-                <w:rFonts w:ascii="Calibri" w:cs="Calibri" w:eastAsia="Calibri" w:hAnsi="Calibri"/>
-                <w:b w:val="false"/>
-                <w:bCs w:val="false"/>
-                <w:color w:val="000000"/>
+              <w:keepNext/>
+              <w:spacing w:after="0"/>
+            </w:pPr>
+            <w:r>
+              <w:rPr>
+                <w:rFonts w:ascii="Calibri" w:cs="Calibri" w:eastAsia="Calibri" w:hAnsi="Calibri"/>
+                <w:b/>
+                <w:bCs/>
+                <w:color w:val="1F3A5F"/>
+                <w:sz w:val="15"/>
+                <w:szCs w:val="15"/>
+              </w:rPr>
+              <w:t xml:space="preserve">19:00-19:30</w:t>
+            </w:r>
+          </w:p>
+          <w:p>
+            <w:pPr>
+              <w:spacing w:after="50"/>
+            </w:pPr>
+            <w:r>
+              <w:rPr>
+                <w:rFonts w:ascii="Calibri" w:cs="Calibri" w:eastAsia="Calibri" w:hAnsi="Calibri"/>
                 <w:sz w:val="16"/>
                 <w:szCs w:val="16"/>
               </w:rPr>
-              <w:t xml:space="preserve">Revue 30 min</w:t>
-            </w:r>
-          </w:p>
-          <w:p>
-            <w:pPr>
-              <w:spacing w:after="20"/>
-              <w:jc w:val="left"/>
-            </w:pPr>
-            <w:r>
-              <w:rPr>
-                <w:rFonts w:ascii="Calibri" w:cs="Calibri" w:eastAsia="Calibri" w:hAnsi="Calibri"/>
-                <w:b w:val="false"/>
-                <w:bCs w:val="false"/>
-                <w:color w:val="000000"/>
+              <w:t xml:space="preserve">Revue (30 min)</w:t>
+            </w:r>
+          </w:p>
+          <w:p>
+            <w:pPr>
+              <w:keepNext/>
+              <w:spacing w:after="0"/>
+            </w:pPr>
+            <w:r>
+              <w:rPr>
+                <w:rFonts w:ascii="Calibri" w:cs="Calibri" w:eastAsia="Calibri" w:hAnsi="Calibri"/>
+                <w:b/>
+                <w:bCs/>
+                <w:color w:val="1F3A5F"/>
+                <w:sz w:val="15"/>
+                <w:szCs w:val="15"/>
+              </w:rPr>
+              <w:t xml:space="preserve">19:30-20:00</w:t>
+            </w:r>
+          </w:p>
+          <w:p>
+            <w:pPr>
+              <w:spacing w:after="50"/>
+            </w:pPr>
+            <w:r>
+              <w:rPr>
+                <w:rFonts w:ascii="Calibri" w:cs="Calibri" w:eastAsia="Calibri" w:hAnsi="Calibri"/>
                 <w:sz w:val="16"/>
                 <w:szCs w:val="16"/>
               </w:rPr>
-              <w:t xml:space="preserve">C 30 min</w:t>
+              <w:t xml:space="preserve">C (30 min)</w:t>
             </w:r>
           </w:p>
         </w:tc>
@@ -13056,59 +13984,98 @@
             <w:tcMar>
               <w:top w:type="dxa" w:w="50"/>
               <w:left w:type="dxa" w:w="70"/>
-              <w:bottom w:type="dxa" w:w="50"/>
+              <w:bottom w:type="dxa" w:w="40"/>
               <w:right w:type="dxa" w:w="70"/>
             </w:tcMar>
           </w:tcPr>
           <w:p>
             <w:pPr>
-              <w:spacing w:after="20"/>
-              <w:jc w:val="left"/>
-            </w:pPr>
-            <w:r>
-              <w:rPr>
-                <w:rFonts w:ascii="Calibri" w:cs="Calibri" w:eastAsia="Calibri" w:hAnsi="Calibri"/>
-                <w:b w:val="false"/>
-                <w:bCs w:val="false"/>
-                <w:color w:val="000000"/>
+              <w:keepNext/>
+              <w:spacing w:after="0"/>
+            </w:pPr>
+            <w:r>
+              <w:rPr>
+                <w:rFonts w:ascii="Calibri" w:cs="Calibri" w:eastAsia="Calibri" w:hAnsi="Calibri"/>
+                <w:b/>
+                <w:bCs/>
+                <w:color w:val="1F3A5F"/>
+                <w:sz w:val="15"/>
+                <w:szCs w:val="15"/>
+              </w:rPr>
+              <w:t xml:space="preserve">09:00-11:00</w:t>
+            </w:r>
+          </w:p>
+          <w:p>
+            <w:pPr>
+              <w:spacing w:after="50"/>
+            </w:pPr>
+            <w:r>
+              <w:rPr>
+                <w:rFonts w:ascii="Calibri" w:cs="Calibri" w:eastAsia="Calibri" w:hAnsi="Calibri"/>
                 <w:sz w:val="16"/>
                 <w:szCs w:val="16"/>
               </w:rPr>
-              <w:t xml:space="preserve">Lab 2 h</w:t>
-            </w:r>
-          </w:p>
-          <w:p>
-            <w:pPr>
-              <w:spacing w:after="20"/>
-              <w:jc w:val="left"/>
-            </w:pPr>
-            <w:r>
-              <w:rPr>
-                <w:rFonts w:ascii="Calibri" w:cs="Calibri" w:eastAsia="Calibri" w:hAnsi="Calibri"/>
-                <w:b w:val="false"/>
-                <w:bCs w:val="false"/>
-                <w:color w:val="000000"/>
+              <w:t xml:space="preserve">Lab (2 h)</w:t>
+            </w:r>
+          </w:p>
+          <w:p>
+            <w:pPr>
+              <w:keepNext/>
+              <w:spacing w:after="0"/>
+            </w:pPr>
+            <w:r>
+              <w:rPr>
+                <w:rFonts w:ascii="Calibri" w:cs="Calibri" w:eastAsia="Calibri" w:hAnsi="Calibri"/>
+                <w:b/>
+                <w:bCs/>
+                <w:color w:val="1F3A5F"/>
+                <w:sz w:val="15"/>
+                <w:szCs w:val="15"/>
+              </w:rPr>
+              <w:t xml:space="preserve">11:15-12:15</w:t>
+            </w:r>
+          </w:p>
+          <w:p>
+            <w:pPr>
+              <w:spacing w:after="50"/>
+            </w:pPr>
+            <w:r>
+              <w:rPr>
+                <w:rFonts w:ascii="Calibri" w:cs="Calibri" w:eastAsia="Calibri" w:hAnsi="Calibri"/>
                 <w:sz w:val="16"/>
                 <w:szCs w:val="16"/>
               </w:rPr>
-              <w:t xml:space="preserve">CRTO 1 h</w:t>
-            </w:r>
-          </w:p>
-          <w:p>
-            <w:pPr>
-              <w:spacing w:after="20"/>
-              <w:jc w:val="left"/>
-            </w:pPr>
-            <w:r>
-              <w:rPr>
-                <w:rFonts w:ascii="Calibri" w:cs="Calibri" w:eastAsia="Calibri" w:hAnsi="Calibri"/>
-                <w:b w:val="false"/>
-                <w:bCs w:val="false"/>
-                <w:color w:val="000000"/>
+              <w:t xml:space="preserve">CRTO (1 h)</w:t>
+            </w:r>
+          </w:p>
+          <w:p>
+            <w:pPr>
+              <w:keepNext/>
+              <w:spacing w:after="0"/>
+            </w:pPr>
+            <w:r>
+              <w:rPr>
+                <w:rFonts w:ascii="Calibri" w:cs="Calibri" w:eastAsia="Calibri" w:hAnsi="Calibri"/>
+                <w:b/>
+                <w:bCs/>
+                <w:color w:val="1F3A5F"/>
+                <w:sz w:val="15"/>
+                <w:szCs w:val="15"/>
+              </w:rPr>
+              <w:t xml:space="preserve">12:30-13:00</w:t>
+            </w:r>
+          </w:p>
+          <w:p>
+            <w:pPr>
+              <w:spacing w:after="50"/>
+            </w:pPr>
+            <w:r>
+              <w:rPr>
+                <w:rFonts w:ascii="Calibri" w:cs="Calibri" w:eastAsia="Calibri" w:hAnsi="Calibri"/>
                 <w:sz w:val="16"/>
                 <w:szCs w:val="16"/>
               </w:rPr>
-              <w:t xml:space="preserve">C 30 min</w:t>
+              <w:t xml:space="preserve">C (30 min)</w:t>
             </w:r>
           </w:p>
         </w:tc>
@@ -13125,20 +14092,14 @@
             <w:tcMar>
               <w:top w:type="dxa" w:w="50"/>
               <w:left w:type="dxa" w:w="70"/>
-              <w:bottom w:type="dxa" w:w="50"/>
+              <w:bottom w:type="dxa" w:w="40"/>
               <w:right w:type="dxa" w:w="70"/>
             </w:tcMar>
           </w:tcPr>
           <w:p>
-            <w:pPr>
-              <w:spacing w:after="20"/>
-              <w:jc w:val="left"/>
-            </w:pPr>
-            <w:r>
-              <w:rPr>
-                <w:rFonts w:ascii="Calibri" w:cs="Calibri" w:eastAsia="Calibri" w:hAnsi="Calibri"/>
-                <w:b w:val="false"/>
-                <w:bCs w:val="false"/>
+            <w:r>
+              <w:rPr>
+                <w:rFonts w:ascii="Calibri" w:cs="Calibri" w:eastAsia="Calibri" w:hAnsi="Calibri"/>
                 <w:color w:val="777777"/>
                 <w:sz w:val="16"/>
                 <w:szCs w:val="16"/>
@@ -13200,25 +14161,38 @@
             <w:tcMar>
               <w:top w:type="dxa" w:w="50"/>
               <w:left w:type="dxa" w:w="70"/>
-              <w:bottom w:type="dxa" w:w="50"/>
+              <w:bottom w:type="dxa" w:w="40"/>
               <w:right w:type="dxa" w:w="70"/>
             </w:tcMar>
           </w:tcPr>
           <w:p>
             <w:pPr>
-              <w:spacing w:after="20"/>
-              <w:jc w:val="left"/>
-            </w:pPr>
-            <w:r>
-              <w:rPr>
-                <w:rFonts w:ascii="Calibri" w:cs="Calibri" w:eastAsia="Calibri" w:hAnsi="Calibri"/>
-                <w:b w:val="false"/>
-                <w:bCs w:val="false"/>
-                <w:color w:val="000000"/>
+              <w:keepNext/>
+              <w:spacing w:after="0"/>
+            </w:pPr>
+            <w:r>
+              <w:rPr>
+                <w:rFonts w:ascii="Calibri" w:cs="Calibri" w:eastAsia="Calibri" w:hAnsi="Calibri"/>
+                <w:b/>
+                <w:bCs/>
+                <w:color w:val="1F3A5F"/>
+                <w:sz w:val="15"/>
+                <w:szCs w:val="15"/>
+              </w:rPr>
+              <w:t xml:space="preserve">19:00-20:00</w:t>
+            </w:r>
+          </w:p>
+          <w:p>
+            <w:pPr>
+              <w:spacing w:after="50"/>
+            </w:pPr>
+            <w:r>
+              <w:rPr>
+                <w:rFonts w:ascii="Calibri" w:cs="Calibri" w:eastAsia="Calibri" w:hAnsi="Calibri"/>
                 <w:sz w:val="16"/>
                 <w:szCs w:val="16"/>
               </w:rPr>
-              <w:t xml:space="preserve">Cours 1 h</w:t>
+              <w:t xml:space="preserve">Cours (1 h)</w:t>
             </w:r>
           </w:p>
         </w:tc>
@@ -13235,25 +14209,38 @@
             <w:tcMar>
               <w:top w:type="dxa" w:w="50"/>
               <w:left w:type="dxa" w:w="70"/>
-              <w:bottom w:type="dxa" w:w="50"/>
+              <w:bottom w:type="dxa" w:w="40"/>
               <w:right w:type="dxa" w:w="70"/>
             </w:tcMar>
           </w:tcPr>
           <w:p>
             <w:pPr>
-              <w:spacing w:after="20"/>
-              <w:jc w:val="left"/>
-            </w:pPr>
-            <w:r>
-              <w:rPr>
-                <w:rFonts w:ascii="Calibri" w:cs="Calibri" w:eastAsia="Calibri" w:hAnsi="Calibri"/>
-                <w:b w:val="false"/>
-                <w:bCs w:val="false"/>
-                <w:color w:val="000000"/>
+              <w:keepNext/>
+              <w:spacing w:after="0"/>
+            </w:pPr>
+            <w:r>
+              <w:rPr>
+                <w:rFonts w:ascii="Calibri" w:cs="Calibri" w:eastAsia="Calibri" w:hAnsi="Calibri"/>
+                <w:b/>
+                <w:bCs/>
+                <w:color w:val="1F3A5F"/>
+                <w:sz w:val="15"/>
+                <w:szCs w:val="15"/>
+              </w:rPr>
+              <w:t xml:space="preserve">19:00-20:00</w:t>
+            </w:r>
+          </w:p>
+          <w:p>
+            <w:pPr>
+              <w:spacing w:after="50"/>
+            </w:pPr>
+            <w:r>
+              <w:rPr>
+                <w:rFonts w:ascii="Calibri" w:cs="Calibri" w:eastAsia="Calibri" w:hAnsi="Calibri"/>
                 <w:sz w:val="16"/>
                 <w:szCs w:val="16"/>
               </w:rPr>
-              <w:t xml:space="preserve">Lab 1 h</w:t>
+              <w:t xml:space="preserve">Lab (1 h)</w:t>
             </w:r>
           </w:p>
         </w:tc>
@@ -13270,25 +14257,38 @@
             <w:tcMar>
               <w:top w:type="dxa" w:w="50"/>
               <w:left w:type="dxa" w:w="70"/>
-              <w:bottom w:type="dxa" w:w="50"/>
+              <w:bottom w:type="dxa" w:w="40"/>
               <w:right w:type="dxa" w:w="70"/>
             </w:tcMar>
           </w:tcPr>
           <w:p>
             <w:pPr>
-              <w:spacing w:after="20"/>
-              <w:jc w:val="left"/>
-            </w:pPr>
-            <w:r>
-              <w:rPr>
-                <w:rFonts w:ascii="Calibri" w:cs="Calibri" w:eastAsia="Calibri" w:hAnsi="Calibri"/>
-                <w:b w:val="false"/>
-                <w:bCs w:val="false"/>
-                <w:color w:val="000000"/>
+              <w:keepNext/>
+              <w:spacing w:after="0"/>
+            </w:pPr>
+            <w:r>
+              <w:rPr>
+                <w:rFonts w:ascii="Calibri" w:cs="Calibri" w:eastAsia="Calibri" w:hAnsi="Calibri"/>
+                <w:b/>
+                <w:bCs/>
+                <w:color w:val="1F3A5F"/>
+                <w:sz w:val="15"/>
+                <w:szCs w:val="15"/>
+              </w:rPr>
+              <w:t xml:space="preserve">19:00-20:00</w:t>
+            </w:r>
+          </w:p>
+          <w:p>
+            <w:pPr>
+              <w:spacing w:after="50"/>
+            </w:pPr>
+            <w:r>
+              <w:rPr>
+                <w:rFonts w:ascii="Calibri" w:cs="Calibri" w:eastAsia="Calibri" w:hAnsi="Calibri"/>
                 <w:sz w:val="16"/>
                 <w:szCs w:val="16"/>
               </w:rPr>
-              <w:t xml:space="preserve">Reverse eng. 1 h</w:t>
+              <w:t xml:space="preserve">Reverse eng. (1 h)</w:t>
             </w:r>
           </w:p>
         </w:tc>
@@ -13305,42 +14305,68 @@
             <w:tcMar>
               <w:top w:type="dxa" w:w="50"/>
               <w:left w:type="dxa" w:w="70"/>
-              <w:bottom w:type="dxa" w:w="50"/>
+              <w:bottom w:type="dxa" w:w="40"/>
               <w:right w:type="dxa" w:w="70"/>
             </w:tcMar>
           </w:tcPr>
           <w:p>
             <w:pPr>
-              <w:spacing w:after="20"/>
-              <w:jc w:val="left"/>
-            </w:pPr>
-            <w:r>
-              <w:rPr>
-                <w:rFonts w:ascii="Calibri" w:cs="Calibri" w:eastAsia="Calibri" w:hAnsi="Calibri"/>
-                <w:b w:val="false"/>
-                <w:bCs w:val="false"/>
-                <w:color w:val="000000"/>
+              <w:keepNext/>
+              <w:spacing w:after="0"/>
+            </w:pPr>
+            <w:r>
+              <w:rPr>
+                <w:rFonts w:ascii="Calibri" w:cs="Calibri" w:eastAsia="Calibri" w:hAnsi="Calibri"/>
+                <w:b/>
+                <w:bCs/>
+                <w:color w:val="1F3A5F"/>
+                <w:sz w:val="15"/>
+                <w:szCs w:val="15"/>
+              </w:rPr>
+              <w:t xml:space="preserve">19:00-20:00</w:t>
+            </w:r>
+          </w:p>
+          <w:p>
+            <w:pPr>
+              <w:spacing w:after="50"/>
+            </w:pPr>
+            <w:r>
+              <w:rPr>
+                <w:rFonts w:ascii="Calibri" w:cs="Calibri" w:eastAsia="Calibri" w:hAnsi="Calibri"/>
                 <w:sz w:val="16"/>
                 <w:szCs w:val="16"/>
               </w:rPr>
-              <w:t xml:space="preserve">Cours 1 h</w:t>
-            </w:r>
-          </w:p>
-          <w:p>
-            <w:pPr>
-              <w:spacing w:after="20"/>
-              <w:jc w:val="left"/>
-            </w:pPr>
-            <w:r>
-              <w:rPr>
-                <w:rFonts w:ascii="Calibri" w:cs="Calibri" w:eastAsia="Calibri" w:hAnsi="Calibri"/>
-                <w:b w:val="false"/>
-                <w:bCs w:val="false"/>
-                <w:color w:val="000000"/>
+              <w:t xml:space="preserve">Cours (1 h)</w:t>
+            </w:r>
+          </w:p>
+          <w:p>
+            <w:pPr>
+              <w:keepNext/>
+              <w:spacing w:after="0"/>
+            </w:pPr>
+            <w:r>
+              <w:rPr>
+                <w:rFonts w:ascii="Calibri" w:cs="Calibri" w:eastAsia="Calibri" w:hAnsi="Calibri"/>
+                <w:b/>
+                <w:bCs/>
+                <w:color w:val="1F3A5F"/>
+                <w:sz w:val="15"/>
+                <w:szCs w:val="15"/>
+              </w:rPr>
+              <w:t xml:space="preserve">20:00-20:30</w:t>
+            </w:r>
+          </w:p>
+          <w:p>
+            <w:pPr>
+              <w:spacing w:after="50"/>
+            </w:pPr>
+            <w:r>
+              <w:rPr>
+                <w:rFonts w:ascii="Calibri" w:cs="Calibri" w:eastAsia="Calibri" w:hAnsi="Calibri"/>
                 <w:sz w:val="16"/>
                 <w:szCs w:val="16"/>
               </w:rPr>
-              <w:t xml:space="preserve">Revue 30 min</w:t>
+              <w:t xml:space="preserve">Revue (30 min)</w:t>
             </w:r>
           </w:p>
         </w:tc>
@@ -13357,42 +14383,68 @@
             <w:tcMar>
               <w:top w:type="dxa" w:w="50"/>
               <w:left w:type="dxa" w:w="70"/>
-              <w:bottom w:type="dxa" w:w="50"/>
+              <w:bottom w:type="dxa" w:w="40"/>
               <w:right w:type="dxa" w:w="70"/>
             </w:tcMar>
           </w:tcPr>
           <w:p>
             <w:pPr>
-              <w:spacing w:after="20"/>
-              <w:jc w:val="left"/>
-            </w:pPr>
-            <w:r>
-              <w:rPr>
-                <w:rFonts w:ascii="Calibri" w:cs="Calibri" w:eastAsia="Calibri" w:hAnsi="Calibri"/>
-                <w:b w:val="false"/>
-                <w:bCs w:val="false"/>
-                <w:color w:val="000000"/>
+              <w:keepNext/>
+              <w:spacing w:after="0"/>
+            </w:pPr>
+            <w:r>
+              <w:rPr>
+                <w:rFonts w:ascii="Calibri" w:cs="Calibri" w:eastAsia="Calibri" w:hAnsi="Calibri"/>
+                <w:b/>
+                <w:bCs/>
+                <w:color w:val="1F3A5F"/>
+                <w:sz w:val="15"/>
+                <w:szCs w:val="15"/>
+              </w:rPr>
+              <w:t xml:space="preserve">19:00-19:30</w:t>
+            </w:r>
+          </w:p>
+          <w:p>
+            <w:pPr>
+              <w:spacing w:after="50"/>
+            </w:pPr>
+            <w:r>
+              <w:rPr>
+                <w:rFonts w:ascii="Calibri" w:cs="Calibri" w:eastAsia="Calibri" w:hAnsi="Calibri"/>
                 <w:sz w:val="16"/>
                 <w:szCs w:val="16"/>
               </w:rPr>
-              <w:t xml:space="preserve">Projet 30 min</w:t>
-            </w:r>
-          </w:p>
-          <w:p>
-            <w:pPr>
-              <w:spacing w:after="20"/>
-              <w:jc w:val="left"/>
-            </w:pPr>
-            <w:r>
-              <w:rPr>
-                <w:rFonts w:ascii="Calibri" w:cs="Calibri" w:eastAsia="Calibri" w:hAnsi="Calibri"/>
-                <w:b w:val="false"/>
-                <w:bCs w:val="false"/>
-                <w:color w:val="000000"/>
+              <w:t xml:space="preserve">Projet (30 min)</w:t>
+            </w:r>
+          </w:p>
+          <w:p>
+            <w:pPr>
+              <w:keepNext/>
+              <w:spacing w:after="0"/>
+            </w:pPr>
+            <w:r>
+              <w:rPr>
+                <w:rFonts w:ascii="Calibri" w:cs="Calibri" w:eastAsia="Calibri" w:hAnsi="Calibri"/>
+                <w:b/>
+                <w:bCs/>
+                <w:color w:val="1F3A5F"/>
+                <w:sz w:val="15"/>
+                <w:szCs w:val="15"/>
+              </w:rPr>
+              <w:t xml:space="preserve">19:30-20:00</w:t>
+            </w:r>
+          </w:p>
+          <w:p>
+            <w:pPr>
+              <w:spacing w:after="50"/>
+            </w:pPr>
+            <w:r>
+              <w:rPr>
+                <w:rFonts w:ascii="Calibri" w:cs="Calibri" w:eastAsia="Calibri" w:hAnsi="Calibri"/>
                 <w:sz w:val="16"/>
                 <w:szCs w:val="16"/>
               </w:rPr>
-              <w:t xml:space="preserve">Revue 30 min</w:t>
+              <w:t xml:space="preserve">Revue (30 min)</w:t>
             </w:r>
           </w:p>
         </w:tc>
@@ -13409,59 +14461,98 @@
             <w:tcMar>
               <w:top w:type="dxa" w:w="50"/>
               <w:left w:type="dxa" w:w="70"/>
-              <w:bottom w:type="dxa" w:w="50"/>
+              <w:bottom w:type="dxa" w:w="40"/>
               <w:right w:type="dxa" w:w="70"/>
             </w:tcMar>
           </w:tcPr>
           <w:p>
             <w:pPr>
-              <w:spacing w:after="20"/>
-              <w:jc w:val="left"/>
-            </w:pPr>
-            <w:r>
-              <w:rPr>
-                <w:rFonts w:ascii="Calibri" w:cs="Calibri" w:eastAsia="Calibri" w:hAnsi="Calibri"/>
-                <w:b w:val="false"/>
-                <w:bCs w:val="false"/>
-                <w:color w:val="000000"/>
+              <w:keepNext/>
+              <w:spacing w:after="0"/>
+            </w:pPr>
+            <w:r>
+              <w:rPr>
+                <w:rFonts w:ascii="Calibri" w:cs="Calibri" w:eastAsia="Calibri" w:hAnsi="Calibri"/>
+                <w:b/>
+                <w:bCs/>
+                <w:color w:val="1F3A5F"/>
+                <w:sz w:val="15"/>
+                <w:szCs w:val="15"/>
+              </w:rPr>
+              <w:t xml:space="preserve">09:00-10:00</w:t>
+            </w:r>
+          </w:p>
+          <w:p>
+            <w:pPr>
+              <w:spacing w:after="50"/>
+            </w:pPr>
+            <w:r>
+              <w:rPr>
+                <w:rFonts w:ascii="Calibri" w:cs="Calibri" w:eastAsia="Calibri" w:hAnsi="Calibri"/>
                 <w:sz w:val="16"/>
                 <w:szCs w:val="16"/>
               </w:rPr>
-              <w:t xml:space="preserve">Cours 1 h</w:t>
-            </w:r>
-          </w:p>
-          <w:p>
-            <w:pPr>
-              <w:spacing w:after="20"/>
-              <w:jc w:val="left"/>
-            </w:pPr>
-            <w:r>
-              <w:rPr>
-                <w:rFonts w:ascii="Calibri" w:cs="Calibri" w:eastAsia="Calibri" w:hAnsi="Calibri"/>
-                <w:b w:val="false"/>
-                <w:bCs w:val="false"/>
-                <w:color w:val="000000"/>
+              <w:t xml:space="preserve">Cours (1 h)</w:t>
+            </w:r>
+          </w:p>
+          <w:p>
+            <w:pPr>
+              <w:keepNext/>
+              <w:spacing w:after="0"/>
+            </w:pPr>
+            <w:r>
+              <w:rPr>
+                <w:rFonts w:ascii="Calibri" w:cs="Calibri" w:eastAsia="Calibri" w:hAnsi="Calibri"/>
+                <w:b/>
+                <w:bCs/>
+                <w:color w:val="1F3A5F"/>
+                <w:sz w:val="15"/>
+                <w:szCs w:val="15"/>
+              </w:rPr>
+              <w:t xml:space="preserve">10:15-12:15</w:t>
+            </w:r>
+          </w:p>
+          <w:p>
+            <w:pPr>
+              <w:spacing w:after="50"/>
+            </w:pPr>
+            <w:r>
+              <w:rPr>
+                <w:rFonts w:ascii="Calibri" w:cs="Calibri" w:eastAsia="Calibri" w:hAnsi="Calibri"/>
                 <w:sz w:val="16"/>
                 <w:szCs w:val="16"/>
               </w:rPr>
-              <w:t xml:space="preserve">Lab 2 h</w:t>
-            </w:r>
-          </w:p>
-          <w:p>
-            <w:pPr>
-              <w:spacing w:after="20"/>
-              <w:jc w:val="left"/>
-            </w:pPr>
-            <w:r>
-              <w:rPr>
-                <w:rFonts w:ascii="Calibri" w:cs="Calibri" w:eastAsia="Calibri" w:hAnsi="Calibri"/>
-                <w:b w:val="false"/>
-                <w:bCs w:val="false"/>
-                <w:color w:val="000000"/>
+              <w:t xml:space="preserve">Lab (2 h)</w:t>
+            </w:r>
+          </w:p>
+          <w:p>
+            <w:pPr>
+              <w:keepNext/>
+              <w:spacing w:after="0"/>
+            </w:pPr>
+            <w:r>
+              <w:rPr>
+                <w:rFonts w:ascii="Calibri" w:cs="Calibri" w:eastAsia="Calibri" w:hAnsi="Calibri"/>
+                <w:b/>
+                <w:bCs/>
+                <w:color w:val="1F3A5F"/>
+                <w:sz w:val="15"/>
+                <w:szCs w:val="15"/>
+              </w:rPr>
+              <w:t xml:space="preserve">12:30-13:30</w:t>
+            </w:r>
+          </w:p>
+          <w:p>
+            <w:pPr>
+              <w:spacing w:after="50"/>
+            </w:pPr>
+            <w:r>
+              <w:rPr>
+                <w:rFonts w:ascii="Calibri" w:cs="Calibri" w:eastAsia="Calibri" w:hAnsi="Calibri"/>
                 <w:sz w:val="16"/>
                 <w:szCs w:val="16"/>
               </w:rPr>
-              <w:t xml:space="preserve">Projet 1 h</w:t>
+              <w:t xml:space="preserve">Projet (1 h)</w:t>
             </w:r>
           </w:p>
         </w:tc>
@@ -13478,20 +14569,14 @@
             <w:tcMar>
               <w:top w:type="dxa" w:w="50"/>
               <w:left w:type="dxa" w:w="70"/>
-              <w:bottom w:type="dxa" w:w="50"/>
+              <w:bottom w:type="dxa" w:w="40"/>
               <w:right w:type="dxa" w:w="70"/>
             </w:tcMar>
           </w:tcPr>
           <w:p>
-            <w:pPr>
-              <w:spacing w:after="20"/>
-              <w:jc w:val="left"/>
-            </w:pPr>
-            <w:r>
-              <w:rPr>
-                <w:rFonts w:ascii="Calibri" w:cs="Calibri" w:eastAsia="Calibri" w:hAnsi="Calibri"/>
-                <w:b w:val="false"/>
-                <w:bCs w:val="false"/>
+            <w:r>
+              <w:rPr>
+                <w:rFonts w:ascii="Calibri" w:cs="Calibri" w:eastAsia="Calibri" w:hAnsi="Calibri"/>
                 <w:color w:val="777777"/>
                 <w:sz w:val="16"/>
                 <w:szCs w:val="16"/>
@@ -13553,25 +14638,38 @@
             <w:tcMar>
               <w:top w:type="dxa" w:w="50"/>
               <w:left w:type="dxa" w:w="70"/>
-              <w:bottom w:type="dxa" w:w="50"/>
+              <w:bottom w:type="dxa" w:w="40"/>
               <w:right w:type="dxa" w:w="70"/>
             </w:tcMar>
           </w:tcPr>
           <w:p>
             <w:pPr>
-              <w:spacing w:after="20"/>
-              <w:jc w:val="left"/>
-            </w:pPr>
-            <w:r>
-              <w:rPr>
-                <w:rFonts w:ascii="Calibri" w:cs="Calibri" w:eastAsia="Calibri" w:hAnsi="Calibri"/>
-                <w:b w:val="false"/>
-                <w:bCs w:val="false"/>
-                <w:color w:val="000000"/>
+              <w:keepNext/>
+              <w:spacing w:after="0"/>
+            </w:pPr>
+            <w:r>
+              <w:rPr>
+                <w:rFonts w:ascii="Calibri" w:cs="Calibri" w:eastAsia="Calibri" w:hAnsi="Calibri"/>
+                <w:b/>
+                <w:bCs/>
+                <w:color w:val="1F3A5F"/>
+                <w:sz w:val="15"/>
+                <w:szCs w:val="15"/>
+              </w:rPr>
+              <w:t xml:space="preserve">19:00-20:00</w:t>
+            </w:r>
+          </w:p>
+          <w:p>
+            <w:pPr>
+              <w:spacing w:after="50"/>
+            </w:pPr>
+            <w:r>
+              <w:rPr>
+                <w:rFonts w:ascii="Calibri" w:cs="Calibri" w:eastAsia="Calibri" w:hAnsi="Calibri"/>
                 <w:sz w:val="16"/>
                 <w:szCs w:val="16"/>
               </w:rPr>
-              <w:t xml:space="preserve">CRTL 1 h</w:t>
+              <w:t xml:space="preserve">CRTL (1 h)</w:t>
             </w:r>
           </w:p>
         </w:tc>
@@ -13588,25 +14686,38 @@
             <w:tcMar>
               <w:top w:type="dxa" w:w="50"/>
               <w:left w:type="dxa" w:w="70"/>
-              <w:bottom w:type="dxa" w:w="50"/>
+              <w:bottom w:type="dxa" w:w="40"/>
               <w:right w:type="dxa" w:w="70"/>
             </w:tcMar>
           </w:tcPr>
           <w:p>
             <w:pPr>
-              <w:spacing w:after="20"/>
-              <w:jc w:val="left"/>
-            </w:pPr>
-            <w:r>
-              <w:rPr>
-                <w:rFonts w:ascii="Calibri" w:cs="Calibri" w:eastAsia="Calibri" w:hAnsi="Calibri"/>
-                <w:b w:val="false"/>
-                <w:bCs w:val="false"/>
-                <w:color w:val="000000"/>
+              <w:keepNext/>
+              <w:spacing w:after="0"/>
+            </w:pPr>
+            <w:r>
+              <w:rPr>
+                <w:rFonts w:ascii="Calibri" w:cs="Calibri" w:eastAsia="Calibri" w:hAnsi="Calibri"/>
+                <w:b/>
+                <w:bCs/>
+                <w:color w:val="1F3A5F"/>
+                <w:sz w:val="15"/>
+                <w:szCs w:val="15"/>
+              </w:rPr>
+              <w:t xml:space="preserve">19:00-20:00</w:t>
+            </w:r>
+          </w:p>
+          <w:p>
+            <w:pPr>
+              <w:spacing w:after="50"/>
+            </w:pPr>
+            <w:r>
+              <w:rPr>
+                <w:rFonts w:ascii="Calibri" w:cs="Calibri" w:eastAsia="Calibri" w:hAnsi="Calibri"/>
                 <w:sz w:val="16"/>
                 <w:szCs w:val="16"/>
               </w:rPr>
-              <w:t xml:space="preserve">Lab 1 h</w:t>
+              <w:t xml:space="preserve">Lab (1 h)</w:t>
             </w:r>
           </w:p>
         </w:tc>
@@ -13623,25 +14734,38 @@
             <w:tcMar>
               <w:top w:type="dxa" w:w="50"/>
               <w:left w:type="dxa" w:w="70"/>
-              <w:bottom w:type="dxa" w:w="50"/>
+              <w:bottom w:type="dxa" w:w="40"/>
               <w:right w:type="dxa" w:w="70"/>
             </w:tcMar>
           </w:tcPr>
           <w:p>
             <w:pPr>
-              <w:spacing w:after="20"/>
-              <w:jc w:val="left"/>
-            </w:pPr>
-            <w:r>
-              <w:rPr>
-                <w:rFonts w:ascii="Calibri" w:cs="Calibri" w:eastAsia="Calibri" w:hAnsi="Calibri"/>
-                <w:b w:val="false"/>
-                <w:bCs w:val="false"/>
-                <w:color w:val="000000"/>
+              <w:keepNext/>
+              <w:spacing w:after="0"/>
+            </w:pPr>
+            <w:r>
+              <w:rPr>
+                <w:rFonts w:ascii="Calibri" w:cs="Calibri" w:eastAsia="Calibri" w:hAnsi="Calibri"/>
+                <w:b/>
+                <w:bCs/>
+                <w:color w:val="1F3A5F"/>
+                <w:sz w:val="15"/>
+                <w:szCs w:val="15"/>
+              </w:rPr>
+              <w:t xml:space="preserve">19:00-20:00</w:t>
+            </w:r>
+          </w:p>
+          <w:p>
+            <w:pPr>
+              <w:spacing w:after="50"/>
+            </w:pPr>
+            <w:r>
+              <w:rPr>
+                <w:rFonts w:ascii="Calibri" w:cs="Calibri" w:eastAsia="Calibri" w:hAnsi="Calibri"/>
                 <w:sz w:val="16"/>
                 <w:szCs w:val="16"/>
               </w:rPr>
-              <w:t xml:space="preserve">Projet 1 h</w:t>
+              <w:t xml:space="preserve">Projet (1 h)</w:t>
             </w:r>
           </w:p>
         </w:tc>
@@ -13658,42 +14782,68 @@
             <w:tcMar>
               <w:top w:type="dxa" w:w="50"/>
               <w:left w:type="dxa" w:w="70"/>
-              <w:bottom w:type="dxa" w:w="50"/>
+              <w:bottom w:type="dxa" w:w="40"/>
               <w:right w:type="dxa" w:w="70"/>
             </w:tcMar>
           </w:tcPr>
           <w:p>
             <w:pPr>
-              <w:spacing w:after="20"/>
-              <w:jc w:val="left"/>
-            </w:pPr>
-            <w:r>
-              <w:rPr>
-                <w:rFonts w:ascii="Calibri" w:cs="Calibri" w:eastAsia="Calibri" w:hAnsi="Calibri"/>
-                <w:b w:val="false"/>
-                <w:bCs w:val="false"/>
-                <w:color w:val="000000"/>
+              <w:keepNext/>
+              <w:spacing w:after="0"/>
+            </w:pPr>
+            <w:r>
+              <w:rPr>
+                <w:rFonts w:ascii="Calibri" w:cs="Calibri" w:eastAsia="Calibri" w:hAnsi="Calibri"/>
+                <w:b/>
+                <w:bCs/>
+                <w:color w:val="1F3A5F"/>
+                <w:sz w:val="15"/>
+                <w:szCs w:val="15"/>
+              </w:rPr>
+              <w:t xml:space="preserve">19:00-20:00</w:t>
+            </w:r>
+          </w:p>
+          <w:p>
+            <w:pPr>
+              <w:spacing w:after="50"/>
+            </w:pPr>
+            <w:r>
+              <w:rPr>
+                <w:rFonts w:ascii="Calibri" w:cs="Calibri" w:eastAsia="Calibri" w:hAnsi="Calibri"/>
                 <w:sz w:val="16"/>
                 <w:szCs w:val="16"/>
               </w:rPr>
-              <w:t xml:space="preserve">CRTL 1 h</w:t>
-            </w:r>
-          </w:p>
-          <w:p>
-            <w:pPr>
-              <w:spacing w:after="20"/>
-              <w:jc w:val="left"/>
-            </w:pPr>
-            <w:r>
-              <w:rPr>
-                <w:rFonts w:ascii="Calibri" w:cs="Calibri" w:eastAsia="Calibri" w:hAnsi="Calibri"/>
-                <w:b w:val="false"/>
-                <w:bCs w:val="false"/>
-                <w:color w:val="000000"/>
+              <w:t xml:space="preserve">CRTL (1 h)</w:t>
+            </w:r>
+          </w:p>
+          <w:p>
+            <w:pPr>
+              <w:keepNext/>
+              <w:spacing w:after="0"/>
+            </w:pPr>
+            <w:r>
+              <w:rPr>
+                <w:rFonts w:ascii="Calibri" w:cs="Calibri" w:eastAsia="Calibri" w:hAnsi="Calibri"/>
+                <w:b/>
+                <w:bCs/>
+                <w:color w:val="1F3A5F"/>
+                <w:sz w:val="15"/>
+                <w:szCs w:val="15"/>
+              </w:rPr>
+              <w:t xml:space="preserve">20:00-20:30</w:t>
+            </w:r>
+          </w:p>
+          <w:p>
+            <w:pPr>
+              <w:spacing w:after="50"/>
+            </w:pPr>
+            <w:r>
+              <w:rPr>
+                <w:rFonts w:ascii="Calibri" w:cs="Calibri" w:eastAsia="Calibri" w:hAnsi="Calibri"/>
                 <w:sz w:val="16"/>
                 <w:szCs w:val="16"/>
               </w:rPr>
-              <w:t xml:space="preserve">Revue 30 min</w:t>
+              <w:t xml:space="preserve">Revue (30 min)</w:t>
             </w:r>
           </w:p>
         </w:tc>
@@ -13710,25 +14860,38 @@
             <w:tcMar>
               <w:top w:type="dxa" w:w="50"/>
               <w:left w:type="dxa" w:w="70"/>
-              <w:bottom w:type="dxa" w:w="50"/>
+              <w:bottom w:type="dxa" w:w="40"/>
               <w:right w:type="dxa" w:w="70"/>
             </w:tcMar>
           </w:tcPr>
           <w:p>
             <w:pPr>
-              <w:spacing w:after="20"/>
-              <w:jc w:val="left"/>
-            </w:pPr>
-            <w:r>
-              <w:rPr>
-                <w:rFonts w:ascii="Calibri" w:cs="Calibri" w:eastAsia="Calibri" w:hAnsi="Calibri"/>
-                <w:b w:val="false"/>
-                <w:bCs w:val="false"/>
-                <w:color w:val="000000"/>
+              <w:keepNext/>
+              <w:spacing w:after="0"/>
+            </w:pPr>
+            <w:r>
+              <w:rPr>
+                <w:rFonts w:ascii="Calibri" w:cs="Calibri" w:eastAsia="Calibri" w:hAnsi="Calibri"/>
+                <w:b/>
+                <w:bCs/>
+                <w:color w:val="1F3A5F"/>
+                <w:sz w:val="15"/>
+                <w:szCs w:val="15"/>
+              </w:rPr>
+              <w:t xml:space="preserve">19:00-20:00</w:t>
+            </w:r>
+          </w:p>
+          <w:p>
+            <w:pPr>
+              <w:spacing w:after="50"/>
+            </w:pPr>
+            <w:r>
+              <w:rPr>
+                <w:rFonts w:ascii="Calibri" w:cs="Calibri" w:eastAsia="Calibri" w:hAnsi="Calibri"/>
                 <w:sz w:val="16"/>
                 <w:szCs w:val="16"/>
               </w:rPr>
-              <w:t xml:space="preserve">Candidatures 1 h</w:t>
+              <w:t xml:space="preserve">Candidatures (1 h)</w:t>
             </w:r>
           </w:p>
         </w:tc>
@@ -13745,59 +14908,98 @@
             <w:tcMar>
               <w:top w:type="dxa" w:w="50"/>
               <w:left w:type="dxa" w:w="70"/>
-              <w:bottom w:type="dxa" w:w="50"/>
+              <w:bottom w:type="dxa" w:w="40"/>
               <w:right w:type="dxa" w:w="70"/>
             </w:tcMar>
           </w:tcPr>
           <w:p>
             <w:pPr>
-              <w:spacing w:after="20"/>
-              <w:jc w:val="left"/>
-            </w:pPr>
-            <w:r>
-              <w:rPr>
-                <w:rFonts w:ascii="Calibri" w:cs="Calibri" w:eastAsia="Calibri" w:hAnsi="Calibri"/>
-                <w:b w:val="false"/>
-                <w:bCs w:val="false"/>
-                <w:color w:val="000000"/>
+              <w:keepNext/>
+              <w:spacing w:after="0"/>
+            </w:pPr>
+            <w:r>
+              <w:rPr>
+                <w:rFonts w:ascii="Calibri" w:cs="Calibri" w:eastAsia="Calibri" w:hAnsi="Calibri"/>
+                <w:b/>
+                <w:bCs/>
+                <w:color w:val="1F3A5F"/>
+                <w:sz w:val="15"/>
+                <w:szCs w:val="15"/>
+              </w:rPr>
+              <w:t xml:space="preserve">09:00-10:00</w:t>
+            </w:r>
+          </w:p>
+          <w:p>
+            <w:pPr>
+              <w:spacing w:after="50"/>
+            </w:pPr>
+            <w:r>
+              <w:rPr>
+                <w:rFonts w:ascii="Calibri" w:cs="Calibri" w:eastAsia="Calibri" w:hAnsi="Calibri"/>
                 <w:sz w:val="16"/>
                 <w:szCs w:val="16"/>
               </w:rPr>
-              <w:t xml:space="preserve">CRTL 1 h</w:t>
-            </w:r>
-          </w:p>
-          <w:p>
-            <w:pPr>
-              <w:spacing w:after="20"/>
-              <w:jc w:val="left"/>
-            </w:pPr>
-            <w:r>
-              <w:rPr>
-                <w:rFonts w:ascii="Calibri" w:cs="Calibri" w:eastAsia="Calibri" w:hAnsi="Calibri"/>
-                <w:b w:val="false"/>
-                <w:bCs w:val="false"/>
-                <w:color w:val="000000"/>
+              <w:t xml:space="preserve">CRTL (1 h)</w:t>
+            </w:r>
+          </w:p>
+          <w:p>
+            <w:pPr>
+              <w:keepNext/>
+              <w:spacing w:after="0"/>
+            </w:pPr>
+            <w:r>
+              <w:rPr>
+                <w:rFonts w:ascii="Calibri" w:cs="Calibri" w:eastAsia="Calibri" w:hAnsi="Calibri"/>
+                <w:b/>
+                <w:bCs/>
+                <w:color w:val="1F3A5F"/>
+                <w:sz w:val="15"/>
+                <w:szCs w:val="15"/>
+              </w:rPr>
+              <w:t xml:space="preserve">10:15-12:15</w:t>
+            </w:r>
+          </w:p>
+          <w:p>
+            <w:pPr>
+              <w:spacing w:after="50"/>
+            </w:pPr>
+            <w:r>
+              <w:rPr>
+                <w:rFonts w:ascii="Calibri" w:cs="Calibri" w:eastAsia="Calibri" w:hAnsi="Calibri"/>
                 <w:sz w:val="16"/>
                 <w:szCs w:val="16"/>
               </w:rPr>
-              <w:t xml:space="preserve">Lab 2 h</w:t>
-            </w:r>
-          </w:p>
-          <w:p>
-            <w:pPr>
-              <w:spacing w:after="20"/>
-              <w:jc w:val="left"/>
-            </w:pPr>
-            <w:r>
-              <w:rPr>
-                <w:rFonts w:ascii="Calibri" w:cs="Calibri" w:eastAsia="Calibri" w:hAnsi="Calibri"/>
-                <w:b w:val="false"/>
-                <w:bCs w:val="false"/>
-                <w:color w:val="000000"/>
+              <w:t xml:space="preserve">Lab (2 h)</w:t>
+            </w:r>
+          </w:p>
+          <w:p>
+            <w:pPr>
+              <w:keepNext/>
+              <w:spacing w:after="0"/>
+            </w:pPr>
+            <w:r>
+              <w:rPr>
+                <w:rFonts w:ascii="Calibri" w:cs="Calibri" w:eastAsia="Calibri" w:hAnsi="Calibri"/>
+                <w:b/>
+                <w:bCs/>
+                <w:color w:val="1F3A5F"/>
+                <w:sz w:val="15"/>
+                <w:szCs w:val="15"/>
+              </w:rPr>
+              <w:t xml:space="preserve">12:30-13:30</w:t>
+            </w:r>
+          </w:p>
+          <w:p>
+            <w:pPr>
+              <w:spacing w:after="50"/>
+            </w:pPr>
+            <w:r>
+              <w:rPr>
+                <w:rFonts w:ascii="Calibri" w:cs="Calibri" w:eastAsia="Calibri" w:hAnsi="Calibri"/>
                 <w:sz w:val="16"/>
                 <w:szCs w:val="16"/>
               </w:rPr>
-              <w:t xml:space="preserve">Projet 1 h</w:t>
+              <w:t xml:space="preserve">Projet (1 h)</w:t>
             </w:r>
           </w:p>
         </w:tc>
@@ -13814,20 +15016,14 @@
             <w:tcMar>
               <w:top w:type="dxa" w:w="50"/>
               <w:left w:type="dxa" w:w="70"/>
-              <w:bottom w:type="dxa" w:w="50"/>
+              <w:bottom w:type="dxa" w:w="40"/>
               <w:right w:type="dxa" w:w="70"/>
             </w:tcMar>
           </w:tcPr>
           <w:p>
-            <w:pPr>
-              <w:spacing w:after="20"/>
-              <w:jc w:val="left"/>
-            </w:pPr>
-            <w:r>
-              <w:rPr>
-                <w:rFonts w:ascii="Calibri" w:cs="Calibri" w:eastAsia="Calibri" w:hAnsi="Calibri"/>
-                <w:b w:val="false"/>
-                <w:bCs w:val="false"/>
+            <w:r>
+              <w:rPr>
+                <w:rFonts w:ascii="Calibri" w:cs="Calibri" w:eastAsia="Calibri" w:hAnsi="Calibri"/>
                 <w:color w:val="777777"/>
                 <w:sz w:val="16"/>
                 <w:szCs w:val="16"/>

</xml_diff>

<commit_message>
Recale les créneaux hebdomadaires sur les horaires réels de l'utilisateur
Co-Authored-By: Claude Sonnet 5.5 <noreply@anthropic.com>
Claude-Session: https://claude.ai/code/session_01PLMe4ge9F6B5wJA3dMBx9D
</commit_message>
<xml_diff>
--- a/05-Plan-Carriere/Plan-carriere-Red-Team-2026-2028.docx
+++ b/05-Plan-Carriere/Plan-carriere-Red-Team-2026-2028.docx
@@ -474,7 +474,7 @@
           <w:i w:val="false"/>
           <w:iCs w:val="false"/>
         </w:rPr>
-        <w:t xml:space="preserve"> abonnement HackTheBox actif jusqu'au 8 octobre 2027 avec accès à Shinra, Ifrit et aux autres Pro Labs et Mini Pro Labs ; lab CRTO inclus dans ton achat ; cours EDR Internals &amp; Development édité par Maldev Academy ; contrat d'apprentissage de deux ans au ministère, sans aucune activité offensive chez ton employeur ; pas de mémoire ni de soutenance en M2.</w:t>
+        <w:t xml:space="preserve"> abonnement HackTheBox actif jusqu'au 8 octobre 2027 avec accès à Shinra, Ifrit et aux autres Pro Labs et Mini Pro Labs ; lab CRTO inclus dans ton achat ; cours EDR Internals &amp; Development édité par Maldev Academy ; contrat d'apprentissage de deux ans au ministère, sans aucune activité offensive chez ton employeur ; pas de mémoire ni de soutenance en M2 ; fin du travail à 16 h 30, retour vers 17 h 15 et travail possible jusque vers 21 h.</w:t>
       </w:r>
     </w:p>
     <w:p>
@@ -9661,7 +9661,7 @@
           <w:i w:val="false"/>
           <w:iCs w:val="false"/>
         </w:rPr>
-        <w:t xml:space="preserve">Créneaux horaires (hypothèse à ajuster) :</w:t>
+        <w:t xml:space="preserve">Créneaux horaires :</w:t>
       </w:r>
       <w:r>
         <w:rPr>
@@ -9671,7 +9671,7 @@
           <w:i w:val="false"/>
           <w:iCs w:val="false"/>
         </w:rPr>
-        <w:t xml:space="preserve"> faute de connaître tes horaires de travail et de cours, j'ai placé les blocs en soirée à partir de 19 h du lundi au vendredi, et le samedi à partir de 9 h avec 15 min de pause entre deux blocs ; le dimanche reste libre. Décale simplement l'heure de départ de chaque jour si tes horaires diffèrent.</w:t>
+        <w:t xml:space="preserve"> d'après tes horaires (fin du travail à 16 h 30, retour vers 17 h 15, travail possible jusque vers 21 h), j'ai placé les blocs du lundi au vendredi à partir de 18 h, ce qui laisse le temps de rentrer et de dîner, sans jamais dépasser 21 h (le bloc le plus long finit à 20 h 30). Le samedi, les blocs commencent à 9 h (hypothèse, avec 15 min de pause entre deux blocs) et le dimanche reste libre. Je n'ai pas tes horaires de fin de cours : les semaines d'école reprennent la même fenêtre, à vérifier.</w:t>
       </w:r>
     </w:p>
     <w:p>
@@ -9763,7 +9763,7 @@
           <w:sz w:val="18"/>
           <w:szCs w:val="18"/>
         </w:rPr>
-        <w:t xml:space="preserve"> Semaine type jour par jour, en heures (les segments inférieurs à 1 h ne sont pas numérotés). Les tableaux suivants détaillent chaque case avec ses créneaux horaires (hypothèse).</w:t>
+        <w:t xml:space="preserve"> Semaine type jour par jour, en heures (les segments inférieurs à 1 h ne sont pas numérotés). Les tableaux suivants détaillent chaque case avec ses créneaux horaires.</w:t>
       </w:r>
     </w:p>
     <w:p>
@@ -10156,7 +10156,7 @@
                 <w:sz w:val="15"/>
                 <w:szCs w:val="15"/>
               </w:rPr>
-              <w:t xml:space="preserve">19:00-21:00</w:t>
+              <w:t xml:space="preserve">18:00-20:00</w:t>
             </w:r>
           </w:p>
           <w:p>
@@ -10204,7 +10204,7 @@
                 <w:sz w:val="15"/>
                 <w:szCs w:val="15"/>
               </w:rPr>
-              <w:t xml:space="preserve">19:00-21:30</w:t>
+              <w:t xml:space="preserve">18:00-20:30</w:t>
             </w:r>
           </w:p>
           <w:p>
@@ -10252,7 +10252,7 @@
                 <w:sz w:val="15"/>
                 <w:szCs w:val="15"/>
               </w:rPr>
-              <w:t xml:space="preserve">19:00-20:30</w:t>
+              <w:t xml:space="preserve">18:00-19:30</w:t>
             </w:r>
           </w:p>
           <w:p>
@@ -10282,7 +10282,7 @@
                 <w:sz w:val="15"/>
                 <w:szCs w:val="15"/>
               </w:rPr>
-              <w:t xml:space="preserve">20:30-21:00</w:t>
+              <w:t xml:space="preserve">19:30-20:00</w:t>
             </w:r>
           </w:p>
           <w:p>
@@ -10330,7 +10330,7 @@
                 <w:sz w:val="15"/>
                 <w:szCs w:val="15"/>
               </w:rPr>
-              <w:t xml:space="preserve">19:00-21:00</w:t>
+              <w:t xml:space="preserve">18:00-20:00</w:t>
             </w:r>
           </w:p>
           <w:p>
@@ -10378,7 +10378,7 @@
                 <w:sz w:val="15"/>
                 <w:szCs w:val="15"/>
               </w:rPr>
-              <w:t xml:space="preserve">19:00-19:30</w:t>
+              <w:t xml:space="preserve">18:00-18:30</w:t>
             </w:r>
           </w:p>
           <w:p>
@@ -10408,7 +10408,7 @@
                 <w:sz w:val="15"/>
                 <w:szCs w:val="15"/>
               </w:rPr>
-              <w:t xml:space="preserve">19:30-20:00</w:t>
+              <w:t xml:space="preserve">18:30-19:00</w:t>
             </w:r>
           </w:p>
           <w:p>
@@ -10633,7 +10633,7 @@
                 <w:sz w:val="15"/>
                 <w:szCs w:val="15"/>
               </w:rPr>
-              <w:t xml:space="preserve">19:00-21:00</w:t>
+              <w:t xml:space="preserve">18:00-20:00</w:t>
             </w:r>
           </w:p>
           <w:p>
@@ -10681,7 +10681,7 @@
                 <w:sz w:val="15"/>
                 <w:szCs w:val="15"/>
               </w:rPr>
-              <w:t xml:space="preserve">19:00-21:30</w:t>
+              <w:t xml:space="preserve">18:00-20:30</w:t>
             </w:r>
           </w:p>
           <w:p>
@@ -10729,7 +10729,7 @@
                 <w:sz w:val="15"/>
                 <w:szCs w:val="15"/>
               </w:rPr>
-              <w:t xml:space="preserve">19:00-21:00</w:t>
+              <w:t xml:space="preserve">18:00-20:00</w:t>
             </w:r>
           </w:p>
           <w:p>
@@ -10759,7 +10759,7 @@
                 <w:sz w:val="15"/>
                 <w:szCs w:val="15"/>
               </w:rPr>
-              <w:t xml:space="preserve">21:00-21:30</w:t>
+              <w:t xml:space="preserve">20:00-20:30</w:t>
             </w:r>
           </w:p>
           <w:p>
@@ -10807,7 +10807,7 @@
                 <w:sz w:val="15"/>
                 <w:szCs w:val="15"/>
               </w:rPr>
-              <w:t xml:space="preserve">19:00-21:00</w:t>
+              <w:t xml:space="preserve">18:00-20:00</w:t>
             </w:r>
           </w:p>
           <w:p>
@@ -10855,7 +10855,7 @@
                 <w:sz w:val="15"/>
                 <w:szCs w:val="15"/>
               </w:rPr>
-              <w:t xml:space="preserve">19:00-19:30</w:t>
+              <w:t xml:space="preserve">18:00-18:30</w:t>
             </w:r>
           </w:p>
           <w:p>
@@ -10885,7 +10885,7 @@
                 <w:sz w:val="15"/>
                 <w:szCs w:val="15"/>
               </w:rPr>
-              <w:t xml:space="preserve">19:30-20:00</w:t>
+              <w:t xml:space="preserve">18:30-19:00</w:t>
             </w:r>
           </w:p>
           <w:p>
@@ -11080,7 +11080,7 @@
                 <w:sz w:val="15"/>
                 <w:szCs w:val="15"/>
               </w:rPr>
-              <w:t xml:space="preserve">19:00-21:00</w:t>
+              <w:t xml:space="preserve">18:00-20:00</w:t>
             </w:r>
           </w:p>
           <w:p>
@@ -11128,7 +11128,7 @@
                 <w:sz w:val="15"/>
                 <w:szCs w:val="15"/>
               </w:rPr>
-              <w:t xml:space="preserve">19:00-21:30</w:t>
+              <w:t xml:space="preserve">18:00-20:30</w:t>
             </w:r>
           </w:p>
           <w:p>
@@ -11176,7 +11176,7 @@
                 <w:sz w:val="15"/>
                 <w:szCs w:val="15"/>
               </w:rPr>
-              <w:t xml:space="preserve">19:00-21:00</w:t>
+              <w:t xml:space="preserve">18:00-20:00</w:t>
             </w:r>
           </w:p>
           <w:p>
@@ -11206,7 +11206,7 @@
                 <w:sz w:val="15"/>
                 <w:szCs w:val="15"/>
               </w:rPr>
-              <w:t xml:space="preserve">21:00-21:30</w:t>
+              <w:t xml:space="preserve">20:00-20:30</w:t>
             </w:r>
           </w:p>
           <w:p>
@@ -11254,7 +11254,7 @@
                 <w:sz w:val="15"/>
                 <w:szCs w:val="15"/>
               </w:rPr>
-              <w:t xml:space="preserve">19:00-21:00</w:t>
+              <w:t xml:space="preserve">18:00-20:00</w:t>
             </w:r>
           </w:p>
           <w:p>
@@ -11302,7 +11302,7 @@
                 <w:sz w:val="15"/>
                 <w:szCs w:val="15"/>
               </w:rPr>
-              <w:t xml:space="preserve">19:00-19:30</w:t>
+              <w:t xml:space="preserve">18:00-18:30</w:t>
             </w:r>
           </w:p>
           <w:p>
@@ -11332,7 +11332,7 @@
                 <w:sz w:val="15"/>
                 <w:szCs w:val="15"/>
               </w:rPr>
-              <w:t xml:space="preserve">19:30-20:00</w:t>
+              <w:t xml:space="preserve">18:30-19:00</w:t>
             </w:r>
           </w:p>
           <w:p>
@@ -11362,7 +11362,7 @@
                 <w:sz w:val="15"/>
                 <w:szCs w:val="15"/>
               </w:rPr>
-              <w:t xml:space="preserve">20:00-20:30</w:t>
+              <w:t xml:space="preserve">19:00-19:30</w:t>
             </w:r>
           </w:p>
           <w:p>
@@ -11557,7 +11557,7 @@
                 <w:sz w:val="15"/>
                 <w:szCs w:val="15"/>
               </w:rPr>
-              <w:t xml:space="preserve">19:00-21:00</w:t>
+              <w:t xml:space="preserve">18:00-20:00</w:t>
             </w:r>
           </w:p>
           <w:p>
@@ -11605,7 +11605,7 @@
                 <w:sz w:val="15"/>
                 <w:szCs w:val="15"/>
               </w:rPr>
-              <w:t xml:space="preserve">19:00-21:30</w:t>
+              <w:t xml:space="preserve">18:00-20:30</w:t>
             </w:r>
           </w:p>
           <w:p>
@@ -11653,7 +11653,7 @@
                 <w:sz w:val="15"/>
                 <w:szCs w:val="15"/>
               </w:rPr>
-              <w:t xml:space="preserve">19:00-21:00</w:t>
+              <w:t xml:space="preserve">18:00-20:00</w:t>
             </w:r>
           </w:p>
           <w:p>
@@ -11701,7 +11701,7 @@
                 <w:sz w:val="15"/>
                 <w:szCs w:val="15"/>
               </w:rPr>
-              <w:t xml:space="preserve">19:00-21:00</w:t>
+              <w:t xml:space="preserve">18:00-20:00</w:t>
             </w:r>
           </w:p>
           <w:p>
@@ -11749,7 +11749,7 @@
                 <w:sz w:val="15"/>
                 <w:szCs w:val="15"/>
               </w:rPr>
-              <w:t xml:space="preserve">19:00-20:00</w:t>
+              <w:t xml:space="preserve">18:00-19:00</w:t>
             </w:r>
           </w:p>
           <w:p>
@@ -11779,7 +11779,7 @@
                 <w:sz w:val="15"/>
                 <w:szCs w:val="15"/>
               </w:rPr>
-              <w:t xml:space="preserve">20:00-20:30</w:t>
+              <w:t xml:space="preserve">19:00-19:30</w:t>
             </w:r>
           </w:p>
           <w:p>
@@ -12004,7 +12004,7 @@
                 <w:sz w:val="15"/>
                 <w:szCs w:val="15"/>
               </w:rPr>
-              <w:t xml:space="preserve">19:00-21:00</w:t>
+              <w:t xml:space="preserve">18:00-20:00</w:t>
             </w:r>
           </w:p>
           <w:p>
@@ -12052,7 +12052,7 @@
                 <w:sz w:val="15"/>
                 <w:szCs w:val="15"/>
               </w:rPr>
-              <w:t xml:space="preserve">19:00-21:30</w:t>
+              <w:t xml:space="preserve">18:00-20:30</w:t>
             </w:r>
           </w:p>
           <w:p>
@@ -12100,7 +12100,7 @@
                 <w:sz w:val="15"/>
                 <w:szCs w:val="15"/>
               </w:rPr>
-              <w:t xml:space="preserve">19:00-21:00</w:t>
+              <w:t xml:space="preserve">18:00-20:00</w:t>
             </w:r>
           </w:p>
           <w:p>
@@ -12148,7 +12148,7 @@
                 <w:sz w:val="15"/>
                 <w:szCs w:val="15"/>
               </w:rPr>
-              <w:t xml:space="preserve">19:00-21:00</w:t>
+              <w:t xml:space="preserve">18:00-20:00</w:t>
             </w:r>
           </w:p>
           <w:p>
@@ -12196,7 +12196,7 @@
                 <w:sz w:val="15"/>
                 <w:szCs w:val="15"/>
               </w:rPr>
-              <w:t xml:space="preserve">19:00-20:00</w:t>
+              <w:t xml:space="preserve">18:00-19:00</w:t>
             </w:r>
           </w:p>
           <w:p>
@@ -12226,7 +12226,7 @@
                 <w:sz w:val="15"/>
                 <w:szCs w:val="15"/>
               </w:rPr>
-              <w:t xml:space="preserve">20:00-20:30</w:t>
+              <w:t xml:space="preserve">19:00-19:30</w:t>
             </w:r>
           </w:p>
           <w:p>
@@ -12778,7 +12778,7 @@
                 <w:sz w:val="15"/>
                 <w:szCs w:val="15"/>
               </w:rPr>
-              <w:t xml:space="preserve">19:00-20:00</w:t>
+              <w:t xml:space="preserve">18:00-19:00</w:t>
             </w:r>
           </w:p>
           <w:p>
@@ -12808,7 +12808,7 @@
                 <w:sz w:val="15"/>
                 <w:szCs w:val="15"/>
               </w:rPr>
-              <w:t xml:space="preserve">20:00-20:30</w:t>
+              <w:t xml:space="preserve">19:00-19:30</w:t>
             </w:r>
           </w:p>
           <w:p>
@@ -12856,7 +12856,7 @@
                 <w:sz w:val="15"/>
                 <w:szCs w:val="15"/>
               </w:rPr>
-              <w:t xml:space="preserve">19:00-20:00</w:t>
+              <w:t xml:space="preserve">18:00-19:00</w:t>
             </w:r>
           </w:p>
           <w:p>
@@ -12904,7 +12904,7 @@
                 <w:sz w:val="15"/>
                 <w:szCs w:val="15"/>
               </w:rPr>
-              <w:t xml:space="preserve">19:00-20:00</w:t>
+              <w:t xml:space="preserve">18:00-19:00</w:t>
             </w:r>
           </w:p>
           <w:p>
@@ -12952,7 +12952,7 @@
                 <w:sz w:val="15"/>
                 <w:szCs w:val="15"/>
               </w:rPr>
-              <w:t xml:space="preserve">19:00-19:30</w:t>
+              <w:t xml:space="preserve">18:00-18:30</w:t>
             </w:r>
           </w:p>
           <w:p>
@@ -12982,7 +12982,7 @@
                 <w:sz w:val="15"/>
                 <w:szCs w:val="15"/>
               </w:rPr>
-              <w:t xml:space="preserve">19:30-20:00</w:t>
+              <w:t xml:space="preserve">18:30-19:00</w:t>
             </w:r>
           </w:p>
           <w:p>
@@ -13030,7 +13030,7 @@
                 <w:sz w:val="15"/>
                 <w:szCs w:val="15"/>
               </w:rPr>
-              <w:t xml:space="preserve">19:00-20:00</w:t>
+              <w:t xml:space="preserve">18:00-19:00</w:t>
             </w:r>
           </w:p>
           <w:p>
@@ -13225,7 +13225,7 @@
                 <w:sz w:val="15"/>
                 <w:szCs w:val="15"/>
               </w:rPr>
-              <w:t xml:space="preserve">19:00-20:00</w:t>
+              <w:t xml:space="preserve">18:00-19:00</w:t>
             </w:r>
           </w:p>
           <w:p>
@@ -13255,7 +13255,7 @@
                 <w:sz w:val="15"/>
                 <w:szCs w:val="15"/>
               </w:rPr>
-              <w:t xml:space="preserve">20:00-20:30</w:t>
+              <w:t xml:space="preserve">19:00-19:30</w:t>
             </w:r>
           </w:p>
           <w:p>
@@ -13303,7 +13303,7 @@
                 <w:sz w:val="15"/>
                 <w:szCs w:val="15"/>
               </w:rPr>
-              <w:t xml:space="preserve">19:00-20:30</w:t>
+              <w:t xml:space="preserve">18:00-19:30</w:t>
             </w:r>
           </w:p>
           <w:p>
@@ -13351,7 +13351,7 @@
                 <w:sz w:val="15"/>
                 <w:szCs w:val="15"/>
               </w:rPr>
-              <w:t xml:space="preserve">19:00-20:00</w:t>
+              <w:t xml:space="preserve">18:00-19:00</w:t>
             </w:r>
           </w:p>
           <w:p>
@@ -13399,7 +13399,7 @@
                 <w:sz w:val="15"/>
                 <w:szCs w:val="15"/>
               </w:rPr>
-              <w:t xml:space="preserve">19:00-20:00</w:t>
+              <w:t xml:space="preserve">18:00-19:00</w:t>
             </w:r>
           </w:p>
           <w:p>
@@ -13429,7 +13429,7 @@
                 <w:sz w:val="15"/>
                 <w:szCs w:val="15"/>
               </w:rPr>
-              <w:t xml:space="preserve">20:00-20:30</w:t>
+              <w:t xml:space="preserve">19:00-19:30</w:t>
             </w:r>
           </w:p>
           <w:p>
@@ -13477,7 +13477,7 @@
                 <w:sz w:val="15"/>
                 <w:szCs w:val="15"/>
               </w:rPr>
-              <w:t xml:space="preserve">19:00-20:00</w:t>
+              <w:t xml:space="preserve">18:00-19:00</w:t>
             </w:r>
           </w:p>
           <w:p>
@@ -13507,7 +13507,7 @@
                 <w:sz w:val="15"/>
                 <w:szCs w:val="15"/>
               </w:rPr>
-              <w:t xml:space="preserve">20:00-20:30</w:t>
+              <w:t xml:space="preserve">19:00-19:30</w:t>
             </w:r>
           </w:p>
           <w:p>
@@ -13672,7 +13672,7 @@
                 <w:sz w:val="15"/>
                 <w:szCs w:val="15"/>
               </w:rPr>
-              <w:t xml:space="preserve">19:00-20:00</w:t>
+              <w:t xml:space="preserve">18:00-19:00</w:t>
             </w:r>
           </w:p>
           <w:p>
@@ -13702,7 +13702,7 @@
                 <w:sz w:val="15"/>
                 <w:szCs w:val="15"/>
               </w:rPr>
-              <w:t xml:space="preserve">20:00-20:30</w:t>
+              <w:t xml:space="preserve">19:00-19:30</w:t>
             </w:r>
           </w:p>
           <w:p>
@@ -13750,7 +13750,7 @@
                 <w:sz w:val="15"/>
                 <w:szCs w:val="15"/>
               </w:rPr>
-              <w:t xml:space="preserve">19:00-20:00</w:t>
+              <w:t xml:space="preserve">18:00-19:00</w:t>
             </w:r>
           </w:p>
           <w:p>
@@ -13798,7 +13798,7 @@
                 <w:sz w:val="15"/>
                 <w:szCs w:val="15"/>
               </w:rPr>
-              <w:t xml:space="preserve">19:00-20:00</w:t>
+              <w:t xml:space="preserve">18:00-19:00</w:t>
             </w:r>
           </w:p>
           <w:p>
@@ -13846,7 +13846,7 @@
                 <w:sz w:val="15"/>
                 <w:szCs w:val="15"/>
               </w:rPr>
-              <w:t xml:space="preserve">19:00-20:00</w:t>
+              <w:t xml:space="preserve">18:00-19:00</w:t>
             </w:r>
           </w:p>
           <w:p>
@@ -13876,7 +13876,7 @@
                 <w:sz w:val="15"/>
                 <w:szCs w:val="15"/>
               </w:rPr>
-              <w:t xml:space="preserve">20:00-20:30</w:t>
+              <w:t xml:space="preserve">19:00-19:30</w:t>
             </w:r>
           </w:p>
           <w:p>
@@ -13924,7 +13924,7 @@
                 <w:sz w:val="15"/>
                 <w:szCs w:val="15"/>
               </w:rPr>
-              <w:t xml:space="preserve">19:00-19:30</w:t>
+              <w:t xml:space="preserve">18:00-18:30</w:t>
             </w:r>
           </w:p>
           <w:p>
@@ -13954,7 +13954,7 @@
                 <w:sz w:val="15"/>
                 <w:szCs w:val="15"/>
               </w:rPr>
-              <w:t xml:space="preserve">19:30-20:00</w:t>
+              <w:t xml:space="preserve">18:30-19:00</w:t>
             </w:r>
           </w:p>
           <w:p>
@@ -14179,7 +14179,7 @@
                 <w:sz w:val="15"/>
                 <w:szCs w:val="15"/>
               </w:rPr>
-              <w:t xml:space="preserve">19:00-20:00</w:t>
+              <w:t xml:space="preserve">18:00-19:00</w:t>
             </w:r>
           </w:p>
           <w:p>
@@ -14227,7 +14227,7 @@
                 <w:sz w:val="15"/>
                 <w:szCs w:val="15"/>
               </w:rPr>
-              <w:t xml:space="preserve">19:00-20:00</w:t>
+              <w:t xml:space="preserve">18:00-19:00</w:t>
             </w:r>
           </w:p>
           <w:p>
@@ -14275,7 +14275,7 @@
                 <w:sz w:val="15"/>
                 <w:szCs w:val="15"/>
               </w:rPr>
-              <w:t xml:space="preserve">19:00-20:00</w:t>
+              <w:t xml:space="preserve">18:00-19:00</w:t>
             </w:r>
           </w:p>
           <w:p>
@@ -14323,7 +14323,7 @@
                 <w:sz w:val="15"/>
                 <w:szCs w:val="15"/>
               </w:rPr>
-              <w:t xml:space="preserve">19:00-20:00</w:t>
+              <w:t xml:space="preserve">18:00-19:00</w:t>
             </w:r>
           </w:p>
           <w:p>
@@ -14353,7 +14353,7 @@
                 <w:sz w:val="15"/>
                 <w:szCs w:val="15"/>
               </w:rPr>
-              <w:t xml:space="preserve">20:00-20:30</w:t>
+              <w:t xml:space="preserve">19:00-19:30</w:t>
             </w:r>
           </w:p>
           <w:p>
@@ -14401,7 +14401,7 @@
                 <w:sz w:val="15"/>
                 <w:szCs w:val="15"/>
               </w:rPr>
-              <w:t xml:space="preserve">19:00-19:30</w:t>
+              <w:t xml:space="preserve">18:00-18:30</w:t>
             </w:r>
           </w:p>
           <w:p>
@@ -14431,7 +14431,7 @@
                 <w:sz w:val="15"/>
                 <w:szCs w:val="15"/>
               </w:rPr>
-              <w:t xml:space="preserve">19:30-20:00</w:t>
+              <w:t xml:space="preserve">18:30-19:00</w:t>
             </w:r>
           </w:p>
           <w:p>
@@ -14656,7 +14656,7 @@
                 <w:sz w:val="15"/>
                 <w:szCs w:val="15"/>
               </w:rPr>
-              <w:t xml:space="preserve">19:00-20:00</w:t>
+              <w:t xml:space="preserve">18:00-19:00</w:t>
             </w:r>
           </w:p>
           <w:p>
@@ -14704,7 +14704,7 @@
                 <w:sz w:val="15"/>
                 <w:szCs w:val="15"/>
               </w:rPr>
-              <w:t xml:space="preserve">19:00-20:00</w:t>
+              <w:t xml:space="preserve">18:00-19:00</w:t>
             </w:r>
           </w:p>
           <w:p>
@@ -14752,7 +14752,7 @@
                 <w:sz w:val="15"/>
                 <w:szCs w:val="15"/>
               </w:rPr>
-              <w:t xml:space="preserve">19:00-20:00</w:t>
+              <w:t xml:space="preserve">18:00-19:00</w:t>
             </w:r>
           </w:p>
           <w:p>
@@ -14800,7 +14800,7 @@
                 <w:sz w:val="15"/>
                 <w:szCs w:val="15"/>
               </w:rPr>
-              <w:t xml:space="preserve">19:00-20:00</w:t>
+              <w:t xml:space="preserve">18:00-19:00</w:t>
             </w:r>
           </w:p>
           <w:p>
@@ -14830,7 +14830,7 @@
                 <w:sz w:val="15"/>
                 <w:szCs w:val="15"/>
               </w:rPr>
-              <w:t xml:space="preserve">20:00-20:30</w:t>
+              <w:t xml:space="preserve">19:00-19:30</w:t>
             </w:r>
           </w:p>
           <w:p>
@@ -14878,7 +14878,7 @@
                 <w:sz w:val="15"/>
                 <w:szCs w:val="15"/>
               </w:rPr>
-              <w:t xml:space="preserve">19:00-20:00</w:t>
+              <w:t xml:space="preserve">18:00-19:00</w:t>
             </w:r>
           </w:p>
           <w:p>

</xml_diff>

<commit_message>
Ajoute la page « ma semaine en un coup d'oeil »
Co-Authored-By: Claude Sonnet 5.5 <noreply@anthropic.com>
Claude-Session: https://claude.ai/code/session_01PLMe4ge9F6B5wJA3dMBx9D
</commit_message>
<xml_diff>
--- a/05-Plan-Carriere/Plan-carriere-Red-Team-2026-2028.docx
+++ b/05-Plan-Carriere/Plan-carriere-Red-Team-2026-2028.docx
@@ -260,7 +260,7 @@
           <w:i w:val="false"/>
           <w:iCs w:val="false"/>
         </w:rPr>
-        <w:t xml:space="preserve"> Le livrable est un document Word au format A4. Une version PDF générée à partir du même fichier est fournie à côté pour la lecture. Le document contient cinq figures (calendrier de référence, semaine type, semaine jour par jour, réalisme et durée des labs, capacité de lab), un planning mensuel en cartes et un tableau de couverture des formations.</w:t>
+        <w:t xml:space="preserve"> Le livrable est un document Word au format A4. Une version PDF générée à partir du même fichier est fournie à côté pour la lecture. Le document contient cinq figures (calendrier de référence, semaine type, semaine jour par jour, réalisme et durée des labs, capacité de lab), un planning mensuel en cartes, une page « ma semaine en un coup d'œil » et un tableau de couverture des formations.</w:t>
       </w:r>
     </w:p>
     <w:p>
@@ -2948,6 +2948,2912 @@
         </w:tc>
       </w:tr>
     </w:tbl>
+    <w:p>
+      <w:pPr>
+        <w:pStyle w:val="Heading1"/>
+        <w:pageBreakBefore/>
+      </w:pPr>
+      <w:r>
+        <w:rPr>
+          <w:rFonts w:ascii="Calibri" w:cs="Calibri" w:eastAsia="Calibri" w:hAnsi="Calibri"/>
+        </w:rPr>
+        <w:t xml:space="preserve">Ma semaine en un coup d'œil</w:t>
+      </w:r>
+    </w:p>
+    <w:p>
+      <w:pPr>
+        <w:keepNext/>
+        <w:spacing w:after="120" w:before="0" w:line="276"/>
+        <w:jc w:val="both"/>
+      </w:pPr>
+      <w:r>
+        <w:rPr>
+          <w:rFonts w:ascii="Calibri" w:cs="Calibri" w:eastAsia="Calibri" w:hAnsi="Calibri"/>
+          <w:b w:val="false"/>
+          <w:bCs w:val="false"/>
+          <w:i w:val="false"/>
+          <w:iCs w:val="false"/>
+        </w:rPr>
+        <w:t xml:space="preserve"/>
+      </w:r>
+      <w:r>
+        <w:rPr>
+          <w:rFonts w:ascii="Calibri" w:cs="Calibri" w:eastAsia="Calibri" w:hAnsi="Calibri"/>
+          <w:b/>
+          <w:bCs/>
+          <w:i w:val="false"/>
+          <w:iCs w:val="false"/>
+        </w:rPr>
+        <w:t xml:space="preserve">Cette phase (du 14 octobre à mi-décembre 2026).</w:t>
+      </w:r>
+      <w:r>
+        <w:rPr>
+          <w:rFonts w:ascii="Calibri" w:cs="Calibri" w:eastAsia="Calibri" w:hAnsi="Calibri"/>
+          <w:b w:val="false"/>
+          <w:bCs w:val="false"/>
+          <w:i w:val="false"/>
+          <w:iCs w:val="false"/>
+        </w:rPr>
+        <w:t xml:space="preserve"> Une case par jour : le créneau puis l'activité. La couleur indique l'activité dominante de la journée : bleu pour la formation principale, orange pour le lab, vert pour la programmation, jaune pour le reverse engineering et la rédaction, rose pour l'école et la revue. Créneaux calés sur tes horaires (18 h à 21 h au plus tard en semaine).</w:t>
+      </w:r>
+    </w:p>
+    <w:tbl>
+      <w:tblPr>
+        <w:tblW w:type="dxa" w:w="14570"/>
+        <w:tblBorders>
+          <w:top w:val="single" w:color="auto" w:sz="4"/>
+          <w:left w:val="single" w:color="auto" w:sz="4"/>
+          <w:bottom w:val="single" w:color="auto" w:sz="4"/>
+          <w:right w:val="single" w:color="auto" w:sz="4"/>
+          <w:insideH w:val="single" w:color="auto" w:sz="4"/>
+          <w:insideV w:val="single" w:color="auto" w:sz="4"/>
+        </w:tblBorders>
+      </w:tblPr>
+      <w:tblGrid>
+        <w:gridCol w:w="1900"/>
+        <w:gridCol w:w="1810"/>
+        <w:gridCol w:w="1810"/>
+        <w:gridCol w:w="1810"/>
+        <w:gridCol w:w="1810"/>
+        <w:gridCol w:w="1810"/>
+        <w:gridCol w:w="1810"/>
+        <w:gridCol w:w="1810"/>
+      </w:tblGrid>
+      <w:tr>
+        <w:trPr>
+          <w:tblHeader/>
+        </w:trPr>
+        <w:tc>
+          <w:tcPr>
+            <w:tcW w:type="dxa" w:w="1900"/>
+            <w:tcBorders>
+              <w:top w:val="single" w:color="B7C3D0" w:sz="4"/>
+              <w:left w:val="single" w:color="B7C3D0" w:sz="4"/>
+              <w:bottom w:val="single" w:color="B7C3D0" w:sz="4"/>
+              <w:right w:val="single" w:color="B7C3D0" w:sz="4"/>
+            </w:tcBorders>
+            <w:shd w:fill="1F3A5F" w:color="auto" w:val="clear"/>
+            <w:tcMar>
+              <w:top w:type="dxa" w:w="50"/>
+              <w:left w:type="dxa" w:w="70"/>
+              <w:bottom w:type="dxa" w:w="50"/>
+              <w:right w:type="dxa" w:w="70"/>
+            </w:tcMar>
+          </w:tcPr>
+          <w:p>
+            <w:pPr>
+              <w:spacing w:after="20"/>
+              <w:jc w:val="left"/>
+            </w:pPr>
+            <w:r>
+              <w:rPr>
+                <w:rFonts w:ascii="Calibri" w:cs="Calibri" w:eastAsia="Calibri" w:hAnsi="Calibri"/>
+                <w:b/>
+                <w:bCs/>
+                <w:color w:val="FFFFFF"/>
+                <w:sz w:val="16"/>
+                <w:szCs w:val="16"/>
+              </w:rPr>
+              <w:t xml:space="preserve"/>
+            </w:r>
+          </w:p>
+        </w:tc>
+        <w:tc>
+          <w:tcPr>
+            <w:tcW w:type="dxa" w:w="1810"/>
+            <w:tcBorders>
+              <w:top w:val="single" w:color="B7C3D0" w:sz="4"/>
+              <w:left w:val="single" w:color="B7C3D0" w:sz="4"/>
+              <w:bottom w:val="single" w:color="B7C3D0" w:sz="4"/>
+              <w:right w:val="single" w:color="B7C3D0" w:sz="4"/>
+            </w:tcBorders>
+            <w:shd w:fill="1F3A5F" w:color="auto" w:val="clear"/>
+            <w:tcMar>
+              <w:top w:type="dxa" w:w="50"/>
+              <w:left w:type="dxa" w:w="70"/>
+              <w:bottom w:type="dxa" w:w="50"/>
+              <w:right w:type="dxa" w:w="70"/>
+            </w:tcMar>
+          </w:tcPr>
+          <w:p>
+            <w:pPr>
+              <w:spacing w:after="20"/>
+              <w:jc w:val="left"/>
+            </w:pPr>
+            <w:r>
+              <w:rPr>
+                <w:rFonts w:ascii="Calibri" w:cs="Calibri" w:eastAsia="Calibri" w:hAnsi="Calibri"/>
+                <w:b/>
+                <w:bCs/>
+                <w:color w:val="FFFFFF"/>
+                <w:sz w:val="16"/>
+                <w:szCs w:val="16"/>
+              </w:rPr>
+              <w:t xml:space="preserve">Lun</w:t>
+            </w:r>
+          </w:p>
+        </w:tc>
+        <w:tc>
+          <w:tcPr>
+            <w:tcW w:type="dxa" w:w="1810"/>
+            <w:tcBorders>
+              <w:top w:val="single" w:color="B7C3D0" w:sz="4"/>
+              <w:left w:val="single" w:color="B7C3D0" w:sz="4"/>
+              <w:bottom w:val="single" w:color="B7C3D0" w:sz="4"/>
+              <w:right w:val="single" w:color="B7C3D0" w:sz="4"/>
+            </w:tcBorders>
+            <w:shd w:fill="1F3A5F" w:color="auto" w:val="clear"/>
+            <w:tcMar>
+              <w:top w:type="dxa" w:w="50"/>
+              <w:left w:type="dxa" w:w="70"/>
+              <w:bottom w:type="dxa" w:w="50"/>
+              <w:right w:type="dxa" w:w="70"/>
+            </w:tcMar>
+          </w:tcPr>
+          <w:p>
+            <w:pPr>
+              <w:spacing w:after="20"/>
+              <w:jc w:val="left"/>
+            </w:pPr>
+            <w:r>
+              <w:rPr>
+                <w:rFonts w:ascii="Calibri" w:cs="Calibri" w:eastAsia="Calibri" w:hAnsi="Calibri"/>
+                <w:b/>
+                <w:bCs/>
+                <w:color w:val="FFFFFF"/>
+                <w:sz w:val="16"/>
+                <w:szCs w:val="16"/>
+              </w:rPr>
+              <w:t xml:space="preserve">Mar</w:t>
+            </w:r>
+          </w:p>
+        </w:tc>
+        <w:tc>
+          <w:tcPr>
+            <w:tcW w:type="dxa" w:w="1810"/>
+            <w:tcBorders>
+              <w:top w:val="single" w:color="B7C3D0" w:sz="4"/>
+              <w:left w:val="single" w:color="B7C3D0" w:sz="4"/>
+              <w:bottom w:val="single" w:color="B7C3D0" w:sz="4"/>
+              <w:right w:val="single" w:color="B7C3D0" w:sz="4"/>
+            </w:tcBorders>
+            <w:shd w:fill="1F3A5F" w:color="auto" w:val="clear"/>
+            <w:tcMar>
+              <w:top w:type="dxa" w:w="50"/>
+              <w:left w:type="dxa" w:w="70"/>
+              <w:bottom w:type="dxa" w:w="50"/>
+              <w:right w:type="dxa" w:w="70"/>
+            </w:tcMar>
+          </w:tcPr>
+          <w:p>
+            <w:pPr>
+              <w:spacing w:after="20"/>
+              <w:jc w:val="left"/>
+            </w:pPr>
+            <w:r>
+              <w:rPr>
+                <w:rFonts w:ascii="Calibri" w:cs="Calibri" w:eastAsia="Calibri" w:hAnsi="Calibri"/>
+                <w:b/>
+                <w:bCs/>
+                <w:color w:val="FFFFFF"/>
+                <w:sz w:val="16"/>
+                <w:szCs w:val="16"/>
+              </w:rPr>
+              <w:t xml:space="preserve">Mer</w:t>
+            </w:r>
+          </w:p>
+        </w:tc>
+        <w:tc>
+          <w:tcPr>
+            <w:tcW w:type="dxa" w:w="1810"/>
+            <w:tcBorders>
+              <w:top w:val="single" w:color="B7C3D0" w:sz="4"/>
+              <w:left w:val="single" w:color="B7C3D0" w:sz="4"/>
+              <w:bottom w:val="single" w:color="B7C3D0" w:sz="4"/>
+              <w:right w:val="single" w:color="B7C3D0" w:sz="4"/>
+            </w:tcBorders>
+            <w:shd w:fill="1F3A5F" w:color="auto" w:val="clear"/>
+            <w:tcMar>
+              <w:top w:type="dxa" w:w="50"/>
+              <w:left w:type="dxa" w:w="70"/>
+              <w:bottom w:type="dxa" w:w="50"/>
+              <w:right w:type="dxa" w:w="70"/>
+            </w:tcMar>
+          </w:tcPr>
+          <w:p>
+            <w:pPr>
+              <w:spacing w:after="20"/>
+              <w:jc w:val="left"/>
+            </w:pPr>
+            <w:r>
+              <w:rPr>
+                <w:rFonts w:ascii="Calibri" w:cs="Calibri" w:eastAsia="Calibri" w:hAnsi="Calibri"/>
+                <w:b/>
+                <w:bCs/>
+                <w:color w:val="FFFFFF"/>
+                <w:sz w:val="16"/>
+                <w:szCs w:val="16"/>
+              </w:rPr>
+              <w:t xml:space="preserve">Jeu</w:t>
+            </w:r>
+          </w:p>
+        </w:tc>
+        <w:tc>
+          <w:tcPr>
+            <w:tcW w:type="dxa" w:w="1810"/>
+            <w:tcBorders>
+              <w:top w:val="single" w:color="B7C3D0" w:sz="4"/>
+              <w:left w:val="single" w:color="B7C3D0" w:sz="4"/>
+              <w:bottom w:val="single" w:color="B7C3D0" w:sz="4"/>
+              <w:right w:val="single" w:color="B7C3D0" w:sz="4"/>
+            </w:tcBorders>
+            <w:shd w:fill="1F3A5F" w:color="auto" w:val="clear"/>
+            <w:tcMar>
+              <w:top w:type="dxa" w:w="50"/>
+              <w:left w:type="dxa" w:w="70"/>
+              <w:bottom w:type="dxa" w:w="50"/>
+              <w:right w:type="dxa" w:w="70"/>
+            </w:tcMar>
+          </w:tcPr>
+          <w:p>
+            <w:pPr>
+              <w:spacing w:after="20"/>
+              <w:jc w:val="left"/>
+            </w:pPr>
+            <w:r>
+              <w:rPr>
+                <w:rFonts w:ascii="Calibri" w:cs="Calibri" w:eastAsia="Calibri" w:hAnsi="Calibri"/>
+                <w:b/>
+                <w:bCs/>
+                <w:color w:val="FFFFFF"/>
+                <w:sz w:val="16"/>
+                <w:szCs w:val="16"/>
+              </w:rPr>
+              <w:t xml:space="preserve">Ven</w:t>
+            </w:r>
+          </w:p>
+        </w:tc>
+        <w:tc>
+          <w:tcPr>
+            <w:tcW w:type="dxa" w:w="1810"/>
+            <w:tcBorders>
+              <w:top w:val="single" w:color="B7C3D0" w:sz="4"/>
+              <w:left w:val="single" w:color="B7C3D0" w:sz="4"/>
+              <w:bottom w:val="single" w:color="B7C3D0" w:sz="4"/>
+              <w:right w:val="single" w:color="B7C3D0" w:sz="4"/>
+            </w:tcBorders>
+            <w:shd w:fill="1F3A5F" w:color="auto" w:val="clear"/>
+            <w:tcMar>
+              <w:top w:type="dxa" w:w="50"/>
+              <w:left w:type="dxa" w:w="70"/>
+              <w:bottom w:type="dxa" w:w="50"/>
+              <w:right w:type="dxa" w:w="70"/>
+            </w:tcMar>
+          </w:tcPr>
+          <w:p>
+            <w:pPr>
+              <w:spacing w:after="20"/>
+              <w:jc w:val="left"/>
+            </w:pPr>
+            <w:r>
+              <w:rPr>
+                <w:rFonts w:ascii="Calibri" w:cs="Calibri" w:eastAsia="Calibri" w:hAnsi="Calibri"/>
+                <w:b/>
+                <w:bCs/>
+                <w:color w:val="FFFFFF"/>
+                <w:sz w:val="16"/>
+                <w:szCs w:val="16"/>
+              </w:rPr>
+              <w:t xml:space="preserve">Sam</w:t>
+            </w:r>
+          </w:p>
+        </w:tc>
+        <w:tc>
+          <w:tcPr>
+            <w:tcW w:type="dxa" w:w="1810"/>
+            <w:tcBorders>
+              <w:top w:val="single" w:color="B7C3D0" w:sz="4"/>
+              <w:left w:val="single" w:color="B7C3D0" w:sz="4"/>
+              <w:bottom w:val="single" w:color="B7C3D0" w:sz="4"/>
+              <w:right w:val="single" w:color="B7C3D0" w:sz="4"/>
+            </w:tcBorders>
+            <w:shd w:fill="1F3A5F" w:color="auto" w:val="clear"/>
+            <w:tcMar>
+              <w:top w:type="dxa" w:w="50"/>
+              <w:left w:type="dxa" w:w="70"/>
+              <w:bottom w:type="dxa" w:w="50"/>
+              <w:right w:type="dxa" w:w="70"/>
+            </w:tcMar>
+          </w:tcPr>
+          <w:p>
+            <w:pPr>
+              <w:spacing w:after="20"/>
+              <w:jc w:val="left"/>
+            </w:pPr>
+            <w:r>
+              <w:rPr>
+                <w:rFonts w:ascii="Calibri" w:cs="Calibri" w:eastAsia="Calibri" w:hAnsi="Calibri"/>
+                <w:b/>
+                <w:bCs/>
+                <w:color w:val="FFFFFF"/>
+                <w:sz w:val="16"/>
+                <w:szCs w:val="16"/>
+              </w:rPr>
+              <w:t xml:space="preserve">Dim</w:t>
+            </w:r>
+          </w:p>
+        </w:tc>
+      </w:tr>
+      <w:tr>
+        <w:trPr>
+          <w:cantSplit/>
+        </w:trPr>
+        <w:tc>
+          <w:tcPr>
+            <w:tcW w:type="dxa" w:w="1900"/>
+            <w:tcBorders>
+              <w:top w:val="single" w:color="B7C3D0" w:sz="4"/>
+              <w:left w:val="single" w:color="B7C3D0" w:sz="4"/>
+              <w:bottom w:val="single" w:color="B7C3D0" w:sz="4"/>
+              <w:right w:val="single" w:color="B7C3D0" w:sz="4"/>
+            </w:tcBorders>
+            <w:shd w:fill="EEF2F7" w:color="auto" w:val="clear"/>
+            <w:tcMar>
+              <w:top w:type="dxa" w:w="50"/>
+              <w:left w:type="dxa" w:w="70"/>
+              <w:bottom w:type="dxa" w:w="50"/>
+              <w:right w:type="dxa" w:w="70"/>
+            </w:tcMar>
+          </w:tcPr>
+          <w:p>
+            <w:pPr>
+              <w:spacing w:after="20"/>
+              <w:jc w:val="left"/>
+            </w:pPr>
+            <w:r>
+              <w:rPr>
+                <w:rFonts w:ascii="Calibri" w:cs="Calibri" w:eastAsia="Calibri" w:hAnsi="Calibri"/>
+                <w:b/>
+                <w:bCs/>
+                <w:color w:val="000000"/>
+                <w:sz w:val="16"/>
+                <w:szCs w:val="16"/>
+              </w:rPr>
+              <w:t xml:space="preserve">Semaine d'entreprise (15 h)</w:t>
+            </w:r>
+          </w:p>
+        </w:tc>
+        <w:tc>
+          <w:tcPr>
+            <w:tcW w:type="dxa" w:w="1810"/>
+            <w:tcBorders>
+              <w:top w:val="single" w:color="B7C3D0" w:sz="4"/>
+              <w:left w:val="single" w:color="B7C3D0" w:sz="4"/>
+              <w:bottom w:val="single" w:color="B7C3D0" w:sz="4"/>
+              <w:right w:val="single" w:color="B7C3D0" w:sz="4"/>
+            </w:tcBorders>
+            <w:shd w:fill="DCEAFB" w:color="auto" w:val="clear"/>
+            <w:tcMar>
+              <w:top w:type="dxa" w:w="70"/>
+              <w:left w:type="dxa" w:w="90"/>
+              <w:bottom w:type="dxa" w:w="50"/>
+              <w:right w:type="dxa" w:w="70"/>
+            </w:tcMar>
+            <w:vAlign w:val="top"/>
+          </w:tcPr>
+          <w:p>
+            <w:pPr>
+              <w:keepNext/>
+              <w:spacing w:after="0"/>
+            </w:pPr>
+            <w:r>
+              <w:rPr>
+                <w:rFonts w:ascii="Calibri" w:cs="Calibri" w:eastAsia="Calibri" w:hAnsi="Calibri"/>
+                <w:b/>
+                <w:bCs/>
+                <w:color w:val="1F3A5F"/>
+                <w:sz w:val="17"/>
+                <w:szCs w:val="17"/>
+              </w:rPr>
+              <w:t xml:space="preserve">18:00-20:00</w:t>
+            </w:r>
+          </w:p>
+          <w:p>
+            <w:pPr>
+              <w:spacing w:after="70"/>
+            </w:pPr>
+            <w:r>
+              <w:rPr>
+                <w:rFonts w:ascii="Calibri" w:cs="Calibri" w:eastAsia="Calibri" w:hAnsi="Calibri"/>
+                <w:sz w:val="19"/>
+                <w:szCs w:val="19"/>
+              </w:rPr>
+              <w:t xml:space="preserve">BSCP (2 h)</w:t>
+            </w:r>
+          </w:p>
+        </w:tc>
+        <w:tc>
+          <w:tcPr>
+            <w:tcW w:type="dxa" w:w="1810"/>
+            <w:tcBorders>
+              <w:top w:val="single" w:color="B7C3D0" w:sz="4"/>
+              <w:left w:val="single" w:color="B7C3D0" w:sz="4"/>
+              <w:bottom w:val="single" w:color="B7C3D0" w:sz="4"/>
+              <w:right w:val="single" w:color="B7C3D0" w:sz="4"/>
+            </w:tcBorders>
+            <w:shd w:fill="FBE0D5" w:color="auto" w:val="clear"/>
+            <w:tcMar>
+              <w:top w:type="dxa" w:w="70"/>
+              <w:left w:type="dxa" w:w="90"/>
+              <w:bottom w:type="dxa" w:w="50"/>
+              <w:right w:type="dxa" w:w="70"/>
+            </w:tcMar>
+            <w:vAlign w:val="top"/>
+          </w:tcPr>
+          <w:p>
+            <w:pPr>
+              <w:keepNext/>
+              <w:spacing w:after="0"/>
+            </w:pPr>
+            <w:r>
+              <w:rPr>
+                <w:rFonts w:ascii="Calibri" w:cs="Calibri" w:eastAsia="Calibri" w:hAnsi="Calibri"/>
+                <w:b/>
+                <w:bCs/>
+                <w:color w:val="1F3A5F"/>
+                <w:sz w:val="17"/>
+                <w:szCs w:val="17"/>
+              </w:rPr>
+              <w:t xml:space="preserve">18:00-20:30</w:t>
+            </w:r>
+          </w:p>
+          <w:p>
+            <w:pPr>
+              <w:spacing w:after="70"/>
+            </w:pPr>
+            <w:r>
+              <w:rPr>
+                <w:rFonts w:ascii="Calibri" w:cs="Calibri" w:eastAsia="Calibri" w:hAnsi="Calibri"/>
+                <w:sz w:val="19"/>
+                <w:szCs w:val="19"/>
+              </w:rPr>
+              <w:t xml:space="preserve">Lab (2 h 30)</w:t>
+            </w:r>
+          </w:p>
+        </w:tc>
+        <w:tc>
+          <w:tcPr>
+            <w:tcW w:type="dxa" w:w="1810"/>
+            <w:tcBorders>
+              <w:top w:val="single" w:color="B7C3D0" w:sz="4"/>
+              <w:left w:val="single" w:color="B7C3D0" w:sz="4"/>
+              <w:bottom w:val="single" w:color="B7C3D0" w:sz="4"/>
+              <w:right w:val="single" w:color="B7C3D0" w:sz="4"/>
+            </w:tcBorders>
+            <w:shd w:fill="D5F0E6" w:color="auto" w:val="clear"/>
+            <w:tcMar>
+              <w:top w:type="dxa" w:w="70"/>
+              <w:left w:type="dxa" w:w="90"/>
+              <w:bottom w:type="dxa" w:w="50"/>
+              <w:right w:type="dxa" w:w="70"/>
+            </w:tcMar>
+            <w:vAlign w:val="top"/>
+          </w:tcPr>
+          <w:p>
+            <w:pPr>
+              <w:keepNext/>
+              <w:spacing w:after="0"/>
+            </w:pPr>
+            <w:r>
+              <w:rPr>
+                <w:rFonts w:ascii="Calibri" w:cs="Calibri" w:eastAsia="Calibri" w:hAnsi="Calibri"/>
+                <w:b/>
+                <w:bCs/>
+                <w:color w:val="1F3A5F"/>
+                <w:sz w:val="17"/>
+                <w:szCs w:val="17"/>
+              </w:rPr>
+              <w:t xml:space="preserve">18:00-19:30</w:t>
+            </w:r>
+          </w:p>
+          <w:p>
+            <w:pPr>
+              <w:spacing w:after="70"/>
+            </w:pPr>
+            <w:r>
+              <w:rPr>
+                <w:rFonts w:ascii="Calibri" w:cs="Calibri" w:eastAsia="Calibri" w:hAnsi="Calibri"/>
+                <w:sz w:val="19"/>
+                <w:szCs w:val="19"/>
+              </w:rPr>
+              <w:t xml:space="preserve">C, Sektor7 (1 h 30)</w:t>
+            </w:r>
+          </w:p>
+          <w:p>
+            <w:pPr>
+              <w:keepNext/>
+              <w:spacing w:after="0"/>
+            </w:pPr>
+            <w:r>
+              <w:rPr>
+                <w:rFonts w:ascii="Calibri" w:cs="Calibri" w:eastAsia="Calibri" w:hAnsi="Calibri"/>
+                <w:b/>
+                <w:bCs/>
+                <w:color w:val="1F3A5F"/>
+                <w:sz w:val="17"/>
+                <w:szCs w:val="17"/>
+              </w:rPr>
+              <w:t xml:space="preserve">19:30-20:00</w:t>
+            </w:r>
+          </w:p>
+          <w:p>
+            <w:pPr>
+              <w:spacing w:after="70"/>
+            </w:pPr>
+            <w:r>
+              <w:rPr>
+                <w:rFonts w:ascii="Calibri" w:cs="Calibri" w:eastAsia="Calibri" w:hAnsi="Calibri"/>
+                <w:sz w:val="19"/>
+                <w:szCs w:val="19"/>
+              </w:rPr>
+              <w:t xml:space="preserve">École (30 min)</w:t>
+            </w:r>
+          </w:p>
+        </w:tc>
+        <w:tc>
+          <w:tcPr>
+            <w:tcW w:type="dxa" w:w="1810"/>
+            <w:tcBorders>
+              <w:top w:val="single" w:color="B7C3D0" w:sz="4"/>
+              <w:left w:val="single" w:color="B7C3D0" w:sz="4"/>
+              <w:bottom w:val="single" w:color="B7C3D0" w:sz="4"/>
+              <w:right w:val="single" w:color="B7C3D0" w:sz="4"/>
+            </w:tcBorders>
+            <w:shd w:fill="DCEAFB" w:color="auto" w:val="clear"/>
+            <w:tcMar>
+              <w:top w:type="dxa" w:w="70"/>
+              <w:left w:type="dxa" w:w="90"/>
+              <w:bottom w:type="dxa" w:w="50"/>
+              <w:right w:type="dxa" w:w="70"/>
+            </w:tcMar>
+            <w:vAlign w:val="top"/>
+          </w:tcPr>
+          <w:p>
+            <w:pPr>
+              <w:keepNext/>
+              <w:spacing w:after="0"/>
+            </w:pPr>
+            <w:r>
+              <w:rPr>
+                <w:rFonts w:ascii="Calibri" w:cs="Calibri" w:eastAsia="Calibri" w:hAnsi="Calibri"/>
+                <w:b/>
+                <w:bCs/>
+                <w:color w:val="1F3A5F"/>
+                <w:sz w:val="17"/>
+                <w:szCs w:val="17"/>
+              </w:rPr>
+              <w:t xml:space="preserve">18:00-20:00</w:t>
+            </w:r>
+          </w:p>
+          <w:p>
+            <w:pPr>
+              <w:spacing w:after="70"/>
+            </w:pPr>
+            <w:r>
+              <w:rPr>
+                <w:rFonts w:ascii="Calibri" w:cs="Calibri" w:eastAsia="Calibri" w:hAnsi="Calibri"/>
+                <w:sz w:val="19"/>
+                <w:szCs w:val="19"/>
+              </w:rPr>
+              <w:t xml:space="preserve">BSCP (2 h)</w:t>
+            </w:r>
+          </w:p>
+        </w:tc>
+        <w:tc>
+          <w:tcPr>
+            <w:tcW w:type="dxa" w:w="1810"/>
+            <w:tcBorders>
+              <w:top w:val="single" w:color="B7C3D0" w:sz="4"/>
+              <w:left w:val="single" w:color="B7C3D0" w:sz="4"/>
+              <w:bottom w:val="single" w:color="B7C3D0" w:sz="4"/>
+              <w:right w:val="single" w:color="B7C3D0" w:sz="4"/>
+            </w:tcBorders>
+            <w:shd w:fill="F6D5E2" w:color="auto" w:val="clear"/>
+            <w:tcMar>
+              <w:top w:type="dxa" w:w="70"/>
+              <w:left w:type="dxa" w:w="90"/>
+              <w:bottom w:type="dxa" w:w="50"/>
+              <w:right w:type="dxa" w:w="70"/>
+            </w:tcMar>
+            <w:vAlign w:val="top"/>
+          </w:tcPr>
+          <w:p>
+            <w:pPr>
+              <w:keepNext/>
+              <w:spacing w:after="0"/>
+            </w:pPr>
+            <w:r>
+              <w:rPr>
+                <w:rFonts w:ascii="Calibri" w:cs="Calibri" w:eastAsia="Calibri" w:hAnsi="Calibri"/>
+                <w:b/>
+                <w:bCs/>
+                <w:color w:val="1F3A5F"/>
+                <w:sz w:val="17"/>
+                <w:szCs w:val="17"/>
+              </w:rPr>
+              <w:t xml:space="preserve">18:00-18:30</w:t>
+            </w:r>
+          </w:p>
+          <w:p>
+            <w:pPr>
+              <w:spacing w:after="70"/>
+            </w:pPr>
+            <w:r>
+              <w:rPr>
+                <w:rFonts w:ascii="Calibri" w:cs="Calibri" w:eastAsia="Calibri" w:hAnsi="Calibri"/>
+                <w:sz w:val="19"/>
+                <w:szCs w:val="19"/>
+              </w:rPr>
+              <w:t xml:space="preserve">École (30 min)</w:t>
+            </w:r>
+          </w:p>
+          <w:p>
+            <w:pPr>
+              <w:keepNext/>
+              <w:spacing w:after="0"/>
+            </w:pPr>
+            <w:r>
+              <w:rPr>
+                <w:rFonts w:ascii="Calibri" w:cs="Calibri" w:eastAsia="Calibri" w:hAnsi="Calibri"/>
+                <w:b/>
+                <w:bCs/>
+                <w:color w:val="1F3A5F"/>
+                <w:sz w:val="17"/>
+                <w:szCs w:val="17"/>
+              </w:rPr>
+              <w:t xml:space="preserve">18:30-19:00</w:t>
+            </w:r>
+          </w:p>
+          <w:p>
+            <w:pPr>
+              <w:spacing w:after="70"/>
+            </w:pPr>
+            <w:r>
+              <w:rPr>
+                <w:rFonts w:ascii="Calibri" w:cs="Calibri" w:eastAsia="Calibri" w:hAnsi="Calibri"/>
+                <w:sz w:val="19"/>
+                <w:szCs w:val="19"/>
+              </w:rPr>
+              <w:t xml:space="preserve">Revue (30 min)</w:t>
+            </w:r>
+          </w:p>
+        </w:tc>
+        <w:tc>
+          <w:tcPr>
+            <w:tcW w:type="dxa" w:w="1810"/>
+            <w:tcBorders>
+              <w:top w:val="single" w:color="B7C3D0" w:sz="4"/>
+              <w:left w:val="single" w:color="B7C3D0" w:sz="4"/>
+              <w:bottom w:val="single" w:color="B7C3D0" w:sz="4"/>
+              <w:right w:val="single" w:color="B7C3D0" w:sz="4"/>
+            </w:tcBorders>
+            <w:shd w:fill="FBE0D5" w:color="auto" w:val="clear"/>
+            <w:tcMar>
+              <w:top w:type="dxa" w:w="70"/>
+              <w:left w:type="dxa" w:w="90"/>
+              <w:bottom w:type="dxa" w:w="50"/>
+              <w:right w:type="dxa" w:w="70"/>
+            </w:tcMar>
+            <w:vAlign w:val="top"/>
+          </w:tcPr>
+          <w:p>
+            <w:pPr>
+              <w:keepNext/>
+              <w:spacing w:after="0"/>
+            </w:pPr>
+            <w:r>
+              <w:rPr>
+                <w:rFonts w:ascii="Calibri" w:cs="Calibri" w:eastAsia="Calibri" w:hAnsi="Calibri"/>
+                <w:b/>
+                <w:bCs/>
+                <w:color w:val="1F3A5F"/>
+                <w:sz w:val="17"/>
+                <w:szCs w:val="17"/>
+              </w:rPr>
+              <w:t xml:space="preserve">09:00-11:00</w:t>
+            </w:r>
+          </w:p>
+          <w:p>
+            <w:pPr>
+              <w:spacing w:after="70"/>
+            </w:pPr>
+            <w:r>
+              <w:rPr>
+                <w:rFonts w:ascii="Calibri" w:cs="Calibri" w:eastAsia="Calibri" w:hAnsi="Calibri"/>
+                <w:sz w:val="19"/>
+                <w:szCs w:val="19"/>
+              </w:rPr>
+              <w:t xml:space="preserve">BSCP (2 h)</w:t>
+            </w:r>
+          </w:p>
+          <w:p>
+            <w:pPr>
+              <w:keepNext/>
+              <w:spacing w:after="0"/>
+            </w:pPr>
+            <w:r>
+              <w:rPr>
+                <w:rFonts w:ascii="Calibri" w:cs="Calibri" w:eastAsia="Calibri" w:hAnsi="Calibri"/>
+                <w:b/>
+                <w:bCs/>
+                <w:color w:val="1F3A5F"/>
+                <w:sz w:val="17"/>
+                <w:szCs w:val="17"/>
+              </w:rPr>
+              <w:t xml:space="preserve">11:15-13:45</w:t>
+            </w:r>
+          </w:p>
+          <w:p>
+            <w:pPr>
+              <w:spacing w:after="70"/>
+            </w:pPr>
+            <w:r>
+              <w:rPr>
+                <w:rFonts w:ascii="Calibri" w:cs="Calibri" w:eastAsia="Calibri" w:hAnsi="Calibri"/>
+                <w:sz w:val="19"/>
+                <w:szCs w:val="19"/>
+              </w:rPr>
+              <w:t xml:space="preserve">Lab (2 h 30)</w:t>
+            </w:r>
+          </w:p>
+          <w:p>
+            <w:pPr>
+              <w:keepNext/>
+              <w:spacing w:after="0"/>
+            </w:pPr>
+            <w:r>
+              <w:rPr>
+                <w:rFonts w:ascii="Calibri" w:cs="Calibri" w:eastAsia="Calibri" w:hAnsi="Calibri"/>
+                <w:b/>
+                <w:bCs/>
+                <w:color w:val="1F3A5F"/>
+                <w:sz w:val="17"/>
+                <w:szCs w:val="17"/>
+              </w:rPr>
+              <w:t xml:space="preserve">14:00-15:00</w:t>
+            </w:r>
+          </w:p>
+          <w:p>
+            <w:pPr>
+              <w:spacing w:after="70"/>
+            </w:pPr>
+            <w:r>
+              <w:rPr>
+                <w:rFonts w:ascii="Calibri" w:cs="Calibri" w:eastAsia="Calibri" w:hAnsi="Calibri"/>
+                <w:sz w:val="19"/>
+                <w:szCs w:val="19"/>
+              </w:rPr>
+              <w:t xml:space="preserve">C (1 h)</w:t>
+            </w:r>
+          </w:p>
+        </w:tc>
+        <w:tc>
+          <w:tcPr>
+            <w:tcW w:type="dxa" w:w="1810"/>
+            <w:tcBorders>
+              <w:top w:val="single" w:color="B7C3D0" w:sz="4"/>
+              <w:left w:val="single" w:color="B7C3D0" w:sz="4"/>
+              <w:bottom w:val="single" w:color="B7C3D0" w:sz="4"/>
+              <w:right w:val="single" w:color="B7C3D0" w:sz="4"/>
+            </w:tcBorders>
+            <w:shd w:fill="F4F3F0" w:color="auto" w:val="clear"/>
+            <w:tcMar>
+              <w:top w:type="dxa" w:w="70"/>
+              <w:left w:type="dxa" w:w="90"/>
+              <w:bottom w:type="dxa" w:w="50"/>
+              <w:right w:type="dxa" w:w="70"/>
+            </w:tcMar>
+            <w:vAlign w:val="top"/>
+          </w:tcPr>
+          <w:p>
+            <w:r>
+              <w:rPr>
+                <w:rFonts w:ascii="Calibri" w:cs="Calibri" w:eastAsia="Calibri" w:hAnsi="Calibri"/>
+                <w:color w:val="777777"/>
+                <w:sz w:val="19"/>
+                <w:szCs w:val="19"/>
+              </w:rPr>
+              <w:t xml:space="preserve">Libre</w:t>
+            </w:r>
+          </w:p>
+        </w:tc>
+      </w:tr>
+      <w:tr>
+        <w:trPr>
+          <w:cantSplit/>
+        </w:trPr>
+        <w:tc>
+          <w:tcPr>
+            <w:tcW w:type="dxa" w:w="1900"/>
+            <w:tcBorders>
+              <w:top w:val="single" w:color="B7C3D0" w:sz="4"/>
+              <w:left w:val="single" w:color="B7C3D0" w:sz="4"/>
+              <w:bottom w:val="single" w:color="B7C3D0" w:sz="4"/>
+              <w:right w:val="single" w:color="B7C3D0" w:sz="4"/>
+            </w:tcBorders>
+            <w:shd w:fill="EEF2F7" w:color="auto" w:val="clear"/>
+            <w:tcMar>
+              <w:top w:type="dxa" w:w="50"/>
+              <w:left w:type="dxa" w:w="70"/>
+              <w:bottom w:type="dxa" w:w="50"/>
+              <w:right w:type="dxa" w:w="70"/>
+            </w:tcMar>
+          </w:tcPr>
+          <w:p>
+            <w:pPr>
+              <w:spacing w:after="20"/>
+              <w:jc w:val="left"/>
+            </w:pPr>
+            <w:r>
+              <w:rPr>
+                <w:rFonts w:ascii="Calibri" w:cs="Calibri" w:eastAsia="Calibri" w:hAnsi="Calibri"/>
+                <w:b/>
+                <w:bCs/>
+                <w:color w:val="000000"/>
+                <w:sz w:val="16"/>
+                <w:szCs w:val="16"/>
+              </w:rPr>
+              <w:t xml:space="preserve">Semaine d'école (9 h 30)</w:t>
+            </w:r>
+          </w:p>
+        </w:tc>
+        <w:tc>
+          <w:tcPr>
+            <w:tcW w:type="dxa" w:w="1810"/>
+            <w:tcBorders>
+              <w:top w:val="single" w:color="B7C3D0" w:sz="4"/>
+              <w:left w:val="single" w:color="B7C3D0" w:sz="4"/>
+              <w:bottom w:val="single" w:color="B7C3D0" w:sz="4"/>
+              <w:right w:val="single" w:color="B7C3D0" w:sz="4"/>
+            </w:tcBorders>
+            <w:shd w:fill="DCEAFB" w:color="auto" w:val="clear"/>
+            <w:tcMar>
+              <w:top w:type="dxa" w:w="70"/>
+              <w:left w:type="dxa" w:w="90"/>
+              <w:bottom w:type="dxa" w:w="50"/>
+              <w:right w:type="dxa" w:w="70"/>
+            </w:tcMar>
+            <w:vAlign w:val="top"/>
+          </w:tcPr>
+          <w:p>
+            <w:pPr>
+              <w:keepNext/>
+              <w:spacing w:after="0"/>
+            </w:pPr>
+            <w:r>
+              <w:rPr>
+                <w:rFonts w:ascii="Calibri" w:cs="Calibri" w:eastAsia="Calibri" w:hAnsi="Calibri"/>
+                <w:b/>
+                <w:bCs/>
+                <w:color w:val="1F3A5F"/>
+                <w:sz w:val="17"/>
+                <w:szCs w:val="17"/>
+              </w:rPr>
+              <w:t xml:space="preserve">18:00-19:00</w:t>
+            </w:r>
+          </w:p>
+          <w:p>
+            <w:pPr>
+              <w:spacing w:after="70"/>
+            </w:pPr>
+            <w:r>
+              <w:rPr>
+                <w:rFonts w:ascii="Calibri" w:cs="Calibri" w:eastAsia="Calibri" w:hAnsi="Calibri"/>
+                <w:sz w:val="19"/>
+                <w:szCs w:val="19"/>
+              </w:rPr>
+              <w:t xml:space="preserve">BSCP (1 h)</w:t>
+            </w:r>
+          </w:p>
+          <w:p>
+            <w:pPr>
+              <w:keepNext/>
+              <w:spacing w:after="0"/>
+            </w:pPr>
+            <w:r>
+              <w:rPr>
+                <w:rFonts w:ascii="Calibri" w:cs="Calibri" w:eastAsia="Calibri" w:hAnsi="Calibri"/>
+                <w:b/>
+                <w:bCs/>
+                <w:color w:val="1F3A5F"/>
+                <w:sz w:val="17"/>
+                <w:szCs w:val="17"/>
+              </w:rPr>
+              <w:t xml:space="preserve">19:00-19:30</w:t>
+            </w:r>
+          </w:p>
+          <w:p>
+            <w:pPr>
+              <w:spacing w:after="70"/>
+            </w:pPr>
+            <w:r>
+              <w:rPr>
+                <w:rFonts w:ascii="Calibri" w:cs="Calibri" w:eastAsia="Calibri" w:hAnsi="Calibri"/>
+                <w:sz w:val="19"/>
+                <w:szCs w:val="19"/>
+              </w:rPr>
+              <w:t xml:space="preserve">École (30 min)</w:t>
+            </w:r>
+          </w:p>
+        </w:tc>
+        <w:tc>
+          <w:tcPr>
+            <w:tcW w:type="dxa" w:w="1810"/>
+            <w:tcBorders>
+              <w:top w:val="single" w:color="B7C3D0" w:sz="4"/>
+              <w:left w:val="single" w:color="B7C3D0" w:sz="4"/>
+              <w:bottom w:val="single" w:color="B7C3D0" w:sz="4"/>
+              <w:right w:val="single" w:color="B7C3D0" w:sz="4"/>
+            </w:tcBorders>
+            <w:shd w:fill="FBE0D5" w:color="auto" w:val="clear"/>
+            <w:tcMar>
+              <w:top w:type="dxa" w:w="70"/>
+              <w:left w:type="dxa" w:w="90"/>
+              <w:bottom w:type="dxa" w:w="50"/>
+              <w:right w:type="dxa" w:w="70"/>
+            </w:tcMar>
+            <w:vAlign w:val="top"/>
+          </w:tcPr>
+          <w:p>
+            <w:pPr>
+              <w:keepNext/>
+              <w:spacing w:after="0"/>
+            </w:pPr>
+            <w:r>
+              <w:rPr>
+                <w:rFonts w:ascii="Calibri" w:cs="Calibri" w:eastAsia="Calibri" w:hAnsi="Calibri"/>
+                <w:b/>
+                <w:bCs/>
+                <w:color w:val="1F3A5F"/>
+                <w:sz w:val="17"/>
+                <w:szCs w:val="17"/>
+              </w:rPr>
+              <w:t xml:space="preserve">18:00-19:00</w:t>
+            </w:r>
+          </w:p>
+          <w:p>
+            <w:pPr>
+              <w:spacing w:after="70"/>
+            </w:pPr>
+            <w:r>
+              <w:rPr>
+                <w:rFonts w:ascii="Calibri" w:cs="Calibri" w:eastAsia="Calibri" w:hAnsi="Calibri"/>
+                <w:sz w:val="19"/>
+                <w:szCs w:val="19"/>
+              </w:rPr>
+              <w:t xml:space="preserve">Lab (1 h)</w:t>
+            </w:r>
+          </w:p>
+        </w:tc>
+        <w:tc>
+          <w:tcPr>
+            <w:tcW w:type="dxa" w:w="1810"/>
+            <w:tcBorders>
+              <w:top w:val="single" w:color="B7C3D0" w:sz="4"/>
+              <w:left w:val="single" w:color="B7C3D0" w:sz="4"/>
+              <w:bottom w:val="single" w:color="B7C3D0" w:sz="4"/>
+              <w:right w:val="single" w:color="B7C3D0" w:sz="4"/>
+            </w:tcBorders>
+            <w:shd w:fill="D5F0E6" w:color="auto" w:val="clear"/>
+            <w:tcMar>
+              <w:top w:type="dxa" w:w="70"/>
+              <w:left w:type="dxa" w:w="90"/>
+              <w:bottom w:type="dxa" w:w="50"/>
+              <w:right w:type="dxa" w:w="70"/>
+            </w:tcMar>
+            <w:vAlign w:val="top"/>
+          </w:tcPr>
+          <w:p>
+            <w:pPr>
+              <w:keepNext/>
+              <w:spacing w:after="0"/>
+            </w:pPr>
+            <w:r>
+              <w:rPr>
+                <w:rFonts w:ascii="Calibri" w:cs="Calibri" w:eastAsia="Calibri" w:hAnsi="Calibri"/>
+                <w:b/>
+                <w:bCs/>
+                <w:color w:val="1F3A5F"/>
+                <w:sz w:val="17"/>
+                <w:szCs w:val="17"/>
+              </w:rPr>
+              <w:t xml:space="preserve">18:00-19:00</w:t>
+            </w:r>
+          </w:p>
+          <w:p>
+            <w:pPr>
+              <w:spacing w:after="70"/>
+            </w:pPr>
+            <w:r>
+              <w:rPr>
+                <w:rFonts w:ascii="Calibri" w:cs="Calibri" w:eastAsia="Calibri" w:hAnsi="Calibri"/>
+                <w:sz w:val="19"/>
+                <w:szCs w:val="19"/>
+              </w:rPr>
+              <w:t xml:space="preserve">C, Sektor7 (1 h)</w:t>
+            </w:r>
+          </w:p>
+        </w:tc>
+        <w:tc>
+          <w:tcPr>
+            <w:tcW w:type="dxa" w:w="1810"/>
+            <w:tcBorders>
+              <w:top w:val="single" w:color="B7C3D0" w:sz="4"/>
+              <w:left w:val="single" w:color="B7C3D0" w:sz="4"/>
+              <w:bottom w:val="single" w:color="B7C3D0" w:sz="4"/>
+              <w:right w:val="single" w:color="B7C3D0" w:sz="4"/>
+            </w:tcBorders>
+            <w:shd w:fill="F6D5E2" w:color="auto" w:val="clear"/>
+            <w:tcMar>
+              <w:top w:type="dxa" w:w="70"/>
+              <w:left w:type="dxa" w:w="90"/>
+              <w:bottom w:type="dxa" w:w="50"/>
+              <w:right w:type="dxa" w:w="70"/>
+            </w:tcMar>
+            <w:vAlign w:val="top"/>
+          </w:tcPr>
+          <w:p>
+            <w:pPr>
+              <w:keepNext/>
+              <w:spacing w:after="0"/>
+            </w:pPr>
+            <w:r>
+              <w:rPr>
+                <w:rFonts w:ascii="Calibri" w:cs="Calibri" w:eastAsia="Calibri" w:hAnsi="Calibri"/>
+                <w:b/>
+                <w:bCs/>
+                <w:color w:val="1F3A5F"/>
+                <w:sz w:val="17"/>
+                <w:szCs w:val="17"/>
+              </w:rPr>
+              <w:t xml:space="preserve">18:00-18:30</w:t>
+            </w:r>
+          </w:p>
+          <w:p>
+            <w:pPr>
+              <w:spacing w:after="70"/>
+            </w:pPr>
+            <w:r>
+              <w:rPr>
+                <w:rFonts w:ascii="Calibri" w:cs="Calibri" w:eastAsia="Calibri" w:hAnsi="Calibri"/>
+                <w:sz w:val="19"/>
+                <w:szCs w:val="19"/>
+              </w:rPr>
+              <w:t xml:space="preserve">École (30 min)</w:t>
+            </w:r>
+          </w:p>
+          <w:p>
+            <w:pPr>
+              <w:keepNext/>
+              <w:spacing w:after="0"/>
+            </w:pPr>
+            <w:r>
+              <w:rPr>
+                <w:rFonts w:ascii="Calibri" w:cs="Calibri" w:eastAsia="Calibri" w:hAnsi="Calibri"/>
+                <w:b/>
+                <w:bCs/>
+                <w:color w:val="1F3A5F"/>
+                <w:sz w:val="17"/>
+                <w:szCs w:val="17"/>
+              </w:rPr>
+              <w:t xml:space="preserve">18:30-19:00</w:t>
+            </w:r>
+          </w:p>
+          <w:p>
+            <w:pPr>
+              <w:spacing w:after="70"/>
+            </w:pPr>
+            <w:r>
+              <w:rPr>
+                <w:rFonts w:ascii="Calibri" w:cs="Calibri" w:eastAsia="Calibri" w:hAnsi="Calibri"/>
+                <w:sz w:val="19"/>
+                <w:szCs w:val="19"/>
+              </w:rPr>
+              <w:t xml:space="preserve">Revue (30 min)</w:t>
+            </w:r>
+          </w:p>
+        </w:tc>
+        <w:tc>
+          <w:tcPr>
+            <w:tcW w:type="dxa" w:w="1810"/>
+            <w:tcBorders>
+              <w:top w:val="single" w:color="B7C3D0" w:sz="4"/>
+              <w:left w:val="single" w:color="B7C3D0" w:sz="4"/>
+              <w:bottom w:val="single" w:color="B7C3D0" w:sz="4"/>
+              <w:right w:val="single" w:color="B7C3D0" w:sz="4"/>
+            </w:tcBorders>
+            <w:shd w:fill="DCEAFB" w:color="auto" w:val="clear"/>
+            <w:tcMar>
+              <w:top w:type="dxa" w:w="70"/>
+              <w:left w:type="dxa" w:w="90"/>
+              <w:bottom w:type="dxa" w:w="50"/>
+              <w:right w:type="dxa" w:w="70"/>
+            </w:tcMar>
+            <w:vAlign w:val="top"/>
+          </w:tcPr>
+          <w:p>
+            <w:pPr>
+              <w:keepNext/>
+              <w:spacing w:after="0"/>
+            </w:pPr>
+            <w:r>
+              <w:rPr>
+                <w:rFonts w:ascii="Calibri" w:cs="Calibri" w:eastAsia="Calibri" w:hAnsi="Calibri"/>
+                <w:b/>
+                <w:bCs/>
+                <w:color w:val="1F3A5F"/>
+                <w:sz w:val="17"/>
+                <w:szCs w:val="17"/>
+              </w:rPr>
+              <w:t xml:space="preserve">18:00-19:00</w:t>
+            </w:r>
+          </w:p>
+          <w:p>
+            <w:pPr>
+              <w:spacing w:after="70"/>
+            </w:pPr>
+            <w:r>
+              <w:rPr>
+                <w:rFonts w:ascii="Calibri" w:cs="Calibri" w:eastAsia="Calibri" w:hAnsi="Calibri"/>
+                <w:sz w:val="19"/>
+                <w:szCs w:val="19"/>
+              </w:rPr>
+              <w:t xml:space="preserve">BSCP (1 h)</w:t>
+            </w:r>
+          </w:p>
+        </w:tc>
+        <w:tc>
+          <w:tcPr>
+            <w:tcW w:type="dxa" w:w="1810"/>
+            <w:tcBorders>
+              <w:top w:val="single" w:color="B7C3D0" w:sz="4"/>
+              <w:left w:val="single" w:color="B7C3D0" w:sz="4"/>
+              <w:bottom w:val="single" w:color="B7C3D0" w:sz="4"/>
+              <w:right w:val="single" w:color="B7C3D0" w:sz="4"/>
+            </w:tcBorders>
+            <w:shd w:fill="DCEAFB" w:color="auto" w:val="clear"/>
+            <w:tcMar>
+              <w:top w:type="dxa" w:w="70"/>
+              <w:left w:type="dxa" w:w="90"/>
+              <w:bottom w:type="dxa" w:w="50"/>
+              <w:right w:type="dxa" w:w="70"/>
+            </w:tcMar>
+            <w:vAlign w:val="top"/>
+          </w:tcPr>
+          <w:p>
+            <w:pPr>
+              <w:keepNext/>
+              <w:spacing w:after="0"/>
+            </w:pPr>
+            <w:r>
+              <w:rPr>
+                <w:rFonts w:ascii="Calibri" w:cs="Calibri" w:eastAsia="Calibri" w:hAnsi="Calibri"/>
+                <w:b/>
+                <w:bCs/>
+                <w:color w:val="1F3A5F"/>
+                <w:sz w:val="17"/>
+                <w:szCs w:val="17"/>
+              </w:rPr>
+              <w:t xml:space="preserve">09:00-11:00</w:t>
+            </w:r>
+          </w:p>
+          <w:p>
+            <w:pPr>
+              <w:spacing w:after="70"/>
+            </w:pPr>
+            <w:r>
+              <w:rPr>
+                <w:rFonts w:ascii="Calibri" w:cs="Calibri" w:eastAsia="Calibri" w:hAnsi="Calibri"/>
+                <w:sz w:val="19"/>
+                <w:szCs w:val="19"/>
+              </w:rPr>
+              <w:t xml:space="preserve">BSCP (2 h)</w:t>
+            </w:r>
+          </w:p>
+          <w:p>
+            <w:pPr>
+              <w:keepNext/>
+              <w:spacing w:after="0"/>
+            </w:pPr>
+            <w:r>
+              <w:rPr>
+                <w:rFonts w:ascii="Calibri" w:cs="Calibri" w:eastAsia="Calibri" w:hAnsi="Calibri"/>
+                <w:b/>
+                <w:bCs/>
+                <w:color w:val="1F3A5F"/>
+                <w:sz w:val="17"/>
+                <w:szCs w:val="17"/>
+              </w:rPr>
+              <w:t xml:space="preserve">11:15-13:15</w:t>
+            </w:r>
+          </w:p>
+          <w:p>
+            <w:pPr>
+              <w:spacing w:after="70"/>
+            </w:pPr>
+            <w:r>
+              <w:rPr>
+                <w:rFonts w:ascii="Calibri" w:cs="Calibri" w:eastAsia="Calibri" w:hAnsi="Calibri"/>
+                <w:sz w:val="19"/>
+                <w:szCs w:val="19"/>
+              </w:rPr>
+              <w:t xml:space="preserve">Lab (2 h)</w:t>
+            </w:r>
+          </w:p>
+        </w:tc>
+        <w:tc>
+          <w:tcPr>
+            <w:tcW w:type="dxa" w:w="1810"/>
+            <w:tcBorders>
+              <w:top w:val="single" w:color="B7C3D0" w:sz="4"/>
+              <w:left w:val="single" w:color="B7C3D0" w:sz="4"/>
+              <w:bottom w:val="single" w:color="B7C3D0" w:sz="4"/>
+              <w:right w:val="single" w:color="B7C3D0" w:sz="4"/>
+            </w:tcBorders>
+            <w:shd w:fill="F4F3F0" w:color="auto" w:val="clear"/>
+            <w:tcMar>
+              <w:top w:type="dxa" w:w="70"/>
+              <w:left w:type="dxa" w:w="90"/>
+              <w:bottom w:type="dxa" w:w="50"/>
+              <w:right w:type="dxa" w:w="70"/>
+            </w:tcMar>
+            <w:vAlign w:val="top"/>
+          </w:tcPr>
+          <w:p>
+            <w:r>
+              <w:rPr>
+                <w:rFonts w:ascii="Calibri" w:cs="Calibri" w:eastAsia="Calibri" w:hAnsi="Calibri"/>
+                <w:color w:val="777777"/>
+                <w:sz w:val="19"/>
+                <w:szCs w:val="19"/>
+              </w:rPr>
+              <w:t xml:space="preserve">Libre</w:t>
+            </w:r>
+          </w:p>
+        </w:tc>
+      </w:tr>
+    </w:tbl>
+    <w:p>
+      <w:pPr>
+        <w:spacing w:after="120"/>
+      </w:pPr>
+    </w:p>
+    <w:p>
+      <w:pPr>
+        <w:pStyle w:val="Heading3"/>
+        <w:keepNext/>
+      </w:pPr>
+      <w:r>
+        <w:rPr>
+          <w:rFonts w:ascii="Calibri" w:cs="Calibri" w:eastAsia="Calibri" w:hAnsi="Calibri"/>
+        </w:rPr>
+        <w:t xml:space="preserve">Les phases suivantes, semaine d'entreprise</w:t>
+      </w:r>
+    </w:p>
+    <w:tbl>
+      <w:tblPr>
+        <w:tblW w:type="dxa" w:w="14570"/>
+        <w:tblBorders>
+          <w:top w:val="single" w:color="auto" w:sz="4"/>
+          <w:left w:val="single" w:color="auto" w:sz="4"/>
+          <w:bottom w:val="single" w:color="auto" w:sz="4"/>
+          <w:right w:val="single" w:color="auto" w:sz="4"/>
+          <w:insideH w:val="single" w:color="auto" w:sz="4"/>
+          <w:insideV w:val="single" w:color="auto" w:sz="4"/>
+        </w:tblBorders>
+      </w:tblPr>
+      <w:tblGrid>
+        <w:gridCol w:w="1900"/>
+        <w:gridCol w:w="1810"/>
+        <w:gridCol w:w="1810"/>
+        <w:gridCol w:w="1810"/>
+        <w:gridCol w:w="1810"/>
+        <w:gridCol w:w="1810"/>
+        <w:gridCol w:w="1810"/>
+        <w:gridCol w:w="1810"/>
+      </w:tblGrid>
+      <w:tr>
+        <w:trPr>
+          <w:tblHeader/>
+        </w:trPr>
+        <w:tc>
+          <w:tcPr>
+            <w:tcW w:type="dxa" w:w="1900"/>
+            <w:tcBorders>
+              <w:top w:val="single" w:color="B7C3D0" w:sz="4"/>
+              <w:left w:val="single" w:color="B7C3D0" w:sz="4"/>
+              <w:bottom w:val="single" w:color="B7C3D0" w:sz="4"/>
+              <w:right w:val="single" w:color="B7C3D0" w:sz="4"/>
+            </w:tcBorders>
+            <w:shd w:fill="1F3A5F" w:color="auto" w:val="clear"/>
+            <w:tcMar>
+              <w:top w:type="dxa" w:w="50"/>
+              <w:left w:type="dxa" w:w="70"/>
+              <w:bottom w:type="dxa" w:w="50"/>
+              <w:right w:type="dxa" w:w="70"/>
+            </w:tcMar>
+          </w:tcPr>
+          <w:p>
+            <w:pPr>
+              <w:spacing w:after="20"/>
+              <w:jc w:val="left"/>
+            </w:pPr>
+            <w:r>
+              <w:rPr>
+                <w:rFonts w:ascii="Calibri" w:cs="Calibri" w:eastAsia="Calibri" w:hAnsi="Calibri"/>
+                <w:b/>
+                <w:bCs/>
+                <w:color w:val="FFFFFF"/>
+                <w:sz w:val="16"/>
+                <w:szCs w:val="16"/>
+              </w:rPr>
+              <w:t xml:space="preserve">Phase</w:t>
+            </w:r>
+          </w:p>
+        </w:tc>
+        <w:tc>
+          <w:tcPr>
+            <w:tcW w:type="dxa" w:w="1810"/>
+            <w:tcBorders>
+              <w:top w:val="single" w:color="B7C3D0" w:sz="4"/>
+              <w:left w:val="single" w:color="B7C3D0" w:sz="4"/>
+              <w:bottom w:val="single" w:color="B7C3D0" w:sz="4"/>
+              <w:right w:val="single" w:color="B7C3D0" w:sz="4"/>
+            </w:tcBorders>
+            <w:shd w:fill="1F3A5F" w:color="auto" w:val="clear"/>
+            <w:tcMar>
+              <w:top w:type="dxa" w:w="50"/>
+              <w:left w:type="dxa" w:w="70"/>
+              <w:bottom w:type="dxa" w:w="50"/>
+              <w:right w:type="dxa" w:w="70"/>
+            </w:tcMar>
+          </w:tcPr>
+          <w:p>
+            <w:pPr>
+              <w:spacing w:after="20"/>
+              <w:jc w:val="left"/>
+            </w:pPr>
+            <w:r>
+              <w:rPr>
+                <w:rFonts w:ascii="Calibri" w:cs="Calibri" w:eastAsia="Calibri" w:hAnsi="Calibri"/>
+                <w:b/>
+                <w:bCs/>
+                <w:color w:val="FFFFFF"/>
+                <w:sz w:val="16"/>
+                <w:szCs w:val="16"/>
+              </w:rPr>
+              <w:t xml:space="preserve">Lun</w:t>
+            </w:r>
+          </w:p>
+        </w:tc>
+        <w:tc>
+          <w:tcPr>
+            <w:tcW w:type="dxa" w:w="1810"/>
+            <w:tcBorders>
+              <w:top w:val="single" w:color="B7C3D0" w:sz="4"/>
+              <w:left w:val="single" w:color="B7C3D0" w:sz="4"/>
+              <w:bottom w:val="single" w:color="B7C3D0" w:sz="4"/>
+              <w:right w:val="single" w:color="B7C3D0" w:sz="4"/>
+            </w:tcBorders>
+            <w:shd w:fill="1F3A5F" w:color="auto" w:val="clear"/>
+            <w:tcMar>
+              <w:top w:type="dxa" w:w="50"/>
+              <w:left w:type="dxa" w:w="70"/>
+              <w:bottom w:type="dxa" w:w="50"/>
+              <w:right w:type="dxa" w:w="70"/>
+            </w:tcMar>
+          </w:tcPr>
+          <w:p>
+            <w:pPr>
+              <w:spacing w:after="20"/>
+              <w:jc w:val="left"/>
+            </w:pPr>
+            <w:r>
+              <w:rPr>
+                <w:rFonts w:ascii="Calibri" w:cs="Calibri" w:eastAsia="Calibri" w:hAnsi="Calibri"/>
+                <w:b/>
+                <w:bCs/>
+                <w:color w:val="FFFFFF"/>
+                <w:sz w:val="16"/>
+                <w:szCs w:val="16"/>
+              </w:rPr>
+              <w:t xml:space="preserve">Mar</w:t>
+            </w:r>
+          </w:p>
+        </w:tc>
+        <w:tc>
+          <w:tcPr>
+            <w:tcW w:type="dxa" w:w="1810"/>
+            <w:tcBorders>
+              <w:top w:val="single" w:color="B7C3D0" w:sz="4"/>
+              <w:left w:val="single" w:color="B7C3D0" w:sz="4"/>
+              <w:bottom w:val="single" w:color="B7C3D0" w:sz="4"/>
+              <w:right w:val="single" w:color="B7C3D0" w:sz="4"/>
+            </w:tcBorders>
+            <w:shd w:fill="1F3A5F" w:color="auto" w:val="clear"/>
+            <w:tcMar>
+              <w:top w:type="dxa" w:w="50"/>
+              <w:left w:type="dxa" w:w="70"/>
+              <w:bottom w:type="dxa" w:w="50"/>
+              <w:right w:type="dxa" w:w="70"/>
+            </w:tcMar>
+          </w:tcPr>
+          <w:p>
+            <w:pPr>
+              <w:spacing w:after="20"/>
+              <w:jc w:val="left"/>
+            </w:pPr>
+            <w:r>
+              <w:rPr>
+                <w:rFonts w:ascii="Calibri" w:cs="Calibri" w:eastAsia="Calibri" w:hAnsi="Calibri"/>
+                <w:b/>
+                <w:bCs/>
+                <w:color w:val="FFFFFF"/>
+                <w:sz w:val="16"/>
+                <w:szCs w:val="16"/>
+              </w:rPr>
+              <w:t xml:space="preserve">Mer</w:t>
+            </w:r>
+          </w:p>
+        </w:tc>
+        <w:tc>
+          <w:tcPr>
+            <w:tcW w:type="dxa" w:w="1810"/>
+            <w:tcBorders>
+              <w:top w:val="single" w:color="B7C3D0" w:sz="4"/>
+              <w:left w:val="single" w:color="B7C3D0" w:sz="4"/>
+              <w:bottom w:val="single" w:color="B7C3D0" w:sz="4"/>
+              <w:right w:val="single" w:color="B7C3D0" w:sz="4"/>
+            </w:tcBorders>
+            <w:shd w:fill="1F3A5F" w:color="auto" w:val="clear"/>
+            <w:tcMar>
+              <w:top w:type="dxa" w:w="50"/>
+              <w:left w:type="dxa" w:w="70"/>
+              <w:bottom w:type="dxa" w:w="50"/>
+              <w:right w:type="dxa" w:w="70"/>
+            </w:tcMar>
+          </w:tcPr>
+          <w:p>
+            <w:pPr>
+              <w:spacing w:after="20"/>
+              <w:jc w:val="left"/>
+            </w:pPr>
+            <w:r>
+              <w:rPr>
+                <w:rFonts w:ascii="Calibri" w:cs="Calibri" w:eastAsia="Calibri" w:hAnsi="Calibri"/>
+                <w:b/>
+                <w:bCs/>
+                <w:color w:val="FFFFFF"/>
+                <w:sz w:val="16"/>
+                <w:szCs w:val="16"/>
+              </w:rPr>
+              <w:t xml:space="preserve">Jeu</w:t>
+            </w:r>
+          </w:p>
+        </w:tc>
+        <w:tc>
+          <w:tcPr>
+            <w:tcW w:type="dxa" w:w="1810"/>
+            <w:tcBorders>
+              <w:top w:val="single" w:color="B7C3D0" w:sz="4"/>
+              <w:left w:val="single" w:color="B7C3D0" w:sz="4"/>
+              <w:bottom w:val="single" w:color="B7C3D0" w:sz="4"/>
+              <w:right w:val="single" w:color="B7C3D0" w:sz="4"/>
+            </w:tcBorders>
+            <w:shd w:fill="1F3A5F" w:color="auto" w:val="clear"/>
+            <w:tcMar>
+              <w:top w:type="dxa" w:w="50"/>
+              <w:left w:type="dxa" w:w="70"/>
+              <w:bottom w:type="dxa" w:w="50"/>
+              <w:right w:type="dxa" w:w="70"/>
+            </w:tcMar>
+          </w:tcPr>
+          <w:p>
+            <w:pPr>
+              <w:spacing w:after="20"/>
+              <w:jc w:val="left"/>
+            </w:pPr>
+            <w:r>
+              <w:rPr>
+                <w:rFonts w:ascii="Calibri" w:cs="Calibri" w:eastAsia="Calibri" w:hAnsi="Calibri"/>
+                <w:b/>
+                <w:bCs/>
+                <w:color w:val="FFFFFF"/>
+                <w:sz w:val="16"/>
+                <w:szCs w:val="16"/>
+              </w:rPr>
+              <w:t xml:space="preserve">Ven</w:t>
+            </w:r>
+          </w:p>
+        </w:tc>
+        <w:tc>
+          <w:tcPr>
+            <w:tcW w:type="dxa" w:w="1810"/>
+            <w:tcBorders>
+              <w:top w:val="single" w:color="B7C3D0" w:sz="4"/>
+              <w:left w:val="single" w:color="B7C3D0" w:sz="4"/>
+              <w:bottom w:val="single" w:color="B7C3D0" w:sz="4"/>
+              <w:right w:val="single" w:color="B7C3D0" w:sz="4"/>
+            </w:tcBorders>
+            <w:shd w:fill="1F3A5F" w:color="auto" w:val="clear"/>
+            <w:tcMar>
+              <w:top w:type="dxa" w:w="50"/>
+              <w:left w:type="dxa" w:w="70"/>
+              <w:bottom w:type="dxa" w:w="50"/>
+              <w:right w:type="dxa" w:w="70"/>
+            </w:tcMar>
+          </w:tcPr>
+          <w:p>
+            <w:pPr>
+              <w:spacing w:after="20"/>
+              <w:jc w:val="left"/>
+            </w:pPr>
+            <w:r>
+              <w:rPr>
+                <w:rFonts w:ascii="Calibri" w:cs="Calibri" w:eastAsia="Calibri" w:hAnsi="Calibri"/>
+                <w:b/>
+                <w:bCs/>
+                <w:color w:val="FFFFFF"/>
+                <w:sz w:val="16"/>
+                <w:szCs w:val="16"/>
+              </w:rPr>
+              <w:t xml:space="preserve">Sam</w:t>
+            </w:r>
+          </w:p>
+        </w:tc>
+        <w:tc>
+          <w:tcPr>
+            <w:tcW w:type="dxa" w:w="1810"/>
+            <w:tcBorders>
+              <w:top w:val="single" w:color="B7C3D0" w:sz="4"/>
+              <w:left w:val="single" w:color="B7C3D0" w:sz="4"/>
+              <w:bottom w:val="single" w:color="B7C3D0" w:sz="4"/>
+              <w:right w:val="single" w:color="B7C3D0" w:sz="4"/>
+            </w:tcBorders>
+            <w:shd w:fill="1F3A5F" w:color="auto" w:val="clear"/>
+            <w:tcMar>
+              <w:top w:type="dxa" w:w="50"/>
+              <w:left w:type="dxa" w:w="70"/>
+              <w:bottom w:type="dxa" w:w="50"/>
+              <w:right w:type="dxa" w:w="70"/>
+            </w:tcMar>
+          </w:tcPr>
+          <w:p>
+            <w:pPr>
+              <w:spacing w:after="20"/>
+              <w:jc w:val="left"/>
+            </w:pPr>
+            <w:r>
+              <w:rPr>
+                <w:rFonts w:ascii="Calibri" w:cs="Calibri" w:eastAsia="Calibri" w:hAnsi="Calibri"/>
+                <w:b/>
+                <w:bCs/>
+                <w:color w:val="FFFFFF"/>
+                <w:sz w:val="16"/>
+                <w:szCs w:val="16"/>
+              </w:rPr>
+              <w:t xml:space="preserve">Dim</w:t>
+            </w:r>
+          </w:p>
+        </w:tc>
+      </w:tr>
+      <w:tr>
+        <w:trPr>
+          <w:cantSplit/>
+        </w:trPr>
+        <w:tc>
+          <w:tcPr>
+            <w:tcW w:type="dxa" w:w="1900"/>
+            <w:tcBorders>
+              <w:top w:val="single" w:color="B7C3D0" w:sz="4"/>
+              <w:left w:val="single" w:color="B7C3D0" w:sz="4"/>
+              <w:bottom w:val="single" w:color="B7C3D0" w:sz="4"/>
+              <w:right w:val="single" w:color="B7C3D0" w:sz="4"/>
+            </w:tcBorders>
+            <w:shd w:fill="EEF2F7" w:color="auto" w:val="clear"/>
+            <w:tcMar>
+              <w:top w:type="dxa" w:w="50"/>
+              <w:left w:type="dxa" w:w="70"/>
+              <w:bottom w:type="dxa" w:w="50"/>
+              <w:right w:type="dxa" w:w="70"/>
+            </w:tcMar>
+          </w:tcPr>
+          <w:p>
+            <w:pPr>
+              <w:spacing w:after="20"/>
+              <w:jc w:val="left"/>
+            </w:pPr>
+            <w:r>
+              <w:rPr>
+                <w:rFonts w:ascii="Calibri" w:cs="Calibri" w:eastAsia="Calibri" w:hAnsi="Calibri"/>
+                <w:b/>
+                <w:bCs/>
+                <w:color w:val="000000"/>
+                <w:sz w:val="16"/>
+                <w:szCs w:val="16"/>
+              </w:rPr>
+              <w:t xml:space="preserve">Mi-décembre 2026 à début février 2027 (BSCP)</w:t>
+            </w:r>
+          </w:p>
+        </w:tc>
+        <w:tc>
+          <w:tcPr>
+            <w:tcW w:type="dxa" w:w="1810"/>
+            <w:tcBorders>
+              <w:top w:val="single" w:color="B7C3D0" w:sz="4"/>
+              <w:left w:val="single" w:color="B7C3D0" w:sz="4"/>
+              <w:bottom w:val="single" w:color="B7C3D0" w:sz="4"/>
+              <w:right w:val="single" w:color="B7C3D0" w:sz="4"/>
+            </w:tcBorders>
+            <w:shd w:fill="DCEAFB" w:color="auto" w:val="clear"/>
+            <w:tcMar>
+              <w:top w:type="dxa" w:w="40"/>
+              <w:left w:type="dxa" w:w="70"/>
+              <w:bottom w:type="dxa" w:w="30"/>
+              <w:right w:type="dxa" w:w="50"/>
+            </w:tcMar>
+            <w:vAlign w:val="top"/>
+          </w:tcPr>
+          <w:p>
+            <w:pPr>
+              <w:spacing w:after="10"/>
+            </w:pPr>
+            <w:r>
+              <w:rPr>
+                <w:rFonts w:ascii="Calibri" w:cs="Calibri" w:eastAsia="Calibri" w:hAnsi="Calibri"/>
+                <w:color w:val="000000"/>
+                <w:sz w:val="16"/>
+                <w:szCs w:val="16"/>
+              </w:rPr>
+              <w:t xml:space="preserve">BSCP 2 h</w:t>
+            </w:r>
+          </w:p>
+        </w:tc>
+        <w:tc>
+          <w:tcPr>
+            <w:tcW w:type="dxa" w:w="1810"/>
+            <w:tcBorders>
+              <w:top w:val="single" w:color="B7C3D0" w:sz="4"/>
+              <w:left w:val="single" w:color="B7C3D0" w:sz="4"/>
+              <w:bottom w:val="single" w:color="B7C3D0" w:sz="4"/>
+              <w:right w:val="single" w:color="B7C3D0" w:sz="4"/>
+            </w:tcBorders>
+            <w:shd w:fill="DCEAFB" w:color="auto" w:val="clear"/>
+            <w:tcMar>
+              <w:top w:type="dxa" w:w="40"/>
+              <w:left w:type="dxa" w:w="70"/>
+              <w:bottom w:type="dxa" w:w="30"/>
+              <w:right w:type="dxa" w:w="50"/>
+            </w:tcMar>
+            <w:vAlign w:val="top"/>
+          </w:tcPr>
+          <w:p>
+            <w:pPr>
+              <w:spacing w:after="10"/>
+            </w:pPr>
+            <w:r>
+              <w:rPr>
+                <w:rFonts w:ascii="Calibri" w:cs="Calibri" w:eastAsia="Calibri" w:hAnsi="Calibri"/>
+                <w:color w:val="000000"/>
+                <w:sz w:val="16"/>
+                <w:szCs w:val="16"/>
+              </w:rPr>
+              <w:t xml:space="preserve">BSCP 2 h 30</w:t>
+            </w:r>
+          </w:p>
+        </w:tc>
+        <w:tc>
+          <w:tcPr>
+            <w:tcW w:type="dxa" w:w="1810"/>
+            <w:tcBorders>
+              <w:top w:val="single" w:color="B7C3D0" w:sz="4"/>
+              <w:left w:val="single" w:color="B7C3D0" w:sz="4"/>
+              <w:bottom w:val="single" w:color="B7C3D0" w:sz="4"/>
+              <w:right w:val="single" w:color="B7C3D0" w:sz="4"/>
+            </w:tcBorders>
+            <w:shd w:fill="FBE0D5" w:color="auto" w:val="clear"/>
+            <w:tcMar>
+              <w:top w:type="dxa" w:w="40"/>
+              <w:left w:type="dxa" w:w="70"/>
+              <w:bottom w:type="dxa" w:w="30"/>
+              <w:right w:type="dxa" w:w="50"/>
+            </w:tcMar>
+            <w:vAlign w:val="top"/>
+          </w:tcPr>
+          <w:p>
+            <w:pPr>
+              <w:spacing w:after="10"/>
+            </w:pPr>
+            <w:r>
+              <w:rPr>
+                <w:rFonts w:ascii="Calibri" w:cs="Calibri" w:eastAsia="Calibri" w:hAnsi="Calibri"/>
+                <w:color w:val="000000"/>
+                <w:sz w:val="16"/>
+                <w:szCs w:val="16"/>
+              </w:rPr>
+              <w:t xml:space="preserve">Lab 2 h</w:t>
+            </w:r>
+          </w:p>
+          <w:p>
+            <w:pPr>
+              <w:spacing w:after="10"/>
+            </w:pPr>
+            <w:r>
+              <w:rPr>
+                <w:rFonts w:ascii="Calibri" w:cs="Calibri" w:eastAsia="Calibri" w:hAnsi="Calibri"/>
+                <w:color w:val="000000"/>
+                <w:sz w:val="16"/>
+                <w:szCs w:val="16"/>
+              </w:rPr>
+              <w:t xml:space="preserve">École 30 min</w:t>
+            </w:r>
+          </w:p>
+        </w:tc>
+        <w:tc>
+          <w:tcPr>
+            <w:tcW w:type="dxa" w:w="1810"/>
+            <w:tcBorders>
+              <w:top w:val="single" w:color="B7C3D0" w:sz="4"/>
+              <w:left w:val="single" w:color="B7C3D0" w:sz="4"/>
+              <w:bottom w:val="single" w:color="B7C3D0" w:sz="4"/>
+              <w:right w:val="single" w:color="B7C3D0" w:sz="4"/>
+            </w:tcBorders>
+            <w:shd w:fill="DCEAFB" w:color="auto" w:val="clear"/>
+            <w:tcMar>
+              <w:top w:type="dxa" w:w="40"/>
+              <w:left w:type="dxa" w:w="70"/>
+              <w:bottom w:type="dxa" w:w="30"/>
+              <w:right w:type="dxa" w:w="50"/>
+            </w:tcMar>
+            <w:vAlign w:val="top"/>
+          </w:tcPr>
+          <w:p>
+            <w:pPr>
+              <w:spacing w:after="10"/>
+            </w:pPr>
+            <w:r>
+              <w:rPr>
+                <w:rFonts w:ascii="Calibri" w:cs="Calibri" w:eastAsia="Calibri" w:hAnsi="Calibri"/>
+                <w:color w:val="000000"/>
+                <w:sz w:val="16"/>
+                <w:szCs w:val="16"/>
+              </w:rPr>
+              <w:t xml:space="preserve">BSCP 2 h</w:t>
+            </w:r>
+          </w:p>
+        </w:tc>
+        <w:tc>
+          <w:tcPr>
+            <w:tcW w:type="dxa" w:w="1810"/>
+            <w:tcBorders>
+              <w:top w:val="single" w:color="B7C3D0" w:sz="4"/>
+              <w:left w:val="single" w:color="B7C3D0" w:sz="4"/>
+              <w:bottom w:val="single" w:color="B7C3D0" w:sz="4"/>
+              <w:right w:val="single" w:color="B7C3D0" w:sz="4"/>
+            </w:tcBorders>
+            <w:shd w:fill="F6D5E2" w:color="auto" w:val="clear"/>
+            <w:tcMar>
+              <w:top w:type="dxa" w:w="40"/>
+              <w:left w:type="dxa" w:w="70"/>
+              <w:bottom w:type="dxa" w:w="30"/>
+              <w:right w:type="dxa" w:w="50"/>
+            </w:tcMar>
+            <w:vAlign w:val="top"/>
+          </w:tcPr>
+          <w:p>
+            <w:pPr>
+              <w:spacing w:after="10"/>
+            </w:pPr>
+            <w:r>
+              <w:rPr>
+                <w:rFonts w:ascii="Calibri" w:cs="Calibri" w:eastAsia="Calibri" w:hAnsi="Calibri"/>
+                <w:color w:val="000000"/>
+                <w:sz w:val="16"/>
+                <w:szCs w:val="16"/>
+              </w:rPr>
+              <w:t xml:space="preserve">École 30 min</w:t>
+            </w:r>
+          </w:p>
+          <w:p>
+            <w:pPr>
+              <w:spacing w:after="10"/>
+            </w:pPr>
+            <w:r>
+              <w:rPr>
+                <w:rFonts w:ascii="Calibri" w:cs="Calibri" w:eastAsia="Calibri" w:hAnsi="Calibri"/>
+                <w:color w:val="000000"/>
+                <w:sz w:val="16"/>
+                <w:szCs w:val="16"/>
+              </w:rPr>
+              <w:t xml:space="preserve">Revue 30 min</w:t>
+            </w:r>
+          </w:p>
+        </w:tc>
+        <w:tc>
+          <w:tcPr>
+            <w:tcW w:type="dxa" w:w="1810"/>
+            <w:tcBorders>
+              <w:top w:val="single" w:color="B7C3D0" w:sz="4"/>
+              <w:left w:val="single" w:color="B7C3D0" w:sz="4"/>
+              <w:bottom w:val="single" w:color="B7C3D0" w:sz="4"/>
+              <w:right w:val="single" w:color="B7C3D0" w:sz="4"/>
+            </w:tcBorders>
+            <w:shd w:fill="FBE0D5" w:color="auto" w:val="clear"/>
+            <w:tcMar>
+              <w:top w:type="dxa" w:w="40"/>
+              <w:left w:type="dxa" w:w="70"/>
+              <w:bottom w:type="dxa" w:w="30"/>
+              <w:right w:type="dxa" w:w="50"/>
+            </w:tcMar>
+            <w:vAlign w:val="top"/>
+          </w:tcPr>
+          <w:p>
+            <w:pPr>
+              <w:spacing w:after="10"/>
+            </w:pPr>
+            <w:r>
+              <w:rPr>
+                <w:rFonts w:ascii="Calibri" w:cs="Calibri" w:eastAsia="Calibri" w:hAnsi="Calibri"/>
+                <w:color w:val="000000"/>
+                <w:sz w:val="16"/>
+                <w:szCs w:val="16"/>
+              </w:rPr>
+              <w:t xml:space="preserve">BSCP 2 h</w:t>
+            </w:r>
+          </w:p>
+          <w:p>
+            <w:pPr>
+              <w:spacing w:after="10"/>
+            </w:pPr>
+            <w:r>
+              <w:rPr>
+                <w:rFonts w:ascii="Calibri" w:cs="Calibri" w:eastAsia="Calibri" w:hAnsi="Calibri"/>
+                <w:color w:val="000000"/>
+                <w:sz w:val="16"/>
+                <w:szCs w:val="16"/>
+              </w:rPr>
+              <w:t xml:space="preserve">Lab 3 h</w:t>
+            </w:r>
+          </w:p>
+        </w:tc>
+        <w:tc>
+          <w:tcPr>
+            <w:tcW w:type="dxa" w:w="1810"/>
+            <w:tcBorders>
+              <w:top w:val="single" w:color="B7C3D0" w:sz="4"/>
+              <w:left w:val="single" w:color="B7C3D0" w:sz="4"/>
+              <w:bottom w:val="single" w:color="B7C3D0" w:sz="4"/>
+              <w:right w:val="single" w:color="B7C3D0" w:sz="4"/>
+            </w:tcBorders>
+            <w:shd w:fill="F4F3F0" w:color="auto" w:val="clear"/>
+            <w:tcMar>
+              <w:top w:type="dxa" w:w="40"/>
+              <w:left w:type="dxa" w:w="70"/>
+              <w:bottom w:type="dxa" w:w="30"/>
+              <w:right w:type="dxa" w:w="50"/>
+            </w:tcMar>
+            <w:vAlign w:val="top"/>
+          </w:tcPr>
+          <w:p>
+            <w:pPr>
+              <w:spacing w:after="10"/>
+            </w:pPr>
+            <w:r>
+              <w:rPr>
+                <w:rFonts w:ascii="Calibri" w:cs="Calibri" w:eastAsia="Calibri" w:hAnsi="Calibri"/>
+                <w:color w:val="777777"/>
+                <w:sz w:val="16"/>
+                <w:szCs w:val="16"/>
+              </w:rPr>
+              <w:t xml:space="preserve">Libre</w:t>
+            </w:r>
+          </w:p>
+        </w:tc>
+      </w:tr>
+      <w:tr>
+        <w:trPr>
+          <w:cantSplit/>
+        </w:trPr>
+        <w:tc>
+          <w:tcPr>
+            <w:tcW w:type="dxa" w:w="1900"/>
+            <w:tcBorders>
+              <w:top w:val="single" w:color="B7C3D0" w:sz="4"/>
+              <w:left w:val="single" w:color="B7C3D0" w:sz="4"/>
+              <w:bottom w:val="single" w:color="B7C3D0" w:sz="4"/>
+              <w:right w:val="single" w:color="B7C3D0" w:sz="4"/>
+            </w:tcBorders>
+            <w:shd w:fill="EEF2F7" w:color="auto" w:val="clear"/>
+            <w:tcMar>
+              <w:top w:type="dxa" w:w="50"/>
+              <w:left w:type="dxa" w:w="70"/>
+              <w:bottom w:type="dxa" w:w="50"/>
+              <w:right w:type="dxa" w:w="70"/>
+            </w:tcMar>
+          </w:tcPr>
+          <w:p>
+            <w:pPr>
+              <w:spacing w:after="20"/>
+              <w:jc w:val="left"/>
+            </w:pPr>
+            <w:r>
+              <w:rPr>
+                <w:rFonts w:ascii="Calibri" w:cs="Calibri" w:eastAsia="Calibri" w:hAnsi="Calibri"/>
+                <w:b/>
+                <w:bCs/>
+                <w:color w:val="000000"/>
+                <w:sz w:val="16"/>
+                <w:szCs w:val="16"/>
+              </w:rPr>
+              <w:t xml:space="preserve">Mi-février à juin 2027 (CRTO)</w:t>
+            </w:r>
+          </w:p>
+        </w:tc>
+        <w:tc>
+          <w:tcPr>
+            <w:tcW w:type="dxa" w:w="1810"/>
+            <w:tcBorders>
+              <w:top w:val="single" w:color="B7C3D0" w:sz="4"/>
+              <w:left w:val="single" w:color="B7C3D0" w:sz="4"/>
+              <w:bottom w:val="single" w:color="B7C3D0" w:sz="4"/>
+              <w:right w:val="single" w:color="B7C3D0" w:sz="4"/>
+            </w:tcBorders>
+            <w:shd w:fill="DCEAFB" w:color="auto" w:val="clear"/>
+            <w:tcMar>
+              <w:top w:type="dxa" w:w="40"/>
+              <w:left w:type="dxa" w:w="70"/>
+              <w:bottom w:type="dxa" w:w="30"/>
+              <w:right w:type="dxa" w:w="50"/>
+            </w:tcMar>
+            <w:vAlign w:val="top"/>
+          </w:tcPr>
+          <w:p>
+            <w:pPr>
+              <w:spacing w:after="10"/>
+            </w:pPr>
+            <w:r>
+              <w:rPr>
+                <w:rFonts w:ascii="Calibri" w:cs="Calibri" w:eastAsia="Calibri" w:hAnsi="Calibri"/>
+                <w:color w:val="000000"/>
+                <w:sz w:val="16"/>
+                <w:szCs w:val="16"/>
+              </w:rPr>
+              <w:t xml:space="preserve">CRTO 2 h</w:t>
+            </w:r>
+          </w:p>
+        </w:tc>
+        <w:tc>
+          <w:tcPr>
+            <w:tcW w:type="dxa" w:w="1810"/>
+            <w:tcBorders>
+              <w:top w:val="single" w:color="B7C3D0" w:sz="4"/>
+              <w:left w:val="single" w:color="B7C3D0" w:sz="4"/>
+              <w:bottom w:val="single" w:color="B7C3D0" w:sz="4"/>
+              <w:right w:val="single" w:color="B7C3D0" w:sz="4"/>
+            </w:tcBorders>
+            <w:shd w:fill="FBE0D5" w:color="auto" w:val="clear"/>
+            <w:tcMar>
+              <w:top w:type="dxa" w:w="40"/>
+              <w:left w:type="dxa" w:w="70"/>
+              <w:bottom w:type="dxa" w:w="30"/>
+              <w:right w:type="dxa" w:w="50"/>
+            </w:tcMar>
+            <w:vAlign w:val="top"/>
+          </w:tcPr>
+          <w:p>
+            <w:pPr>
+              <w:spacing w:after="10"/>
+            </w:pPr>
+            <w:r>
+              <w:rPr>
+                <w:rFonts w:ascii="Calibri" w:cs="Calibri" w:eastAsia="Calibri" w:hAnsi="Calibri"/>
+                <w:color w:val="000000"/>
+                <w:sz w:val="16"/>
+                <w:szCs w:val="16"/>
+              </w:rPr>
+              <w:t xml:space="preserve">Lab 2 h 30</w:t>
+            </w:r>
+          </w:p>
+        </w:tc>
+        <w:tc>
+          <w:tcPr>
+            <w:tcW w:type="dxa" w:w="1810"/>
+            <w:tcBorders>
+              <w:top w:val="single" w:color="B7C3D0" w:sz="4"/>
+              <w:left w:val="single" w:color="B7C3D0" w:sz="4"/>
+              <w:bottom w:val="single" w:color="B7C3D0" w:sz="4"/>
+              <w:right w:val="single" w:color="B7C3D0" w:sz="4"/>
+            </w:tcBorders>
+            <w:shd w:fill="D5F0E6" w:color="auto" w:val="clear"/>
+            <w:tcMar>
+              <w:top w:type="dxa" w:w="40"/>
+              <w:left w:type="dxa" w:w="70"/>
+              <w:bottom w:type="dxa" w:w="30"/>
+              <w:right w:type="dxa" w:w="50"/>
+            </w:tcMar>
+            <w:vAlign w:val="top"/>
+          </w:tcPr>
+          <w:p>
+            <w:pPr>
+              <w:spacing w:after="10"/>
+            </w:pPr>
+            <w:r>
+              <w:rPr>
+                <w:rFonts w:ascii="Calibri" w:cs="Calibri" w:eastAsia="Calibri" w:hAnsi="Calibri"/>
+                <w:color w:val="000000"/>
+                <w:sz w:val="16"/>
+                <w:szCs w:val="16"/>
+              </w:rPr>
+              <w:t xml:space="preserve">C, Sektor7 2 h</w:t>
+            </w:r>
+          </w:p>
+          <w:p>
+            <w:pPr>
+              <w:spacing w:after="10"/>
+            </w:pPr>
+            <w:r>
+              <w:rPr>
+                <w:rFonts w:ascii="Calibri" w:cs="Calibri" w:eastAsia="Calibri" w:hAnsi="Calibri"/>
+                <w:color w:val="000000"/>
+                <w:sz w:val="16"/>
+                <w:szCs w:val="16"/>
+              </w:rPr>
+              <w:t xml:space="preserve">Rédaction 30 min</w:t>
+            </w:r>
+          </w:p>
+        </w:tc>
+        <w:tc>
+          <w:tcPr>
+            <w:tcW w:type="dxa" w:w="1810"/>
+            <w:tcBorders>
+              <w:top w:val="single" w:color="B7C3D0" w:sz="4"/>
+              <w:left w:val="single" w:color="B7C3D0" w:sz="4"/>
+              <w:bottom w:val="single" w:color="B7C3D0" w:sz="4"/>
+              <w:right w:val="single" w:color="B7C3D0" w:sz="4"/>
+            </w:tcBorders>
+            <w:shd w:fill="DCEAFB" w:color="auto" w:val="clear"/>
+            <w:tcMar>
+              <w:top w:type="dxa" w:w="40"/>
+              <w:left w:type="dxa" w:w="70"/>
+              <w:bottom w:type="dxa" w:w="30"/>
+              <w:right w:type="dxa" w:w="50"/>
+            </w:tcMar>
+            <w:vAlign w:val="top"/>
+          </w:tcPr>
+          <w:p>
+            <w:pPr>
+              <w:spacing w:after="10"/>
+            </w:pPr>
+            <w:r>
+              <w:rPr>
+                <w:rFonts w:ascii="Calibri" w:cs="Calibri" w:eastAsia="Calibri" w:hAnsi="Calibri"/>
+                <w:color w:val="000000"/>
+                <w:sz w:val="16"/>
+                <w:szCs w:val="16"/>
+              </w:rPr>
+              <w:t xml:space="preserve">CRTO 2 h</w:t>
+            </w:r>
+          </w:p>
+        </w:tc>
+        <w:tc>
+          <w:tcPr>
+            <w:tcW w:type="dxa" w:w="1810"/>
+            <w:tcBorders>
+              <w:top w:val="single" w:color="B7C3D0" w:sz="4"/>
+              <w:left w:val="single" w:color="B7C3D0" w:sz="4"/>
+              <w:bottom w:val="single" w:color="B7C3D0" w:sz="4"/>
+              <w:right w:val="single" w:color="B7C3D0" w:sz="4"/>
+            </w:tcBorders>
+            <w:shd w:fill="F6D5E2" w:color="auto" w:val="clear"/>
+            <w:tcMar>
+              <w:top w:type="dxa" w:w="40"/>
+              <w:left w:type="dxa" w:w="70"/>
+              <w:bottom w:type="dxa" w:w="30"/>
+              <w:right w:type="dxa" w:w="50"/>
+            </w:tcMar>
+            <w:vAlign w:val="top"/>
+          </w:tcPr>
+          <w:p>
+            <w:pPr>
+              <w:spacing w:after="10"/>
+            </w:pPr>
+            <w:r>
+              <w:rPr>
+                <w:rFonts w:ascii="Calibri" w:cs="Calibri" w:eastAsia="Calibri" w:hAnsi="Calibri"/>
+                <w:color w:val="000000"/>
+                <w:sz w:val="16"/>
+                <w:szCs w:val="16"/>
+              </w:rPr>
+              <w:t xml:space="preserve">École 30 min</w:t>
+            </w:r>
+          </w:p>
+          <w:p>
+            <w:pPr>
+              <w:spacing w:after="10"/>
+            </w:pPr>
+            <w:r>
+              <w:rPr>
+                <w:rFonts w:ascii="Calibri" w:cs="Calibri" w:eastAsia="Calibri" w:hAnsi="Calibri"/>
+                <w:color w:val="000000"/>
+                <w:sz w:val="16"/>
+                <w:szCs w:val="16"/>
+              </w:rPr>
+              <w:t xml:space="preserve">Revue 30 min</w:t>
+            </w:r>
+          </w:p>
+          <w:p>
+            <w:pPr>
+              <w:spacing w:after="10"/>
+            </w:pPr>
+            <w:r>
+              <w:rPr>
+                <w:rFonts w:ascii="Calibri" w:cs="Calibri" w:eastAsia="Calibri" w:hAnsi="Calibri"/>
+                <w:color w:val="000000"/>
+                <w:sz w:val="16"/>
+                <w:szCs w:val="16"/>
+              </w:rPr>
+              <w:t xml:space="preserve">Rédaction 30 min</w:t>
+            </w:r>
+          </w:p>
+        </w:tc>
+        <w:tc>
+          <w:tcPr>
+            <w:tcW w:type="dxa" w:w="1810"/>
+            <w:tcBorders>
+              <w:top w:val="single" w:color="B7C3D0" w:sz="4"/>
+              <w:left w:val="single" w:color="B7C3D0" w:sz="4"/>
+              <w:bottom w:val="single" w:color="B7C3D0" w:sz="4"/>
+              <w:right w:val="single" w:color="B7C3D0" w:sz="4"/>
+            </w:tcBorders>
+            <w:shd w:fill="FBE0D5" w:color="auto" w:val="clear"/>
+            <w:tcMar>
+              <w:top w:type="dxa" w:w="40"/>
+              <w:left w:type="dxa" w:w="70"/>
+              <w:bottom w:type="dxa" w:w="30"/>
+              <w:right w:type="dxa" w:w="50"/>
+            </w:tcMar>
+            <w:vAlign w:val="top"/>
+          </w:tcPr>
+          <w:p>
+            <w:pPr>
+              <w:spacing w:after="10"/>
+            </w:pPr>
+            <w:r>
+              <w:rPr>
+                <w:rFonts w:ascii="Calibri" w:cs="Calibri" w:eastAsia="Calibri" w:hAnsi="Calibri"/>
+                <w:color w:val="000000"/>
+                <w:sz w:val="16"/>
+                <w:szCs w:val="16"/>
+              </w:rPr>
+              <w:t xml:space="preserve">Lab 2 h 30</w:t>
+            </w:r>
+          </w:p>
+          <w:p>
+            <w:pPr>
+              <w:spacing w:after="10"/>
+            </w:pPr>
+            <w:r>
+              <w:rPr>
+                <w:rFonts w:ascii="Calibri" w:cs="Calibri" w:eastAsia="Calibri" w:hAnsi="Calibri"/>
+                <w:color w:val="000000"/>
+                <w:sz w:val="16"/>
+                <w:szCs w:val="16"/>
+              </w:rPr>
+              <w:t xml:space="preserve">C, projet 2 h</w:t>
+            </w:r>
+          </w:p>
+        </w:tc>
+        <w:tc>
+          <w:tcPr>
+            <w:tcW w:type="dxa" w:w="1810"/>
+            <w:tcBorders>
+              <w:top w:val="single" w:color="B7C3D0" w:sz="4"/>
+              <w:left w:val="single" w:color="B7C3D0" w:sz="4"/>
+              <w:bottom w:val="single" w:color="B7C3D0" w:sz="4"/>
+              <w:right w:val="single" w:color="B7C3D0" w:sz="4"/>
+            </w:tcBorders>
+            <w:shd w:fill="F4F3F0" w:color="auto" w:val="clear"/>
+            <w:tcMar>
+              <w:top w:type="dxa" w:w="40"/>
+              <w:left w:type="dxa" w:w="70"/>
+              <w:bottom w:type="dxa" w:w="30"/>
+              <w:right w:type="dxa" w:w="50"/>
+            </w:tcMar>
+            <w:vAlign w:val="top"/>
+          </w:tcPr>
+          <w:p>
+            <w:pPr>
+              <w:spacing w:after="10"/>
+            </w:pPr>
+            <w:r>
+              <w:rPr>
+                <w:rFonts w:ascii="Calibri" w:cs="Calibri" w:eastAsia="Calibri" w:hAnsi="Calibri"/>
+                <w:color w:val="777777"/>
+                <w:sz w:val="16"/>
+                <w:szCs w:val="16"/>
+              </w:rPr>
+              <w:t xml:space="preserve">Libre</w:t>
+            </w:r>
+          </w:p>
+        </w:tc>
+      </w:tr>
+      <w:tr>
+        <w:trPr>
+          <w:cantSplit/>
+        </w:trPr>
+        <w:tc>
+          <w:tcPr>
+            <w:tcW w:type="dxa" w:w="1900"/>
+            <w:tcBorders>
+              <w:top w:val="single" w:color="B7C3D0" w:sz="4"/>
+              <w:left w:val="single" w:color="B7C3D0" w:sz="4"/>
+              <w:bottom w:val="single" w:color="B7C3D0" w:sz="4"/>
+              <w:right w:val="single" w:color="B7C3D0" w:sz="4"/>
+            </w:tcBorders>
+            <w:shd w:fill="EEF2F7" w:color="auto" w:val="clear"/>
+            <w:tcMar>
+              <w:top w:type="dxa" w:w="50"/>
+              <w:left w:type="dxa" w:w="70"/>
+              <w:bottom w:type="dxa" w:w="50"/>
+              <w:right w:type="dxa" w:w="70"/>
+            </w:tcMar>
+          </w:tcPr>
+          <w:p>
+            <w:pPr>
+              <w:spacing w:after="20"/>
+              <w:jc w:val="left"/>
+            </w:pPr>
+            <w:r>
+              <w:rPr>
+                <w:rFonts w:ascii="Calibri" w:cs="Calibri" w:eastAsia="Calibri" w:hAnsi="Calibri"/>
+                <w:b/>
+                <w:bCs/>
+                <w:color w:val="000000"/>
+                <w:sz w:val="16"/>
+                <w:szCs w:val="16"/>
+              </w:rPr>
+              <w:t xml:space="preserve">Juillet 2027 à janvier 2028 (Maldev, EDR)</w:t>
+            </w:r>
+          </w:p>
+        </w:tc>
+        <w:tc>
+          <w:tcPr>
+            <w:tcW w:type="dxa" w:w="1810"/>
+            <w:tcBorders>
+              <w:top w:val="single" w:color="B7C3D0" w:sz="4"/>
+              <w:left w:val="single" w:color="B7C3D0" w:sz="4"/>
+              <w:bottom w:val="single" w:color="B7C3D0" w:sz="4"/>
+              <w:right w:val="single" w:color="B7C3D0" w:sz="4"/>
+            </w:tcBorders>
+            <w:shd w:fill="DCEAFB" w:color="auto" w:val="clear"/>
+            <w:tcMar>
+              <w:top w:type="dxa" w:w="40"/>
+              <w:left w:type="dxa" w:w="70"/>
+              <w:bottom w:type="dxa" w:w="30"/>
+              <w:right w:type="dxa" w:w="50"/>
+            </w:tcMar>
+            <w:vAlign w:val="top"/>
+          </w:tcPr>
+          <w:p>
+            <w:pPr>
+              <w:spacing w:after="10"/>
+            </w:pPr>
+            <w:r>
+              <w:rPr>
+                <w:rFonts w:ascii="Calibri" w:cs="Calibri" w:eastAsia="Calibri" w:hAnsi="Calibri"/>
+                <w:color w:val="000000"/>
+                <w:sz w:val="16"/>
+                <w:szCs w:val="16"/>
+              </w:rPr>
+              <w:t xml:space="preserve">Cours 2 h</w:t>
+            </w:r>
+          </w:p>
+        </w:tc>
+        <w:tc>
+          <w:tcPr>
+            <w:tcW w:type="dxa" w:w="1810"/>
+            <w:tcBorders>
+              <w:top w:val="single" w:color="B7C3D0" w:sz="4"/>
+              <w:left w:val="single" w:color="B7C3D0" w:sz="4"/>
+              <w:bottom w:val="single" w:color="B7C3D0" w:sz="4"/>
+              <w:right w:val="single" w:color="B7C3D0" w:sz="4"/>
+            </w:tcBorders>
+            <w:shd w:fill="FBE0D5" w:color="auto" w:val="clear"/>
+            <w:tcMar>
+              <w:top w:type="dxa" w:w="40"/>
+              <w:left w:type="dxa" w:w="70"/>
+              <w:bottom w:type="dxa" w:w="30"/>
+              <w:right w:type="dxa" w:w="50"/>
+            </w:tcMar>
+            <w:vAlign w:val="top"/>
+          </w:tcPr>
+          <w:p>
+            <w:pPr>
+              <w:spacing w:after="10"/>
+            </w:pPr>
+            <w:r>
+              <w:rPr>
+                <w:rFonts w:ascii="Calibri" w:cs="Calibri" w:eastAsia="Calibri" w:hAnsi="Calibri"/>
+                <w:color w:val="000000"/>
+                <w:sz w:val="16"/>
+                <w:szCs w:val="16"/>
+              </w:rPr>
+              <w:t xml:space="preserve">Lab 2 h 30</w:t>
+            </w:r>
+          </w:p>
+        </w:tc>
+        <w:tc>
+          <w:tcPr>
+            <w:tcW w:type="dxa" w:w="1810"/>
+            <w:tcBorders>
+              <w:top w:val="single" w:color="B7C3D0" w:sz="4"/>
+              <w:left w:val="single" w:color="B7C3D0" w:sz="4"/>
+              <w:bottom w:val="single" w:color="B7C3D0" w:sz="4"/>
+              <w:right w:val="single" w:color="B7C3D0" w:sz="4"/>
+            </w:tcBorders>
+            <w:shd w:fill="FCEFC9" w:color="auto" w:val="clear"/>
+            <w:tcMar>
+              <w:top w:type="dxa" w:w="40"/>
+              <w:left w:type="dxa" w:w="70"/>
+              <w:bottom w:type="dxa" w:w="30"/>
+              <w:right w:type="dxa" w:w="50"/>
+            </w:tcMar>
+            <w:vAlign w:val="top"/>
+          </w:tcPr>
+          <w:p>
+            <w:pPr>
+              <w:spacing w:after="10"/>
+            </w:pPr>
+            <w:r>
+              <w:rPr>
+                <w:rFonts w:ascii="Calibri" w:cs="Calibri" w:eastAsia="Calibri" w:hAnsi="Calibri"/>
+                <w:color w:val="000000"/>
+                <w:sz w:val="16"/>
+                <w:szCs w:val="16"/>
+              </w:rPr>
+              <w:t xml:space="preserve">Reverse eng. 2 h</w:t>
+            </w:r>
+          </w:p>
+        </w:tc>
+        <w:tc>
+          <w:tcPr>
+            <w:tcW w:type="dxa" w:w="1810"/>
+            <w:tcBorders>
+              <w:top w:val="single" w:color="B7C3D0" w:sz="4"/>
+              <w:left w:val="single" w:color="B7C3D0" w:sz="4"/>
+              <w:bottom w:val="single" w:color="B7C3D0" w:sz="4"/>
+              <w:right w:val="single" w:color="B7C3D0" w:sz="4"/>
+            </w:tcBorders>
+            <w:shd w:fill="DCEAFB" w:color="auto" w:val="clear"/>
+            <w:tcMar>
+              <w:top w:type="dxa" w:w="40"/>
+              <w:left w:type="dxa" w:w="70"/>
+              <w:bottom w:type="dxa" w:w="30"/>
+              <w:right w:type="dxa" w:w="50"/>
+            </w:tcMar>
+            <w:vAlign w:val="top"/>
+          </w:tcPr>
+          <w:p>
+            <w:pPr>
+              <w:spacing w:after="10"/>
+            </w:pPr>
+            <w:r>
+              <w:rPr>
+                <w:rFonts w:ascii="Calibri" w:cs="Calibri" w:eastAsia="Calibri" w:hAnsi="Calibri"/>
+                <w:color w:val="000000"/>
+                <w:sz w:val="16"/>
+                <w:szCs w:val="16"/>
+              </w:rPr>
+              <w:t xml:space="preserve">Cours 2 h</w:t>
+            </w:r>
+          </w:p>
+        </w:tc>
+        <w:tc>
+          <w:tcPr>
+            <w:tcW w:type="dxa" w:w="1810"/>
+            <w:tcBorders>
+              <w:top w:val="single" w:color="B7C3D0" w:sz="4"/>
+              <w:left w:val="single" w:color="B7C3D0" w:sz="4"/>
+              <w:bottom w:val="single" w:color="B7C3D0" w:sz="4"/>
+              <w:right w:val="single" w:color="B7C3D0" w:sz="4"/>
+            </w:tcBorders>
+            <w:shd w:fill="FCEFC9" w:color="auto" w:val="clear"/>
+            <w:tcMar>
+              <w:top w:type="dxa" w:w="40"/>
+              <w:left w:type="dxa" w:w="70"/>
+              <w:bottom w:type="dxa" w:w="30"/>
+              <w:right w:type="dxa" w:w="50"/>
+            </w:tcMar>
+            <w:vAlign w:val="top"/>
+          </w:tcPr>
+          <w:p>
+            <w:pPr>
+              <w:spacing w:after="10"/>
+            </w:pPr>
+            <w:r>
+              <w:rPr>
+                <w:rFonts w:ascii="Calibri" w:cs="Calibri" w:eastAsia="Calibri" w:hAnsi="Calibri"/>
+                <w:color w:val="000000"/>
+                <w:sz w:val="16"/>
+                <w:szCs w:val="16"/>
+              </w:rPr>
+              <w:t xml:space="preserve">Rédaction 1 h</w:t>
+            </w:r>
+          </w:p>
+          <w:p>
+            <w:pPr>
+              <w:spacing w:after="10"/>
+            </w:pPr>
+            <w:r>
+              <w:rPr>
+                <w:rFonts w:ascii="Calibri" w:cs="Calibri" w:eastAsia="Calibri" w:hAnsi="Calibri"/>
+                <w:color w:val="000000"/>
+                <w:sz w:val="16"/>
+                <w:szCs w:val="16"/>
+              </w:rPr>
+              <w:t xml:space="preserve">Revue 30 min</w:t>
+            </w:r>
+          </w:p>
+        </w:tc>
+        <w:tc>
+          <w:tcPr>
+            <w:tcW w:type="dxa" w:w="1810"/>
+            <w:tcBorders>
+              <w:top w:val="single" w:color="B7C3D0" w:sz="4"/>
+              <w:left w:val="single" w:color="B7C3D0" w:sz="4"/>
+              <w:bottom w:val="single" w:color="B7C3D0" w:sz="4"/>
+              <w:right w:val="single" w:color="B7C3D0" w:sz="4"/>
+            </w:tcBorders>
+            <w:shd w:fill="FBE0D5" w:color="auto" w:val="clear"/>
+            <w:tcMar>
+              <w:top w:type="dxa" w:w="40"/>
+              <w:left w:type="dxa" w:w="70"/>
+              <w:bottom w:type="dxa" w:w="30"/>
+              <w:right w:type="dxa" w:w="50"/>
+            </w:tcMar>
+            <w:vAlign w:val="top"/>
+          </w:tcPr>
+          <w:p>
+            <w:pPr>
+              <w:spacing w:after="10"/>
+            </w:pPr>
+            <w:r>
+              <w:rPr>
+                <w:rFonts w:ascii="Calibri" w:cs="Calibri" w:eastAsia="Calibri" w:hAnsi="Calibri"/>
+                <w:color w:val="000000"/>
+                <w:sz w:val="16"/>
+                <w:szCs w:val="16"/>
+              </w:rPr>
+              <w:t xml:space="preserve">Lab 2 h 30</w:t>
+            </w:r>
+          </w:p>
+          <w:p>
+            <w:pPr>
+              <w:spacing w:after="10"/>
+            </w:pPr>
+            <w:r>
+              <w:rPr>
+                <w:rFonts w:ascii="Calibri" w:cs="Calibri" w:eastAsia="Calibri" w:hAnsi="Calibri"/>
+                <w:color w:val="000000"/>
+                <w:sz w:val="16"/>
+                <w:szCs w:val="16"/>
+              </w:rPr>
+              <w:t xml:space="preserve">Projet 2 h</w:t>
+            </w:r>
+          </w:p>
+          <w:p>
+            <w:pPr>
+              <w:spacing w:after="10"/>
+            </w:pPr>
+            <w:r>
+              <w:rPr>
+                <w:rFonts w:ascii="Calibri" w:cs="Calibri" w:eastAsia="Calibri" w:hAnsi="Calibri"/>
+                <w:color w:val="000000"/>
+                <w:sz w:val="16"/>
+                <w:szCs w:val="16"/>
+              </w:rPr>
+              <w:t xml:space="preserve">Revue 30 min</w:t>
+            </w:r>
+          </w:p>
+        </w:tc>
+        <w:tc>
+          <w:tcPr>
+            <w:tcW w:type="dxa" w:w="1810"/>
+            <w:tcBorders>
+              <w:top w:val="single" w:color="B7C3D0" w:sz="4"/>
+              <w:left w:val="single" w:color="B7C3D0" w:sz="4"/>
+              <w:bottom w:val="single" w:color="B7C3D0" w:sz="4"/>
+              <w:right w:val="single" w:color="B7C3D0" w:sz="4"/>
+            </w:tcBorders>
+            <w:shd w:fill="F4F3F0" w:color="auto" w:val="clear"/>
+            <w:tcMar>
+              <w:top w:type="dxa" w:w="40"/>
+              <w:left w:type="dxa" w:w="70"/>
+              <w:bottom w:type="dxa" w:w="30"/>
+              <w:right w:type="dxa" w:w="50"/>
+            </w:tcMar>
+            <w:vAlign w:val="top"/>
+          </w:tcPr>
+          <w:p>
+            <w:pPr>
+              <w:spacing w:after="10"/>
+            </w:pPr>
+            <w:r>
+              <w:rPr>
+                <w:rFonts w:ascii="Calibri" w:cs="Calibri" w:eastAsia="Calibri" w:hAnsi="Calibri"/>
+                <w:color w:val="777777"/>
+                <w:sz w:val="16"/>
+                <w:szCs w:val="16"/>
+              </w:rPr>
+              <w:t xml:space="preserve">Libre</w:t>
+            </w:r>
+          </w:p>
+        </w:tc>
+      </w:tr>
+      <w:tr>
+        <w:trPr>
+          <w:cantSplit/>
+        </w:trPr>
+        <w:tc>
+          <w:tcPr>
+            <w:tcW w:type="dxa" w:w="1900"/>
+            <w:tcBorders>
+              <w:top w:val="single" w:color="B7C3D0" w:sz="4"/>
+              <w:left w:val="single" w:color="B7C3D0" w:sz="4"/>
+              <w:bottom w:val="single" w:color="B7C3D0" w:sz="4"/>
+              <w:right w:val="single" w:color="B7C3D0" w:sz="4"/>
+            </w:tcBorders>
+            <w:shd w:fill="EEF2F7" w:color="auto" w:val="clear"/>
+            <w:tcMar>
+              <w:top w:type="dxa" w:w="50"/>
+              <w:left w:type="dxa" w:w="70"/>
+              <w:bottom w:type="dxa" w:w="50"/>
+              <w:right w:type="dxa" w:w="70"/>
+            </w:tcMar>
+          </w:tcPr>
+          <w:p>
+            <w:pPr>
+              <w:spacing w:after="20"/>
+              <w:jc w:val="left"/>
+            </w:pPr>
+            <w:r>
+              <w:rPr>
+                <w:rFonts w:ascii="Calibri" w:cs="Calibri" w:eastAsia="Calibri" w:hAnsi="Calibri"/>
+                <w:b/>
+                <w:bCs/>
+                <w:color w:val="000000"/>
+                <w:sz w:val="16"/>
+                <w:szCs w:val="16"/>
+              </w:rPr>
+              <w:t xml:space="preserve">Février à été 2028 (CRTL)</w:t>
+            </w:r>
+          </w:p>
+        </w:tc>
+        <w:tc>
+          <w:tcPr>
+            <w:tcW w:type="dxa" w:w="1810"/>
+            <w:tcBorders>
+              <w:top w:val="single" w:color="B7C3D0" w:sz="4"/>
+              <w:left w:val="single" w:color="B7C3D0" w:sz="4"/>
+              <w:bottom w:val="single" w:color="B7C3D0" w:sz="4"/>
+              <w:right w:val="single" w:color="B7C3D0" w:sz="4"/>
+            </w:tcBorders>
+            <w:shd w:fill="DCEAFB" w:color="auto" w:val="clear"/>
+            <w:tcMar>
+              <w:top w:type="dxa" w:w="40"/>
+              <w:left w:type="dxa" w:w="70"/>
+              <w:bottom w:type="dxa" w:w="30"/>
+              <w:right w:type="dxa" w:w="50"/>
+            </w:tcMar>
+            <w:vAlign w:val="top"/>
+          </w:tcPr>
+          <w:p>
+            <w:pPr>
+              <w:spacing w:after="10"/>
+            </w:pPr>
+            <w:r>
+              <w:rPr>
+                <w:rFonts w:ascii="Calibri" w:cs="Calibri" w:eastAsia="Calibri" w:hAnsi="Calibri"/>
+                <w:color w:val="000000"/>
+                <w:sz w:val="16"/>
+                <w:szCs w:val="16"/>
+              </w:rPr>
+              <w:t xml:space="preserve">CRTL 2 h</w:t>
+            </w:r>
+          </w:p>
+        </w:tc>
+        <w:tc>
+          <w:tcPr>
+            <w:tcW w:type="dxa" w:w="1810"/>
+            <w:tcBorders>
+              <w:top w:val="single" w:color="B7C3D0" w:sz="4"/>
+              <w:left w:val="single" w:color="B7C3D0" w:sz="4"/>
+              <w:bottom w:val="single" w:color="B7C3D0" w:sz="4"/>
+              <w:right w:val="single" w:color="B7C3D0" w:sz="4"/>
+            </w:tcBorders>
+            <w:shd w:fill="FBE0D5" w:color="auto" w:val="clear"/>
+            <w:tcMar>
+              <w:top w:type="dxa" w:w="40"/>
+              <w:left w:type="dxa" w:w="70"/>
+              <w:bottom w:type="dxa" w:w="30"/>
+              <w:right w:type="dxa" w:w="50"/>
+            </w:tcMar>
+            <w:vAlign w:val="top"/>
+          </w:tcPr>
+          <w:p>
+            <w:pPr>
+              <w:spacing w:after="10"/>
+            </w:pPr>
+            <w:r>
+              <w:rPr>
+                <w:rFonts w:ascii="Calibri" w:cs="Calibri" w:eastAsia="Calibri" w:hAnsi="Calibri"/>
+                <w:color w:val="000000"/>
+                <w:sz w:val="16"/>
+                <w:szCs w:val="16"/>
+              </w:rPr>
+              <w:t xml:space="preserve">Lab 2 h 30</w:t>
+            </w:r>
+          </w:p>
+        </w:tc>
+        <w:tc>
+          <w:tcPr>
+            <w:tcW w:type="dxa" w:w="1810"/>
+            <w:tcBorders>
+              <w:top w:val="single" w:color="B7C3D0" w:sz="4"/>
+              <w:left w:val="single" w:color="B7C3D0" w:sz="4"/>
+              <w:bottom w:val="single" w:color="B7C3D0" w:sz="4"/>
+              <w:right w:val="single" w:color="B7C3D0" w:sz="4"/>
+            </w:tcBorders>
+            <w:shd w:fill="D5F0E6" w:color="auto" w:val="clear"/>
+            <w:tcMar>
+              <w:top w:type="dxa" w:w="40"/>
+              <w:left w:type="dxa" w:w="70"/>
+              <w:bottom w:type="dxa" w:w="30"/>
+              <w:right w:type="dxa" w:w="50"/>
+            </w:tcMar>
+            <w:vAlign w:val="top"/>
+          </w:tcPr>
+          <w:p>
+            <w:pPr>
+              <w:spacing w:after="10"/>
+            </w:pPr>
+            <w:r>
+              <w:rPr>
+                <w:rFonts w:ascii="Calibri" w:cs="Calibri" w:eastAsia="Calibri" w:hAnsi="Calibri"/>
+                <w:color w:val="000000"/>
+                <w:sz w:val="16"/>
+                <w:szCs w:val="16"/>
+              </w:rPr>
+              <w:t xml:space="preserve">Projet 2 h</w:t>
+            </w:r>
+          </w:p>
+        </w:tc>
+        <w:tc>
+          <w:tcPr>
+            <w:tcW w:type="dxa" w:w="1810"/>
+            <w:tcBorders>
+              <w:top w:val="single" w:color="B7C3D0" w:sz="4"/>
+              <w:left w:val="single" w:color="B7C3D0" w:sz="4"/>
+              <w:bottom w:val="single" w:color="B7C3D0" w:sz="4"/>
+              <w:right w:val="single" w:color="B7C3D0" w:sz="4"/>
+            </w:tcBorders>
+            <w:shd w:fill="DCEAFB" w:color="auto" w:val="clear"/>
+            <w:tcMar>
+              <w:top w:type="dxa" w:w="40"/>
+              <w:left w:type="dxa" w:w="70"/>
+              <w:bottom w:type="dxa" w:w="30"/>
+              <w:right w:type="dxa" w:w="50"/>
+            </w:tcMar>
+            <w:vAlign w:val="top"/>
+          </w:tcPr>
+          <w:p>
+            <w:pPr>
+              <w:spacing w:after="10"/>
+            </w:pPr>
+            <w:r>
+              <w:rPr>
+                <w:rFonts w:ascii="Calibri" w:cs="Calibri" w:eastAsia="Calibri" w:hAnsi="Calibri"/>
+                <w:color w:val="000000"/>
+                <w:sz w:val="16"/>
+                <w:szCs w:val="16"/>
+              </w:rPr>
+              <w:t xml:space="preserve">CRTL 2 h</w:t>
+            </w:r>
+          </w:p>
+        </w:tc>
+        <w:tc>
+          <w:tcPr>
+            <w:tcW w:type="dxa" w:w="1810"/>
+            <w:tcBorders>
+              <w:top w:val="single" w:color="B7C3D0" w:sz="4"/>
+              <w:left w:val="single" w:color="B7C3D0" w:sz="4"/>
+              <w:bottom w:val="single" w:color="B7C3D0" w:sz="4"/>
+              <w:right w:val="single" w:color="B7C3D0" w:sz="4"/>
+            </w:tcBorders>
+            <w:shd w:fill="FCEFC9" w:color="auto" w:val="clear"/>
+            <w:tcMar>
+              <w:top w:type="dxa" w:w="40"/>
+              <w:left w:type="dxa" w:w="70"/>
+              <w:bottom w:type="dxa" w:w="30"/>
+              <w:right w:type="dxa" w:w="50"/>
+            </w:tcMar>
+            <w:vAlign w:val="top"/>
+          </w:tcPr>
+          <w:p>
+            <w:pPr>
+              <w:spacing w:after="10"/>
+            </w:pPr>
+            <w:r>
+              <w:rPr>
+                <w:rFonts w:ascii="Calibri" w:cs="Calibri" w:eastAsia="Calibri" w:hAnsi="Calibri"/>
+                <w:color w:val="000000"/>
+                <w:sz w:val="16"/>
+                <w:szCs w:val="16"/>
+              </w:rPr>
+              <w:t xml:space="preserve">Reverse eng. 1 h</w:t>
+            </w:r>
+          </w:p>
+          <w:p>
+            <w:pPr>
+              <w:spacing w:after="10"/>
+            </w:pPr>
+            <w:r>
+              <w:rPr>
+                <w:rFonts w:ascii="Calibri" w:cs="Calibri" w:eastAsia="Calibri" w:hAnsi="Calibri"/>
+                <w:color w:val="000000"/>
+                <w:sz w:val="16"/>
+                <w:szCs w:val="16"/>
+              </w:rPr>
+              <w:t xml:space="preserve">Revue 30 min</w:t>
+            </w:r>
+          </w:p>
+        </w:tc>
+        <w:tc>
+          <w:tcPr>
+            <w:tcW w:type="dxa" w:w="1810"/>
+            <w:tcBorders>
+              <w:top w:val="single" w:color="B7C3D0" w:sz="4"/>
+              <w:left w:val="single" w:color="B7C3D0" w:sz="4"/>
+              <w:bottom w:val="single" w:color="B7C3D0" w:sz="4"/>
+              <w:right w:val="single" w:color="B7C3D0" w:sz="4"/>
+            </w:tcBorders>
+            <w:shd w:fill="FBE0D5" w:color="auto" w:val="clear"/>
+            <w:tcMar>
+              <w:top w:type="dxa" w:w="40"/>
+              <w:left w:type="dxa" w:w="70"/>
+              <w:bottom w:type="dxa" w:w="30"/>
+              <w:right w:type="dxa" w:w="50"/>
+            </w:tcMar>
+            <w:vAlign w:val="top"/>
+          </w:tcPr>
+          <w:p>
+            <w:pPr>
+              <w:spacing w:after="10"/>
+            </w:pPr>
+            <w:r>
+              <w:rPr>
+                <w:rFonts w:ascii="Calibri" w:cs="Calibri" w:eastAsia="Calibri" w:hAnsi="Calibri"/>
+                <w:color w:val="000000"/>
+                <w:sz w:val="16"/>
+                <w:szCs w:val="16"/>
+              </w:rPr>
+              <w:t xml:space="preserve">Lab 2 h 30</w:t>
+            </w:r>
+          </w:p>
+          <w:p>
+            <w:pPr>
+              <w:spacing w:after="10"/>
+            </w:pPr>
+            <w:r>
+              <w:rPr>
+                <w:rFonts w:ascii="Calibri" w:cs="Calibri" w:eastAsia="Calibri" w:hAnsi="Calibri"/>
+                <w:color w:val="000000"/>
+                <w:sz w:val="16"/>
+                <w:szCs w:val="16"/>
+              </w:rPr>
+              <w:t xml:space="preserve">Projet 1 h</w:t>
+            </w:r>
+          </w:p>
+          <w:p>
+            <w:pPr>
+              <w:spacing w:after="10"/>
+            </w:pPr>
+            <w:r>
+              <w:rPr>
+                <w:rFonts w:ascii="Calibri" w:cs="Calibri" w:eastAsia="Calibri" w:hAnsi="Calibri"/>
+                <w:color w:val="000000"/>
+                <w:sz w:val="16"/>
+                <w:szCs w:val="16"/>
+              </w:rPr>
+              <w:t xml:space="preserve">Candidatures 1 h 30</w:t>
+            </w:r>
+          </w:p>
+        </w:tc>
+        <w:tc>
+          <w:tcPr>
+            <w:tcW w:type="dxa" w:w="1810"/>
+            <w:tcBorders>
+              <w:top w:val="single" w:color="B7C3D0" w:sz="4"/>
+              <w:left w:val="single" w:color="B7C3D0" w:sz="4"/>
+              <w:bottom w:val="single" w:color="B7C3D0" w:sz="4"/>
+              <w:right w:val="single" w:color="B7C3D0" w:sz="4"/>
+            </w:tcBorders>
+            <w:shd w:fill="F4F3F0" w:color="auto" w:val="clear"/>
+            <w:tcMar>
+              <w:top w:type="dxa" w:w="40"/>
+              <w:left w:type="dxa" w:w="70"/>
+              <w:bottom w:type="dxa" w:w="30"/>
+              <w:right w:type="dxa" w:w="50"/>
+            </w:tcMar>
+            <w:vAlign w:val="top"/>
+          </w:tcPr>
+          <w:p>
+            <w:pPr>
+              <w:spacing w:after="10"/>
+            </w:pPr>
+            <w:r>
+              <w:rPr>
+                <w:rFonts w:ascii="Calibri" w:cs="Calibri" w:eastAsia="Calibri" w:hAnsi="Calibri"/>
+                <w:color w:val="777777"/>
+                <w:sz w:val="16"/>
+                <w:szCs w:val="16"/>
+              </w:rPr>
+              <w:t xml:space="preserve">Libre</w:t>
+            </w:r>
+          </w:p>
+        </w:tc>
+      </w:tr>
+    </w:tbl>
+    <w:p>
+      <w:pPr>
+        <w:keepNext w:val="false"/>
+        <w:spacing w:after="120" w:before="0" w:line="276"/>
+        <w:jc w:val="both"/>
+      </w:pPr>
+      <w:r>
+        <w:rPr>
+          <w:rFonts w:ascii="Calibri" w:cs="Calibri" w:eastAsia="Calibri" w:hAnsi="Calibri"/>
+          <w:b w:val="false"/>
+          <w:bCs w:val="false"/>
+          <w:i/>
+          <w:iCs/>
+          <w:color w:val="555555"/>
+          <w:sz w:val="18"/>
+          <w:szCs w:val="18"/>
+        </w:rPr>
+        <w:t xml:space="preserve">Les semaines d'école suivent les mêmes jours avec des volumes réduits (9 h 30) : voir la section 4.2. À partir de mi-décembre, le mardi est consacré à la BSCP.</w:t>
+      </w:r>
+    </w:p>
     <w:p>
       <w:pPr>
         <w:sectPr>

</xml_diff>

<commit_message>
Simplifie la page « ma semaine en un coup d'oeil » : activités par jour sans horaires
Co-Authored-By: Claude Sonnet 5.5 <noreply@anthropic.com>
Claude-Session: https://claude.ai/code/session_01PLMe4ge9F6B5wJA3dMBx9D
</commit_message>
<xml_diff>
--- a/05-Plan-Carriere/Plan-carriere-Red-Team-2026-2028.docx
+++ b/05-Plan-Carriere/Plan-carriere-Red-Team-2026-2028.docx
@@ -2974,27 +2974,7 @@
           <w:i w:val="false"/>
           <w:iCs w:val="false"/>
         </w:rPr>
-        <w:t xml:space="preserve"/>
-      </w:r>
-      <w:r>
-        <w:rPr>
-          <w:rFonts w:ascii="Calibri" w:cs="Calibri" w:eastAsia="Calibri" w:hAnsi="Calibri"/>
-          <w:b/>
-          <w:bCs/>
-          <w:i w:val="false"/>
-          <w:iCs w:val="false"/>
-        </w:rPr>
-        <w:t xml:space="preserve">Cette phase (du 14 octobre à mi-décembre 2026).</w:t>
-      </w:r>
-      <w:r>
-        <w:rPr>
-          <w:rFonts w:ascii="Calibri" w:cs="Calibri" w:eastAsia="Calibri" w:hAnsi="Calibri"/>
-          <w:b w:val="false"/>
-          <w:bCs w:val="false"/>
-          <w:i w:val="false"/>
-          <w:iCs w:val="false"/>
-        </w:rPr>
-        <w:t xml:space="preserve"> Une case par jour : le créneau puis l'activité. La couleur indique l'activité dominante de la journée : bleu pour la formation principale, orange pour le lab, vert pour la programmation, jaune pour le reverse engineering et la rédaction, rose pour l'école et la revue. Créneaux calés sur tes horaires (18 h à 21 h au plus tard en semaine).</w:t>
+        <w:t xml:space="preserve">Une ligne par phase du plan, une case par jour : l'activité à faire, sans horaire ni durée. La couleur indique l'activité dominante de la journée : bleu pour la formation principale, orange pour le lab, vert pour la programmation, jaune pour le reverse engineering et la rédaction, rose pour l'école et la revue. Les horaires et les durées sont dans la section 4.2.</w:t>
       </w:r>
     </w:p>
     <w:tbl>
@@ -3010,14 +2990,14 @@
         </w:tblBorders>
       </w:tblPr>
       <w:tblGrid>
-        <w:gridCol w:w="1900"/>
-        <w:gridCol w:w="1810"/>
-        <w:gridCol w:w="1810"/>
-        <w:gridCol w:w="1810"/>
-        <w:gridCol w:w="1810"/>
-        <w:gridCol w:w="1810"/>
-        <w:gridCol w:w="1810"/>
-        <w:gridCol w:w="1810"/>
+        <w:gridCol w:w="2100"/>
+        <w:gridCol w:w="1781"/>
+        <w:gridCol w:w="1781"/>
+        <w:gridCol w:w="1781"/>
+        <w:gridCol w:w="1781"/>
+        <w:gridCol w:w="1781"/>
+        <w:gridCol w:w="1781"/>
+        <w:gridCol w:w="1784"/>
       </w:tblGrid>
       <w:tr>
         <w:trPr>
@@ -3025,7 +3005,7 @@
         </w:trPr>
         <w:tc>
           <w:tcPr>
-            <w:tcW w:type="dxa" w:w="1900"/>
+            <w:tcW w:type="dxa" w:w="2100"/>
             <w:tcBorders>
               <w:top w:val="single" w:color="B7C3D0" w:sz="4"/>
               <w:left w:val="single" w:color="B7C3D0" w:sz="4"/>
@@ -3054,13 +3034,13 @@
                 <w:sz w:val="16"/>
                 <w:szCs w:val="16"/>
               </w:rPr>
-              <w:t xml:space="preserve"/>
-            </w:r>
-          </w:p>
-        </w:tc>
-        <w:tc>
-          <w:tcPr>
-            <w:tcW w:type="dxa" w:w="1810"/>
+              <w:t xml:space="preserve">Phase</w:t>
+            </w:r>
+          </w:p>
+        </w:tc>
+        <w:tc>
+          <w:tcPr>
+            <w:tcW w:type="dxa" w:w="1781"/>
             <w:tcBorders>
               <w:top w:val="single" w:color="B7C3D0" w:sz="4"/>
               <w:left w:val="single" w:color="B7C3D0" w:sz="4"/>
@@ -3095,7 +3075,7 @@
         </w:tc>
         <w:tc>
           <w:tcPr>
-            <w:tcW w:type="dxa" w:w="1810"/>
+            <w:tcW w:type="dxa" w:w="1781"/>
             <w:tcBorders>
               <w:top w:val="single" w:color="B7C3D0" w:sz="4"/>
               <w:left w:val="single" w:color="B7C3D0" w:sz="4"/>
@@ -3130,7 +3110,7 @@
         </w:tc>
         <w:tc>
           <w:tcPr>
-            <w:tcW w:type="dxa" w:w="1810"/>
+            <w:tcW w:type="dxa" w:w="1781"/>
             <w:tcBorders>
               <w:top w:val="single" w:color="B7C3D0" w:sz="4"/>
               <w:left w:val="single" w:color="B7C3D0" w:sz="4"/>
@@ -3165,7 +3145,7 @@
         </w:tc>
         <w:tc>
           <w:tcPr>
-            <w:tcW w:type="dxa" w:w="1810"/>
+            <w:tcW w:type="dxa" w:w="1781"/>
             <w:tcBorders>
               <w:top w:val="single" w:color="B7C3D0" w:sz="4"/>
               <w:left w:val="single" w:color="B7C3D0" w:sz="4"/>
@@ -3200,7 +3180,7 @@
         </w:tc>
         <w:tc>
           <w:tcPr>
-            <w:tcW w:type="dxa" w:w="1810"/>
+            <w:tcW w:type="dxa" w:w="1781"/>
             <w:tcBorders>
               <w:top w:val="single" w:color="B7C3D0" w:sz="4"/>
               <w:left w:val="single" w:color="B7C3D0" w:sz="4"/>
@@ -3235,7 +3215,7 @@
         </w:tc>
         <w:tc>
           <w:tcPr>
-            <w:tcW w:type="dxa" w:w="1810"/>
+            <w:tcW w:type="dxa" w:w="1781"/>
             <w:tcBorders>
               <w:top w:val="single" w:color="B7C3D0" w:sz="4"/>
               <w:left w:val="single" w:color="B7C3D0" w:sz="4"/>
@@ -3270,7 +3250,7 @@
         </w:tc>
         <w:tc>
           <w:tcPr>
-            <w:tcW w:type="dxa" w:w="1810"/>
+            <w:tcW w:type="dxa" w:w="1784"/>
             <w:tcBorders>
               <w:top w:val="single" w:color="B7C3D0" w:sz="4"/>
               <w:left w:val="single" w:color="B7C3D0" w:sz="4"/>
@@ -3310,14 +3290,14 @@
         </w:trPr>
         <w:tc>
           <w:tcPr>
-            <w:tcW w:type="dxa" w:w="1900"/>
-            <w:tcBorders>
-              <w:top w:val="single" w:color="B7C3D0" w:sz="4"/>
-              <w:left w:val="single" w:color="B7C3D0" w:sz="4"/>
-              <w:bottom w:val="single" w:color="B7C3D0" w:sz="4"/>
-              <w:right w:val="single" w:color="B7C3D0" w:sz="4"/>
-            </w:tcBorders>
-            <w:shd w:fill="EEF2F7" w:color="auto" w:val="clear"/>
+            <w:tcW w:type="dxa" w:w="2100"/>
+            <w:tcBorders>
+              <w:top w:val="single" w:color="B7C3D0" w:sz="4"/>
+              <w:left w:val="single" w:color="B7C3D0" w:sz="4"/>
+              <w:bottom w:val="single" w:color="B7C3D0" w:sz="4"/>
+              <w:right w:val="single" w:color="B7C3D0" w:sz="4"/>
+            </w:tcBorders>
+            <w:shd w:fill="D9E2EF" w:color="auto" w:val="clear"/>
             <w:tcMar>
               <w:top w:type="dxa" w:w="50"/>
               <w:left w:type="dxa" w:w="70"/>
@@ -3339,427 +3319,304 @@
                 <w:sz w:val="16"/>
                 <w:szCs w:val="16"/>
               </w:rPr>
-              <w:t xml:space="preserve">Semaine d'entreprise (15 h)</w:t>
-            </w:r>
-          </w:p>
-        </w:tc>
-        <w:tc>
-          <w:tcPr>
-            <w:tcW w:type="dxa" w:w="1810"/>
-            <w:tcBorders>
-              <w:top w:val="single" w:color="B7C3D0" w:sz="4"/>
-              <w:left w:val="single" w:color="B7C3D0" w:sz="4"/>
-              <w:bottom w:val="single" w:color="B7C3D0" w:sz="4"/>
-              <w:right w:val="single" w:color="B7C3D0" w:sz="4"/>
-            </w:tcBorders>
-            <w:shd w:fill="DCEAFB" w:color="auto" w:val="clear"/>
-            <w:tcMar>
-              <w:top w:type="dxa" w:w="70"/>
-              <w:left w:type="dxa" w:w="90"/>
-              <w:bottom w:type="dxa" w:w="50"/>
-              <w:right w:type="dxa" w:w="70"/>
-            </w:tcMar>
-            <w:vAlign w:val="top"/>
-          </w:tcPr>
-          <w:p>
-            <w:pPr>
-              <w:keepNext/>
-              <w:spacing w:after="0"/>
+              <w:t xml:space="preserve">Octobre à mi-décembre 2026</w:t>
+            </w:r>
+          </w:p>
+          <w:p>
+            <w:pPr>
+              <w:spacing w:after="20"/>
+              <w:jc w:val="left"/>
             </w:pPr>
             <w:r>
               <w:rPr>
                 <w:rFonts w:ascii="Calibri" w:cs="Calibri" w:eastAsia="Calibri" w:hAnsi="Calibri"/>
                 <w:b/>
                 <w:bCs/>
-                <w:color w:val="1F3A5F"/>
-                <w:sz w:val="17"/>
-                <w:szCs w:val="17"/>
-              </w:rPr>
-              <w:t xml:space="preserve">18:00-20:00</w:t>
-            </w:r>
-          </w:p>
-          <w:p>
-            <w:pPr>
-              <w:spacing w:after="70"/>
-            </w:pPr>
-            <w:r>
-              <w:rPr>
-                <w:rFonts w:ascii="Calibri" w:cs="Calibri" w:eastAsia="Calibri" w:hAnsi="Calibri"/>
-                <w:sz w:val="19"/>
-                <w:szCs w:val="19"/>
-              </w:rPr>
-              <w:t xml:space="preserve">BSCP (2 h)</w:t>
-            </w:r>
-          </w:p>
-        </w:tc>
-        <w:tc>
-          <w:tcPr>
-            <w:tcW w:type="dxa" w:w="1810"/>
-            <w:tcBorders>
-              <w:top w:val="single" w:color="B7C3D0" w:sz="4"/>
-              <w:left w:val="single" w:color="B7C3D0" w:sz="4"/>
-              <w:bottom w:val="single" w:color="B7C3D0" w:sz="4"/>
-              <w:right w:val="single" w:color="B7C3D0" w:sz="4"/>
-            </w:tcBorders>
-            <w:shd w:fill="FBE0D5" w:color="auto" w:val="clear"/>
-            <w:tcMar>
-              <w:top w:type="dxa" w:w="70"/>
-              <w:left w:type="dxa" w:w="90"/>
-              <w:bottom w:type="dxa" w:w="50"/>
+                <w:color w:val="000000"/>
+                <w:sz w:val="16"/>
+                <w:szCs w:val="16"/>
+              </w:rPr>
+              <w:t xml:space="preserve">(phase en cours)</w:t>
+            </w:r>
+          </w:p>
+        </w:tc>
+        <w:tc>
+          <w:tcPr>
+            <w:tcW w:type="dxa" w:w="1781"/>
+            <w:tcBorders>
+              <w:top w:val="single" w:color="B7C3D0" w:sz="4"/>
+              <w:left w:val="single" w:color="B7C3D0" w:sz="4"/>
+              <w:bottom w:val="single" w:color="B7C3D0" w:sz="4"/>
+              <w:right w:val="single" w:color="B7C3D0" w:sz="4"/>
+            </w:tcBorders>
+            <w:shd w:fill="DCEAFB" w:color="auto" w:val="clear"/>
+            <w:tcMar>
+              <w:top w:type="dxa" w:w="90"/>
+              <w:left w:type="dxa" w:w="100"/>
+              <w:bottom w:type="dxa" w:w="70"/>
               <w:right w:type="dxa" w:w="70"/>
             </w:tcMar>
             <w:vAlign w:val="top"/>
           </w:tcPr>
           <w:p>
             <w:pPr>
-              <w:keepNext/>
-              <w:spacing w:after="0"/>
+              <w:spacing w:after="30"/>
             </w:pPr>
             <w:r>
               <w:rPr>
                 <w:rFonts w:ascii="Calibri" w:cs="Calibri" w:eastAsia="Calibri" w:hAnsi="Calibri"/>
                 <w:b/>
                 <w:bCs/>
-                <w:color w:val="1F3A5F"/>
-                <w:sz w:val="17"/>
-                <w:szCs w:val="17"/>
-              </w:rPr>
-              <w:t xml:space="preserve">18:00-20:30</w:t>
-            </w:r>
-          </w:p>
-          <w:p>
-            <w:pPr>
-              <w:spacing w:after="70"/>
-            </w:pPr>
-            <w:r>
-              <w:rPr>
-                <w:rFonts w:ascii="Calibri" w:cs="Calibri" w:eastAsia="Calibri" w:hAnsi="Calibri"/>
-                <w:sz w:val="19"/>
-                <w:szCs w:val="19"/>
-              </w:rPr>
-              <w:t xml:space="preserve">Lab (2 h 30)</w:t>
-            </w:r>
-          </w:p>
-        </w:tc>
-        <w:tc>
-          <w:tcPr>
-            <w:tcW w:type="dxa" w:w="1810"/>
-            <w:tcBorders>
-              <w:top w:val="single" w:color="B7C3D0" w:sz="4"/>
-              <w:left w:val="single" w:color="B7C3D0" w:sz="4"/>
-              <w:bottom w:val="single" w:color="B7C3D0" w:sz="4"/>
-              <w:right w:val="single" w:color="B7C3D0" w:sz="4"/>
-            </w:tcBorders>
-            <w:shd w:fill="D5F0E6" w:color="auto" w:val="clear"/>
-            <w:tcMar>
-              <w:top w:type="dxa" w:w="70"/>
-              <w:left w:type="dxa" w:w="90"/>
-              <w:bottom w:type="dxa" w:w="50"/>
+                <w:color w:val="000000"/>
+                <w:sz w:val="20"/>
+                <w:szCs w:val="20"/>
+              </w:rPr>
+              <w:t xml:space="preserve">BSCP</w:t>
+            </w:r>
+          </w:p>
+        </w:tc>
+        <w:tc>
+          <w:tcPr>
+            <w:tcW w:type="dxa" w:w="1781"/>
+            <w:tcBorders>
+              <w:top w:val="single" w:color="B7C3D0" w:sz="4"/>
+              <w:left w:val="single" w:color="B7C3D0" w:sz="4"/>
+              <w:bottom w:val="single" w:color="B7C3D0" w:sz="4"/>
+              <w:right w:val="single" w:color="B7C3D0" w:sz="4"/>
+            </w:tcBorders>
+            <w:shd w:fill="FBE0D5" w:color="auto" w:val="clear"/>
+            <w:tcMar>
+              <w:top w:type="dxa" w:w="90"/>
+              <w:left w:type="dxa" w:w="100"/>
+              <w:bottom w:type="dxa" w:w="70"/>
               <w:right w:type="dxa" w:w="70"/>
             </w:tcMar>
             <w:vAlign w:val="top"/>
           </w:tcPr>
           <w:p>
             <w:pPr>
-              <w:keepNext/>
-              <w:spacing w:after="0"/>
+              <w:spacing w:after="30"/>
             </w:pPr>
             <w:r>
               <w:rPr>
                 <w:rFonts w:ascii="Calibri" w:cs="Calibri" w:eastAsia="Calibri" w:hAnsi="Calibri"/>
                 <w:b/>
                 <w:bCs/>
-                <w:color w:val="1F3A5F"/>
-                <w:sz w:val="17"/>
-                <w:szCs w:val="17"/>
-              </w:rPr>
-              <w:t xml:space="preserve">18:00-19:30</w:t>
-            </w:r>
-          </w:p>
-          <w:p>
-            <w:pPr>
-              <w:spacing w:after="70"/>
-            </w:pPr>
-            <w:r>
-              <w:rPr>
-                <w:rFonts w:ascii="Calibri" w:cs="Calibri" w:eastAsia="Calibri" w:hAnsi="Calibri"/>
-                <w:sz w:val="19"/>
-                <w:szCs w:val="19"/>
-              </w:rPr>
-              <w:t xml:space="preserve">C, Sektor7 (1 h 30)</w:t>
-            </w:r>
-          </w:p>
-          <w:p>
-            <w:pPr>
-              <w:keepNext/>
-              <w:spacing w:after="0"/>
+                <w:color w:val="000000"/>
+                <w:sz w:val="20"/>
+                <w:szCs w:val="20"/>
+              </w:rPr>
+              <w:t xml:space="preserve">Lab</w:t>
+            </w:r>
+          </w:p>
+        </w:tc>
+        <w:tc>
+          <w:tcPr>
+            <w:tcW w:type="dxa" w:w="1781"/>
+            <w:tcBorders>
+              <w:top w:val="single" w:color="B7C3D0" w:sz="4"/>
+              <w:left w:val="single" w:color="B7C3D0" w:sz="4"/>
+              <w:bottom w:val="single" w:color="B7C3D0" w:sz="4"/>
+              <w:right w:val="single" w:color="B7C3D0" w:sz="4"/>
+            </w:tcBorders>
+            <w:shd w:fill="D5F0E6" w:color="auto" w:val="clear"/>
+            <w:tcMar>
+              <w:top w:type="dxa" w:w="90"/>
+              <w:left w:type="dxa" w:w="100"/>
+              <w:bottom w:type="dxa" w:w="70"/>
+              <w:right w:type="dxa" w:w="70"/>
+            </w:tcMar>
+            <w:vAlign w:val="top"/>
+          </w:tcPr>
+          <w:p>
+            <w:pPr>
+              <w:spacing w:after="30"/>
             </w:pPr>
             <w:r>
               <w:rPr>
                 <w:rFonts w:ascii="Calibri" w:cs="Calibri" w:eastAsia="Calibri" w:hAnsi="Calibri"/>
                 <w:b/>
                 <w:bCs/>
-                <w:color w:val="1F3A5F"/>
-                <w:sz w:val="17"/>
-                <w:szCs w:val="17"/>
-              </w:rPr>
-              <w:t xml:space="preserve">19:30-20:00</w:t>
-            </w:r>
-          </w:p>
-          <w:p>
-            <w:pPr>
-              <w:spacing w:after="70"/>
-            </w:pPr>
-            <w:r>
-              <w:rPr>
-                <w:rFonts w:ascii="Calibri" w:cs="Calibri" w:eastAsia="Calibri" w:hAnsi="Calibri"/>
-                <w:sz w:val="19"/>
-                <w:szCs w:val="19"/>
-              </w:rPr>
-              <w:t xml:space="preserve">École (30 min)</w:t>
-            </w:r>
-          </w:p>
-        </w:tc>
-        <w:tc>
-          <w:tcPr>
-            <w:tcW w:type="dxa" w:w="1810"/>
-            <w:tcBorders>
-              <w:top w:val="single" w:color="B7C3D0" w:sz="4"/>
-              <w:left w:val="single" w:color="B7C3D0" w:sz="4"/>
-              <w:bottom w:val="single" w:color="B7C3D0" w:sz="4"/>
-              <w:right w:val="single" w:color="B7C3D0" w:sz="4"/>
-            </w:tcBorders>
-            <w:shd w:fill="DCEAFB" w:color="auto" w:val="clear"/>
-            <w:tcMar>
-              <w:top w:type="dxa" w:w="70"/>
-              <w:left w:type="dxa" w:w="90"/>
-              <w:bottom w:type="dxa" w:w="50"/>
-              <w:right w:type="dxa" w:w="70"/>
-            </w:tcMar>
-            <w:vAlign w:val="top"/>
-          </w:tcPr>
-          <w:p>
-            <w:pPr>
-              <w:keepNext/>
-              <w:spacing w:after="0"/>
+                <w:color w:val="000000"/>
+                <w:sz w:val="20"/>
+                <w:szCs w:val="20"/>
+              </w:rPr>
+              <w:t xml:space="preserve">C, Sektor7</w:t>
+            </w:r>
+          </w:p>
+          <w:p>
+            <w:pPr>
+              <w:spacing w:after="30"/>
             </w:pPr>
             <w:r>
               <w:rPr>
                 <w:rFonts w:ascii="Calibri" w:cs="Calibri" w:eastAsia="Calibri" w:hAnsi="Calibri"/>
                 <w:b/>
                 <w:bCs/>
-                <w:color w:val="1F3A5F"/>
-                <w:sz w:val="17"/>
-                <w:szCs w:val="17"/>
-              </w:rPr>
-              <w:t xml:space="preserve">18:00-20:00</w:t>
-            </w:r>
-          </w:p>
-          <w:p>
-            <w:pPr>
-              <w:spacing w:after="70"/>
-            </w:pPr>
-            <w:r>
-              <w:rPr>
-                <w:rFonts w:ascii="Calibri" w:cs="Calibri" w:eastAsia="Calibri" w:hAnsi="Calibri"/>
-                <w:sz w:val="19"/>
-                <w:szCs w:val="19"/>
-              </w:rPr>
-              <w:t xml:space="preserve">BSCP (2 h)</w:t>
-            </w:r>
-          </w:p>
-        </w:tc>
-        <w:tc>
-          <w:tcPr>
-            <w:tcW w:type="dxa" w:w="1810"/>
-            <w:tcBorders>
-              <w:top w:val="single" w:color="B7C3D0" w:sz="4"/>
-              <w:left w:val="single" w:color="B7C3D0" w:sz="4"/>
-              <w:bottom w:val="single" w:color="B7C3D0" w:sz="4"/>
-              <w:right w:val="single" w:color="B7C3D0" w:sz="4"/>
-            </w:tcBorders>
-            <w:shd w:fill="F6D5E2" w:color="auto" w:val="clear"/>
-            <w:tcMar>
-              <w:top w:type="dxa" w:w="70"/>
-              <w:left w:type="dxa" w:w="90"/>
-              <w:bottom w:type="dxa" w:w="50"/>
+                <w:color w:val="000000"/>
+                <w:sz w:val="20"/>
+                <w:szCs w:val="20"/>
+              </w:rPr>
+              <w:t xml:space="preserve">École</w:t>
+            </w:r>
+          </w:p>
+        </w:tc>
+        <w:tc>
+          <w:tcPr>
+            <w:tcW w:type="dxa" w:w="1781"/>
+            <w:tcBorders>
+              <w:top w:val="single" w:color="B7C3D0" w:sz="4"/>
+              <w:left w:val="single" w:color="B7C3D0" w:sz="4"/>
+              <w:bottom w:val="single" w:color="B7C3D0" w:sz="4"/>
+              <w:right w:val="single" w:color="B7C3D0" w:sz="4"/>
+            </w:tcBorders>
+            <w:shd w:fill="DCEAFB" w:color="auto" w:val="clear"/>
+            <w:tcMar>
+              <w:top w:type="dxa" w:w="90"/>
+              <w:left w:type="dxa" w:w="100"/>
+              <w:bottom w:type="dxa" w:w="70"/>
               <w:right w:type="dxa" w:w="70"/>
             </w:tcMar>
             <w:vAlign w:val="top"/>
           </w:tcPr>
           <w:p>
             <w:pPr>
-              <w:keepNext/>
-              <w:spacing w:after="0"/>
+              <w:spacing w:after="30"/>
             </w:pPr>
             <w:r>
               <w:rPr>
                 <w:rFonts w:ascii="Calibri" w:cs="Calibri" w:eastAsia="Calibri" w:hAnsi="Calibri"/>
                 <w:b/>
                 <w:bCs/>
-                <w:color w:val="1F3A5F"/>
-                <w:sz w:val="17"/>
-                <w:szCs w:val="17"/>
-              </w:rPr>
-              <w:t xml:space="preserve">18:00-18:30</w:t>
-            </w:r>
-          </w:p>
-          <w:p>
-            <w:pPr>
-              <w:spacing w:after="70"/>
-            </w:pPr>
-            <w:r>
-              <w:rPr>
-                <w:rFonts w:ascii="Calibri" w:cs="Calibri" w:eastAsia="Calibri" w:hAnsi="Calibri"/>
-                <w:sz w:val="19"/>
-                <w:szCs w:val="19"/>
-              </w:rPr>
-              <w:t xml:space="preserve">École (30 min)</w:t>
-            </w:r>
-          </w:p>
-          <w:p>
-            <w:pPr>
-              <w:keepNext/>
-              <w:spacing w:after="0"/>
+                <w:color w:val="000000"/>
+                <w:sz w:val="20"/>
+                <w:szCs w:val="20"/>
+              </w:rPr>
+              <w:t xml:space="preserve">BSCP</w:t>
+            </w:r>
+          </w:p>
+        </w:tc>
+        <w:tc>
+          <w:tcPr>
+            <w:tcW w:type="dxa" w:w="1781"/>
+            <w:tcBorders>
+              <w:top w:val="single" w:color="B7C3D0" w:sz="4"/>
+              <w:left w:val="single" w:color="B7C3D0" w:sz="4"/>
+              <w:bottom w:val="single" w:color="B7C3D0" w:sz="4"/>
+              <w:right w:val="single" w:color="B7C3D0" w:sz="4"/>
+            </w:tcBorders>
+            <w:shd w:fill="F6D5E2" w:color="auto" w:val="clear"/>
+            <w:tcMar>
+              <w:top w:type="dxa" w:w="90"/>
+              <w:left w:type="dxa" w:w="100"/>
+              <w:bottom w:type="dxa" w:w="70"/>
+              <w:right w:type="dxa" w:w="70"/>
+            </w:tcMar>
+            <w:vAlign w:val="top"/>
+          </w:tcPr>
+          <w:p>
+            <w:pPr>
+              <w:spacing w:after="30"/>
             </w:pPr>
             <w:r>
               <w:rPr>
                 <w:rFonts w:ascii="Calibri" w:cs="Calibri" w:eastAsia="Calibri" w:hAnsi="Calibri"/>
                 <w:b/>
                 <w:bCs/>
-                <w:color w:val="1F3A5F"/>
-                <w:sz w:val="17"/>
-                <w:szCs w:val="17"/>
-              </w:rPr>
-              <w:t xml:space="preserve">18:30-19:00</w:t>
-            </w:r>
-          </w:p>
-          <w:p>
-            <w:pPr>
-              <w:spacing w:after="70"/>
-            </w:pPr>
-            <w:r>
-              <w:rPr>
-                <w:rFonts w:ascii="Calibri" w:cs="Calibri" w:eastAsia="Calibri" w:hAnsi="Calibri"/>
-                <w:sz w:val="19"/>
-                <w:szCs w:val="19"/>
-              </w:rPr>
-              <w:t xml:space="preserve">Revue (30 min)</w:t>
-            </w:r>
-          </w:p>
-        </w:tc>
-        <w:tc>
-          <w:tcPr>
-            <w:tcW w:type="dxa" w:w="1810"/>
-            <w:tcBorders>
-              <w:top w:val="single" w:color="B7C3D0" w:sz="4"/>
-              <w:left w:val="single" w:color="B7C3D0" w:sz="4"/>
-              <w:bottom w:val="single" w:color="B7C3D0" w:sz="4"/>
-              <w:right w:val="single" w:color="B7C3D0" w:sz="4"/>
-            </w:tcBorders>
-            <w:shd w:fill="FBE0D5" w:color="auto" w:val="clear"/>
-            <w:tcMar>
-              <w:top w:type="dxa" w:w="70"/>
-              <w:left w:type="dxa" w:w="90"/>
-              <w:bottom w:type="dxa" w:w="50"/>
-              <w:right w:type="dxa" w:w="70"/>
-            </w:tcMar>
-            <w:vAlign w:val="top"/>
-          </w:tcPr>
-          <w:p>
-            <w:pPr>
-              <w:keepNext/>
-              <w:spacing w:after="0"/>
+                <w:color w:val="000000"/>
+                <w:sz w:val="20"/>
+                <w:szCs w:val="20"/>
+              </w:rPr>
+              <w:t xml:space="preserve">École</w:t>
+            </w:r>
+          </w:p>
+          <w:p>
+            <w:pPr>
+              <w:spacing w:after="30"/>
             </w:pPr>
             <w:r>
               <w:rPr>
                 <w:rFonts w:ascii="Calibri" w:cs="Calibri" w:eastAsia="Calibri" w:hAnsi="Calibri"/>
                 <w:b/>
                 <w:bCs/>
-                <w:color w:val="1F3A5F"/>
-                <w:sz w:val="17"/>
-                <w:szCs w:val="17"/>
-              </w:rPr>
-              <w:t xml:space="preserve">09:00-11:00</w:t>
-            </w:r>
-          </w:p>
-          <w:p>
-            <w:pPr>
-              <w:spacing w:after="70"/>
-            </w:pPr>
-            <w:r>
-              <w:rPr>
-                <w:rFonts w:ascii="Calibri" w:cs="Calibri" w:eastAsia="Calibri" w:hAnsi="Calibri"/>
-                <w:sz w:val="19"/>
-                <w:szCs w:val="19"/>
-              </w:rPr>
-              <w:t xml:space="preserve">BSCP (2 h)</w:t>
-            </w:r>
-          </w:p>
-          <w:p>
-            <w:pPr>
-              <w:keepNext/>
-              <w:spacing w:after="0"/>
+                <w:color w:val="000000"/>
+                <w:sz w:val="20"/>
+                <w:szCs w:val="20"/>
+              </w:rPr>
+              <w:t xml:space="preserve">Revue</w:t>
+            </w:r>
+          </w:p>
+        </w:tc>
+        <w:tc>
+          <w:tcPr>
+            <w:tcW w:type="dxa" w:w="1781"/>
+            <w:tcBorders>
+              <w:top w:val="single" w:color="B7C3D0" w:sz="4"/>
+              <w:left w:val="single" w:color="B7C3D0" w:sz="4"/>
+              <w:bottom w:val="single" w:color="B7C3D0" w:sz="4"/>
+              <w:right w:val="single" w:color="B7C3D0" w:sz="4"/>
+            </w:tcBorders>
+            <w:shd w:fill="FBE0D5" w:color="auto" w:val="clear"/>
+            <w:tcMar>
+              <w:top w:type="dxa" w:w="90"/>
+              <w:left w:type="dxa" w:w="100"/>
+              <w:bottom w:type="dxa" w:w="70"/>
+              <w:right w:type="dxa" w:w="70"/>
+            </w:tcMar>
+            <w:vAlign w:val="top"/>
+          </w:tcPr>
+          <w:p>
+            <w:pPr>
+              <w:spacing w:after="30"/>
             </w:pPr>
             <w:r>
               <w:rPr>
                 <w:rFonts w:ascii="Calibri" w:cs="Calibri" w:eastAsia="Calibri" w:hAnsi="Calibri"/>
                 <w:b/>
                 <w:bCs/>
-                <w:color w:val="1F3A5F"/>
-                <w:sz w:val="17"/>
-                <w:szCs w:val="17"/>
-              </w:rPr>
-              <w:t xml:space="preserve">11:15-13:45</w:t>
-            </w:r>
-          </w:p>
-          <w:p>
-            <w:pPr>
-              <w:spacing w:after="70"/>
-            </w:pPr>
-            <w:r>
-              <w:rPr>
-                <w:rFonts w:ascii="Calibri" w:cs="Calibri" w:eastAsia="Calibri" w:hAnsi="Calibri"/>
-                <w:sz w:val="19"/>
-                <w:szCs w:val="19"/>
-              </w:rPr>
-              <w:t xml:space="preserve">Lab (2 h 30)</w:t>
-            </w:r>
-          </w:p>
-          <w:p>
-            <w:pPr>
-              <w:keepNext/>
-              <w:spacing w:after="0"/>
+                <w:color w:val="000000"/>
+                <w:sz w:val="20"/>
+                <w:szCs w:val="20"/>
+              </w:rPr>
+              <w:t xml:space="preserve">BSCP</w:t>
+            </w:r>
+          </w:p>
+          <w:p>
+            <w:pPr>
+              <w:spacing w:after="30"/>
             </w:pPr>
             <w:r>
               <w:rPr>
                 <w:rFonts w:ascii="Calibri" w:cs="Calibri" w:eastAsia="Calibri" w:hAnsi="Calibri"/>
                 <w:b/>
                 <w:bCs/>
-                <w:color w:val="1F3A5F"/>
-                <w:sz w:val="17"/>
-                <w:szCs w:val="17"/>
-              </w:rPr>
-              <w:t xml:space="preserve">14:00-15:00</w:t>
-            </w:r>
-          </w:p>
-          <w:p>
-            <w:pPr>
-              <w:spacing w:after="70"/>
-            </w:pPr>
-            <w:r>
-              <w:rPr>
-                <w:rFonts w:ascii="Calibri" w:cs="Calibri" w:eastAsia="Calibri" w:hAnsi="Calibri"/>
-                <w:sz w:val="19"/>
-                <w:szCs w:val="19"/>
-              </w:rPr>
-              <w:t xml:space="preserve">C (1 h)</w:t>
-            </w:r>
-          </w:p>
-        </w:tc>
-        <w:tc>
-          <w:tcPr>
-            <w:tcW w:type="dxa" w:w="1810"/>
+                <w:color w:val="000000"/>
+                <w:sz w:val="20"/>
+                <w:szCs w:val="20"/>
+              </w:rPr>
+              <w:t xml:space="preserve">Lab</w:t>
+            </w:r>
+          </w:p>
+          <w:p>
+            <w:pPr>
+              <w:spacing w:after="30"/>
+            </w:pPr>
+            <w:r>
+              <w:rPr>
+                <w:rFonts w:ascii="Calibri" w:cs="Calibri" w:eastAsia="Calibri" w:hAnsi="Calibri"/>
+                <w:b/>
+                <w:bCs/>
+                <w:color w:val="000000"/>
+                <w:sz w:val="20"/>
+                <w:szCs w:val="20"/>
+              </w:rPr>
+              <w:t xml:space="preserve">C</w:t>
+            </w:r>
+          </w:p>
+        </w:tc>
+        <w:tc>
+          <w:tcPr>
+            <w:tcW w:type="dxa" w:w="1784"/>
             <w:tcBorders>
               <w:top w:val="single" w:color="B7C3D0" w:sz="4"/>
               <w:left w:val="single" w:color="B7C3D0" w:sz="4"/>
@@ -3768,20 +3625,25 @@
             </w:tcBorders>
             <w:shd w:fill="F4F3F0" w:color="auto" w:val="clear"/>
             <w:tcMar>
-              <w:top w:type="dxa" w:w="70"/>
-              <w:left w:type="dxa" w:w="90"/>
-              <w:bottom w:type="dxa" w:w="50"/>
+              <w:top w:type="dxa" w:w="90"/>
+              <w:left w:type="dxa" w:w="100"/>
+              <w:bottom w:type="dxa" w:w="70"/>
               <w:right w:type="dxa" w:w="70"/>
             </w:tcMar>
             <w:vAlign w:val="top"/>
           </w:tcPr>
           <w:p>
-            <w:r>
-              <w:rPr>
-                <w:rFonts w:ascii="Calibri" w:cs="Calibri" w:eastAsia="Calibri" w:hAnsi="Calibri"/>
+            <w:pPr>
+              <w:spacing w:after="30"/>
+            </w:pPr>
+            <w:r>
+              <w:rPr>
+                <w:rFonts w:ascii="Calibri" w:cs="Calibri" w:eastAsia="Calibri" w:hAnsi="Calibri"/>
+                <w:b w:val="false"/>
+                <w:bCs w:val="false"/>
                 <w:color w:val="777777"/>
-                <w:sz w:val="19"/>
-                <w:szCs w:val="19"/>
+                <w:sz w:val="20"/>
+                <w:szCs w:val="20"/>
               </w:rPr>
               <w:t xml:space="preserve">Libre</w:t>
             </w:r>
@@ -3794,7 +3656,7 @@
         </w:trPr>
         <w:tc>
           <w:tcPr>
-            <w:tcW w:type="dxa" w:w="1900"/>
+            <w:tcW w:type="dxa" w:w="2100"/>
             <w:tcBorders>
               <w:top w:val="single" w:color="B7C3D0" w:sz="4"/>
               <w:left w:val="single" w:color="B7C3D0" w:sz="4"/>
@@ -3823,13 +3685,13 @@
                 <w:sz w:val="16"/>
                 <w:szCs w:val="16"/>
               </w:rPr>
-              <w:t xml:space="preserve">Semaine d'école (9 h 30)</w:t>
-            </w:r>
-          </w:p>
-        </w:tc>
-        <w:tc>
-          <w:tcPr>
-            <w:tcW w:type="dxa" w:w="1810"/>
+              <w:t xml:space="preserve">Mi-décembre 2026 à début février 2027 (BSCP)</w:t>
+            </w:r>
+          </w:p>
+        </w:tc>
+        <w:tc>
+          <w:tcPr>
+            <w:tcW w:type="dxa" w:w="1781"/>
             <w:tcBorders>
               <w:top w:val="single" w:color="B7C3D0" w:sz="4"/>
               <w:left w:val="single" w:color="B7C3D0" w:sz="4"/>
@@ -3838,77 +3700,68 @@
             </w:tcBorders>
             <w:shd w:fill="DCEAFB" w:color="auto" w:val="clear"/>
             <w:tcMar>
-              <w:top w:type="dxa" w:w="70"/>
-              <w:left w:type="dxa" w:w="90"/>
-              <w:bottom w:type="dxa" w:w="50"/>
+              <w:top w:type="dxa" w:w="90"/>
+              <w:left w:type="dxa" w:w="100"/>
+              <w:bottom w:type="dxa" w:w="70"/>
               <w:right w:type="dxa" w:w="70"/>
             </w:tcMar>
             <w:vAlign w:val="top"/>
           </w:tcPr>
           <w:p>
             <w:pPr>
-              <w:keepNext/>
-              <w:spacing w:after="0"/>
+              <w:spacing w:after="30"/>
             </w:pPr>
             <w:r>
               <w:rPr>
                 <w:rFonts w:ascii="Calibri" w:cs="Calibri" w:eastAsia="Calibri" w:hAnsi="Calibri"/>
                 <w:b/>
                 <w:bCs/>
-                <w:color w:val="1F3A5F"/>
-                <w:sz w:val="17"/>
-                <w:szCs w:val="17"/>
-              </w:rPr>
-              <w:t xml:space="preserve">18:00-19:00</w:t>
-            </w:r>
-          </w:p>
-          <w:p>
-            <w:pPr>
-              <w:spacing w:after="70"/>
-            </w:pPr>
-            <w:r>
-              <w:rPr>
-                <w:rFonts w:ascii="Calibri" w:cs="Calibri" w:eastAsia="Calibri" w:hAnsi="Calibri"/>
-                <w:sz w:val="19"/>
-                <w:szCs w:val="19"/>
-              </w:rPr>
-              <w:t xml:space="preserve">BSCP (1 h)</w:t>
-            </w:r>
-          </w:p>
-          <w:p>
-            <w:pPr>
-              <w:keepNext/>
-              <w:spacing w:after="0"/>
+                <w:color w:val="000000"/>
+                <w:sz w:val="20"/>
+                <w:szCs w:val="20"/>
+              </w:rPr>
+              <w:t xml:space="preserve">BSCP</w:t>
+            </w:r>
+          </w:p>
+        </w:tc>
+        <w:tc>
+          <w:tcPr>
+            <w:tcW w:type="dxa" w:w="1781"/>
+            <w:tcBorders>
+              <w:top w:val="single" w:color="B7C3D0" w:sz="4"/>
+              <w:left w:val="single" w:color="B7C3D0" w:sz="4"/>
+              <w:bottom w:val="single" w:color="B7C3D0" w:sz="4"/>
+              <w:right w:val="single" w:color="B7C3D0" w:sz="4"/>
+            </w:tcBorders>
+            <w:shd w:fill="DCEAFB" w:color="auto" w:val="clear"/>
+            <w:tcMar>
+              <w:top w:type="dxa" w:w="90"/>
+              <w:left w:type="dxa" w:w="100"/>
+              <w:bottom w:type="dxa" w:w="70"/>
+              <w:right w:type="dxa" w:w="70"/>
+            </w:tcMar>
+            <w:vAlign w:val="top"/>
+          </w:tcPr>
+          <w:p>
+            <w:pPr>
+              <w:spacing w:after="30"/>
             </w:pPr>
             <w:r>
               <w:rPr>
                 <w:rFonts w:ascii="Calibri" w:cs="Calibri" w:eastAsia="Calibri" w:hAnsi="Calibri"/>
                 <w:b/>
                 <w:bCs/>
-                <w:color w:val="1F3A5F"/>
-                <w:sz w:val="17"/>
-                <w:szCs w:val="17"/>
-              </w:rPr>
-              <w:t xml:space="preserve">19:00-19:30</w:t>
-            </w:r>
-          </w:p>
-          <w:p>
-            <w:pPr>
-              <w:spacing w:after="70"/>
-            </w:pPr>
-            <w:r>
-              <w:rPr>
-                <w:rFonts w:ascii="Calibri" w:cs="Calibri" w:eastAsia="Calibri" w:hAnsi="Calibri"/>
-                <w:sz w:val="19"/>
-                <w:szCs w:val="19"/>
-              </w:rPr>
-              <w:t xml:space="preserve">École (30 min)</w:t>
-            </w:r>
-          </w:p>
-        </w:tc>
-        <w:tc>
-          <w:tcPr>
-            <w:tcW w:type="dxa" w:w="1810"/>
+                <w:color w:val="000000"/>
+                <w:sz w:val="20"/>
+                <w:szCs w:val="20"/>
+              </w:rPr>
+              <w:t xml:space="preserve">BSCP</w:t>
+            </w:r>
+          </w:p>
+        </w:tc>
+        <w:tc>
+          <w:tcPr>
+            <w:tcW w:type="dxa" w:w="1781"/>
             <w:tcBorders>
               <w:top w:val="single" w:color="B7C3D0" w:sz="4"/>
               <w:left w:val="single" w:color="B7C3D0" w:sz="4"/>
@@ -3917,303 +3770,186 @@
             </w:tcBorders>
             <w:shd w:fill="FBE0D5" w:color="auto" w:val="clear"/>
             <w:tcMar>
-              <w:top w:type="dxa" w:w="70"/>
-              <w:left w:type="dxa" w:w="90"/>
-              <w:bottom w:type="dxa" w:w="50"/>
+              <w:top w:type="dxa" w:w="90"/>
+              <w:left w:type="dxa" w:w="100"/>
+              <w:bottom w:type="dxa" w:w="70"/>
               <w:right w:type="dxa" w:w="70"/>
             </w:tcMar>
             <w:vAlign w:val="top"/>
           </w:tcPr>
           <w:p>
             <w:pPr>
-              <w:keepNext/>
-              <w:spacing w:after="0"/>
+              <w:spacing w:after="30"/>
             </w:pPr>
             <w:r>
               <w:rPr>
                 <w:rFonts w:ascii="Calibri" w:cs="Calibri" w:eastAsia="Calibri" w:hAnsi="Calibri"/>
                 <w:b/>
                 <w:bCs/>
-                <w:color w:val="1F3A5F"/>
-                <w:sz w:val="17"/>
-                <w:szCs w:val="17"/>
-              </w:rPr>
-              <w:t xml:space="preserve">18:00-19:00</w:t>
-            </w:r>
-          </w:p>
-          <w:p>
-            <w:pPr>
-              <w:spacing w:after="70"/>
-            </w:pPr>
-            <w:r>
-              <w:rPr>
-                <w:rFonts w:ascii="Calibri" w:cs="Calibri" w:eastAsia="Calibri" w:hAnsi="Calibri"/>
-                <w:sz w:val="19"/>
-                <w:szCs w:val="19"/>
-              </w:rPr>
-              <w:t xml:space="preserve">Lab (1 h)</w:t>
-            </w:r>
-          </w:p>
-        </w:tc>
-        <w:tc>
-          <w:tcPr>
-            <w:tcW w:type="dxa" w:w="1810"/>
-            <w:tcBorders>
-              <w:top w:val="single" w:color="B7C3D0" w:sz="4"/>
-              <w:left w:val="single" w:color="B7C3D0" w:sz="4"/>
-              <w:bottom w:val="single" w:color="B7C3D0" w:sz="4"/>
-              <w:right w:val="single" w:color="B7C3D0" w:sz="4"/>
-            </w:tcBorders>
-            <w:shd w:fill="D5F0E6" w:color="auto" w:val="clear"/>
-            <w:tcMar>
-              <w:top w:type="dxa" w:w="70"/>
-              <w:left w:type="dxa" w:w="90"/>
-              <w:bottom w:type="dxa" w:w="50"/>
-              <w:right w:type="dxa" w:w="70"/>
-            </w:tcMar>
-            <w:vAlign w:val="top"/>
-          </w:tcPr>
-          <w:p>
-            <w:pPr>
-              <w:keepNext/>
-              <w:spacing w:after="0"/>
+                <w:color w:val="000000"/>
+                <w:sz w:val="20"/>
+                <w:szCs w:val="20"/>
+              </w:rPr>
+              <w:t xml:space="preserve">Lab</w:t>
+            </w:r>
+          </w:p>
+          <w:p>
+            <w:pPr>
+              <w:spacing w:after="30"/>
             </w:pPr>
             <w:r>
               <w:rPr>
                 <w:rFonts w:ascii="Calibri" w:cs="Calibri" w:eastAsia="Calibri" w:hAnsi="Calibri"/>
                 <w:b/>
                 <w:bCs/>
-                <w:color w:val="1F3A5F"/>
-                <w:sz w:val="17"/>
-                <w:szCs w:val="17"/>
-              </w:rPr>
-              <w:t xml:space="preserve">18:00-19:00</w:t>
-            </w:r>
-          </w:p>
-          <w:p>
-            <w:pPr>
-              <w:spacing w:after="70"/>
-            </w:pPr>
-            <w:r>
-              <w:rPr>
-                <w:rFonts w:ascii="Calibri" w:cs="Calibri" w:eastAsia="Calibri" w:hAnsi="Calibri"/>
-                <w:sz w:val="19"/>
-                <w:szCs w:val="19"/>
-              </w:rPr>
-              <w:t xml:space="preserve">C, Sektor7 (1 h)</w:t>
-            </w:r>
-          </w:p>
-        </w:tc>
-        <w:tc>
-          <w:tcPr>
-            <w:tcW w:type="dxa" w:w="1810"/>
-            <w:tcBorders>
-              <w:top w:val="single" w:color="B7C3D0" w:sz="4"/>
-              <w:left w:val="single" w:color="B7C3D0" w:sz="4"/>
-              <w:bottom w:val="single" w:color="B7C3D0" w:sz="4"/>
-              <w:right w:val="single" w:color="B7C3D0" w:sz="4"/>
-            </w:tcBorders>
-            <w:shd w:fill="F6D5E2" w:color="auto" w:val="clear"/>
-            <w:tcMar>
-              <w:top w:type="dxa" w:w="70"/>
-              <w:left w:type="dxa" w:w="90"/>
-              <w:bottom w:type="dxa" w:w="50"/>
+                <w:color w:val="000000"/>
+                <w:sz w:val="20"/>
+                <w:szCs w:val="20"/>
+              </w:rPr>
+              <w:t xml:space="preserve">École</w:t>
+            </w:r>
+          </w:p>
+        </w:tc>
+        <w:tc>
+          <w:tcPr>
+            <w:tcW w:type="dxa" w:w="1781"/>
+            <w:tcBorders>
+              <w:top w:val="single" w:color="B7C3D0" w:sz="4"/>
+              <w:left w:val="single" w:color="B7C3D0" w:sz="4"/>
+              <w:bottom w:val="single" w:color="B7C3D0" w:sz="4"/>
+              <w:right w:val="single" w:color="B7C3D0" w:sz="4"/>
+            </w:tcBorders>
+            <w:shd w:fill="DCEAFB" w:color="auto" w:val="clear"/>
+            <w:tcMar>
+              <w:top w:type="dxa" w:w="90"/>
+              <w:left w:type="dxa" w:w="100"/>
+              <w:bottom w:type="dxa" w:w="70"/>
               <w:right w:type="dxa" w:w="70"/>
             </w:tcMar>
             <w:vAlign w:val="top"/>
           </w:tcPr>
           <w:p>
             <w:pPr>
-              <w:keepNext/>
-              <w:spacing w:after="0"/>
+              <w:spacing w:after="30"/>
             </w:pPr>
             <w:r>
               <w:rPr>
                 <w:rFonts w:ascii="Calibri" w:cs="Calibri" w:eastAsia="Calibri" w:hAnsi="Calibri"/>
                 <w:b/>
                 <w:bCs/>
-                <w:color w:val="1F3A5F"/>
-                <w:sz w:val="17"/>
-                <w:szCs w:val="17"/>
-              </w:rPr>
-              <w:t xml:space="preserve">18:00-18:30</w:t>
-            </w:r>
-          </w:p>
-          <w:p>
-            <w:pPr>
-              <w:spacing w:after="70"/>
-            </w:pPr>
-            <w:r>
-              <w:rPr>
-                <w:rFonts w:ascii="Calibri" w:cs="Calibri" w:eastAsia="Calibri" w:hAnsi="Calibri"/>
-                <w:sz w:val="19"/>
-                <w:szCs w:val="19"/>
-              </w:rPr>
-              <w:t xml:space="preserve">École (30 min)</w:t>
-            </w:r>
-          </w:p>
-          <w:p>
-            <w:pPr>
-              <w:keepNext/>
-              <w:spacing w:after="0"/>
+                <w:color w:val="000000"/>
+                <w:sz w:val="20"/>
+                <w:szCs w:val="20"/>
+              </w:rPr>
+              <w:t xml:space="preserve">BSCP</w:t>
+            </w:r>
+          </w:p>
+        </w:tc>
+        <w:tc>
+          <w:tcPr>
+            <w:tcW w:type="dxa" w:w="1781"/>
+            <w:tcBorders>
+              <w:top w:val="single" w:color="B7C3D0" w:sz="4"/>
+              <w:left w:val="single" w:color="B7C3D0" w:sz="4"/>
+              <w:bottom w:val="single" w:color="B7C3D0" w:sz="4"/>
+              <w:right w:val="single" w:color="B7C3D0" w:sz="4"/>
+            </w:tcBorders>
+            <w:shd w:fill="F6D5E2" w:color="auto" w:val="clear"/>
+            <w:tcMar>
+              <w:top w:type="dxa" w:w="90"/>
+              <w:left w:type="dxa" w:w="100"/>
+              <w:bottom w:type="dxa" w:w="70"/>
+              <w:right w:type="dxa" w:w="70"/>
+            </w:tcMar>
+            <w:vAlign w:val="top"/>
+          </w:tcPr>
+          <w:p>
+            <w:pPr>
+              <w:spacing w:after="30"/>
             </w:pPr>
             <w:r>
               <w:rPr>
                 <w:rFonts w:ascii="Calibri" w:cs="Calibri" w:eastAsia="Calibri" w:hAnsi="Calibri"/>
                 <w:b/>
                 <w:bCs/>
-                <w:color w:val="1F3A5F"/>
-                <w:sz w:val="17"/>
-                <w:szCs w:val="17"/>
-              </w:rPr>
-              <w:t xml:space="preserve">18:30-19:00</w:t>
-            </w:r>
-          </w:p>
-          <w:p>
-            <w:pPr>
-              <w:spacing w:after="70"/>
-            </w:pPr>
-            <w:r>
-              <w:rPr>
-                <w:rFonts w:ascii="Calibri" w:cs="Calibri" w:eastAsia="Calibri" w:hAnsi="Calibri"/>
-                <w:sz w:val="19"/>
-                <w:szCs w:val="19"/>
-              </w:rPr>
-              <w:t xml:space="preserve">Revue (30 min)</w:t>
-            </w:r>
-          </w:p>
-        </w:tc>
-        <w:tc>
-          <w:tcPr>
-            <w:tcW w:type="dxa" w:w="1810"/>
-            <w:tcBorders>
-              <w:top w:val="single" w:color="B7C3D0" w:sz="4"/>
-              <w:left w:val="single" w:color="B7C3D0" w:sz="4"/>
-              <w:bottom w:val="single" w:color="B7C3D0" w:sz="4"/>
-              <w:right w:val="single" w:color="B7C3D0" w:sz="4"/>
-            </w:tcBorders>
-            <w:shd w:fill="DCEAFB" w:color="auto" w:val="clear"/>
-            <w:tcMar>
-              <w:top w:type="dxa" w:w="70"/>
-              <w:left w:type="dxa" w:w="90"/>
-              <w:bottom w:type="dxa" w:w="50"/>
-              <w:right w:type="dxa" w:w="70"/>
-            </w:tcMar>
-            <w:vAlign w:val="top"/>
-          </w:tcPr>
-          <w:p>
-            <w:pPr>
-              <w:keepNext/>
-              <w:spacing w:after="0"/>
+                <w:color w:val="000000"/>
+                <w:sz w:val="20"/>
+                <w:szCs w:val="20"/>
+              </w:rPr>
+              <w:t xml:space="preserve">École</w:t>
+            </w:r>
+          </w:p>
+          <w:p>
+            <w:pPr>
+              <w:spacing w:after="30"/>
             </w:pPr>
             <w:r>
               <w:rPr>
                 <w:rFonts w:ascii="Calibri" w:cs="Calibri" w:eastAsia="Calibri" w:hAnsi="Calibri"/>
                 <w:b/>
                 <w:bCs/>
-                <w:color w:val="1F3A5F"/>
-                <w:sz w:val="17"/>
-                <w:szCs w:val="17"/>
-              </w:rPr>
-              <w:t xml:space="preserve">18:00-19:00</w:t>
-            </w:r>
-          </w:p>
-          <w:p>
-            <w:pPr>
-              <w:spacing w:after="70"/>
-            </w:pPr>
-            <w:r>
-              <w:rPr>
-                <w:rFonts w:ascii="Calibri" w:cs="Calibri" w:eastAsia="Calibri" w:hAnsi="Calibri"/>
-                <w:sz w:val="19"/>
-                <w:szCs w:val="19"/>
-              </w:rPr>
-              <w:t xml:space="preserve">BSCP (1 h)</w:t>
-            </w:r>
-          </w:p>
-        </w:tc>
-        <w:tc>
-          <w:tcPr>
-            <w:tcW w:type="dxa" w:w="1810"/>
-            <w:tcBorders>
-              <w:top w:val="single" w:color="B7C3D0" w:sz="4"/>
-              <w:left w:val="single" w:color="B7C3D0" w:sz="4"/>
-              <w:bottom w:val="single" w:color="B7C3D0" w:sz="4"/>
-              <w:right w:val="single" w:color="B7C3D0" w:sz="4"/>
-            </w:tcBorders>
-            <w:shd w:fill="DCEAFB" w:color="auto" w:val="clear"/>
-            <w:tcMar>
-              <w:top w:type="dxa" w:w="70"/>
-              <w:left w:type="dxa" w:w="90"/>
-              <w:bottom w:type="dxa" w:w="50"/>
+                <w:color w:val="000000"/>
+                <w:sz w:val="20"/>
+                <w:szCs w:val="20"/>
+              </w:rPr>
+              <w:t xml:space="preserve">Revue</w:t>
+            </w:r>
+          </w:p>
+        </w:tc>
+        <w:tc>
+          <w:tcPr>
+            <w:tcW w:type="dxa" w:w="1781"/>
+            <w:tcBorders>
+              <w:top w:val="single" w:color="B7C3D0" w:sz="4"/>
+              <w:left w:val="single" w:color="B7C3D0" w:sz="4"/>
+              <w:bottom w:val="single" w:color="B7C3D0" w:sz="4"/>
+              <w:right w:val="single" w:color="B7C3D0" w:sz="4"/>
+            </w:tcBorders>
+            <w:shd w:fill="FBE0D5" w:color="auto" w:val="clear"/>
+            <w:tcMar>
+              <w:top w:type="dxa" w:w="90"/>
+              <w:left w:type="dxa" w:w="100"/>
+              <w:bottom w:type="dxa" w:w="70"/>
               <w:right w:type="dxa" w:w="70"/>
             </w:tcMar>
             <w:vAlign w:val="top"/>
           </w:tcPr>
           <w:p>
             <w:pPr>
-              <w:keepNext/>
-              <w:spacing w:after="0"/>
+              <w:spacing w:after="30"/>
             </w:pPr>
             <w:r>
               <w:rPr>
                 <w:rFonts w:ascii="Calibri" w:cs="Calibri" w:eastAsia="Calibri" w:hAnsi="Calibri"/>
                 <w:b/>
                 <w:bCs/>
-                <w:color w:val="1F3A5F"/>
-                <w:sz w:val="17"/>
-                <w:szCs w:val="17"/>
-              </w:rPr>
-              <w:t xml:space="preserve">09:00-11:00</w:t>
-            </w:r>
-          </w:p>
-          <w:p>
-            <w:pPr>
-              <w:spacing w:after="70"/>
-            </w:pPr>
-            <w:r>
-              <w:rPr>
-                <w:rFonts w:ascii="Calibri" w:cs="Calibri" w:eastAsia="Calibri" w:hAnsi="Calibri"/>
-                <w:sz w:val="19"/>
-                <w:szCs w:val="19"/>
-              </w:rPr>
-              <w:t xml:space="preserve">BSCP (2 h)</w:t>
-            </w:r>
-          </w:p>
-          <w:p>
-            <w:pPr>
-              <w:keepNext/>
-              <w:spacing w:after="0"/>
+                <w:color w:val="000000"/>
+                <w:sz w:val="20"/>
+                <w:szCs w:val="20"/>
+              </w:rPr>
+              <w:t xml:space="preserve">BSCP</w:t>
+            </w:r>
+          </w:p>
+          <w:p>
+            <w:pPr>
+              <w:spacing w:after="30"/>
             </w:pPr>
             <w:r>
               <w:rPr>
                 <w:rFonts w:ascii="Calibri" w:cs="Calibri" w:eastAsia="Calibri" w:hAnsi="Calibri"/>
                 <w:b/>
                 <w:bCs/>
-                <w:color w:val="1F3A5F"/>
-                <w:sz w:val="17"/>
-                <w:szCs w:val="17"/>
-              </w:rPr>
-              <w:t xml:space="preserve">11:15-13:15</w:t>
-            </w:r>
-          </w:p>
-          <w:p>
-            <w:pPr>
-              <w:spacing w:after="70"/>
-            </w:pPr>
-            <w:r>
-              <w:rPr>
-                <w:rFonts w:ascii="Calibri" w:cs="Calibri" w:eastAsia="Calibri" w:hAnsi="Calibri"/>
-                <w:sz w:val="19"/>
-                <w:szCs w:val="19"/>
-              </w:rPr>
-              <w:t xml:space="preserve">Lab (2 h)</w:t>
-            </w:r>
-          </w:p>
-        </w:tc>
-        <w:tc>
-          <w:tcPr>
-            <w:tcW w:type="dxa" w:w="1810"/>
+                <w:color w:val="000000"/>
+                <w:sz w:val="20"/>
+                <w:szCs w:val="20"/>
+              </w:rPr>
+              <w:t xml:space="preserve">Lab</w:t>
+            </w:r>
+          </w:p>
+        </w:tc>
+        <w:tc>
+          <w:tcPr>
+            <w:tcW w:type="dxa" w:w="1784"/>
             <w:tcBorders>
               <w:top w:val="single" w:color="B7C3D0" w:sz="4"/>
               <w:left w:val="single" w:color="B7C3D0" w:sz="4"/>
@@ -4222,347 +3958,27 @@
             </w:tcBorders>
             <w:shd w:fill="F4F3F0" w:color="auto" w:val="clear"/>
             <w:tcMar>
-              <w:top w:type="dxa" w:w="70"/>
-              <w:left w:type="dxa" w:w="90"/>
-              <w:bottom w:type="dxa" w:w="50"/>
+              <w:top w:type="dxa" w:w="90"/>
+              <w:left w:type="dxa" w:w="100"/>
+              <w:bottom w:type="dxa" w:w="70"/>
               <w:right w:type="dxa" w:w="70"/>
             </w:tcMar>
             <w:vAlign w:val="top"/>
           </w:tcPr>
           <w:p>
-            <w:r>
-              <w:rPr>
-                <w:rFonts w:ascii="Calibri" w:cs="Calibri" w:eastAsia="Calibri" w:hAnsi="Calibri"/>
+            <w:pPr>
+              <w:spacing w:after="30"/>
+            </w:pPr>
+            <w:r>
+              <w:rPr>
+                <w:rFonts w:ascii="Calibri" w:cs="Calibri" w:eastAsia="Calibri" w:hAnsi="Calibri"/>
+                <w:b w:val="false"/>
+                <w:bCs w:val="false"/>
                 <w:color w:val="777777"/>
-                <w:sz w:val="19"/>
-                <w:szCs w:val="19"/>
+                <w:sz w:val="20"/>
+                <w:szCs w:val="20"/>
               </w:rPr>
               <w:t xml:space="preserve">Libre</w:t>
-            </w:r>
-          </w:p>
-        </w:tc>
-      </w:tr>
-    </w:tbl>
-    <w:p>
-      <w:pPr>
-        <w:spacing w:after="120"/>
-      </w:pPr>
-    </w:p>
-    <w:p>
-      <w:pPr>
-        <w:pStyle w:val="Heading3"/>
-        <w:keepNext/>
-      </w:pPr>
-      <w:r>
-        <w:rPr>
-          <w:rFonts w:ascii="Calibri" w:cs="Calibri" w:eastAsia="Calibri" w:hAnsi="Calibri"/>
-        </w:rPr>
-        <w:t xml:space="preserve">Les phases suivantes, semaine d'entreprise</w:t>
-      </w:r>
-    </w:p>
-    <w:tbl>
-      <w:tblPr>
-        <w:tblW w:type="dxa" w:w="14570"/>
-        <w:tblBorders>
-          <w:top w:val="single" w:color="auto" w:sz="4"/>
-          <w:left w:val="single" w:color="auto" w:sz="4"/>
-          <w:bottom w:val="single" w:color="auto" w:sz="4"/>
-          <w:right w:val="single" w:color="auto" w:sz="4"/>
-          <w:insideH w:val="single" w:color="auto" w:sz="4"/>
-          <w:insideV w:val="single" w:color="auto" w:sz="4"/>
-        </w:tblBorders>
-      </w:tblPr>
-      <w:tblGrid>
-        <w:gridCol w:w="1900"/>
-        <w:gridCol w:w="1810"/>
-        <w:gridCol w:w="1810"/>
-        <w:gridCol w:w="1810"/>
-        <w:gridCol w:w="1810"/>
-        <w:gridCol w:w="1810"/>
-        <w:gridCol w:w="1810"/>
-        <w:gridCol w:w="1810"/>
-      </w:tblGrid>
-      <w:tr>
-        <w:trPr>
-          <w:tblHeader/>
-        </w:trPr>
-        <w:tc>
-          <w:tcPr>
-            <w:tcW w:type="dxa" w:w="1900"/>
-            <w:tcBorders>
-              <w:top w:val="single" w:color="B7C3D0" w:sz="4"/>
-              <w:left w:val="single" w:color="B7C3D0" w:sz="4"/>
-              <w:bottom w:val="single" w:color="B7C3D0" w:sz="4"/>
-              <w:right w:val="single" w:color="B7C3D0" w:sz="4"/>
-            </w:tcBorders>
-            <w:shd w:fill="1F3A5F" w:color="auto" w:val="clear"/>
-            <w:tcMar>
-              <w:top w:type="dxa" w:w="50"/>
-              <w:left w:type="dxa" w:w="70"/>
-              <w:bottom w:type="dxa" w:w="50"/>
-              <w:right w:type="dxa" w:w="70"/>
-            </w:tcMar>
-          </w:tcPr>
-          <w:p>
-            <w:pPr>
-              <w:spacing w:after="20"/>
-              <w:jc w:val="left"/>
-            </w:pPr>
-            <w:r>
-              <w:rPr>
-                <w:rFonts w:ascii="Calibri" w:cs="Calibri" w:eastAsia="Calibri" w:hAnsi="Calibri"/>
-                <w:b/>
-                <w:bCs/>
-                <w:color w:val="FFFFFF"/>
-                <w:sz w:val="16"/>
-                <w:szCs w:val="16"/>
-              </w:rPr>
-              <w:t xml:space="preserve">Phase</w:t>
-            </w:r>
-          </w:p>
-        </w:tc>
-        <w:tc>
-          <w:tcPr>
-            <w:tcW w:type="dxa" w:w="1810"/>
-            <w:tcBorders>
-              <w:top w:val="single" w:color="B7C3D0" w:sz="4"/>
-              <w:left w:val="single" w:color="B7C3D0" w:sz="4"/>
-              <w:bottom w:val="single" w:color="B7C3D0" w:sz="4"/>
-              <w:right w:val="single" w:color="B7C3D0" w:sz="4"/>
-            </w:tcBorders>
-            <w:shd w:fill="1F3A5F" w:color="auto" w:val="clear"/>
-            <w:tcMar>
-              <w:top w:type="dxa" w:w="50"/>
-              <w:left w:type="dxa" w:w="70"/>
-              <w:bottom w:type="dxa" w:w="50"/>
-              <w:right w:type="dxa" w:w="70"/>
-            </w:tcMar>
-          </w:tcPr>
-          <w:p>
-            <w:pPr>
-              <w:spacing w:after="20"/>
-              <w:jc w:val="left"/>
-            </w:pPr>
-            <w:r>
-              <w:rPr>
-                <w:rFonts w:ascii="Calibri" w:cs="Calibri" w:eastAsia="Calibri" w:hAnsi="Calibri"/>
-                <w:b/>
-                <w:bCs/>
-                <w:color w:val="FFFFFF"/>
-                <w:sz w:val="16"/>
-                <w:szCs w:val="16"/>
-              </w:rPr>
-              <w:t xml:space="preserve">Lun</w:t>
-            </w:r>
-          </w:p>
-        </w:tc>
-        <w:tc>
-          <w:tcPr>
-            <w:tcW w:type="dxa" w:w="1810"/>
-            <w:tcBorders>
-              <w:top w:val="single" w:color="B7C3D0" w:sz="4"/>
-              <w:left w:val="single" w:color="B7C3D0" w:sz="4"/>
-              <w:bottom w:val="single" w:color="B7C3D0" w:sz="4"/>
-              <w:right w:val="single" w:color="B7C3D0" w:sz="4"/>
-            </w:tcBorders>
-            <w:shd w:fill="1F3A5F" w:color="auto" w:val="clear"/>
-            <w:tcMar>
-              <w:top w:type="dxa" w:w="50"/>
-              <w:left w:type="dxa" w:w="70"/>
-              <w:bottom w:type="dxa" w:w="50"/>
-              <w:right w:type="dxa" w:w="70"/>
-            </w:tcMar>
-          </w:tcPr>
-          <w:p>
-            <w:pPr>
-              <w:spacing w:after="20"/>
-              <w:jc w:val="left"/>
-            </w:pPr>
-            <w:r>
-              <w:rPr>
-                <w:rFonts w:ascii="Calibri" w:cs="Calibri" w:eastAsia="Calibri" w:hAnsi="Calibri"/>
-                <w:b/>
-                <w:bCs/>
-                <w:color w:val="FFFFFF"/>
-                <w:sz w:val="16"/>
-                <w:szCs w:val="16"/>
-              </w:rPr>
-              <w:t xml:space="preserve">Mar</w:t>
-            </w:r>
-          </w:p>
-        </w:tc>
-        <w:tc>
-          <w:tcPr>
-            <w:tcW w:type="dxa" w:w="1810"/>
-            <w:tcBorders>
-              <w:top w:val="single" w:color="B7C3D0" w:sz="4"/>
-              <w:left w:val="single" w:color="B7C3D0" w:sz="4"/>
-              <w:bottom w:val="single" w:color="B7C3D0" w:sz="4"/>
-              <w:right w:val="single" w:color="B7C3D0" w:sz="4"/>
-            </w:tcBorders>
-            <w:shd w:fill="1F3A5F" w:color="auto" w:val="clear"/>
-            <w:tcMar>
-              <w:top w:type="dxa" w:w="50"/>
-              <w:left w:type="dxa" w:w="70"/>
-              <w:bottom w:type="dxa" w:w="50"/>
-              <w:right w:type="dxa" w:w="70"/>
-            </w:tcMar>
-          </w:tcPr>
-          <w:p>
-            <w:pPr>
-              <w:spacing w:after="20"/>
-              <w:jc w:val="left"/>
-            </w:pPr>
-            <w:r>
-              <w:rPr>
-                <w:rFonts w:ascii="Calibri" w:cs="Calibri" w:eastAsia="Calibri" w:hAnsi="Calibri"/>
-                <w:b/>
-                <w:bCs/>
-                <w:color w:val="FFFFFF"/>
-                <w:sz w:val="16"/>
-                <w:szCs w:val="16"/>
-              </w:rPr>
-              <w:t xml:space="preserve">Mer</w:t>
-            </w:r>
-          </w:p>
-        </w:tc>
-        <w:tc>
-          <w:tcPr>
-            <w:tcW w:type="dxa" w:w="1810"/>
-            <w:tcBorders>
-              <w:top w:val="single" w:color="B7C3D0" w:sz="4"/>
-              <w:left w:val="single" w:color="B7C3D0" w:sz="4"/>
-              <w:bottom w:val="single" w:color="B7C3D0" w:sz="4"/>
-              <w:right w:val="single" w:color="B7C3D0" w:sz="4"/>
-            </w:tcBorders>
-            <w:shd w:fill="1F3A5F" w:color="auto" w:val="clear"/>
-            <w:tcMar>
-              <w:top w:type="dxa" w:w="50"/>
-              <w:left w:type="dxa" w:w="70"/>
-              <w:bottom w:type="dxa" w:w="50"/>
-              <w:right w:type="dxa" w:w="70"/>
-            </w:tcMar>
-          </w:tcPr>
-          <w:p>
-            <w:pPr>
-              <w:spacing w:after="20"/>
-              <w:jc w:val="left"/>
-            </w:pPr>
-            <w:r>
-              <w:rPr>
-                <w:rFonts w:ascii="Calibri" w:cs="Calibri" w:eastAsia="Calibri" w:hAnsi="Calibri"/>
-                <w:b/>
-                <w:bCs/>
-                <w:color w:val="FFFFFF"/>
-                <w:sz w:val="16"/>
-                <w:szCs w:val="16"/>
-              </w:rPr>
-              <w:t xml:space="preserve">Jeu</w:t>
-            </w:r>
-          </w:p>
-        </w:tc>
-        <w:tc>
-          <w:tcPr>
-            <w:tcW w:type="dxa" w:w="1810"/>
-            <w:tcBorders>
-              <w:top w:val="single" w:color="B7C3D0" w:sz="4"/>
-              <w:left w:val="single" w:color="B7C3D0" w:sz="4"/>
-              <w:bottom w:val="single" w:color="B7C3D0" w:sz="4"/>
-              <w:right w:val="single" w:color="B7C3D0" w:sz="4"/>
-            </w:tcBorders>
-            <w:shd w:fill="1F3A5F" w:color="auto" w:val="clear"/>
-            <w:tcMar>
-              <w:top w:type="dxa" w:w="50"/>
-              <w:left w:type="dxa" w:w="70"/>
-              <w:bottom w:type="dxa" w:w="50"/>
-              <w:right w:type="dxa" w:w="70"/>
-            </w:tcMar>
-          </w:tcPr>
-          <w:p>
-            <w:pPr>
-              <w:spacing w:after="20"/>
-              <w:jc w:val="left"/>
-            </w:pPr>
-            <w:r>
-              <w:rPr>
-                <w:rFonts w:ascii="Calibri" w:cs="Calibri" w:eastAsia="Calibri" w:hAnsi="Calibri"/>
-                <w:b/>
-                <w:bCs/>
-                <w:color w:val="FFFFFF"/>
-                <w:sz w:val="16"/>
-                <w:szCs w:val="16"/>
-              </w:rPr>
-              <w:t xml:space="preserve">Ven</w:t>
-            </w:r>
-          </w:p>
-        </w:tc>
-        <w:tc>
-          <w:tcPr>
-            <w:tcW w:type="dxa" w:w="1810"/>
-            <w:tcBorders>
-              <w:top w:val="single" w:color="B7C3D0" w:sz="4"/>
-              <w:left w:val="single" w:color="B7C3D0" w:sz="4"/>
-              <w:bottom w:val="single" w:color="B7C3D0" w:sz="4"/>
-              <w:right w:val="single" w:color="B7C3D0" w:sz="4"/>
-            </w:tcBorders>
-            <w:shd w:fill="1F3A5F" w:color="auto" w:val="clear"/>
-            <w:tcMar>
-              <w:top w:type="dxa" w:w="50"/>
-              <w:left w:type="dxa" w:w="70"/>
-              <w:bottom w:type="dxa" w:w="50"/>
-              <w:right w:type="dxa" w:w="70"/>
-            </w:tcMar>
-          </w:tcPr>
-          <w:p>
-            <w:pPr>
-              <w:spacing w:after="20"/>
-              <w:jc w:val="left"/>
-            </w:pPr>
-            <w:r>
-              <w:rPr>
-                <w:rFonts w:ascii="Calibri" w:cs="Calibri" w:eastAsia="Calibri" w:hAnsi="Calibri"/>
-                <w:b/>
-                <w:bCs/>
-                <w:color w:val="FFFFFF"/>
-                <w:sz w:val="16"/>
-                <w:szCs w:val="16"/>
-              </w:rPr>
-              <w:t xml:space="preserve">Sam</w:t>
-            </w:r>
-          </w:p>
-        </w:tc>
-        <w:tc>
-          <w:tcPr>
-            <w:tcW w:type="dxa" w:w="1810"/>
-            <w:tcBorders>
-              <w:top w:val="single" w:color="B7C3D0" w:sz="4"/>
-              <w:left w:val="single" w:color="B7C3D0" w:sz="4"/>
-              <w:bottom w:val="single" w:color="B7C3D0" w:sz="4"/>
-              <w:right w:val="single" w:color="B7C3D0" w:sz="4"/>
-            </w:tcBorders>
-            <w:shd w:fill="1F3A5F" w:color="auto" w:val="clear"/>
-            <w:tcMar>
-              <w:top w:type="dxa" w:w="50"/>
-              <w:left w:type="dxa" w:w="70"/>
-              <w:bottom w:type="dxa" w:w="50"/>
-              <w:right w:type="dxa" w:w="70"/>
-            </w:tcMar>
-          </w:tcPr>
-          <w:p>
-            <w:pPr>
-              <w:spacing w:after="20"/>
-              <w:jc w:val="left"/>
-            </w:pPr>
-            <w:r>
-              <w:rPr>
-                <w:rFonts w:ascii="Calibri" w:cs="Calibri" w:eastAsia="Calibri" w:hAnsi="Calibri"/>
-                <w:b/>
-                <w:bCs/>
-                <w:color w:val="FFFFFF"/>
-                <w:sz w:val="16"/>
-                <w:szCs w:val="16"/>
-              </w:rPr>
-              <w:t xml:space="preserve">Dim</w:t>
             </w:r>
           </w:p>
         </w:tc>
@@ -4573,7 +3989,7 @@
         </w:trPr>
         <w:tc>
           <w:tcPr>
-            <w:tcW w:type="dxa" w:w="1900"/>
+            <w:tcW w:type="dxa" w:w="2100"/>
             <w:tcBorders>
               <w:top w:val="single" w:color="B7C3D0" w:sz="4"/>
               <w:left w:val="single" w:color="B7C3D0" w:sz="4"/>
@@ -4602,13 +4018,13 @@
                 <w:sz w:val="16"/>
                 <w:szCs w:val="16"/>
               </w:rPr>
-              <w:t xml:space="preserve">Mi-décembre 2026 à début février 2027 (BSCP)</w:t>
-            </w:r>
-          </w:p>
-        </w:tc>
-        <w:tc>
-          <w:tcPr>
-            <w:tcW w:type="dxa" w:w="1810"/>
+              <w:t xml:space="preserve">Mi-février à juin 2027 (CRTO)</w:t>
+            </w:r>
+          </w:p>
+        </w:tc>
+        <w:tc>
+          <w:tcPr>
+            <w:tcW w:type="dxa" w:w="1781"/>
             <w:tcBorders>
               <w:top w:val="single" w:color="B7C3D0" w:sz="4"/>
               <w:left w:val="single" w:color="B7C3D0" w:sz="4"/>
@@ -4617,31 +4033,119 @@
             </w:tcBorders>
             <w:shd w:fill="DCEAFB" w:color="auto" w:val="clear"/>
             <w:tcMar>
-              <w:top w:type="dxa" w:w="40"/>
-              <w:left w:type="dxa" w:w="70"/>
-              <w:bottom w:type="dxa" w:w="30"/>
-              <w:right w:type="dxa" w:w="50"/>
+              <w:top w:type="dxa" w:w="90"/>
+              <w:left w:type="dxa" w:w="100"/>
+              <w:bottom w:type="dxa" w:w="70"/>
+              <w:right w:type="dxa" w:w="70"/>
             </w:tcMar>
             <w:vAlign w:val="top"/>
           </w:tcPr>
           <w:p>
             <w:pPr>
-              <w:spacing w:after="10"/>
-            </w:pPr>
-            <w:r>
-              <w:rPr>
-                <w:rFonts w:ascii="Calibri" w:cs="Calibri" w:eastAsia="Calibri" w:hAnsi="Calibri"/>
+              <w:spacing w:after="30"/>
+            </w:pPr>
+            <w:r>
+              <w:rPr>
+                <w:rFonts w:ascii="Calibri" w:cs="Calibri" w:eastAsia="Calibri" w:hAnsi="Calibri"/>
+                <w:b/>
+                <w:bCs/>
                 <w:color w:val="000000"/>
-                <w:sz w:val="16"/>
-                <w:szCs w:val="16"/>
-              </w:rPr>
-              <w:t xml:space="preserve">BSCP 2 h</w:t>
-            </w:r>
-          </w:p>
-        </w:tc>
-        <w:tc>
-          <w:tcPr>
-            <w:tcW w:type="dxa" w:w="1810"/>
+                <w:sz w:val="20"/>
+                <w:szCs w:val="20"/>
+              </w:rPr>
+              <w:t xml:space="preserve">CRTO</w:t>
+            </w:r>
+          </w:p>
+        </w:tc>
+        <w:tc>
+          <w:tcPr>
+            <w:tcW w:type="dxa" w:w="1781"/>
+            <w:tcBorders>
+              <w:top w:val="single" w:color="B7C3D0" w:sz="4"/>
+              <w:left w:val="single" w:color="B7C3D0" w:sz="4"/>
+              <w:bottom w:val="single" w:color="B7C3D0" w:sz="4"/>
+              <w:right w:val="single" w:color="B7C3D0" w:sz="4"/>
+            </w:tcBorders>
+            <w:shd w:fill="FBE0D5" w:color="auto" w:val="clear"/>
+            <w:tcMar>
+              <w:top w:type="dxa" w:w="90"/>
+              <w:left w:type="dxa" w:w="100"/>
+              <w:bottom w:type="dxa" w:w="70"/>
+              <w:right w:type="dxa" w:w="70"/>
+            </w:tcMar>
+            <w:vAlign w:val="top"/>
+          </w:tcPr>
+          <w:p>
+            <w:pPr>
+              <w:spacing w:after="30"/>
+            </w:pPr>
+            <w:r>
+              <w:rPr>
+                <w:rFonts w:ascii="Calibri" w:cs="Calibri" w:eastAsia="Calibri" w:hAnsi="Calibri"/>
+                <w:b/>
+                <w:bCs/>
+                <w:color w:val="000000"/>
+                <w:sz w:val="20"/>
+                <w:szCs w:val="20"/>
+              </w:rPr>
+              <w:t xml:space="preserve">Lab</w:t>
+            </w:r>
+          </w:p>
+        </w:tc>
+        <w:tc>
+          <w:tcPr>
+            <w:tcW w:type="dxa" w:w="1781"/>
+            <w:tcBorders>
+              <w:top w:val="single" w:color="B7C3D0" w:sz="4"/>
+              <w:left w:val="single" w:color="B7C3D0" w:sz="4"/>
+              <w:bottom w:val="single" w:color="B7C3D0" w:sz="4"/>
+              <w:right w:val="single" w:color="B7C3D0" w:sz="4"/>
+            </w:tcBorders>
+            <w:shd w:fill="D5F0E6" w:color="auto" w:val="clear"/>
+            <w:tcMar>
+              <w:top w:type="dxa" w:w="90"/>
+              <w:left w:type="dxa" w:w="100"/>
+              <w:bottom w:type="dxa" w:w="70"/>
+              <w:right w:type="dxa" w:w="70"/>
+            </w:tcMar>
+            <w:vAlign w:val="top"/>
+          </w:tcPr>
+          <w:p>
+            <w:pPr>
+              <w:spacing w:after="30"/>
+            </w:pPr>
+            <w:r>
+              <w:rPr>
+                <w:rFonts w:ascii="Calibri" w:cs="Calibri" w:eastAsia="Calibri" w:hAnsi="Calibri"/>
+                <w:b/>
+                <w:bCs/>
+                <w:color w:val="000000"/>
+                <w:sz w:val="20"/>
+                <w:szCs w:val="20"/>
+              </w:rPr>
+              <w:t xml:space="preserve">C, Sektor7</w:t>
+            </w:r>
+          </w:p>
+          <w:p>
+            <w:pPr>
+              <w:spacing w:after="30"/>
+            </w:pPr>
+            <w:r>
+              <w:rPr>
+                <w:rFonts w:ascii="Calibri" w:cs="Calibri" w:eastAsia="Calibri" w:hAnsi="Calibri"/>
+                <w:b/>
+                <w:bCs/>
+                <w:color w:val="000000"/>
+                <w:sz w:val="20"/>
+                <w:szCs w:val="20"/>
+              </w:rPr>
+              <w:t xml:space="preserve">Rédaction</w:t>
+            </w:r>
+          </w:p>
+        </w:tc>
+        <w:tc>
+          <w:tcPr>
+            <w:tcW w:type="dxa" w:w="1781"/>
             <w:tcBorders>
               <w:top w:val="single" w:color="B7C3D0" w:sz="4"/>
               <w:left w:val="single" w:color="B7C3D0" w:sz="4"/>
@@ -4650,31 +4154,100 @@
             </w:tcBorders>
             <w:shd w:fill="DCEAFB" w:color="auto" w:val="clear"/>
             <w:tcMar>
-              <w:top w:type="dxa" w:w="40"/>
-              <w:left w:type="dxa" w:w="70"/>
-              <w:bottom w:type="dxa" w:w="30"/>
-              <w:right w:type="dxa" w:w="50"/>
+              <w:top w:type="dxa" w:w="90"/>
+              <w:left w:type="dxa" w:w="100"/>
+              <w:bottom w:type="dxa" w:w="70"/>
+              <w:right w:type="dxa" w:w="70"/>
             </w:tcMar>
             <w:vAlign w:val="top"/>
           </w:tcPr>
           <w:p>
             <w:pPr>
-              <w:spacing w:after="10"/>
-            </w:pPr>
-            <w:r>
-              <w:rPr>
-                <w:rFonts w:ascii="Calibri" w:cs="Calibri" w:eastAsia="Calibri" w:hAnsi="Calibri"/>
+              <w:spacing w:after="30"/>
+            </w:pPr>
+            <w:r>
+              <w:rPr>
+                <w:rFonts w:ascii="Calibri" w:cs="Calibri" w:eastAsia="Calibri" w:hAnsi="Calibri"/>
+                <w:b/>
+                <w:bCs/>
                 <w:color w:val="000000"/>
-                <w:sz w:val="16"/>
-                <w:szCs w:val="16"/>
-              </w:rPr>
-              <w:t xml:space="preserve">BSCP 2 h 30</w:t>
-            </w:r>
-          </w:p>
-        </w:tc>
-        <w:tc>
-          <w:tcPr>
-            <w:tcW w:type="dxa" w:w="1810"/>
+                <w:sz w:val="20"/>
+                <w:szCs w:val="20"/>
+              </w:rPr>
+              <w:t xml:space="preserve">CRTO</w:t>
+            </w:r>
+          </w:p>
+        </w:tc>
+        <w:tc>
+          <w:tcPr>
+            <w:tcW w:type="dxa" w:w="1781"/>
+            <w:tcBorders>
+              <w:top w:val="single" w:color="B7C3D0" w:sz="4"/>
+              <w:left w:val="single" w:color="B7C3D0" w:sz="4"/>
+              <w:bottom w:val="single" w:color="B7C3D0" w:sz="4"/>
+              <w:right w:val="single" w:color="B7C3D0" w:sz="4"/>
+            </w:tcBorders>
+            <w:shd w:fill="F6D5E2" w:color="auto" w:val="clear"/>
+            <w:tcMar>
+              <w:top w:type="dxa" w:w="90"/>
+              <w:left w:type="dxa" w:w="100"/>
+              <w:bottom w:type="dxa" w:w="70"/>
+              <w:right w:type="dxa" w:w="70"/>
+            </w:tcMar>
+            <w:vAlign w:val="top"/>
+          </w:tcPr>
+          <w:p>
+            <w:pPr>
+              <w:spacing w:after="30"/>
+            </w:pPr>
+            <w:r>
+              <w:rPr>
+                <w:rFonts w:ascii="Calibri" w:cs="Calibri" w:eastAsia="Calibri" w:hAnsi="Calibri"/>
+                <w:b/>
+                <w:bCs/>
+                <w:color w:val="000000"/>
+                <w:sz w:val="20"/>
+                <w:szCs w:val="20"/>
+              </w:rPr>
+              <w:t xml:space="preserve">École</w:t>
+            </w:r>
+          </w:p>
+          <w:p>
+            <w:pPr>
+              <w:spacing w:after="30"/>
+            </w:pPr>
+            <w:r>
+              <w:rPr>
+                <w:rFonts w:ascii="Calibri" w:cs="Calibri" w:eastAsia="Calibri" w:hAnsi="Calibri"/>
+                <w:b/>
+                <w:bCs/>
+                <w:color w:val="000000"/>
+                <w:sz w:val="20"/>
+                <w:szCs w:val="20"/>
+              </w:rPr>
+              <w:t xml:space="preserve">Revue</w:t>
+            </w:r>
+          </w:p>
+          <w:p>
+            <w:pPr>
+              <w:spacing w:after="30"/>
+            </w:pPr>
+            <w:r>
+              <w:rPr>
+                <w:rFonts w:ascii="Calibri" w:cs="Calibri" w:eastAsia="Calibri" w:hAnsi="Calibri"/>
+                <w:b/>
+                <w:bCs/>
+                <w:color w:val="000000"/>
+                <w:sz w:val="20"/>
+                <w:szCs w:val="20"/>
+              </w:rPr>
+              <w:t xml:space="preserve">Rédaction</w:t>
+            </w:r>
+          </w:p>
+        </w:tc>
+        <w:tc>
+          <w:tcPr>
+            <w:tcW w:type="dxa" w:w="1781"/>
             <w:tcBorders>
               <w:top w:val="single" w:color="B7C3D0" w:sz="4"/>
               <w:left w:val="single" w:color="B7C3D0" w:sz="4"/>
@@ -4683,197 +4256,76 @@
             </w:tcBorders>
             <w:shd w:fill="FBE0D5" w:color="auto" w:val="clear"/>
             <w:tcMar>
-              <w:top w:type="dxa" w:w="40"/>
-              <w:left w:type="dxa" w:w="70"/>
-              <w:bottom w:type="dxa" w:w="30"/>
-              <w:right w:type="dxa" w:w="50"/>
+              <w:top w:type="dxa" w:w="90"/>
+              <w:left w:type="dxa" w:w="100"/>
+              <w:bottom w:type="dxa" w:w="70"/>
+              <w:right w:type="dxa" w:w="70"/>
             </w:tcMar>
             <w:vAlign w:val="top"/>
           </w:tcPr>
           <w:p>
             <w:pPr>
-              <w:spacing w:after="10"/>
-            </w:pPr>
-            <w:r>
-              <w:rPr>
-                <w:rFonts w:ascii="Calibri" w:cs="Calibri" w:eastAsia="Calibri" w:hAnsi="Calibri"/>
+              <w:spacing w:after="30"/>
+            </w:pPr>
+            <w:r>
+              <w:rPr>
+                <w:rFonts w:ascii="Calibri" w:cs="Calibri" w:eastAsia="Calibri" w:hAnsi="Calibri"/>
+                <w:b/>
+                <w:bCs/>
                 <w:color w:val="000000"/>
-                <w:sz w:val="16"/>
-                <w:szCs w:val="16"/>
-              </w:rPr>
-              <w:t xml:space="preserve">Lab 2 h</w:t>
-            </w:r>
-          </w:p>
-          <w:p>
-            <w:pPr>
-              <w:spacing w:after="10"/>
-            </w:pPr>
-            <w:r>
-              <w:rPr>
-                <w:rFonts w:ascii="Calibri" w:cs="Calibri" w:eastAsia="Calibri" w:hAnsi="Calibri"/>
+                <w:sz w:val="20"/>
+                <w:szCs w:val="20"/>
+              </w:rPr>
+              <w:t xml:space="preserve">Lab</w:t>
+            </w:r>
+          </w:p>
+          <w:p>
+            <w:pPr>
+              <w:spacing w:after="30"/>
+            </w:pPr>
+            <w:r>
+              <w:rPr>
+                <w:rFonts w:ascii="Calibri" w:cs="Calibri" w:eastAsia="Calibri" w:hAnsi="Calibri"/>
+                <w:b/>
+                <w:bCs/>
                 <w:color w:val="000000"/>
-                <w:sz w:val="16"/>
-                <w:szCs w:val="16"/>
-              </w:rPr>
-              <w:t xml:space="preserve">École 30 min</w:t>
-            </w:r>
-          </w:p>
-        </w:tc>
-        <w:tc>
-          <w:tcPr>
-            <w:tcW w:type="dxa" w:w="1810"/>
-            <w:tcBorders>
-              <w:top w:val="single" w:color="B7C3D0" w:sz="4"/>
-              <w:left w:val="single" w:color="B7C3D0" w:sz="4"/>
-              <w:bottom w:val="single" w:color="B7C3D0" w:sz="4"/>
-              <w:right w:val="single" w:color="B7C3D0" w:sz="4"/>
-            </w:tcBorders>
-            <w:shd w:fill="DCEAFB" w:color="auto" w:val="clear"/>
-            <w:tcMar>
-              <w:top w:type="dxa" w:w="40"/>
-              <w:left w:type="dxa" w:w="70"/>
-              <w:bottom w:type="dxa" w:w="30"/>
-              <w:right w:type="dxa" w:w="50"/>
+                <w:sz w:val="20"/>
+                <w:szCs w:val="20"/>
+              </w:rPr>
+              <w:t xml:space="preserve">C, projet</w:t>
+            </w:r>
+          </w:p>
+        </w:tc>
+        <w:tc>
+          <w:tcPr>
+            <w:tcW w:type="dxa" w:w="1784"/>
+            <w:tcBorders>
+              <w:top w:val="single" w:color="B7C3D0" w:sz="4"/>
+              <w:left w:val="single" w:color="B7C3D0" w:sz="4"/>
+              <w:bottom w:val="single" w:color="B7C3D0" w:sz="4"/>
+              <w:right w:val="single" w:color="B7C3D0" w:sz="4"/>
+            </w:tcBorders>
+            <w:shd w:fill="F4F3F0" w:color="auto" w:val="clear"/>
+            <w:tcMar>
+              <w:top w:type="dxa" w:w="90"/>
+              <w:left w:type="dxa" w:w="100"/>
+              <w:bottom w:type="dxa" w:w="70"/>
+              <w:right w:type="dxa" w:w="70"/>
             </w:tcMar>
             <w:vAlign w:val="top"/>
           </w:tcPr>
           <w:p>
             <w:pPr>
-              <w:spacing w:after="10"/>
-            </w:pPr>
-            <w:r>
-              <w:rPr>
-                <w:rFonts w:ascii="Calibri" w:cs="Calibri" w:eastAsia="Calibri" w:hAnsi="Calibri"/>
-                <w:color w:val="000000"/>
-                <w:sz w:val="16"/>
-                <w:szCs w:val="16"/>
-              </w:rPr>
-              <w:t xml:space="preserve">BSCP 2 h</w:t>
-            </w:r>
-          </w:p>
-        </w:tc>
-        <w:tc>
-          <w:tcPr>
-            <w:tcW w:type="dxa" w:w="1810"/>
-            <w:tcBorders>
-              <w:top w:val="single" w:color="B7C3D0" w:sz="4"/>
-              <w:left w:val="single" w:color="B7C3D0" w:sz="4"/>
-              <w:bottom w:val="single" w:color="B7C3D0" w:sz="4"/>
-              <w:right w:val="single" w:color="B7C3D0" w:sz="4"/>
-            </w:tcBorders>
-            <w:shd w:fill="F6D5E2" w:color="auto" w:val="clear"/>
-            <w:tcMar>
-              <w:top w:type="dxa" w:w="40"/>
-              <w:left w:type="dxa" w:w="70"/>
-              <w:bottom w:type="dxa" w:w="30"/>
-              <w:right w:type="dxa" w:w="50"/>
-            </w:tcMar>
-            <w:vAlign w:val="top"/>
-          </w:tcPr>
-          <w:p>
-            <w:pPr>
-              <w:spacing w:after="10"/>
-            </w:pPr>
-            <w:r>
-              <w:rPr>
-                <w:rFonts w:ascii="Calibri" w:cs="Calibri" w:eastAsia="Calibri" w:hAnsi="Calibri"/>
-                <w:color w:val="000000"/>
-                <w:sz w:val="16"/>
-                <w:szCs w:val="16"/>
-              </w:rPr>
-              <w:t xml:space="preserve">École 30 min</w:t>
-            </w:r>
-          </w:p>
-          <w:p>
-            <w:pPr>
-              <w:spacing w:after="10"/>
-            </w:pPr>
-            <w:r>
-              <w:rPr>
-                <w:rFonts w:ascii="Calibri" w:cs="Calibri" w:eastAsia="Calibri" w:hAnsi="Calibri"/>
-                <w:color w:val="000000"/>
-                <w:sz w:val="16"/>
-                <w:szCs w:val="16"/>
-              </w:rPr>
-              <w:t xml:space="preserve">Revue 30 min</w:t>
-            </w:r>
-          </w:p>
-        </w:tc>
-        <w:tc>
-          <w:tcPr>
-            <w:tcW w:type="dxa" w:w="1810"/>
-            <w:tcBorders>
-              <w:top w:val="single" w:color="B7C3D0" w:sz="4"/>
-              <w:left w:val="single" w:color="B7C3D0" w:sz="4"/>
-              <w:bottom w:val="single" w:color="B7C3D0" w:sz="4"/>
-              <w:right w:val="single" w:color="B7C3D0" w:sz="4"/>
-            </w:tcBorders>
-            <w:shd w:fill="FBE0D5" w:color="auto" w:val="clear"/>
-            <w:tcMar>
-              <w:top w:type="dxa" w:w="40"/>
-              <w:left w:type="dxa" w:w="70"/>
-              <w:bottom w:type="dxa" w:w="30"/>
-              <w:right w:type="dxa" w:w="50"/>
-            </w:tcMar>
-            <w:vAlign w:val="top"/>
-          </w:tcPr>
-          <w:p>
-            <w:pPr>
-              <w:spacing w:after="10"/>
-            </w:pPr>
-            <w:r>
-              <w:rPr>
-                <w:rFonts w:ascii="Calibri" w:cs="Calibri" w:eastAsia="Calibri" w:hAnsi="Calibri"/>
-                <w:color w:val="000000"/>
-                <w:sz w:val="16"/>
-                <w:szCs w:val="16"/>
-              </w:rPr>
-              <w:t xml:space="preserve">BSCP 2 h</w:t>
-            </w:r>
-          </w:p>
-          <w:p>
-            <w:pPr>
-              <w:spacing w:after="10"/>
-            </w:pPr>
-            <w:r>
-              <w:rPr>
-                <w:rFonts w:ascii="Calibri" w:cs="Calibri" w:eastAsia="Calibri" w:hAnsi="Calibri"/>
-                <w:color w:val="000000"/>
-                <w:sz w:val="16"/>
-                <w:szCs w:val="16"/>
-              </w:rPr>
-              <w:t xml:space="preserve">Lab 3 h</w:t>
-            </w:r>
-          </w:p>
-        </w:tc>
-        <w:tc>
-          <w:tcPr>
-            <w:tcW w:type="dxa" w:w="1810"/>
-            <w:tcBorders>
-              <w:top w:val="single" w:color="B7C3D0" w:sz="4"/>
-              <w:left w:val="single" w:color="B7C3D0" w:sz="4"/>
-              <w:bottom w:val="single" w:color="B7C3D0" w:sz="4"/>
-              <w:right w:val="single" w:color="B7C3D0" w:sz="4"/>
-            </w:tcBorders>
-            <w:shd w:fill="F4F3F0" w:color="auto" w:val="clear"/>
-            <w:tcMar>
-              <w:top w:type="dxa" w:w="40"/>
-              <w:left w:type="dxa" w:w="70"/>
-              <w:bottom w:type="dxa" w:w="30"/>
-              <w:right w:type="dxa" w:w="50"/>
-            </w:tcMar>
-            <w:vAlign w:val="top"/>
-          </w:tcPr>
-          <w:p>
-            <w:pPr>
-              <w:spacing w:after="10"/>
-            </w:pPr>
-            <w:r>
-              <w:rPr>
-                <w:rFonts w:ascii="Calibri" w:cs="Calibri" w:eastAsia="Calibri" w:hAnsi="Calibri"/>
+              <w:spacing w:after="30"/>
+            </w:pPr>
+            <w:r>
+              <w:rPr>
+                <w:rFonts w:ascii="Calibri" w:cs="Calibri" w:eastAsia="Calibri" w:hAnsi="Calibri"/>
+                <w:b w:val="false"/>
+                <w:bCs w:val="false"/>
                 <w:color w:val="777777"/>
-                <w:sz w:val="16"/>
-                <w:szCs w:val="16"/>
+                <w:sz w:val="20"/>
+                <w:szCs w:val="20"/>
               </w:rPr>
               <w:t xml:space="preserve">Libre</w:t>
             </w:r>
@@ -4886,7 +4338,7 @@
         </w:trPr>
         <w:tc>
           <w:tcPr>
-            <w:tcW w:type="dxa" w:w="1900"/>
+            <w:tcW w:type="dxa" w:w="2100"/>
             <w:tcBorders>
               <w:top w:val="single" w:color="B7C3D0" w:sz="4"/>
               <w:left w:val="single" w:color="B7C3D0" w:sz="4"/>
@@ -4915,13 +4367,13 @@
                 <w:sz w:val="16"/>
                 <w:szCs w:val="16"/>
               </w:rPr>
-              <w:t xml:space="preserve">Mi-février à juin 2027 (CRTO)</w:t>
-            </w:r>
-          </w:p>
-        </w:tc>
-        <w:tc>
-          <w:tcPr>
-            <w:tcW w:type="dxa" w:w="1810"/>
+              <w:t xml:space="preserve">Juillet 2027 à janvier 2028 (Maldev, EDR)</w:t>
+            </w:r>
+          </w:p>
+        </w:tc>
+        <w:tc>
+          <w:tcPr>
+            <w:tcW w:type="dxa" w:w="1781"/>
             <w:tcBorders>
               <w:top w:val="single" w:color="B7C3D0" w:sz="4"/>
               <w:left w:val="single" w:color="B7C3D0" w:sz="4"/>
@@ -4930,31 +4382,33 @@
             </w:tcBorders>
             <w:shd w:fill="DCEAFB" w:color="auto" w:val="clear"/>
             <w:tcMar>
-              <w:top w:type="dxa" w:w="40"/>
-              <w:left w:type="dxa" w:w="70"/>
-              <w:bottom w:type="dxa" w:w="30"/>
-              <w:right w:type="dxa" w:w="50"/>
+              <w:top w:type="dxa" w:w="90"/>
+              <w:left w:type="dxa" w:w="100"/>
+              <w:bottom w:type="dxa" w:w="70"/>
+              <w:right w:type="dxa" w:w="70"/>
             </w:tcMar>
             <w:vAlign w:val="top"/>
           </w:tcPr>
           <w:p>
             <w:pPr>
-              <w:spacing w:after="10"/>
-            </w:pPr>
-            <w:r>
-              <w:rPr>
-                <w:rFonts w:ascii="Calibri" w:cs="Calibri" w:eastAsia="Calibri" w:hAnsi="Calibri"/>
+              <w:spacing w:after="30"/>
+            </w:pPr>
+            <w:r>
+              <w:rPr>
+                <w:rFonts w:ascii="Calibri" w:cs="Calibri" w:eastAsia="Calibri" w:hAnsi="Calibri"/>
+                <w:b/>
+                <w:bCs/>
                 <w:color w:val="000000"/>
-                <w:sz w:val="16"/>
-                <w:szCs w:val="16"/>
-              </w:rPr>
-              <w:t xml:space="preserve">CRTO 2 h</w:t>
-            </w:r>
-          </w:p>
-        </w:tc>
-        <w:tc>
-          <w:tcPr>
-            <w:tcW w:type="dxa" w:w="1810"/>
+                <w:sz w:val="20"/>
+                <w:szCs w:val="20"/>
+              </w:rPr>
+              <w:t xml:space="preserve">Cours</w:t>
+            </w:r>
+          </w:p>
+        </w:tc>
+        <w:tc>
+          <w:tcPr>
+            <w:tcW w:type="dxa" w:w="1781"/>
             <w:tcBorders>
               <w:top w:val="single" w:color="B7C3D0" w:sz="4"/>
               <w:left w:val="single" w:color="B7C3D0" w:sz="4"/>
@@ -4963,244 +4417,248 @@
             </w:tcBorders>
             <w:shd w:fill="FBE0D5" w:color="auto" w:val="clear"/>
             <w:tcMar>
-              <w:top w:type="dxa" w:w="40"/>
-              <w:left w:type="dxa" w:w="70"/>
-              <w:bottom w:type="dxa" w:w="30"/>
-              <w:right w:type="dxa" w:w="50"/>
+              <w:top w:type="dxa" w:w="90"/>
+              <w:left w:type="dxa" w:w="100"/>
+              <w:bottom w:type="dxa" w:w="70"/>
+              <w:right w:type="dxa" w:w="70"/>
             </w:tcMar>
             <w:vAlign w:val="top"/>
           </w:tcPr>
           <w:p>
             <w:pPr>
-              <w:spacing w:after="10"/>
-            </w:pPr>
-            <w:r>
-              <w:rPr>
-                <w:rFonts w:ascii="Calibri" w:cs="Calibri" w:eastAsia="Calibri" w:hAnsi="Calibri"/>
+              <w:spacing w:after="30"/>
+            </w:pPr>
+            <w:r>
+              <w:rPr>
+                <w:rFonts w:ascii="Calibri" w:cs="Calibri" w:eastAsia="Calibri" w:hAnsi="Calibri"/>
+                <w:b/>
+                <w:bCs/>
                 <w:color w:val="000000"/>
-                <w:sz w:val="16"/>
-                <w:szCs w:val="16"/>
-              </w:rPr>
-              <w:t xml:space="preserve">Lab 2 h 30</w:t>
-            </w:r>
-          </w:p>
-        </w:tc>
-        <w:tc>
-          <w:tcPr>
-            <w:tcW w:type="dxa" w:w="1810"/>
-            <w:tcBorders>
-              <w:top w:val="single" w:color="B7C3D0" w:sz="4"/>
-              <w:left w:val="single" w:color="B7C3D0" w:sz="4"/>
-              <w:bottom w:val="single" w:color="B7C3D0" w:sz="4"/>
-              <w:right w:val="single" w:color="B7C3D0" w:sz="4"/>
-            </w:tcBorders>
-            <w:shd w:fill="D5F0E6" w:color="auto" w:val="clear"/>
-            <w:tcMar>
-              <w:top w:type="dxa" w:w="40"/>
-              <w:left w:type="dxa" w:w="70"/>
-              <w:bottom w:type="dxa" w:w="30"/>
-              <w:right w:type="dxa" w:w="50"/>
+                <w:sz w:val="20"/>
+                <w:szCs w:val="20"/>
+              </w:rPr>
+              <w:t xml:space="preserve">Lab</w:t>
+            </w:r>
+          </w:p>
+        </w:tc>
+        <w:tc>
+          <w:tcPr>
+            <w:tcW w:type="dxa" w:w="1781"/>
+            <w:tcBorders>
+              <w:top w:val="single" w:color="B7C3D0" w:sz="4"/>
+              <w:left w:val="single" w:color="B7C3D0" w:sz="4"/>
+              <w:bottom w:val="single" w:color="B7C3D0" w:sz="4"/>
+              <w:right w:val="single" w:color="B7C3D0" w:sz="4"/>
+            </w:tcBorders>
+            <w:shd w:fill="FCEFC9" w:color="auto" w:val="clear"/>
+            <w:tcMar>
+              <w:top w:type="dxa" w:w="90"/>
+              <w:left w:type="dxa" w:w="100"/>
+              <w:bottom w:type="dxa" w:w="70"/>
+              <w:right w:type="dxa" w:w="70"/>
             </w:tcMar>
             <w:vAlign w:val="top"/>
           </w:tcPr>
           <w:p>
             <w:pPr>
-              <w:spacing w:after="10"/>
-            </w:pPr>
-            <w:r>
-              <w:rPr>
-                <w:rFonts w:ascii="Calibri" w:cs="Calibri" w:eastAsia="Calibri" w:hAnsi="Calibri"/>
+              <w:spacing w:after="30"/>
+            </w:pPr>
+            <w:r>
+              <w:rPr>
+                <w:rFonts w:ascii="Calibri" w:cs="Calibri" w:eastAsia="Calibri" w:hAnsi="Calibri"/>
+                <w:b/>
+                <w:bCs/>
                 <w:color w:val="000000"/>
-                <w:sz w:val="16"/>
-                <w:szCs w:val="16"/>
-              </w:rPr>
-              <w:t xml:space="preserve">C, Sektor7 2 h</w:t>
-            </w:r>
-          </w:p>
-          <w:p>
-            <w:pPr>
-              <w:spacing w:after="10"/>
-            </w:pPr>
-            <w:r>
-              <w:rPr>
-                <w:rFonts w:ascii="Calibri" w:cs="Calibri" w:eastAsia="Calibri" w:hAnsi="Calibri"/>
+                <w:sz w:val="20"/>
+                <w:szCs w:val="20"/>
+              </w:rPr>
+              <w:t xml:space="preserve">Reverse eng.</w:t>
+            </w:r>
+          </w:p>
+        </w:tc>
+        <w:tc>
+          <w:tcPr>
+            <w:tcW w:type="dxa" w:w="1781"/>
+            <w:tcBorders>
+              <w:top w:val="single" w:color="B7C3D0" w:sz="4"/>
+              <w:left w:val="single" w:color="B7C3D0" w:sz="4"/>
+              <w:bottom w:val="single" w:color="B7C3D0" w:sz="4"/>
+              <w:right w:val="single" w:color="B7C3D0" w:sz="4"/>
+            </w:tcBorders>
+            <w:shd w:fill="DCEAFB" w:color="auto" w:val="clear"/>
+            <w:tcMar>
+              <w:top w:type="dxa" w:w="90"/>
+              <w:left w:type="dxa" w:w="100"/>
+              <w:bottom w:type="dxa" w:w="70"/>
+              <w:right w:type="dxa" w:w="70"/>
+            </w:tcMar>
+            <w:vAlign w:val="top"/>
+          </w:tcPr>
+          <w:p>
+            <w:pPr>
+              <w:spacing w:after="30"/>
+            </w:pPr>
+            <w:r>
+              <w:rPr>
+                <w:rFonts w:ascii="Calibri" w:cs="Calibri" w:eastAsia="Calibri" w:hAnsi="Calibri"/>
+                <w:b/>
+                <w:bCs/>
                 <w:color w:val="000000"/>
-                <w:sz w:val="16"/>
-                <w:szCs w:val="16"/>
-              </w:rPr>
-              <w:t xml:space="preserve">Rédaction 30 min</w:t>
-            </w:r>
-          </w:p>
-        </w:tc>
-        <w:tc>
-          <w:tcPr>
-            <w:tcW w:type="dxa" w:w="1810"/>
-            <w:tcBorders>
-              <w:top w:val="single" w:color="B7C3D0" w:sz="4"/>
-              <w:left w:val="single" w:color="B7C3D0" w:sz="4"/>
-              <w:bottom w:val="single" w:color="B7C3D0" w:sz="4"/>
-              <w:right w:val="single" w:color="B7C3D0" w:sz="4"/>
-            </w:tcBorders>
-            <w:shd w:fill="DCEAFB" w:color="auto" w:val="clear"/>
-            <w:tcMar>
-              <w:top w:type="dxa" w:w="40"/>
-              <w:left w:type="dxa" w:w="70"/>
-              <w:bottom w:type="dxa" w:w="30"/>
-              <w:right w:type="dxa" w:w="50"/>
+                <w:sz w:val="20"/>
+                <w:szCs w:val="20"/>
+              </w:rPr>
+              <w:t xml:space="preserve">Cours</w:t>
+            </w:r>
+          </w:p>
+        </w:tc>
+        <w:tc>
+          <w:tcPr>
+            <w:tcW w:type="dxa" w:w="1781"/>
+            <w:tcBorders>
+              <w:top w:val="single" w:color="B7C3D0" w:sz="4"/>
+              <w:left w:val="single" w:color="B7C3D0" w:sz="4"/>
+              <w:bottom w:val="single" w:color="B7C3D0" w:sz="4"/>
+              <w:right w:val="single" w:color="B7C3D0" w:sz="4"/>
+            </w:tcBorders>
+            <w:shd w:fill="FCEFC9" w:color="auto" w:val="clear"/>
+            <w:tcMar>
+              <w:top w:type="dxa" w:w="90"/>
+              <w:left w:type="dxa" w:w="100"/>
+              <w:bottom w:type="dxa" w:w="70"/>
+              <w:right w:type="dxa" w:w="70"/>
             </w:tcMar>
             <w:vAlign w:val="top"/>
           </w:tcPr>
           <w:p>
             <w:pPr>
-              <w:spacing w:after="10"/>
-            </w:pPr>
-            <w:r>
-              <w:rPr>
-                <w:rFonts w:ascii="Calibri" w:cs="Calibri" w:eastAsia="Calibri" w:hAnsi="Calibri"/>
+              <w:spacing w:after="30"/>
+            </w:pPr>
+            <w:r>
+              <w:rPr>
+                <w:rFonts w:ascii="Calibri" w:cs="Calibri" w:eastAsia="Calibri" w:hAnsi="Calibri"/>
+                <w:b/>
+                <w:bCs/>
                 <w:color w:val="000000"/>
-                <w:sz w:val="16"/>
-                <w:szCs w:val="16"/>
-              </w:rPr>
-              <w:t xml:space="preserve">CRTO 2 h</w:t>
-            </w:r>
-          </w:p>
-        </w:tc>
-        <w:tc>
-          <w:tcPr>
-            <w:tcW w:type="dxa" w:w="1810"/>
-            <w:tcBorders>
-              <w:top w:val="single" w:color="B7C3D0" w:sz="4"/>
-              <w:left w:val="single" w:color="B7C3D0" w:sz="4"/>
-              <w:bottom w:val="single" w:color="B7C3D0" w:sz="4"/>
-              <w:right w:val="single" w:color="B7C3D0" w:sz="4"/>
-            </w:tcBorders>
-            <w:shd w:fill="F6D5E2" w:color="auto" w:val="clear"/>
-            <w:tcMar>
-              <w:top w:type="dxa" w:w="40"/>
-              <w:left w:type="dxa" w:w="70"/>
-              <w:bottom w:type="dxa" w:w="30"/>
-              <w:right w:type="dxa" w:w="50"/>
+                <w:sz w:val="20"/>
+                <w:szCs w:val="20"/>
+              </w:rPr>
+              <w:t xml:space="preserve">Rédaction</w:t>
+            </w:r>
+          </w:p>
+          <w:p>
+            <w:pPr>
+              <w:spacing w:after="30"/>
+            </w:pPr>
+            <w:r>
+              <w:rPr>
+                <w:rFonts w:ascii="Calibri" w:cs="Calibri" w:eastAsia="Calibri" w:hAnsi="Calibri"/>
+                <w:b/>
+                <w:bCs/>
+                <w:color w:val="000000"/>
+                <w:sz w:val="20"/>
+                <w:szCs w:val="20"/>
+              </w:rPr>
+              <w:t xml:space="preserve">Revue</w:t>
+            </w:r>
+          </w:p>
+        </w:tc>
+        <w:tc>
+          <w:tcPr>
+            <w:tcW w:type="dxa" w:w="1781"/>
+            <w:tcBorders>
+              <w:top w:val="single" w:color="B7C3D0" w:sz="4"/>
+              <w:left w:val="single" w:color="B7C3D0" w:sz="4"/>
+              <w:bottom w:val="single" w:color="B7C3D0" w:sz="4"/>
+              <w:right w:val="single" w:color="B7C3D0" w:sz="4"/>
+            </w:tcBorders>
+            <w:shd w:fill="FBE0D5" w:color="auto" w:val="clear"/>
+            <w:tcMar>
+              <w:top w:type="dxa" w:w="90"/>
+              <w:left w:type="dxa" w:w="100"/>
+              <w:bottom w:type="dxa" w:w="70"/>
+              <w:right w:type="dxa" w:w="70"/>
             </w:tcMar>
             <w:vAlign w:val="top"/>
           </w:tcPr>
           <w:p>
             <w:pPr>
-              <w:spacing w:after="10"/>
-            </w:pPr>
-            <w:r>
-              <w:rPr>
-                <w:rFonts w:ascii="Calibri" w:cs="Calibri" w:eastAsia="Calibri" w:hAnsi="Calibri"/>
+              <w:spacing w:after="30"/>
+            </w:pPr>
+            <w:r>
+              <w:rPr>
+                <w:rFonts w:ascii="Calibri" w:cs="Calibri" w:eastAsia="Calibri" w:hAnsi="Calibri"/>
+                <w:b/>
+                <w:bCs/>
                 <w:color w:val="000000"/>
-                <w:sz w:val="16"/>
-                <w:szCs w:val="16"/>
-              </w:rPr>
-              <w:t xml:space="preserve">École 30 min</w:t>
-            </w:r>
-          </w:p>
-          <w:p>
-            <w:pPr>
-              <w:spacing w:after="10"/>
-            </w:pPr>
-            <w:r>
-              <w:rPr>
-                <w:rFonts w:ascii="Calibri" w:cs="Calibri" w:eastAsia="Calibri" w:hAnsi="Calibri"/>
+                <w:sz w:val="20"/>
+                <w:szCs w:val="20"/>
+              </w:rPr>
+              <w:t xml:space="preserve">Lab</w:t>
+            </w:r>
+          </w:p>
+          <w:p>
+            <w:pPr>
+              <w:spacing w:after="30"/>
+            </w:pPr>
+            <w:r>
+              <w:rPr>
+                <w:rFonts w:ascii="Calibri" w:cs="Calibri" w:eastAsia="Calibri" w:hAnsi="Calibri"/>
+                <w:b/>
+                <w:bCs/>
                 <w:color w:val="000000"/>
-                <w:sz w:val="16"/>
-                <w:szCs w:val="16"/>
-              </w:rPr>
-              <w:t xml:space="preserve">Revue 30 min</w:t>
-            </w:r>
-          </w:p>
-          <w:p>
-            <w:pPr>
-              <w:spacing w:after="10"/>
-            </w:pPr>
-            <w:r>
-              <w:rPr>
-                <w:rFonts w:ascii="Calibri" w:cs="Calibri" w:eastAsia="Calibri" w:hAnsi="Calibri"/>
+                <w:sz w:val="20"/>
+                <w:szCs w:val="20"/>
+              </w:rPr>
+              <w:t xml:space="preserve">Projet</w:t>
+            </w:r>
+          </w:p>
+          <w:p>
+            <w:pPr>
+              <w:spacing w:after="30"/>
+            </w:pPr>
+            <w:r>
+              <w:rPr>
+                <w:rFonts w:ascii="Calibri" w:cs="Calibri" w:eastAsia="Calibri" w:hAnsi="Calibri"/>
+                <w:b/>
+                <w:bCs/>
                 <w:color w:val="000000"/>
-                <w:sz w:val="16"/>
-                <w:szCs w:val="16"/>
-              </w:rPr>
-              <w:t xml:space="preserve">Rédaction 30 min</w:t>
-            </w:r>
-          </w:p>
-        </w:tc>
-        <w:tc>
-          <w:tcPr>
-            <w:tcW w:type="dxa" w:w="1810"/>
-            <w:tcBorders>
-              <w:top w:val="single" w:color="B7C3D0" w:sz="4"/>
-              <w:left w:val="single" w:color="B7C3D0" w:sz="4"/>
-              <w:bottom w:val="single" w:color="B7C3D0" w:sz="4"/>
-              <w:right w:val="single" w:color="B7C3D0" w:sz="4"/>
-            </w:tcBorders>
-            <w:shd w:fill="FBE0D5" w:color="auto" w:val="clear"/>
-            <w:tcMar>
-              <w:top w:type="dxa" w:w="40"/>
-              <w:left w:type="dxa" w:w="70"/>
-              <w:bottom w:type="dxa" w:w="30"/>
-              <w:right w:type="dxa" w:w="50"/>
+                <w:sz w:val="20"/>
+                <w:szCs w:val="20"/>
+              </w:rPr>
+              <w:t xml:space="preserve">Revue</w:t>
+            </w:r>
+          </w:p>
+        </w:tc>
+        <w:tc>
+          <w:tcPr>
+            <w:tcW w:type="dxa" w:w="1784"/>
+            <w:tcBorders>
+              <w:top w:val="single" w:color="B7C3D0" w:sz="4"/>
+              <w:left w:val="single" w:color="B7C3D0" w:sz="4"/>
+              <w:bottom w:val="single" w:color="B7C3D0" w:sz="4"/>
+              <w:right w:val="single" w:color="B7C3D0" w:sz="4"/>
+            </w:tcBorders>
+            <w:shd w:fill="F4F3F0" w:color="auto" w:val="clear"/>
+            <w:tcMar>
+              <w:top w:type="dxa" w:w="90"/>
+              <w:left w:type="dxa" w:w="100"/>
+              <w:bottom w:type="dxa" w:w="70"/>
+              <w:right w:type="dxa" w:w="70"/>
             </w:tcMar>
             <w:vAlign w:val="top"/>
           </w:tcPr>
           <w:p>
             <w:pPr>
-              <w:spacing w:after="10"/>
-            </w:pPr>
-            <w:r>
-              <w:rPr>
-                <w:rFonts w:ascii="Calibri" w:cs="Calibri" w:eastAsia="Calibri" w:hAnsi="Calibri"/>
-                <w:color w:val="000000"/>
-                <w:sz w:val="16"/>
-                <w:szCs w:val="16"/>
-              </w:rPr>
-              <w:t xml:space="preserve">Lab 2 h 30</w:t>
-            </w:r>
-          </w:p>
-          <w:p>
-            <w:pPr>
-              <w:spacing w:after="10"/>
-            </w:pPr>
-            <w:r>
-              <w:rPr>
-                <w:rFonts w:ascii="Calibri" w:cs="Calibri" w:eastAsia="Calibri" w:hAnsi="Calibri"/>
-                <w:color w:val="000000"/>
-                <w:sz w:val="16"/>
-                <w:szCs w:val="16"/>
-              </w:rPr>
-              <w:t xml:space="preserve">C, projet 2 h</w:t>
-            </w:r>
-          </w:p>
-        </w:tc>
-        <w:tc>
-          <w:tcPr>
-            <w:tcW w:type="dxa" w:w="1810"/>
-            <w:tcBorders>
-              <w:top w:val="single" w:color="B7C3D0" w:sz="4"/>
-              <w:left w:val="single" w:color="B7C3D0" w:sz="4"/>
-              <w:bottom w:val="single" w:color="B7C3D0" w:sz="4"/>
-              <w:right w:val="single" w:color="B7C3D0" w:sz="4"/>
-            </w:tcBorders>
-            <w:shd w:fill="F4F3F0" w:color="auto" w:val="clear"/>
-            <w:tcMar>
-              <w:top w:type="dxa" w:w="40"/>
-              <w:left w:type="dxa" w:w="70"/>
-              <w:bottom w:type="dxa" w:w="30"/>
-              <w:right w:type="dxa" w:w="50"/>
-            </w:tcMar>
-            <w:vAlign w:val="top"/>
-          </w:tcPr>
-          <w:p>
-            <w:pPr>
-              <w:spacing w:after="10"/>
-            </w:pPr>
-            <w:r>
-              <w:rPr>
-                <w:rFonts w:ascii="Calibri" w:cs="Calibri" w:eastAsia="Calibri" w:hAnsi="Calibri"/>
+              <w:spacing w:after="30"/>
+            </w:pPr>
+            <w:r>
+              <w:rPr>
+                <w:rFonts w:ascii="Calibri" w:cs="Calibri" w:eastAsia="Calibri" w:hAnsi="Calibri"/>
+                <w:b w:val="false"/>
+                <w:bCs w:val="false"/>
                 <w:color w:val="777777"/>
-                <w:sz w:val="16"/>
-                <w:szCs w:val="16"/>
+                <w:sz w:val="20"/>
+                <w:szCs w:val="20"/>
               </w:rPr>
               <w:t xml:space="preserve">Libre</w:t>
             </w:r>
@@ -5213,7 +4671,7 @@
         </w:trPr>
         <w:tc>
           <w:tcPr>
-            <w:tcW w:type="dxa" w:w="1900"/>
+            <w:tcW w:type="dxa" w:w="2100"/>
             <w:tcBorders>
               <w:top w:val="single" w:color="B7C3D0" w:sz="4"/>
               <w:left w:val="single" w:color="B7C3D0" w:sz="4"/>
@@ -5242,13 +4700,13 @@
                 <w:sz w:val="16"/>
                 <w:szCs w:val="16"/>
               </w:rPr>
-              <w:t xml:space="preserve">Juillet 2027 à janvier 2028 (Maldev, EDR)</w:t>
-            </w:r>
-          </w:p>
-        </w:tc>
-        <w:tc>
-          <w:tcPr>
-            <w:tcW w:type="dxa" w:w="1810"/>
+              <w:t xml:space="preserve">Février à été 2028 (CRTL)</w:t>
+            </w:r>
+          </w:p>
+        </w:tc>
+        <w:tc>
+          <w:tcPr>
+            <w:tcW w:type="dxa" w:w="1781"/>
             <w:tcBorders>
               <w:top w:val="single" w:color="B7C3D0" w:sz="4"/>
               <w:left w:val="single" w:color="B7C3D0" w:sz="4"/>
@@ -5257,294 +4715,16 @@
             </w:tcBorders>
             <w:shd w:fill="DCEAFB" w:color="auto" w:val="clear"/>
             <w:tcMar>
-              <w:top w:type="dxa" w:w="40"/>
-              <w:left w:type="dxa" w:w="70"/>
-              <w:bottom w:type="dxa" w:w="30"/>
-              <w:right w:type="dxa" w:w="50"/>
+              <w:top w:type="dxa" w:w="90"/>
+              <w:left w:type="dxa" w:w="100"/>
+              <w:bottom w:type="dxa" w:w="70"/>
+              <w:right w:type="dxa" w:w="70"/>
             </w:tcMar>
             <w:vAlign w:val="top"/>
           </w:tcPr>
           <w:p>
             <w:pPr>
-              <w:spacing w:after="10"/>
-            </w:pPr>
-            <w:r>
-              <w:rPr>
-                <w:rFonts w:ascii="Calibri" w:cs="Calibri" w:eastAsia="Calibri" w:hAnsi="Calibri"/>
-                <w:color w:val="000000"/>
-                <w:sz w:val="16"/>
-                <w:szCs w:val="16"/>
-              </w:rPr>
-              <w:t xml:space="preserve">Cours 2 h</w:t>
-            </w:r>
-          </w:p>
-        </w:tc>
-        <w:tc>
-          <w:tcPr>
-            <w:tcW w:type="dxa" w:w="1810"/>
-            <w:tcBorders>
-              <w:top w:val="single" w:color="B7C3D0" w:sz="4"/>
-              <w:left w:val="single" w:color="B7C3D0" w:sz="4"/>
-              <w:bottom w:val="single" w:color="B7C3D0" w:sz="4"/>
-              <w:right w:val="single" w:color="B7C3D0" w:sz="4"/>
-            </w:tcBorders>
-            <w:shd w:fill="FBE0D5" w:color="auto" w:val="clear"/>
-            <w:tcMar>
-              <w:top w:type="dxa" w:w="40"/>
-              <w:left w:type="dxa" w:w="70"/>
-              <w:bottom w:type="dxa" w:w="30"/>
-              <w:right w:type="dxa" w:w="50"/>
-            </w:tcMar>
-            <w:vAlign w:val="top"/>
-          </w:tcPr>
-          <w:p>
-            <w:pPr>
-              <w:spacing w:after="10"/>
-            </w:pPr>
-            <w:r>
-              <w:rPr>
-                <w:rFonts w:ascii="Calibri" w:cs="Calibri" w:eastAsia="Calibri" w:hAnsi="Calibri"/>
-                <w:color w:val="000000"/>
-                <w:sz w:val="16"/>
-                <w:szCs w:val="16"/>
-              </w:rPr>
-              <w:t xml:space="preserve">Lab 2 h 30</w:t>
-            </w:r>
-          </w:p>
-        </w:tc>
-        <w:tc>
-          <w:tcPr>
-            <w:tcW w:type="dxa" w:w="1810"/>
-            <w:tcBorders>
-              <w:top w:val="single" w:color="B7C3D0" w:sz="4"/>
-              <w:left w:val="single" w:color="B7C3D0" w:sz="4"/>
-              <w:bottom w:val="single" w:color="B7C3D0" w:sz="4"/>
-              <w:right w:val="single" w:color="B7C3D0" w:sz="4"/>
-            </w:tcBorders>
-            <w:shd w:fill="FCEFC9" w:color="auto" w:val="clear"/>
-            <w:tcMar>
-              <w:top w:type="dxa" w:w="40"/>
-              <w:left w:type="dxa" w:w="70"/>
-              <w:bottom w:type="dxa" w:w="30"/>
-              <w:right w:type="dxa" w:w="50"/>
-            </w:tcMar>
-            <w:vAlign w:val="top"/>
-          </w:tcPr>
-          <w:p>
-            <w:pPr>
-              <w:spacing w:after="10"/>
-            </w:pPr>
-            <w:r>
-              <w:rPr>
-                <w:rFonts w:ascii="Calibri" w:cs="Calibri" w:eastAsia="Calibri" w:hAnsi="Calibri"/>
-                <w:color w:val="000000"/>
-                <w:sz w:val="16"/>
-                <w:szCs w:val="16"/>
-              </w:rPr>
-              <w:t xml:space="preserve">Reverse eng. 2 h</w:t>
-            </w:r>
-          </w:p>
-        </w:tc>
-        <w:tc>
-          <w:tcPr>
-            <w:tcW w:type="dxa" w:w="1810"/>
-            <w:tcBorders>
-              <w:top w:val="single" w:color="B7C3D0" w:sz="4"/>
-              <w:left w:val="single" w:color="B7C3D0" w:sz="4"/>
-              <w:bottom w:val="single" w:color="B7C3D0" w:sz="4"/>
-              <w:right w:val="single" w:color="B7C3D0" w:sz="4"/>
-            </w:tcBorders>
-            <w:shd w:fill="DCEAFB" w:color="auto" w:val="clear"/>
-            <w:tcMar>
-              <w:top w:type="dxa" w:w="40"/>
-              <w:left w:type="dxa" w:w="70"/>
-              <w:bottom w:type="dxa" w:w="30"/>
-              <w:right w:type="dxa" w:w="50"/>
-            </w:tcMar>
-            <w:vAlign w:val="top"/>
-          </w:tcPr>
-          <w:p>
-            <w:pPr>
-              <w:spacing w:after="10"/>
-            </w:pPr>
-            <w:r>
-              <w:rPr>
-                <w:rFonts w:ascii="Calibri" w:cs="Calibri" w:eastAsia="Calibri" w:hAnsi="Calibri"/>
-                <w:color w:val="000000"/>
-                <w:sz w:val="16"/>
-                <w:szCs w:val="16"/>
-              </w:rPr>
-              <w:t xml:space="preserve">Cours 2 h</w:t>
-            </w:r>
-          </w:p>
-        </w:tc>
-        <w:tc>
-          <w:tcPr>
-            <w:tcW w:type="dxa" w:w="1810"/>
-            <w:tcBorders>
-              <w:top w:val="single" w:color="B7C3D0" w:sz="4"/>
-              <w:left w:val="single" w:color="B7C3D0" w:sz="4"/>
-              <w:bottom w:val="single" w:color="B7C3D0" w:sz="4"/>
-              <w:right w:val="single" w:color="B7C3D0" w:sz="4"/>
-            </w:tcBorders>
-            <w:shd w:fill="FCEFC9" w:color="auto" w:val="clear"/>
-            <w:tcMar>
-              <w:top w:type="dxa" w:w="40"/>
-              <w:left w:type="dxa" w:w="70"/>
-              <w:bottom w:type="dxa" w:w="30"/>
-              <w:right w:type="dxa" w:w="50"/>
-            </w:tcMar>
-            <w:vAlign w:val="top"/>
-          </w:tcPr>
-          <w:p>
-            <w:pPr>
-              <w:spacing w:after="10"/>
-            </w:pPr>
-            <w:r>
-              <w:rPr>
-                <w:rFonts w:ascii="Calibri" w:cs="Calibri" w:eastAsia="Calibri" w:hAnsi="Calibri"/>
-                <w:color w:val="000000"/>
-                <w:sz w:val="16"/>
-                <w:szCs w:val="16"/>
-              </w:rPr>
-              <w:t xml:space="preserve">Rédaction 1 h</w:t>
-            </w:r>
-          </w:p>
-          <w:p>
-            <w:pPr>
-              <w:spacing w:after="10"/>
-            </w:pPr>
-            <w:r>
-              <w:rPr>
-                <w:rFonts w:ascii="Calibri" w:cs="Calibri" w:eastAsia="Calibri" w:hAnsi="Calibri"/>
-                <w:color w:val="000000"/>
-                <w:sz w:val="16"/>
-                <w:szCs w:val="16"/>
-              </w:rPr>
-              <w:t xml:space="preserve">Revue 30 min</w:t>
-            </w:r>
-          </w:p>
-        </w:tc>
-        <w:tc>
-          <w:tcPr>
-            <w:tcW w:type="dxa" w:w="1810"/>
-            <w:tcBorders>
-              <w:top w:val="single" w:color="B7C3D0" w:sz="4"/>
-              <w:left w:val="single" w:color="B7C3D0" w:sz="4"/>
-              <w:bottom w:val="single" w:color="B7C3D0" w:sz="4"/>
-              <w:right w:val="single" w:color="B7C3D0" w:sz="4"/>
-            </w:tcBorders>
-            <w:shd w:fill="FBE0D5" w:color="auto" w:val="clear"/>
-            <w:tcMar>
-              <w:top w:type="dxa" w:w="40"/>
-              <w:left w:type="dxa" w:w="70"/>
-              <w:bottom w:type="dxa" w:w="30"/>
-              <w:right w:type="dxa" w:w="50"/>
-            </w:tcMar>
-            <w:vAlign w:val="top"/>
-          </w:tcPr>
-          <w:p>
-            <w:pPr>
-              <w:spacing w:after="10"/>
-            </w:pPr>
-            <w:r>
-              <w:rPr>
-                <w:rFonts w:ascii="Calibri" w:cs="Calibri" w:eastAsia="Calibri" w:hAnsi="Calibri"/>
-                <w:color w:val="000000"/>
-                <w:sz w:val="16"/>
-                <w:szCs w:val="16"/>
-              </w:rPr>
-              <w:t xml:space="preserve">Lab 2 h 30</w:t>
-            </w:r>
-          </w:p>
-          <w:p>
-            <w:pPr>
-              <w:spacing w:after="10"/>
-            </w:pPr>
-            <w:r>
-              <w:rPr>
-                <w:rFonts w:ascii="Calibri" w:cs="Calibri" w:eastAsia="Calibri" w:hAnsi="Calibri"/>
-                <w:color w:val="000000"/>
-                <w:sz w:val="16"/>
-                <w:szCs w:val="16"/>
-              </w:rPr>
-              <w:t xml:space="preserve">Projet 2 h</w:t>
-            </w:r>
-          </w:p>
-          <w:p>
-            <w:pPr>
-              <w:spacing w:after="10"/>
-            </w:pPr>
-            <w:r>
-              <w:rPr>
-                <w:rFonts w:ascii="Calibri" w:cs="Calibri" w:eastAsia="Calibri" w:hAnsi="Calibri"/>
-                <w:color w:val="000000"/>
-                <w:sz w:val="16"/>
-                <w:szCs w:val="16"/>
-              </w:rPr>
-              <w:t xml:space="preserve">Revue 30 min</w:t>
-            </w:r>
-          </w:p>
-        </w:tc>
-        <w:tc>
-          <w:tcPr>
-            <w:tcW w:type="dxa" w:w="1810"/>
-            <w:tcBorders>
-              <w:top w:val="single" w:color="B7C3D0" w:sz="4"/>
-              <w:left w:val="single" w:color="B7C3D0" w:sz="4"/>
-              <w:bottom w:val="single" w:color="B7C3D0" w:sz="4"/>
-              <w:right w:val="single" w:color="B7C3D0" w:sz="4"/>
-            </w:tcBorders>
-            <w:shd w:fill="F4F3F0" w:color="auto" w:val="clear"/>
-            <w:tcMar>
-              <w:top w:type="dxa" w:w="40"/>
-              <w:left w:type="dxa" w:w="70"/>
-              <w:bottom w:type="dxa" w:w="30"/>
-              <w:right w:type="dxa" w:w="50"/>
-            </w:tcMar>
-            <w:vAlign w:val="top"/>
-          </w:tcPr>
-          <w:p>
-            <w:pPr>
-              <w:spacing w:after="10"/>
-            </w:pPr>
-            <w:r>
-              <w:rPr>
-                <w:rFonts w:ascii="Calibri" w:cs="Calibri" w:eastAsia="Calibri" w:hAnsi="Calibri"/>
-                <w:color w:val="777777"/>
-                <w:sz w:val="16"/>
-                <w:szCs w:val="16"/>
-              </w:rPr>
-              <w:t xml:space="preserve">Libre</w:t>
-            </w:r>
-          </w:p>
-        </w:tc>
-      </w:tr>
-      <w:tr>
-        <w:trPr>
-          <w:cantSplit/>
-        </w:trPr>
-        <w:tc>
-          <w:tcPr>
-            <w:tcW w:type="dxa" w:w="1900"/>
-            <w:tcBorders>
-              <w:top w:val="single" w:color="B7C3D0" w:sz="4"/>
-              <w:left w:val="single" w:color="B7C3D0" w:sz="4"/>
-              <w:bottom w:val="single" w:color="B7C3D0" w:sz="4"/>
-              <w:right w:val="single" w:color="B7C3D0" w:sz="4"/>
-            </w:tcBorders>
-            <w:shd w:fill="EEF2F7" w:color="auto" w:val="clear"/>
-            <w:tcMar>
-              <w:top w:type="dxa" w:w="50"/>
-              <w:left w:type="dxa" w:w="70"/>
-              <w:bottom w:type="dxa" w:w="50"/>
-              <w:right w:type="dxa" w:w="70"/>
-            </w:tcMar>
-          </w:tcPr>
-          <w:p>
-            <w:pPr>
-              <w:spacing w:after="20"/>
-              <w:jc w:val="left"/>
+              <w:spacing w:after="30"/>
             </w:pPr>
             <w:r>
               <w:rPr>
@@ -5552,16 +4732,86 @@
                 <w:b/>
                 <w:bCs/>
                 <w:color w:val="000000"/>
-                <w:sz w:val="16"/>
-                <w:szCs w:val="16"/>
-              </w:rPr>
-              <w:t xml:space="preserve">Février à été 2028 (CRTL)</w:t>
-            </w:r>
-          </w:p>
-        </w:tc>
-        <w:tc>
-          <w:tcPr>
-            <w:tcW w:type="dxa" w:w="1810"/>
+                <w:sz w:val="20"/>
+                <w:szCs w:val="20"/>
+              </w:rPr>
+              <w:t xml:space="preserve">CRTL</w:t>
+            </w:r>
+          </w:p>
+        </w:tc>
+        <w:tc>
+          <w:tcPr>
+            <w:tcW w:type="dxa" w:w="1781"/>
+            <w:tcBorders>
+              <w:top w:val="single" w:color="B7C3D0" w:sz="4"/>
+              <w:left w:val="single" w:color="B7C3D0" w:sz="4"/>
+              <w:bottom w:val="single" w:color="B7C3D0" w:sz="4"/>
+              <w:right w:val="single" w:color="B7C3D0" w:sz="4"/>
+            </w:tcBorders>
+            <w:shd w:fill="FBE0D5" w:color="auto" w:val="clear"/>
+            <w:tcMar>
+              <w:top w:type="dxa" w:w="90"/>
+              <w:left w:type="dxa" w:w="100"/>
+              <w:bottom w:type="dxa" w:w="70"/>
+              <w:right w:type="dxa" w:w="70"/>
+            </w:tcMar>
+            <w:vAlign w:val="top"/>
+          </w:tcPr>
+          <w:p>
+            <w:pPr>
+              <w:spacing w:after="30"/>
+            </w:pPr>
+            <w:r>
+              <w:rPr>
+                <w:rFonts w:ascii="Calibri" w:cs="Calibri" w:eastAsia="Calibri" w:hAnsi="Calibri"/>
+                <w:b/>
+                <w:bCs/>
+                <w:color w:val="000000"/>
+                <w:sz w:val="20"/>
+                <w:szCs w:val="20"/>
+              </w:rPr>
+              <w:t xml:space="preserve">Lab</w:t>
+            </w:r>
+          </w:p>
+        </w:tc>
+        <w:tc>
+          <w:tcPr>
+            <w:tcW w:type="dxa" w:w="1781"/>
+            <w:tcBorders>
+              <w:top w:val="single" w:color="B7C3D0" w:sz="4"/>
+              <w:left w:val="single" w:color="B7C3D0" w:sz="4"/>
+              <w:bottom w:val="single" w:color="B7C3D0" w:sz="4"/>
+              <w:right w:val="single" w:color="B7C3D0" w:sz="4"/>
+            </w:tcBorders>
+            <w:shd w:fill="D5F0E6" w:color="auto" w:val="clear"/>
+            <w:tcMar>
+              <w:top w:type="dxa" w:w="90"/>
+              <w:left w:type="dxa" w:w="100"/>
+              <w:bottom w:type="dxa" w:w="70"/>
+              <w:right w:type="dxa" w:w="70"/>
+            </w:tcMar>
+            <w:vAlign w:val="top"/>
+          </w:tcPr>
+          <w:p>
+            <w:pPr>
+              <w:spacing w:after="30"/>
+            </w:pPr>
+            <w:r>
+              <w:rPr>
+                <w:rFonts w:ascii="Calibri" w:cs="Calibri" w:eastAsia="Calibri" w:hAnsi="Calibri"/>
+                <w:b/>
+                <w:bCs/>
+                <w:color w:val="000000"/>
+                <w:sz w:val="20"/>
+                <w:szCs w:val="20"/>
+              </w:rPr>
+              <w:t xml:space="preserve">Projet</w:t>
+            </w:r>
+          </w:p>
+        </w:tc>
+        <w:tc>
+          <w:tcPr>
+            <w:tcW w:type="dxa" w:w="1781"/>
             <w:tcBorders>
               <w:top w:val="single" w:color="B7C3D0" w:sz="4"/>
               <w:left w:val="single" w:color="B7C3D0" w:sz="4"/>
@@ -5570,31 +4820,84 @@
             </w:tcBorders>
             <w:shd w:fill="DCEAFB" w:color="auto" w:val="clear"/>
             <w:tcMar>
-              <w:top w:type="dxa" w:w="40"/>
-              <w:left w:type="dxa" w:w="70"/>
-              <w:bottom w:type="dxa" w:w="30"/>
-              <w:right w:type="dxa" w:w="50"/>
+              <w:top w:type="dxa" w:w="90"/>
+              <w:left w:type="dxa" w:w="100"/>
+              <w:bottom w:type="dxa" w:w="70"/>
+              <w:right w:type="dxa" w:w="70"/>
             </w:tcMar>
             <w:vAlign w:val="top"/>
           </w:tcPr>
           <w:p>
             <w:pPr>
-              <w:spacing w:after="10"/>
-            </w:pPr>
-            <w:r>
-              <w:rPr>
-                <w:rFonts w:ascii="Calibri" w:cs="Calibri" w:eastAsia="Calibri" w:hAnsi="Calibri"/>
+              <w:spacing w:after="30"/>
+            </w:pPr>
+            <w:r>
+              <w:rPr>
+                <w:rFonts w:ascii="Calibri" w:cs="Calibri" w:eastAsia="Calibri" w:hAnsi="Calibri"/>
+                <w:b/>
+                <w:bCs/>
                 <w:color w:val="000000"/>
-                <w:sz w:val="16"/>
-                <w:szCs w:val="16"/>
-              </w:rPr>
-              <w:t xml:space="preserve">CRTL 2 h</w:t>
-            </w:r>
-          </w:p>
-        </w:tc>
-        <w:tc>
-          <w:tcPr>
-            <w:tcW w:type="dxa" w:w="1810"/>
+                <w:sz w:val="20"/>
+                <w:szCs w:val="20"/>
+              </w:rPr>
+              <w:t xml:space="preserve">CRTL</w:t>
+            </w:r>
+          </w:p>
+        </w:tc>
+        <w:tc>
+          <w:tcPr>
+            <w:tcW w:type="dxa" w:w="1781"/>
+            <w:tcBorders>
+              <w:top w:val="single" w:color="B7C3D0" w:sz="4"/>
+              <w:left w:val="single" w:color="B7C3D0" w:sz="4"/>
+              <w:bottom w:val="single" w:color="B7C3D0" w:sz="4"/>
+              <w:right w:val="single" w:color="B7C3D0" w:sz="4"/>
+            </w:tcBorders>
+            <w:shd w:fill="FCEFC9" w:color="auto" w:val="clear"/>
+            <w:tcMar>
+              <w:top w:type="dxa" w:w="90"/>
+              <w:left w:type="dxa" w:w="100"/>
+              <w:bottom w:type="dxa" w:w="70"/>
+              <w:right w:type="dxa" w:w="70"/>
+            </w:tcMar>
+            <w:vAlign w:val="top"/>
+          </w:tcPr>
+          <w:p>
+            <w:pPr>
+              <w:spacing w:after="30"/>
+            </w:pPr>
+            <w:r>
+              <w:rPr>
+                <w:rFonts w:ascii="Calibri" w:cs="Calibri" w:eastAsia="Calibri" w:hAnsi="Calibri"/>
+                <w:b/>
+                <w:bCs/>
+                <w:color w:val="000000"/>
+                <w:sz w:val="20"/>
+                <w:szCs w:val="20"/>
+              </w:rPr>
+              <w:t xml:space="preserve">Reverse eng.</w:t>
+            </w:r>
+          </w:p>
+          <w:p>
+            <w:pPr>
+              <w:spacing w:after="30"/>
+            </w:pPr>
+            <w:r>
+              <w:rPr>
+                <w:rFonts w:ascii="Calibri" w:cs="Calibri" w:eastAsia="Calibri" w:hAnsi="Calibri"/>
+                <w:b/>
+                <w:bCs/>
+                <w:color w:val="000000"/>
+                <w:sz w:val="20"/>
+                <w:szCs w:val="20"/>
+              </w:rPr>
+              <w:t xml:space="preserve">Revue</w:t>
+            </w:r>
+          </w:p>
+        </w:tc>
+        <w:tc>
+          <w:tcPr>
+            <w:tcW w:type="dxa" w:w="1781"/>
             <w:tcBorders>
               <w:top w:val="single" w:color="B7C3D0" w:sz="4"/>
               <w:left w:val="single" w:color="B7C3D0" w:sz="4"/>
@@ -5603,230 +4906,92 @@
             </w:tcBorders>
             <w:shd w:fill="FBE0D5" w:color="auto" w:val="clear"/>
             <w:tcMar>
-              <w:top w:type="dxa" w:w="40"/>
-              <w:left w:type="dxa" w:w="70"/>
-              <w:bottom w:type="dxa" w:w="30"/>
-              <w:right w:type="dxa" w:w="50"/>
+              <w:top w:type="dxa" w:w="90"/>
+              <w:left w:type="dxa" w:w="100"/>
+              <w:bottom w:type="dxa" w:w="70"/>
+              <w:right w:type="dxa" w:w="70"/>
             </w:tcMar>
             <w:vAlign w:val="top"/>
           </w:tcPr>
           <w:p>
             <w:pPr>
-              <w:spacing w:after="10"/>
-            </w:pPr>
-            <w:r>
-              <w:rPr>
-                <w:rFonts w:ascii="Calibri" w:cs="Calibri" w:eastAsia="Calibri" w:hAnsi="Calibri"/>
+              <w:spacing w:after="30"/>
+            </w:pPr>
+            <w:r>
+              <w:rPr>
+                <w:rFonts w:ascii="Calibri" w:cs="Calibri" w:eastAsia="Calibri" w:hAnsi="Calibri"/>
+                <w:b/>
+                <w:bCs/>
                 <w:color w:val="000000"/>
-                <w:sz w:val="16"/>
-                <w:szCs w:val="16"/>
-              </w:rPr>
-              <w:t xml:space="preserve">Lab 2 h 30</w:t>
-            </w:r>
-          </w:p>
-        </w:tc>
-        <w:tc>
-          <w:tcPr>
-            <w:tcW w:type="dxa" w:w="1810"/>
-            <w:tcBorders>
-              <w:top w:val="single" w:color="B7C3D0" w:sz="4"/>
-              <w:left w:val="single" w:color="B7C3D0" w:sz="4"/>
-              <w:bottom w:val="single" w:color="B7C3D0" w:sz="4"/>
-              <w:right w:val="single" w:color="B7C3D0" w:sz="4"/>
-            </w:tcBorders>
-            <w:shd w:fill="D5F0E6" w:color="auto" w:val="clear"/>
-            <w:tcMar>
-              <w:top w:type="dxa" w:w="40"/>
-              <w:left w:type="dxa" w:w="70"/>
-              <w:bottom w:type="dxa" w:w="30"/>
-              <w:right w:type="dxa" w:w="50"/>
+                <w:sz w:val="20"/>
+                <w:szCs w:val="20"/>
+              </w:rPr>
+              <w:t xml:space="preserve">Lab</w:t>
+            </w:r>
+          </w:p>
+          <w:p>
+            <w:pPr>
+              <w:spacing w:after="30"/>
+            </w:pPr>
+            <w:r>
+              <w:rPr>
+                <w:rFonts w:ascii="Calibri" w:cs="Calibri" w:eastAsia="Calibri" w:hAnsi="Calibri"/>
+                <w:b/>
+                <w:bCs/>
+                <w:color w:val="000000"/>
+                <w:sz w:val="20"/>
+                <w:szCs w:val="20"/>
+              </w:rPr>
+              <w:t xml:space="preserve">Projet</w:t>
+            </w:r>
+          </w:p>
+          <w:p>
+            <w:pPr>
+              <w:spacing w:after="30"/>
+            </w:pPr>
+            <w:r>
+              <w:rPr>
+                <w:rFonts w:ascii="Calibri" w:cs="Calibri" w:eastAsia="Calibri" w:hAnsi="Calibri"/>
+                <w:b/>
+                <w:bCs/>
+                <w:color w:val="000000"/>
+                <w:sz w:val="20"/>
+                <w:szCs w:val="20"/>
+              </w:rPr>
+              <w:t xml:space="preserve">Candidatures</w:t>
+            </w:r>
+          </w:p>
+        </w:tc>
+        <w:tc>
+          <w:tcPr>
+            <w:tcW w:type="dxa" w:w="1784"/>
+            <w:tcBorders>
+              <w:top w:val="single" w:color="B7C3D0" w:sz="4"/>
+              <w:left w:val="single" w:color="B7C3D0" w:sz="4"/>
+              <w:bottom w:val="single" w:color="B7C3D0" w:sz="4"/>
+              <w:right w:val="single" w:color="B7C3D0" w:sz="4"/>
+            </w:tcBorders>
+            <w:shd w:fill="F4F3F0" w:color="auto" w:val="clear"/>
+            <w:tcMar>
+              <w:top w:type="dxa" w:w="90"/>
+              <w:left w:type="dxa" w:w="100"/>
+              <w:bottom w:type="dxa" w:w="70"/>
+              <w:right w:type="dxa" w:w="70"/>
             </w:tcMar>
             <w:vAlign w:val="top"/>
           </w:tcPr>
           <w:p>
             <w:pPr>
-              <w:spacing w:after="10"/>
-            </w:pPr>
-            <w:r>
-              <w:rPr>
-                <w:rFonts w:ascii="Calibri" w:cs="Calibri" w:eastAsia="Calibri" w:hAnsi="Calibri"/>
-                <w:color w:val="000000"/>
-                <w:sz w:val="16"/>
-                <w:szCs w:val="16"/>
-              </w:rPr>
-              <w:t xml:space="preserve">Projet 2 h</w:t>
-            </w:r>
-          </w:p>
-        </w:tc>
-        <w:tc>
-          <w:tcPr>
-            <w:tcW w:type="dxa" w:w="1810"/>
-            <w:tcBorders>
-              <w:top w:val="single" w:color="B7C3D0" w:sz="4"/>
-              <w:left w:val="single" w:color="B7C3D0" w:sz="4"/>
-              <w:bottom w:val="single" w:color="B7C3D0" w:sz="4"/>
-              <w:right w:val="single" w:color="B7C3D0" w:sz="4"/>
-            </w:tcBorders>
-            <w:shd w:fill="DCEAFB" w:color="auto" w:val="clear"/>
-            <w:tcMar>
-              <w:top w:type="dxa" w:w="40"/>
-              <w:left w:type="dxa" w:w="70"/>
-              <w:bottom w:type="dxa" w:w="30"/>
-              <w:right w:type="dxa" w:w="50"/>
-            </w:tcMar>
-            <w:vAlign w:val="top"/>
-          </w:tcPr>
-          <w:p>
-            <w:pPr>
-              <w:spacing w:after="10"/>
-            </w:pPr>
-            <w:r>
-              <w:rPr>
-                <w:rFonts w:ascii="Calibri" w:cs="Calibri" w:eastAsia="Calibri" w:hAnsi="Calibri"/>
-                <w:color w:val="000000"/>
-                <w:sz w:val="16"/>
-                <w:szCs w:val="16"/>
-              </w:rPr>
-              <w:t xml:space="preserve">CRTL 2 h</w:t>
-            </w:r>
-          </w:p>
-        </w:tc>
-        <w:tc>
-          <w:tcPr>
-            <w:tcW w:type="dxa" w:w="1810"/>
-            <w:tcBorders>
-              <w:top w:val="single" w:color="B7C3D0" w:sz="4"/>
-              <w:left w:val="single" w:color="B7C3D0" w:sz="4"/>
-              <w:bottom w:val="single" w:color="B7C3D0" w:sz="4"/>
-              <w:right w:val="single" w:color="B7C3D0" w:sz="4"/>
-            </w:tcBorders>
-            <w:shd w:fill="FCEFC9" w:color="auto" w:val="clear"/>
-            <w:tcMar>
-              <w:top w:type="dxa" w:w="40"/>
-              <w:left w:type="dxa" w:w="70"/>
-              <w:bottom w:type="dxa" w:w="30"/>
-              <w:right w:type="dxa" w:w="50"/>
-            </w:tcMar>
-            <w:vAlign w:val="top"/>
-          </w:tcPr>
-          <w:p>
-            <w:pPr>
-              <w:spacing w:after="10"/>
-            </w:pPr>
-            <w:r>
-              <w:rPr>
-                <w:rFonts w:ascii="Calibri" w:cs="Calibri" w:eastAsia="Calibri" w:hAnsi="Calibri"/>
-                <w:color w:val="000000"/>
-                <w:sz w:val="16"/>
-                <w:szCs w:val="16"/>
-              </w:rPr>
-              <w:t xml:space="preserve">Reverse eng. 1 h</w:t>
-            </w:r>
-          </w:p>
-          <w:p>
-            <w:pPr>
-              <w:spacing w:after="10"/>
-            </w:pPr>
-            <w:r>
-              <w:rPr>
-                <w:rFonts w:ascii="Calibri" w:cs="Calibri" w:eastAsia="Calibri" w:hAnsi="Calibri"/>
-                <w:color w:val="000000"/>
-                <w:sz w:val="16"/>
-                <w:szCs w:val="16"/>
-              </w:rPr>
-              <w:t xml:space="preserve">Revue 30 min</w:t>
-            </w:r>
-          </w:p>
-        </w:tc>
-        <w:tc>
-          <w:tcPr>
-            <w:tcW w:type="dxa" w:w="1810"/>
-            <w:tcBorders>
-              <w:top w:val="single" w:color="B7C3D0" w:sz="4"/>
-              <w:left w:val="single" w:color="B7C3D0" w:sz="4"/>
-              <w:bottom w:val="single" w:color="B7C3D0" w:sz="4"/>
-              <w:right w:val="single" w:color="B7C3D0" w:sz="4"/>
-            </w:tcBorders>
-            <w:shd w:fill="FBE0D5" w:color="auto" w:val="clear"/>
-            <w:tcMar>
-              <w:top w:type="dxa" w:w="40"/>
-              <w:left w:type="dxa" w:w="70"/>
-              <w:bottom w:type="dxa" w:w="30"/>
-              <w:right w:type="dxa" w:w="50"/>
-            </w:tcMar>
-            <w:vAlign w:val="top"/>
-          </w:tcPr>
-          <w:p>
-            <w:pPr>
-              <w:spacing w:after="10"/>
-            </w:pPr>
-            <w:r>
-              <w:rPr>
-                <w:rFonts w:ascii="Calibri" w:cs="Calibri" w:eastAsia="Calibri" w:hAnsi="Calibri"/>
-                <w:color w:val="000000"/>
-                <w:sz w:val="16"/>
-                <w:szCs w:val="16"/>
-              </w:rPr>
-              <w:t xml:space="preserve">Lab 2 h 30</w:t>
-            </w:r>
-          </w:p>
-          <w:p>
-            <w:pPr>
-              <w:spacing w:after="10"/>
-            </w:pPr>
-            <w:r>
-              <w:rPr>
-                <w:rFonts w:ascii="Calibri" w:cs="Calibri" w:eastAsia="Calibri" w:hAnsi="Calibri"/>
-                <w:color w:val="000000"/>
-                <w:sz w:val="16"/>
-                <w:szCs w:val="16"/>
-              </w:rPr>
-              <w:t xml:space="preserve">Projet 1 h</w:t>
-            </w:r>
-          </w:p>
-          <w:p>
-            <w:pPr>
-              <w:spacing w:after="10"/>
-            </w:pPr>
-            <w:r>
-              <w:rPr>
-                <w:rFonts w:ascii="Calibri" w:cs="Calibri" w:eastAsia="Calibri" w:hAnsi="Calibri"/>
-                <w:color w:val="000000"/>
-                <w:sz w:val="16"/>
-                <w:szCs w:val="16"/>
-              </w:rPr>
-              <w:t xml:space="preserve">Candidatures 1 h 30</w:t>
-            </w:r>
-          </w:p>
-        </w:tc>
-        <w:tc>
-          <w:tcPr>
-            <w:tcW w:type="dxa" w:w="1810"/>
-            <w:tcBorders>
-              <w:top w:val="single" w:color="B7C3D0" w:sz="4"/>
-              <w:left w:val="single" w:color="B7C3D0" w:sz="4"/>
-              <w:bottom w:val="single" w:color="B7C3D0" w:sz="4"/>
-              <w:right w:val="single" w:color="B7C3D0" w:sz="4"/>
-            </w:tcBorders>
-            <w:shd w:fill="F4F3F0" w:color="auto" w:val="clear"/>
-            <w:tcMar>
-              <w:top w:type="dxa" w:w="40"/>
-              <w:left w:type="dxa" w:w="70"/>
-              <w:bottom w:type="dxa" w:w="30"/>
-              <w:right w:type="dxa" w:w="50"/>
-            </w:tcMar>
-            <w:vAlign w:val="top"/>
-          </w:tcPr>
-          <w:p>
-            <w:pPr>
-              <w:spacing w:after="10"/>
-            </w:pPr>
-            <w:r>
-              <w:rPr>
-                <w:rFonts w:ascii="Calibri" w:cs="Calibri" w:eastAsia="Calibri" w:hAnsi="Calibri"/>
+              <w:spacing w:after="30"/>
+            </w:pPr>
+            <w:r>
+              <w:rPr>
+                <w:rFonts w:ascii="Calibri" w:cs="Calibri" w:eastAsia="Calibri" w:hAnsi="Calibri"/>
+                <w:b w:val="false"/>
+                <w:bCs w:val="false"/>
                 <w:color w:val="777777"/>
-                <w:sz w:val="16"/>
-                <w:szCs w:val="16"/>
+                <w:sz w:val="20"/>
+                <w:szCs w:val="20"/>
               </w:rPr>
               <w:t xml:space="preserve">Libre</w:t>
             </w:r>
@@ -5851,7 +5016,7 @@
           <w:sz w:val="18"/>
           <w:szCs w:val="18"/>
         </w:rPr>
-        <w:t xml:space="preserve">Les semaines d'école suivent les mêmes jours avec des volumes réduits (9 h 30) : voir la section 4.2. À partir de mi-décembre, le mardi est consacré à la BSCP.</w:t>
+        <w:t xml:space="preserve">Semaine d'entreprise. Les semaines d'école suivent les mêmes jours avec des volumes réduits. À partir de mi-décembre, le mardi est consacré à la BSCP. Le dimanche reste libre.</w:t>
       </w:r>
     </w:p>
     <w:p>

</xml_diff>